<commit_message>
Sankey added, technology added, carrier branching added
</commit_message>
<xml_diff>
--- a/pyros_be/controllers/audit_template.docx
+++ b/pyros_be/controllers/audit_template.docx
@@ -93,7 +93,7 @@
     </w:p>
     <w:sdt>
       <w:sdtPr>
-        <w:id w:val="-1790596975"/>
+        <w:id w:val="1383798335"/>
         <w:docPartObj>
           <w:docPartGallery w:val="Table of Contents"/>
           <w:docPartUnique w:val="1"/>
@@ -115,7 +115,7 @@
             </w:pBdr>
             <w:shd w:fill="auto" w:val="clear"/>
             <w:tabs>
-              <w:tab w:val="right" w:leader="dot" w:pos="9016"/>
+              <w:tab w:val="right" w:leader="none" w:pos="9016"/>
             </w:tabs>
             <w:spacing w:after="100" w:before="0" w:line="360" w:lineRule="auto"/>
             <w:ind w:left="0" w:right="0" w:firstLine="0"/>
@@ -141,7 +141,7 @@
             <w:instrText xml:space="preserve"> TOC \h \u \z \t "Heading 1,1,Heading 2,2,Heading 3,3,"</w:instrText>
             <w:fldChar w:fldCharType="separate"/>
           </w:r>
-          <w:hyperlink w:anchor="_49j73h9ehsdd">
+          <w:hyperlink w:anchor="_poaunr5vl9ew">
             <w:r>
               <w:rPr>
                 <w:rFonts w:ascii="Times New Roman" w:cs="Times New Roman" w:eastAsia="Times New Roman" w:hAnsi="Times New Roman"/>
@@ -185,7 +185,7 @@
             </w:pBdr>
             <w:shd w:fill="auto" w:val="clear"/>
             <w:tabs>
-              <w:tab w:val="right" w:leader="dot" w:pos="9016"/>
+              <w:tab w:val="right" w:leader="none" w:pos="9016"/>
             </w:tabs>
             <w:spacing w:after="100" w:before="0" w:line="360" w:lineRule="auto"/>
             <w:ind w:left="0" w:right="0" w:firstLine="0"/>
@@ -206,7 +206,7 @@
               <w:vertAlign w:val="baseline"/>
             </w:rPr>
           </w:pPr>
-          <w:hyperlink w:anchor="_mul79y5yra3n">
+          <w:hyperlink w:anchor="_jyleb9oakg65">
             <w:r>
               <w:rPr>
                 <w:rFonts w:ascii="Times New Roman" w:cs="Times New Roman" w:eastAsia="Times New Roman" w:hAnsi="Times New Roman"/>
@@ -250,7 +250,7 @@
             </w:pBdr>
             <w:shd w:fill="auto" w:val="clear"/>
             <w:tabs>
-              <w:tab w:val="right" w:leader="dot" w:pos="9016"/>
+              <w:tab w:val="right" w:leader="none" w:pos="9016"/>
             </w:tabs>
             <w:spacing w:after="100" w:before="0" w:line="360" w:lineRule="auto"/>
             <w:ind w:left="0" w:right="0" w:firstLine="0"/>
@@ -271,7 +271,7 @@
               <w:vertAlign w:val="baseline"/>
             </w:rPr>
           </w:pPr>
-          <w:hyperlink w:anchor="_7m37u25addz5">
+          <w:hyperlink w:anchor="_1judf6aiosh8">
             <w:r>
               <w:rPr>
                 <w:rFonts w:ascii="Times New Roman" w:cs="Times New Roman" w:eastAsia="Times New Roman" w:hAnsi="Times New Roman"/>
@@ -315,7 +315,7 @@
             </w:pBdr>
             <w:shd w:fill="auto" w:val="clear"/>
             <w:tabs>
-              <w:tab w:val="right" w:leader="dot" w:pos="9016"/>
+              <w:tab w:val="right" w:leader="none" w:pos="9016"/>
             </w:tabs>
             <w:spacing w:after="100" w:before="0" w:line="360" w:lineRule="auto"/>
             <w:ind w:left="0" w:right="0" w:firstLine="0"/>
@@ -336,7 +336,7 @@
               <w:vertAlign w:val="baseline"/>
             </w:rPr>
           </w:pPr>
-          <w:hyperlink w:anchor="_5nesa93jb31m">
+          <w:hyperlink w:anchor="_32r77tg88wi9">
             <w:r>
               <w:rPr>
                 <w:rFonts w:ascii="Times New Roman" w:cs="Times New Roman" w:eastAsia="Times New Roman" w:hAnsi="Times New Roman"/>
@@ -385,7 +385,7 @@
         <w:pStyle w:val="Heading1"/>
         <w:rPr/>
       </w:pPr>
-      <w:bookmarkStart w:colFirst="0" w:colLast="0" w:name="_49j73h9ehsdd" w:id="0"/>
+      <w:bookmarkStart w:colFirst="0" w:colLast="0" w:name="_poaunr5vl9ew" w:id="0"/>
       <w:bookmarkEnd w:id="0"/>
       <w:r>
         <w:rPr>
@@ -587,7 +587,7 @@
               <w:rPr>
                 <w:rtl w:val="0"/>
               </w:rPr>
-              <w:t xml:space="preserve">${carrier1}</w:t>
+              <w:t xml:space="preserve">${carrier}</w:t>
             </w:r>
           </w:p>
         </w:tc>
@@ -601,7 +601,7 @@
               <w:rPr>
                 <w:rtl w:val="0"/>
               </w:rPr>
-              <w:t xml:space="preserve">${carrier1_building}</w:t>
+              <w:t xml:space="preserve">${carrier_building}</w:t>
             </w:r>
           </w:p>
         </w:tc>
@@ -615,7 +615,7 @@
               <w:rPr>
                 <w:rtl w:val="0"/>
               </w:rPr>
-              <w:t xml:space="preserve">${carrier1_product}</w:t>
+              <w:t xml:space="preserve">${carrier_product}</w:t>
             </w:r>
           </w:p>
         </w:tc>
@@ -629,7 +629,7 @@
               <w:rPr>
                 <w:rtl w:val="0"/>
               </w:rPr>
-              <w:t xml:space="preserve">${carrier1_vehicle}</w:t>
+              <w:t xml:space="preserve">${carrier_vehicle}</w:t>
             </w:r>
           </w:p>
         </w:tc>
@@ -643,7 +643,7 @@
               <w:rPr>
                 <w:rtl w:val="0"/>
               </w:rPr>
-              <w:t xml:space="preserve">${carrier1_total}</w:t>
+              <w:t xml:space="preserve">${carrier_total}</w:t>
             </w:r>
           </w:p>
         </w:tc>
@@ -675,7 +675,7 @@
         <w:pStyle w:val="Heading1"/>
         <w:rPr/>
       </w:pPr>
-      <w:bookmarkStart w:colFirst="0" w:colLast="0" w:name="_mul79y5yra3n" w:id="1"/>
+      <w:bookmarkStart w:colFirst="0" w:colLast="0" w:name="_jyleb9oakg65" w:id="1"/>
       <w:bookmarkEnd w:id="1"/>
       <w:r>
         <w:rPr>
@@ -722,7 +722,7 @@
         <w:pStyle w:val="Heading1"/>
         <w:rPr/>
       </w:pPr>
-      <w:bookmarkStart w:colFirst="0" w:colLast="0" w:name="_7m37u25addz5" w:id="2"/>
+      <w:bookmarkStart w:colFirst="0" w:colLast="0" w:name="_1judf6aiosh8" w:id="2"/>
       <w:bookmarkEnd w:id="2"/>
       <w:r>
         <w:rPr>
@@ -758,7 +758,7 @@
         <w:pStyle w:val="Heading1"/>
         <w:rPr/>
       </w:pPr>
-      <w:bookmarkStart w:colFirst="0" w:colLast="0" w:name="_xahlj777qf9x" w:id="3"/>
+      <w:bookmarkStart w:colFirst="0" w:colLast="0" w:name="_pgil67bhu4rv" w:id="3"/>
       <w:bookmarkEnd w:id="3"/>
       <w:r>
         <w:rPr>
@@ -776,17 +776,6 @@
           <w:rtl w:val="0"/>
         </w:rPr>
         <w:t xml:space="preserve">A ${company_name} az alábbi mérőkkel, illetve számított fogyasztásokkal rendelkezik:</w:t>
-      </w:r>
-    </w:p>
-    <w:p>
-      <w:pPr>
-        <w:rPr/>
-      </w:pPr>
-      <w:r>
-        <w:rPr>
-          <w:rtl w:val="0"/>
-        </w:rPr>
-        <w:t xml:space="preserve">${standing_hierarchy}</w:t>
       </w:r>
     </w:p>
     <w:p>
@@ -798,106 +787,14 @@
       </w:pPr>
       <w:r>
         <w:rPr>
-          <w:i w:val="1"/>
-          <w:iCs w:val="1"/>
-          <w:rtl w:val="0"/>
-        </w:rPr>
-        <w:t xml:space="preserve">Formátum: </w:t>
-      </w:r>
-    </w:p>
-    <w:p>
-      <w:pPr>
-        <w:ind w:left="4253" w:hanging="4253"/>
-        <w:rPr>
-          <w:i w:val="1"/>
-          <w:iCs w:val="1"/>
-        </w:rPr>
-      </w:pPr>
-      <w:r>
-        <w:rPr>
-          <w:i w:val="1"/>
-          <w:iCs w:val="1"/>
-          <w:rtl w:val="0"/>
-        </w:rPr>
-        <w:t xml:space="preserve">Főmérő 1</w:t>
-        <w:tab/>
-        <w:t xml:space="preserve">Fogyasztás</w:t>
-      </w:r>
-    </w:p>
-    <w:p>
-      <w:pPr>
-        <w:ind w:left="4253" w:hanging="3533"/>
-        <w:rPr>
-          <w:i w:val="1"/>
-          <w:iCs w:val="1"/>
-        </w:rPr>
-      </w:pPr>
-      <w:r>
-        <w:rPr>
-          <w:i w:val="1"/>
-          <w:iCs w:val="1"/>
-          <w:rtl w:val="0"/>
-        </w:rPr>
-        <w:t xml:space="preserve">Almérő 1</w:t>
-        <w:tab/>
-        <w:t xml:space="preserve">Fogyasztás</w:t>
-      </w:r>
-    </w:p>
-    <w:p>
-      <w:pPr>
-        <w:ind w:left="4253" w:hanging="3533"/>
-        <w:rPr>
-          <w:i w:val="1"/>
-          <w:iCs w:val="1"/>
-        </w:rPr>
-      </w:pPr>
-      <w:r>
-        <w:rPr>
-          <w:i w:val="1"/>
-          <w:iCs w:val="1"/>
-          <w:rtl w:val="0"/>
-        </w:rPr>
-        <w:t xml:space="preserve">Almérő 2</w:t>
-        <w:tab/>
-        <w:t xml:space="preserve">Fogyasztás</w:t>
-      </w:r>
-    </w:p>
-    <w:p>
-      <w:pPr>
-        <w:ind w:left="4253" w:hanging="4253"/>
-        <w:rPr>
-          <w:i w:val="1"/>
-          <w:iCs w:val="1"/>
-        </w:rPr>
-      </w:pPr>
-      <w:r>
-        <w:rPr>
-          <w:i w:val="1"/>
-          <w:iCs w:val="1"/>
-          <w:rtl w:val="0"/>
-        </w:rPr>
-        <w:t xml:space="preserve">Főmérő 2</w:t>
-        <w:tab/>
-        <w:t xml:space="preserve">Fogyasztás</w:t>
-      </w:r>
-    </w:p>
-    <w:p>
-      <w:pPr>
-        <w:ind w:left="4253" w:hanging="4253"/>
-        <w:rPr>
-          <w:i w:val="1"/>
-          <w:iCs w:val="1"/>
-        </w:rPr>
-      </w:pPr>
-      <w:r>
-        <w:rPr>
-          <w:i w:val="1"/>
-          <w:iCs w:val="1"/>
-          <w:rtl w:val="0"/>
-        </w:rPr>
-        <w:t xml:space="preserve">Virtuális mérő 1</w:t>
-        <w:tab/>
-        <w:t xml:space="preserve">Fogyasztás</w:t>
+          <w:rtl w:val="0"/>
+        </w:rPr>
+        <w:t xml:space="preserve">${standing_hierarchy}</w:t>
+      </w:r>
+      <w:r>
+        <w:rPr>
+          <w:rtl w:val="0"/>
+        </w:rPr>
       </w:r>
     </w:p>
     <w:p>
@@ -2790,6 +2687,11 @@
         </w:rPr>
         <w:t xml:space="preserve">​​)−Beruházási költség</w:t>
       </w:r>
+      <w:r>
+        <w:rPr>
+          <w:rtl w:val="0"/>
+        </w:rPr>
+      </w:r>
     </w:p>
     <w:p>
       <w:pPr>
@@ -2929,13 +2831,27 @@
     </w:p>
     <w:p>
       <w:pPr>
-        <w:rPr/>
-      </w:pPr>
-      <w:r>
-        <w:rPr>
-          <w:rtl w:val="0"/>
-        </w:rPr>
-        <w:t xml:space="preserve">${technology_page}</w:t>
+        <w:pStyle w:val="Heading1"/>
+        <w:rPr/>
+      </w:pPr>
+      <w:bookmarkStart w:colFirst="0" w:colLast="0" w:name="_ah77jle03xqd" w:id="4"/>
+      <w:bookmarkEnd w:id="4"/>
+      <w:r>
+        <w:rPr>
+          <w:rtl w:val="0"/>
+        </w:rPr>
+        <w:t xml:space="preserve">${technology_title}</w:t>
+      </w:r>
+    </w:p>
+    <w:p>
+      <w:pPr>
+        <w:rPr/>
+      </w:pPr>
+      <w:r>
+        <w:rPr>
+          <w:rtl w:val="0"/>
+        </w:rPr>
+        <w:t xml:space="preserve">${technology_content}</w:t>
       </w:r>
     </w:p>
     <w:p>
@@ -3137,7 +3053,7 @@
               <w:rPr>
                 <w:rtl w:val="0"/>
               </w:rPr>
-              <w:t xml:space="preserve">Földgáz</w:t>
+              <w:t xml:space="preserve">${carrier2}</w:t>
             </w:r>
           </w:p>
         </w:tc>
@@ -3159,7 +3075,7 @@
               <w:rPr>
                 <w:rtl w:val="0"/>
               </w:rPr>
-              <w:t xml:space="preserve">x</w:t>
+              <w:t xml:space="preserve">${carrier2_building}</w:t>
             </w:r>
           </w:p>
         </w:tc>
@@ -3181,7 +3097,7 @@
               <w:rPr>
                 <w:rtl w:val="0"/>
               </w:rPr>
-              <w:t xml:space="preserve">x</w:t>
+              <w:t xml:space="preserve">${carrier2_product}</w:t>
             </w:r>
           </w:p>
         </w:tc>
@@ -3203,845 +3119,7 @@
               <w:rPr>
                 <w:rtl w:val="0"/>
               </w:rPr>
-            </w:r>
-          </w:p>
-        </w:tc>
-      </w:tr>
-      <w:tr>
-        <w:trPr>
-          <w:cantSplit w:val="0"/>
-          <w:tblHeader w:val="0"/>
-        </w:trPr>
-        <w:tc>
-          <w:tcPr>
-            <w:tcBorders>
-              <w:top w:color="000000" w:space="0" w:sz="4" w:val="single"/>
-              <w:left w:color="000000" w:space="0" w:sz="4" w:val="single"/>
-              <w:bottom w:color="000000" w:space="0" w:sz="4" w:val="single"/>
-              <w:right w:color="000000" w:space="0" w:sz="4" w:val="single"/>
-            </w:tcBorders>
-          </w:tcPr>
-          <w:p>
-            <w:pPr>
-              <w:spacing w:after="160" w:lineRule="auto"/>
-              <w:rPr/>
-            </w:pPr>
-            <w:r>
-              <w:rPr>
-                <w:rtl w:val="0"/>
-              </w:rPr>
-              <w:t xml:space="preserve">Villamos energia</w:t>
-            </w:r>
-          </w:p>
-        </w:tc>
-        <w:tc>
-          <w:tcPr>
-            <w:tcBorders>
-              <w:top w:color="000000" w:space="0" w:sz="4" w:val="single"/>
-              <w:left w:color="000000" w:space="0" w:sz="4" w:val="single"/>
-              <w:bottom w:color="000000" w:space="0" w:sz="4" w:val="single"/>
-              <w:right w:color="000000" w:space="0" w:sz="4" w:val="single"/>
-            </w:tcBorders>
-          </w:tcPr>
-          <w:p>
-            <w:pPr>
-              <w:spacing w:after="160" w:lineRule="auto"/>
-              <w:rPr/>
-            </w:pPr>
-            <w:r>
-              <w:rPr>
-                <w:rtl w:val="0"/>
-              </w:rPr>
-              <w:t xml:space="preserve">x</w:t>
-            </w:r>
-          </w:p>
-        </w:tc>
-        <w:tc>
-          <w:tcPr>
-            <w:tcBorders>
-              <w:top w:color="000000" w:space="0" w:sz="4" w:val="single"/>
-              <w:left w:color="000000" w:space="0" w:sz="4" w:val="single"/>
-              <w:bottom w:color="000000" w:space="0" w:sz="4" w:val="single"/>
-              <w:right w:color="000000" w:space="0" w:sz="4" w:val="single"/>
-            </w:tcBorders>
-          </w:tcPr>
-          <w:p>
-            <w:pPr>
-              <w:spacing w:after="160" w:lineRule="auto"/>
-              <w:rPr/>
-            </w:pPr>
-            <w:r>
-              <w:rPr>
-                <w:rtl w:val="0"/>
-              </w:rPr>
-              <w:t xml:space="preserve">x</w:t>
-            </w:r>
-          </w:p>
-        </w:tc>
-        <w:tc>
-          <w:tcPr>
-            <w:tcBorders>
-              <w:top w:color="000000" w:space="0" w:sz="4" w:val="single"/>
-              <w:left w:color="000000" w:space="0" w:sz="4" w:val="single"/>
-              <w:bottom w:color="000000" w:space="0" w:sz="4" w:val="single"/>
-              <w:right w:color="000000" w:space="0" w:sz="4" w:val="single"/>
-            </w:tcBorders>
-          </w:tcPr>
-          <w:p>
-            <w:pPr>
-              <w:spacing w:after="160" w:lineRule="auto"/>
-              <w:rPr/>
-            </w:pPr>
-            <w:r>
-              <w:rPr>
-                <w:rtl w:val="0"/>
-              </w:rPr>
-              <w:t xml:space="preserve">x</w:t>
-            </w:r>
-          </w:p>
-        </w:tc>
-      </w:tr>
-      <w:tr>
-        <w:trPr>
-          <w:cantSplit w:val="0"/>
-          <w:tblHeader w:val="0"/>
-        </w:trPr>
-        <w:tc>
-          <w:tcPr>
-            <w:tcBorders>
-              <w:top w:color="000000" w:space="0" w:sz="4" w:val="single"/>
-              <w:left w:color="000000" w:space="0" w:sz="4" w:val="single"/>
-              <w:bottom w:color="000000" w:space="0" w:sz="4" w:val="single"/>
-              <w:right w:color="000000" w:space="0" w:sz="4" w:val="single"/>
-            </w:tcBorders>
-          </w:tcPr>
-          <w:p>
-            <w:pPr>
-              <w:spacing w:after="160" w:lineRule="auto"/>
-              <w:rPr/>
-            </w:pPr>
-            <w:r>
-              <w:rPr>
-                <w:rtl w:val="0"/>
-              </w:rPr>
-              <w:t xml:space="preserve">Távhő</w:t>
-            </w:r>
-          </w:p>
-        </w:tc>
-        <w:tc>
-          <w:tcPr>
-            <w:tcBorders>
-              <w:top w:color="000000" w:space="0" w:sz="4" w:val="single"/>
-              <w:left w:color="000000" w:space="0" w:sz="4" w:val="single"/>
-              <w:bottom w:color="000000" w:space="0" w:sz="4" w:val="single"/>
-              <w:right w:color="000000" w:space="0" w:sz="4" w:val="single"/>
-            </w:tcBorders>
-          </w:tcPr>
-          <w:p>
-            <w:pPr>
-              <w:spacing w:after="160" w:lineRule="auto"/>
-              <w:rPr/>
-            </w:pPr>
-            <w:r>
-              <w:rPr>
-                <w:rtl w:val="0"/>
-              </w:rPr>
-              <w:t xml:space="preserve">x</w:t>
-            </w:r>
-          </w:p>
-        </w:tc>
-        <w:tc>
-          <w:tcPr>
-            <w:tcBorders>
-              <w:top w:color="000000" w:space="0" w:sz="4" w:val="single"/>
-              <w:left w:color="000000" w:space="0" w:sz="4" w:val="single"/>
-              <w:bottom w:color="000000" w:space="0" w:sz="4" w:val="single"/>
-              <w:right w:color="000000" w:space="0" w:sz="4" w:val="single"/>
-            </w:tcBorders>
-          </w:tcPr>
-          <w:p>
-            <w:pPr>
-              <w:spacing w:after="160" w:lineRule="auto"/>
-              <w:rPr/>
-            </w:pPr>
-            <w:r>
-              <w:rPr>
-                <w:rtl w:val="0"/>
-              </w:rPr>
-              <w:t xml:space="preserve">x</w:t>
-            </w:r>
-          </w:p>
-        </w:tc>
-        <w:tc>
-          <w:tcPr>
-            <w:tcBorders>
-              <w:top w:color="000000" w:space="0" w:sz="4" w:val="single"/>
-              <w:left w:color="000000" w:space="0" w:sz="4" w:val="single"/>
-              <w:bottom w:color="000000" w:space="0" w:sz="4" w:val="single"/>
-              <w:right w:color="000000" w:space="0" w:sz="4" w:val="single"/>
-            </w:tcBorders>
-          </w:tcPr>
-          <w:p>
-            <w:pPr>
-              <w:spacing w:after="160" w:lineRule="auto"/>
-              <w:rPr/>
-            </w:pPr>
-            <w:r>
-              <w:rPr>
-                <w:rtl w:val="0"/>
-              </w:rPr>
-            </w:r>
-          </w:p>
-        </w:tc>
-      </w:tr>
-      <w:tr>
-        <w:trPr>
-          <w:cantSplit w:val="0"/>
-          <w:tblHeader w:val="0"/>
-        </w:trPr>
-        <w:tc>
-          <w:tcPr>
-            <w:tcBorders>
-              <w:top w:color="000000" w:space="0" w:sz="4" w:val="single"/>
-              <w:left w:color="000000" w:space="0" w:sz="4" w:val="single"/>
-              <w:bottom w:color="000000" w:space="0" w:sz="4" w:val="single"/>
-              <w:right w:color="000000" w:space="0" w:sz="4" w:val="single"/>
-            </w:tcBorders>
-          </w:tcPr>
-          <w:p>
-            <w:pPr>
-              <w:spacing w:after="160" w:lineRule="auto"/>
-              <w:rPr/>
-            </w:pPr>
-            <w:r>
-              <w:rPr>
-                <w:rtl w:val="0"/>
-              </w:rPr>
-              <w:t xml:space="preserve">PB</w:t>
-            </w:r>
-          </w:p>
-        </w:tc>
-        <w:tc>
-          <w:tcPr>
-            <w:tcBorders>
-              <w:top w:color="000000" w:space="0" w:sz="4" w:val="single"/>
-              <w:left w:color="000000" w:space="0" w:sz="4" w:val="single"/>
-              <w:bottom w:color="000000" w:space="0" w:sz="4" w:val="single"/>
-              <w:right w:color="000000" w:space="0" w:sz="4" w:val="single"/>
-            </w:tcBorders>
-          </w:tcPr>
-          <w:p>
-            <w:pPr>
-              <w:spacing w:after="160" w:lineRule="auto"/>
-              <w:rPr/>
-            </w:pPr>
-            <w:r>
-              <w:rPr>
-                <w:rtl w:val="0"/>
-              </w:rPr>
-              <w:t xml:space="preserve">x</w:t>
-            </w:r>
-          </w:p>
-        </w:tc>
-        <w:tc>
-          <w:tcPr>
-            <w:tcBorders>
-              <w:top w:color="000000" w:space="0" w:sz="4" w:val="single"/>
-              <w:left w:color="000000" w:space="0" w:sz="4" w:val="single"/>
-              <w:bottom w:color="000000" w:space="0" w:sz="4" w:val="single"/>
-              <w:right w:color="000000" w:space="0" w:sz="4" w:val="single"/>
-            </w:tcBorders>
-          </w:tcPr>
-          <w:p>
-            <w:pPr>
-              <w:spacing w:after="160" w:lineRule="auto"/>
-              <w:rPr/>
-            </w:pPr>
-            <w:r>
-              <w:rPr>
-                <w:rtl w:val="0"/>
-              </w:rPr>
-              <w:t xml:space="preserve">x</w:t>
-            </w:r>
-          </w:p>
-        </w:tc>
-        <w:tc>
-          <w:tcPr>
-            <w:tcBorders>
-              <w:top w:color="000000" w:space="0" w:sz="4" w:val="single"/>
-              <w:left w:color="000000" w:space="0" w:sz="4" w:val="single"/>
-              <w:bottom w:color="000000" w:space="0" w:sz="4" w:val="single"/>
-              <w:right w:color="000000" w:space="0" w:sz="4" w:val="single"/>
-            </w:tcBorders>
-          </w:tcPr>
-          <w:p>
-            <w:pPr>
-              <w:spacing w:after="160" w:lineRule="auto"/>
-              <w:rPr/>
-            </w:pPr>
-            <w:r>
-              <w:rPr>
-                <w:rtl w:val="0"/>
-              </w:rPr>
-              <w:t xml:space="preserve">x</w:t>
-            </w:r>
-          </w:p>
-        </w:tc>
-      </w:tr>
-      <w:tr>
-        <w:trPr>
-          <w:cantSplit w:val="0"/>
-          <w:tblHeader w:val="0"/>
-        </w:trPr>
-        <w:tc>
-          <w:tcPr>
-            <w:tcBorders>
-              <w:top w:color="000000" w:space="0" w:sz="4" w:val="single"/>
-              <w:left w:color="000000" w:space="0" w:sz="4" w:val="single"/>
-              <w:bottom w:color="000000" w:space="0" w:sz="4" w:val="single"/>
-              <w:right w:color="000000" w:space="0" w:sz="4" w:val="single"/>
-            </w:tcBorders>
-          </w:tcPr>
-          <w:p>
-            <w:pPr>
-              <w:spacing w:after="160" w:lineRule="auto"/>
-              <w:rPr/>
-            </w:pPr>
-            <w:r>
-              <w:rPr>
-                <w:rtl w:val="0"/>
-              </w:rPr>
-              <w:t xml:space="preserve">motorbenzin</w:t>
-            </w:r>
-          </w:p>
-        </w:tc>
-        <w:tc>
-          <w:tcPr>
-            <w:tcBorders>
-              <w:top w:color="000000" w:space="0" w:sz="4" w:val="single"/>
-              <w:left w:color="000000" w:space="0" w:sz="4" w:val="single"/>
-              <w:bottom w:color="000000" w:space="0" w:sz="4" w:val="single"/>
-              <w:right w:color="000000" w:space="0" w:sz="4" w:val="single"/>
-            </w:tcBorders>
-          </w:tcPr>
-          <w:p>
-            <w:pPr>
-              <w:spacing w:after="160" w:lineRule="auto"/>
-              <w:rPr/>
-            </w:pPr>
-            <w:r>
-              <w:rPr>
-                <w:rtl w:val="0"/>
-              </w:rPr>
-            </w:r>
-          </w:p>
-        </w:tc>
-        <w:tc>
-          <w:tcPr>
-            <w:tcBorders>
-              <w:top w:color="000000" w:space="0" w:sz="4" w:val="single"/>
-              <w:left w:color="000000" w:space="0" w:sz="4" w:val="single"/>
-              <w:bottom w:color="000000" w:space="0" w:sz="4" w:val="single"/>
-              <w:right w:color="000000" w:space="0" w:sz="4" w:val="single"/>
-            </w:tcBorders>
-          </w:tcPr>
-          <w:p>
-            <w:pPr>
-              <w:spacing w:after="160" w:lineRule="auto"/>
-              <w:rPr/>
-            </w:pPr>
-            <w:r>
-              <w:rPr>
-                <w:rtl w:val="0"/>
-              </w:rPr>
-              <w:t xml:space="preserve">x</w:t>
-            </w:r>
-          </w:p>
-        </w:tc>
-        <w:tc>
-          <w:tcPr>
-            <w:tcBorders>
-              <w:top w:color="000000" w:space="0" w:sz="4" w:val="single"/>
-              <w:left w:color="000000" w:space="0" w:sz="4" w:val="single"/>
-              <w:bottom w:color="000000" w:space="0" w:sz="4" w:val="single"/>
-              <w:right w:color="000000" w:space="0" w:sz="4" w:val="single"/>
-            </w:tcBorders>
-          </w:tcPr>
-          <w:p>
-            <w:pPr>
-              <w:spacing w:after="160" w:lineRule="auto"/>
-              <w:rPr/>
-            </w:pPr>
-            <w:r>
-              <w:rPr>
-                <w:rtl w:val="0"/>
-              </w:rPr>
-              <w:t xml:space="preserve">x</w:t>
-            </w:r>
-          </w:p>
-        </w:tc>
-      </w:tr>
-      <w:tr>
-        <w:trPr>
-          <w:cantSplit w:val="0"/>
-          <w:tblHeader w:val="0"/>
-        </w:trPr>
-        <w:tc>
-          <w:tcPr>
-            <w:tcBorders>
-              <w:top w:color="000000" w:space="0" w:sz="4" w:val="single"/>
-              <w:left w:color="000000" w:space="0" w:sz="4" w:val="single"/>
-              <w:bottom w:color="000000" w:space="0" w:sz="4" w:val="single"/>
-              <w:right w:color="000000" w:space="0" w:sz="4" w:val="single"/>
-            </w:tcBorders>
-          </w:tcPr>
-          <w:p>
-            <w:pPr>
-              <w:spacing w:after="160" w:lineRule="auto"/>
-              <w:rPr/>
-            </w:pPr>
-            <w:r>
-              <w:rPr>
-                <w:rtl w:val="0"/>
-              </w:rPr>
-              <w:t xml:space="preserve">gázolaj</w:t>
-            </w:r>
-          </w:p>
-        </w:tc>
-        <w:tc>
-          <w:tcPr>
-            <w:tcBorders>
-              <w:top w:color="000000" w:space="0" w:sz="4" w:val="single"/>
-              <w:left w:color="000000" w:space="0" w:sz="4" w:val="single"/>
-              <w:bottom w:color="000000" w:space="0" w:sz="4" w:val="single"/>
-              <w:right w:color="000000" w:space="0" w:sz="4" w:val="single"/>
-            </w:tcBorders>
-          </w:tcPr>
-          <w:p>
-            <w:pPr>
-              <w:spacing w:after="160" w:lineRule="auto"/>
-              <w:rPr/>
-            </w:pPr>
-            <w:r>
-              <w:rPr>
-                <w:rtl w:val="0"/>
-              </w:rPr>
-            </w:r>
-          </w:p>
-        </w:tc>
-        <w:tc>
-          <w:tcPr>
-            <w:tcBorders>
-              <w:top w:color="000000" w:space="0" w:sz="4" w:val="single"/>
-              <w:left w:color="000000" w:space="0" w:sz="4" w:val="single"/>
-              <w:bottom w:color="000000" w:space="0" w:sz="4" w:val="single"/>
-              <w:right w:color="000000" w:space="0" w:sz="4" w:val="single"/>
-            </w:tcBorders>
-          </w:tcPr>
-          <w:p>
-            <w:pPr>
-              <w:spacing w:after="160" w:lineRule="auto"/>
-              <w:rPr/>
-            </w:pPr>
-            <w:r>
-              <w:rPr>
-                <w:rtl w:val="0"/>
-              </w:rPr>
-              <w:t xml:space="preserve">x</w:t>
-            </w:r>
-          </w:p>
-        </w:tc>
-        <w:tc>
-          <w:tcPr>
-            <w:tcBorders>
-              <w:top w:color="000000" w:space="0" w:sz="4" w:val="single"/>
-              <w:left w:color="000000" w:space="0" w:sz="4" w:val="single"/>
-              <w:bottom w:color="000000" w:space="0" w:sz="4" w:val="single"/>
-              <w:right w:color="000000" w:space="0" w:sz="4" w:val="single"/>
-            </w:tcBorders>
-          </w:tcPr>
-          <w:p>
-            <w:pPr>
-              <w:spacing w:after="160" w:lineRule="auto"/>
-              <w:rPr/>
-            </w:pPr>
-            <w:r>
-              <w:rPr>
-                <w:rtl w:val="0"/>
-              </w:rPr>
-              <w:t xml:space="preserve">x</w:t>
-            </w:r>
-          </w:p>
-        </w:tc>
-      </w:tr>
-      <w:tr>
-        <w:trPr>
-          <w:cantSplit w:val="0"/>
-          <w:tblHeader w:val="0"/>
-        </w:trPr>
-        <w:tc>
-          <w:tcPr>
-            <w:tcBorders>
-              <w:top w:color="000000" w:space="0" w:sz="4" w:val="single"/>
-              <w:left w:color="000000" w:space="0" w:sz="4" w:val="single"/>
-              <w:bottom w:color="000000" w:space="0" w:sz="4" w:val="single"/>
-              <w:right w:color="000000" w:space="0" w:sz="4" w:val="single"/>
-            </w:tcBorders>
-          </w:tcPr>
-          <w:p>
-            <w:pPr>
-              <w:spacing w:after="160" w:lineRule="auto"/>
-              <w:rPr/>
-            </w:pPr>
-            <w:r>
-              <w:rPr>
-                <w:rtl w:val="0"/>
-              </w:rPr>
-              <w:t xml:space="preserve">szén</w:t>
-            </w:r>
-          </w:p>
-        </w:tc>
-        <w:tc>
-          <w:tcPr>
-            <w:tcBorders>
-              <w:top w:color="000000" w:space="0" w:sz="4" w:val="single"/>
-              <w:left w:color="000000" w:space="0" w:sz="4" w:val="single"/>
-              <w:bottom w:color="000000" w:space="0" w:sz="4" w:val="single"/>
-              <w:right w:color="000000" w:space="0" w:sz="4" w:val="single"/>
-            </w:tcBorders>
-          </w:tcPr>
-          <w:p>
-            <w:pPr>
-              <w:spacing w:after="160" w:lineRule="auto"/>
-              <w:rPr/>
-            </w:pPr>
-            <w:r>
-              <w:rPr>
-                <w:rtl w:val="0"/>
-              </w:rPr>
-              <w:t xml:space="preserve">x</w:t>
-            </w:r>
-          </w:p>
-        </w:tc>
-        <w:tc>
-          <w:tcPr>
-            <w:tcBorders>
-              <w:top w:color="000000" w:space="0" w:sz="4" w:val="single"/>
-              <w:left w:color="000000" w:space="0" w:sz="4" w:val="single"/>
-              <w:bottom w:color="000000" w:space="0" w:sz="4" w:val="single"/>
-              <w:right w:color="000000" w:space="0" w:sz="4" w:val="single"/>
-            </w:tcBorders>
-          </w:tcPr>
-          <w:p>
-            <w:pPr>
-              <w:spacing w:after="160" w:lineRule="auto"/>
-              <w:rPr/>
-            </w:pPr>
-            <w:r>
-              <w:rPr>
-                <w:rtl w:val="0"/>
-              </w:rPr>
-              <w:t xml:space="preserve">x</w:t>
-            </w:r>
-          </w:p>
-        </w:tc>
-        <w:tc>
-          <w:tcPr>
-            <w:tcBorders>
-              <w:top w:color="000000" w:space="0" w:sz="4" w:val="single"/>
-              <w:left w:color="000000" w:space="0" w:sz="4" w:val="single"/>
-              <w:bottom w:color="000000" w:space="0" w:sz="4" w:val="single"/>
-              <w:right w:color="000000" w:space="0" w:sz="4" w:val="single"/>
-            </w:tcBorders>
-          </w:tcPr>
-          <w:p>
-            <w:pPr>
-              <w:spacing w:after="160" w:lineRule="auto"/>
-              <w:rPr/>
-            </w:pPr>
-            <w:r>
-              <w:rPr>
-                <w:rtl w:val="0"/>
-              </w:rPr>
-            </w:r>
-          </w:p>
-        </w:tc>
-      </w:tr>
-      <w:tr>
-        <w:trPr>
-          <w:cantSplit w:val="0"/>
-          <w:tblHeader w:val="0"/>
-        </w:trPr>
-        <w:tc>
-          <w:tcPr>
-            <w:tcBorders>
-              <w:top w:color="000000" w:space="0" w:sz="4" w:val="single"/>
-              <w:left w:color="000000" w:space="0" w:sz="4" w:val="single"/>
-              <w:bottom w:color="000000" w:space="0" w:sz="4" w:val="single"/>
-              <w:right w:color="000000" w:space="0" w:sz="4" w:val="single"/>
-            </w:tcBorders>
-          </w:tcPr>
-          <w:p>
-            <w:pPr>
-              <w:spacing w:after="160" w:lineRule="auto"/>
-              <w:rPr/>
-            </w:pPr>
-            <w:r>
-              <w:rPr>
-                <w:rtl w:val="0"/>
-              </w:rPr>
-              <w:t xml:space="preserve">petrolkoksz</w:t>
-            </w:r>
-          </w:p>
-        </w:tc>
-        <w:tc>
-          <w:tcPr>
-            <w:tcBorders>
-              <w:top w:color="000000" w:space="0" w:sz="4" w:val="single"/>
-              <w:left w:color="000000" w:space="0" w:sz="4" w:val="single"/>
-              <w:bottom w:color="000000" w:space="0" w:sz="4" w:val="single"/>
-              <w:right w:color="000000" w:space="0" w:sz="4" w:val="single"/>
-            </w:tcBorders>
-          </w:tcPr>
-          <w:p>
-            <w:pPr>
-              <w:spacing w:after="160" w:lineRule="auto"/>
-              <w:rPr/>
-            </w:pPr>
-            <w:r>
-              <w:rPr>
-                <w:rtl w:val="0"/>
-              </w:rPr>
-              <w:t xml:space="preserve">x</w:t>
-            </w:r>
-          </w:p>
-        </w:tc>
-        <w:tc>
-          <w:tcPr>
-            <w:tcBorders>
-              <w:top w:color="000000" w:space="0" w:sz="4" w:val="single"/>
-              <w:left w:color="000000" w:space="0" w:sz="4" w:val="single"/>
-              <w:bottom w:color="000000" w:space="0" w:sz="4" w:val="single"/>
-              <w:right w:color="000000" w:space="0" w:sz="4" w:val="single"/>
-            </w:tcBorders>
-          </w:tcPr>
-          <w:p>
-            <w:pPr>
-              <w:spacing w:after="160" w:lineRule="auto"/>
-              <w:rPr/>
-            </w:pPr>
-            <w:r>
-              <w:rPr>
-                <w:rtl w:val="0"/>
-              </w:rPr>
-              <w:t xml:space="preserve">x</w:t>
-            </w:r>
-          </w:p>
-        </w:tc>
-        <w:tc>
-          <w:tcPr>
-            <w:tcBorders>
-              <w:top w:color="000000" w:space="0" w:sz="4" w:val="single"/>
-              <w:left w:color="000000" w:space="0" w:sz="4" w:val="single"/>
-              <w:bottom w:color="000000" w:space="0" w:sz="4" w:val="single"/>
-              <w:right w:color="000000" w:space="0" w:sz="4" w:val="single"/>
-            </w:tcBorders>
-          </w:tcPr>
-          <w:p>
-            <w:pPr>
-              <w:spacing w:after="160" w:lineRule="auto"/>
-              <w:rPr/>
-            </w:pPr>
-            <w:r>
-              <w:rPr>
-                <w:rtl w:val="0"/>
-              </w:rPr>
-            </w:r>
-          </w:p>
-        </w:tc>
-      </w:tr>
-      <w:tr>
-        <w:trPr>
-          <w:cantSplit w:val="0"/>
-          <w:tblHeader w:val="0"/>
-        </w:trPr>
-        <w:tc>
-          <w:tcPr>
-            <w:tcBorders>
-              <w:top w:color="000000" w:space="0" w:sz="4" w:val="single"/>
-              <w:left w:color="000000" w:space="0" w:sz="4" w:val="single"/>
-              <w:bottom w:color="000000" w:space="0" w:sz="4" w:val="single"/>
-              <w:right w:color="000000" w:space="0" w:sz="4" w:val="single"/>
-            </w:tcBorders>
-          </w:tcPr>
-          <w:p>
-            <w:pPr>
-              <w:spacing w:after="160" w:lineRule="auto"/>
-              <w:rPr/>
-            </w:pPr>
-            <w:r>
-              <w:rPr>
-                <w:rtl w:val="0"/>
-              </w:rPr>
-              <w:t xml:space="preserve">tüzifa</w:t>
-            </w:r>
-          </w:p>
-        </w:tc>
-        <w:tc>
-          <w:tcPr>
-            <w:tcBorders>
-              <w:top w:color="000000" w:space="0" w:sz="4" w:val="single"/>
-              <w:left w:color="000000" w:space="0" w:sz="4" w:val="single"/>
-              <w:bottom w:color="000000" w:space="0" w:sz="4" w:val="single"/>
-              <w:right w:color="000000" w:space="0" w:sz="4" w:val="single"/>
-            </w:tcBorders>
-          </w:tcPr>
-          <w:p>
-            <w:pPr>
-              <w:spacing w:after="160" w:lineRule="auto"/>
-              <w:rPr/>
-            </w:pPr>
-            <w:r>
-              <w:rPr>
-                <w:rtl w:val="0"/>
-              </w:rPr>
-              <w:t xml:space="preserve">x</w:t>
-            </w:r>
-          </w:p>
-        </w:tc>
-        <w:tc>
-          <w:tcPr>
-            <w:tcBorders>
-              <w:top w:color="000000" w:space="0" w:sz="4" w:val="single"/>
-              <w:left w:color="000000" w:space="0" w:sz="4" w:val="single"/>
-              <w:bottom w:color="000000" w:space="0" w:sz="4" w:val="single"/>
-              <w:right w:color="000000" w:space="0" w:sz="4" w:val="single"/>
-            </w:tcBorders>
-          </w:tcPr>
-          <w:p>
-            <w:pPr>
-              <w:spacing w:after="160" w:lineRule="auto"/>
-              <w:rPr/>
-            </w:pPr>
-            <w:r>
-              <w:rPr>
-                <w:rtl w:val="0"/>
-              </w:rPr>
-              <w:t xml:space="preserve">x</w:t>
-            </w:r>
-          </w:p>
-        </w:tc>
-        <w:tc>
-          <w:tcPr>
-            <w:tcBorders>
-              <w:top w:color="000000" w:space="0" w:sz="4" w:val="single"/>
-              <w:left w:color="000000" w:space="0" w:sz="4" w:val="single"/>
-              <w:bottom w:color="000000" w:space="0" w:sz="4" w:val="single"/>
-              <w:right w:color="000000" w:space="0" w:sz="4" w:val="single"/>
-            </w:tcBorders>
-          </w:tcPr>
-          <w:p>
-            <w:pPr>
-              <w:spacing w:after="160" w:lineRule="auto"/>
-              <w:rPr/>
-            </w:pPr>
-            <w:r>
-              <w:rPr>
-                <w:rtl w:val="0"/>
-              </w:rPr>
-            </w:r>
-          </w:p>
-        </w:tc>
-      </w:tr>
-      <w:tr>
-        <w:trPr>
-          <w:cantSplit w:val="0"/>
-          <w:tblHeader w:val="0"/>
-        </w:trPr>
-        <w:tc>
-          <w:tcPr>
-            <w:tcBorders>
-              <w:top w:color="000000" w:space="0" w:sz="4" w:val="single"/>
-              <w:left w:color="000000" w:space="0" w:sz="4" w:val="single"/>
-              <w:bottom w:color="000000" w:space="0" w:sz="4" w:val="single"/>
-              <w:right w:color="000000" w:space="0" w:sz="4" w:val="single"/>
-            </w:tcBorders>
-          </w:tcPr>
-          <w:p>
-            <w:pPr>
-              <w:spacing w:after="160" w:lineRule="auto"/>
-              <w:rPr/>
-            </w:pPr>
-            <w:r>
-              <w:rPr>
-                <w:rtl w:val="0"/>
-              </w:rPr>
-              <w:t xml:space="preserve">egyéb megújuló</w:t>
-            </w:r>
-          </w:p>
-        </w:tc>
-        <w:tc>
-          <w:tcPr>
-            <w:tcBorders>
-              <w:top w:color="000000" w:space="0" w:sz="4" w:val="single"/>
-              <w:left w:color="000000" w:space="0" w:sz="4" w:val="single"/>
-              <w:bottom w:color="000000" w:space="0" w:sz="4" w:val="single"/>
-              <w:right w:color="000000" w:space="0" w:sz="4" w:val="single"/>
-            </w:tcBorders>
-          </w:tcPr>
-          <w:p>
-            <w:pPr>
-              <w:spacing w:after="160" w:lineRule="auto"/>
-              <w:rPr/>
-            </w:pPr>
-            <w:r>
-              <w:rPr>
-                <w:rtl w:val="0"/>
-              </w:rPr>
-              <w:t xml:space="preserve">x</w:t>
-            </w:r>
-          </w:p>
-        </w:tc>
-        <w:tc>
-          <w:tcPr>
-            <w:tcBorders>
-              <w:top w:color="000000" w:space="0" w:sz="4" w:val="single"/>
-              <w:left w:color="000000" w:space="0" w:sz="4" w:val="single"/>
-              <w:bottom w:color="000000" w:space="0" w:sz="4" w:val="single"/>
-              <w:right w:color="000000" w:space="0" w:sz="4" w:val="single"/>
-            </w:tcBorders>
-          </w:tcPr>
-          <w:p>
-            <w:pPr>
-              <w:spacing w:after="160" w:lineRule="auto"/>
-              <w:rPr/>
-            </w:pPr>
-            <w:r>
-              <w:rPr>
-                <w:rtl w:val="0"/>
-              </w:rPr>
-              <w:t xml:space="preserve">x</w:t>
-            </w:r>
-          </w:p>
-        </w:tc>
-        <w:tc>
-          <w:tcPr>
-            <w:tcBorders>
-              <w:top w:color="000000" w:space="0" w:sz="4" w:val="single"/>
-              <w:left w:color="000000" w:space="0" w:sz="4" w:val="single"/>
-              <w:bottom w:color="000000" w:space="0" w:sz="4" w:val="single"/>
-              <w:right w:color="000000" w:space="0" w:sz="4" w:val="single"/>
-            </w:tcBorders>
-          </w:tcPr>
-          <w:p>
-            <w:pPr>
-              <w:spacing w:after="160" w:lineRule="auto"/>
-              <w:rPr/>
-            </w:pPr>
-            <w:r>
-              <w:rPr>
-                <w:rtl w:val="0"/>
-              </w:rPr>
+              <w:t xml:space="preserve">${carrier2_vehicle}</w:t>
             </w:r>
           </w:p>
         </w:tc>
@@ -4049,6 +3127,17 @@
     </w:tbl>
     <w:p>
       <w:pPr>
+        <w:rPr/>
+      </w:pPr>
+      <w:r>
+        <w:rPr>
+          <w:rtl w:val="0"/>
+        </w:rPr>
+      </w:r>
+    </w:p>
+    <w:p>
+      <w:pPr>
+        <w:jc w:val="center"/>
         <w:rPr/>
       </w:pPr>
       <w:r>
@@ -4221,7 +3310,6 @@
     <w:pPr>
       <w:keepNext w:val="0"/>
       <w:keepLines w:val="0"/>
-      <w:pageBreakBefore w:val="0"/>
       <w:widowControl w:val="1"/>
       <w:pBdr>
         <w:top w:space="0" w:sz="0" w:val="nil"/>

</xml_diff>

<commit_message>
Scope grow added, not much left
</commit_message>
<xml_diff>
--- a/pyros_be/controllers/audit_template.docx
+++ b/pyros_be/controllers/audit_template.docx
@@ -43,7 +43,6 @@
         <w:keepNext w:val="1"/>
         <w:keepLines w:val="1"/>
         <w:pageBreakBefore w:val="1"/>
-        <w:widowControl w:val="1"/>
         <w:pBdr>
           <w:top w:space="0" w:sz="0" w:val="nil"/>
           <w:left w:space="0" w:sz="0" w:val="nil"/>
@@ -51,41 +50,22 @@
           <w:right w:space="0" w:sz="0" w:val="nil"/>
           <w:between w:space="0" w:sz="0" w:val="nil"/>
         </w:pBdr>
-        <w:shd w:fill="auto" w:val="clear"/>
         <w:spacing w:after="0" w:before="240" w:line="259" w:lineRule="auto"/>
-        <w:ind w:left="0" w:right="0" w:firstLine="0"/>
-        <w:jc w:val="left"/>
-        <w:rPr>
-          <w:rFonts w:ascii="Times New Roman" w:cs="Times New Roman" w:eastAsia="Times New Roman" w:hAnsi="Times New Roman"/>
+        <w:rPr>
           <w:b w:val="1"/>
           <w:bCs w:val="1"/>
-          <w:i w:val="0"/>
-          <w:iCs w:val="0"/>
-          <w:smallCaps w:val="0"/>
-          <w:strike w:val="0"/>
           <w:color w:val="000000"/>
           <w:sz w:val="40"/>
           <w:szCs w:val="40"/>
-          <w:u w:val="none"/>
-          <w:shd w:fill="auto" w:val="clear"/>
-          <w:vertAlign w:val="baseline"/>
-        </w:rPr>
-      </w:pPr>
-      <w:r>
-        <w:rPr>
-          <w:rFonts w:ascii="Times New Roman" w:cs="Times New Roman" w:eastAsia="Times New Roman" w:hAnsi="Times New Roman"/>
+        </w:rPr>
+      </w:pPr>
+      <w:r>
+        <w:rPr>
           <w:b w:val="1"/>
           <w:bCs w:val="1"/>
-          <w:i w:val="0"/>
-          <w:iCs w:val="0"/>
-          <w:smallCaps w:val="0"/>
-          <w:strike w:val="0"/>
           <w:color w:val="000000"/>
           <w:sz w:val="40"/>
           <w:szCs w:val="40"/>
-          <w:u w:val="none"/>
-          <w:shd w:fill="auto" w:val="clear"/>
-          <w:vertAlign w:val="baseline"/>
           <w:rtl w:val="0"/>
         </w:rPr>
         <w:t xml:space="preserve">Tartalomjegyzék</w:t>
@@ -93,7 +73,7 @@
     </w:p>
     <w:sdt>
       <w:sdtPr>
-        <w:id w:val="1383798335"/>
+        <w:id w:val="2123348276"/>
         <w:docPartObj>
           <w:docPartGallery w:val="Table of Contents"/>
           <w:docPartUnique w:val="1"/>
@@ -121,7 +101,7 @@
             <w:ind w:left="0" w:right="0" w:firstLine="0"/>
             <w:jc w:val="left"/>
             <w:rPr>
-              <w:rFonts w:ascii="Aptos" w:cs="Aptos" w:eastAsia="Aptos" w:hAnsi="Aptos"/>
+              <w:rFonts w:ascii="Times New Roman" w:cs="Times New Roman" w:eastAsia="Times New Roman" w:hAnsi="Times New Roman"/>
               <w:b w:val="0"/>
               <w:bCs w:val="0"/>
               <w:i w:val="0"/>
@@ -141,7 +121,7 @@
             <w:instrText xml:space="preserve"> TOC \h \u \z \t "Heading 1,1,Heading 2,2,Heading 3,3,"</w:instrText>
             <w:fldChar w:fldCharType="separate"/>
           </w:r>
-          <w:hyperlink w:anchor="_poaunr5vl9ew">
+          <w:hyperlink w:anchor="_ni38zpbjo3vp">
             <w:r>
               <w:rPr>
                 <w:rFonts w:ascii="Times New Roman" w:cs="Times New Roman" w:eastAsia="Times New Roman" w:hAnsi="Times New Roman"/>
@@ -159,7 +139,7 @@
                 <w:vertAlign w:val="baseline"/>
                 <w:rtl w:val="0"/>
               </w:rPr>
-              <w:t xml:space="preserve">Vezetői összefoglaló</w:t>
+              <w:t xml:space="preserve">1.Vezetői összefoglaló</w:t>
               <w:tab/>
               <w:t xml:space="preserve">3</w:t>
             </w:r>
@@ -191,7 +171,7 @@
             <w:ind w:left="0" w:right="0" w:firstLine="0"/>
             <w:jc w:val="left"/>
             <w:rPr>
-              <w:rFonts w:ascii="Aptos" w:cs="Aptos" w:eastAsia="Aptos" w:hAnsi="Aptos"/>
+              <w:rFonts w:ascii="Times New Roman" w:cs="Times New Roman" w:eastAsia="Times New Roman" w:hAnsi="Times New Roman"/>
               <w:b w:val="0"/>
               <w:bCs w:val="0"/>
               <w:i w:val="0"/>
@@ -206,7 +186,7 @@
               <w:vertAlign w:val="baseline"/>
             </w:rPr>
           </w:pPr>
-          <w:hyperlink w:anchor="_jyleb9oakg65">
+          <w:hyperlink w:anchor="_19axcrultbpu">
             <w:r>
               <w:rPr>
                 <w:rFonts w:ascii="Times New Roman" w:cs="Times New Roman" w:eastAsia="Times New Roman" w:hAnsi="Times New Roman"/>
@@ -224,7 +204,7 @@
                 <w:vertAlign w:val="baseline"/>
                 <w:rtl w:val="0"/>
               </w:rPr>
-              <w:t xml:space="preserve">Vállalkozás bemutatása</w:t>
+              <w:t xml:space="preserve">2.Vállalkozás bemutatása</w:t>
               <w:tab/>
               <w:t xml:space="preserve">4</w:t>
             </w:r>
@@ -256,7 +236,7 @@
             <w:ind w:left="0" w:right="0" w:firstLine="0"/>
             <w:jc w:val="left"/>
             <w:rPr>
-              <w:rFonts w:ascii="Aptos" w:cs="Aptos" w:eastAsia="Aptos" w:hAnsi="Aptos"/>
+              <w:rFonts w:ascii="Times New Roman" w:cs="Times New Roman" w:eastAsia="Times New Roman" w:hAnsi="Times New Roman"/>
               <w:b w:val="0"/>
               <w:bCs w:val="0"/>
               <w:i w:val="0"/>
@@ -271,7 +251,7 @@
               <w:vertAlign w:val="baseline"/>
             </w:rPr>
           </w:pPr>
-          <w:hyperlink w:anchor="_1judf6aiosh8">
+          <w:hyperlink w:anchor="_uzkertphoojv">
             <w:r>
               <w:rPr>
                 <w:rFonts w:ascii="Times New Roman" w:cs="Times New Roman" w:eastAsia="Times New Roman" w:hAnsi="Times New Roman"/>
@@ -289,7 +269,7 @@
                 <w:vertAlign w:val="baseline"/>
                 <w:rtl w:val="0"/>
               </w:rPr>
-              <w:t xml:space="preserve">Fogyasztási adatok</w:t>
+              <w:t xml:space="preserve">3.Fogyasztási adatok</w:t>
               <w:tab/>
               <w:t xml:space="preserve">5</w:t>
             </w:r>
@@ -321,7 +301,7 @@
             <w:ind w:left="0" w:right="0" w:firstLine="0"/>
             <w:jc w:val="left"/>
             <w:rPr>
-              <w:rFonts w:ascii="Aptos" w:cs="Aptos" w:eastAsia="Aptos" w:hAnsi="Aptos"/>
+              <w:rFonts w:ascii="Times New Roman" w:cs="Times New Roman" w:eastAsia="Times New Roman" w:hAnsi="Times New Roman"/>
               <w:b w:val="0"/>
               <w:bCs w:val="0"/>
               <w:i w:val="0"/>
@@ -336,7 +316,7 @@
               <w:vertAlign w:val="baseline"/>
             </w:rPr>
           </w:pPr>
-          <w:hyperlink w:anchor="_32r77tg88wi9">
+          <w:hyperlink w:anchor="_pd8ax8n1cvhf">
             <w:r>
               <w:rPr>
                 <w:rFonts w:ascii="Times New Roman" w:cs="Times New Roman" w:eastAsia="Times New Roman" w:hAnsi="Times New Roman"/>
@@ -354,9 +334,919 @@
                 <w:vertAlign w:val="baseline"/>
                 <w:rtl w:val="0"/>
               </w:rPr>
-              <w:t xml:space="preserve">Mérési hálózatok</w:t>
+              <w:t xml:space="preserve">4.Mérési hálózatok</w:t>
               <w:tab/>
               <w:t xml:space="preserve">6</w:t>
+            </w:r>
+          </w:hyperlink>
+          <w:r>
+            <w:rPr>
+              <w:rtl w:val="0"/>
+            </w:rPr>
+          </w:r>
+        </w:p>
+        <w:p>
+          <w:pPr>
+            <w:keepNext w:val="0"/>
+            <w:keepLines w:val="0"/>
+            <w:pageBreakBefore w:val="0"/>
+            <w:widowControl w:val="1"/>
+            <w:pBdr>
+              <w:top w:space="0" w:sz="0" w:val="nil"/>
+              <w:left w:space="0" w:sz="0" w:val="nil"/>
+              <w:bottom w:space="0" w:sz="0" w:val="nil"/>
+              <w:right w:space="0" w:sz="0" w:val="nil"/>
+              <w:between w:space="0" w:sz="0" w:val="nil"/>
+            </w:pBdr>
+            <w:shd w:fill="auto" w:val="clear"/>
+            <w:tabs>
+              <w:tab w:val="right" w:leader="none" w:pos="9016"/>
+            </w:tabs>
+            <w:spacing w:after="100" w:before="0" w:line="360" w:lineRule="auto"/>
+            <w:ind w:left="0" w:right="0" w:firstLine="0"/>
+            <w:jc w:val="left"/>
+            <w:rPr>
+              <w:rFonts w:ascii="Times New Roman" w:cs="Times New Roman" w:eastAsia="Times New Roman" w:hAnsi="Times New Roman"/>
+              <w:b w:val="0"/>
+              <w:bCs w:val="0"/>
+              <w:i w:val="0"/>
+              <w:iCs w:val="0"/>
+              <w:smallCaps w:val="0"/>
+              <w:strike w:val="0"/>
+              <w:color w:val="000000"/>
+              <w:sz w:val="24"/>
+              <w:szCs w:val="24"/>
+              <w:u w:val="none"/>
+              <w:shd w:fill="auto" w:val="clear"/>
+              <w:vertAlign w:val="baseline"/>
+            </w:rPr>
+          </w:pPr>
+          <w:hyperlink w:anchor="_ccg07hacib0w">
+            <w:r>
+              <w:rPr>
+                <w:rFonts w:ascii="Times New Roman" w:cs="Times New Roman" w:eastAsia="Times New Roman" w:hAnsi="Times New Roman"/>
+                <w:b w:val="0"/>
+                <w:bCs w:val="0"/>
+                <w:i w:val="0"/>
+                <w:iCs w:val="0"/>
+                <w:smallCaps w:val="0"/>
+                <w:strike w:val="0"/>
+                <w:color w:val="000000"/>
+                <w:sz w:val="24"/>
+                <w:szCs w:val="24"/>
+                <w:u w:val="none"/>
+                <w:shd w:fill="auto" w:val="clear"/>
+                <w:vertAlign w:val="baseline"/>
+                <w:rtl w:val="0"/>
+              </w:rPr>
+              <w:t xml:space="preserve">5.Költségek kalkulációja</w:t>
+              <w:tab/>
+              <w:t xml:space="preserve">7</w:t>
+            </w:r>
+          </w:hyperlink>
+          <w:r>
+            <w:rPr>
+              <w:rtl w:val="0"/>
+            </w:rPr>
+          </w:r>
+        </w:p>
+        <w:p>
+          <w:pPr>
+            <w:keepNext w:val="0"/>
+            <w:keepLines w:val="0"/>
+            <w:pageBreakBefore w:val="0"/>
+            <w:widowControl w:val="1"/>
+            <w:pBdr>
+              <w:top w:space="0" w:sz="0" w:val="nil"/>
+              <w:left w:space="0" w:sz="0" w:val="nil"/>
+              <w:bottom w:space="0" w:sz="0" w:val="nil"/>
+              <w:right w:space="0" w:sz="0" w:val="nil"/>
+              <w:between w:space="0" w:sz="0" w:val="nil"/>
+            </w:pBdr>
+            <w:shd w:fill="auto" w:val="clear"/>
+            <w:tabs>
+              <w:tab w:val="right" w:leader="none" w:pos="9016"/>
+            </w:tabs>
+            <w:spacing w:after="100" w:before="0" w:line="360" w:lineRule="auto"/>
+            <w:ind w:left="0" w:right="0" w:firstLine="0"/>
+            <w:jc w:val="left"/>
+            <w:rPr>
+              <w:rFonts w:ascii="Times New Roman" w:cs="Times New Roman" w:eastAsia="Times New Roman" w:hAnsi="Times New Roman"/>
+              <w:b w:val="0"/>
+              <w:bCs w:val="0"/>
+              <w:i w:val="0"/>
+              <w:iCs w:val="0"/>
+              <w:smallCaps w:val="0"/>
+              <w:strike w:val="0"/>
+              <w:color w:val="000000"/>
+              <w:sz w:val="24"/>
+              <w:szCs w:val="24"/>
+              <w:u w:val="none"/>
+              <w:shd w:fill="auto" w:val="clear"/>
+              <w:vertAlign w:val="baseline"/>
+            </w:rPr>
+          </w:pPr>
+          <w:hyperlink w:anchor="_q0qgfw2d2u8d">
+            <w:r>
+              <w:rPr>
+                <w:rFonts w:ascii="Times New Roman" w:cs="Times New Roman" w:eastAsia="Times New Roman" w:hAnsi="Times New Roman"/>
+                <w:b w:val="0"/>
+                <w:bCs w:val="0"/>
+                <w:i w:val="0"/>
+                <w:iCs w:val="0"/>
+                <w:smallCaps w:val="0"/>
+                <w:strike w:val="0"/>
+                <w:color w:val="000000"/>
+                <w:sz w:val="24"/>
+                <w:szCs w:val="24"/>
+                <w:u w:val="none"/>
+                <w:shd w:fill="auto" w:val="clear"/>
+                <w:vertAlign w:val="baseline"/>
+                <w:rtl w:val="0"/>
+              </w:rPr>
+              <w:t xml:space="preserve">6.Pénzügyi környezet kalkuláció</w:t>
+              <w:tab/>
+              <w:t xml:space="preserve">9</w:t>
+            </w:r>
+          </w:hyperlink>
+          <w:r>
+            <w:rPr>
+              <w:rtl w:val="0"/>
+            </w:rPr>
+          </w:r>
+        </w:p>
+        <w:p>
+          <w:pPr>
+            <w:keepNext w:val="0"/>
+            <w:keepLines w:val="0"/>
+            <w:pageBreakBefore w:val="0"/>
+            <w:widowControl w:val="1"/>
+            <w:pBdr>
+              <w:top w:space="0" w:sz="0" w:val="nil"/>
+              <w:left w:space="0" w:sz="0" w:val="nil"/>
+              <w:bottom w:space="0" w:sz="0" w:val="nil"/>
+              <w:right w:space="0" w:sz="0" w:val="nil"/>
+              <w:between w:space="0" w:sz="0" w:val="nil"/>
+            </w:pBdr>
+            <w:shd w:fill="auto" w:val="clear"/>
+            <w:tabs>
+              <w:tab w:val="right" w:leader="none" w:pos="9016"/>
+            </w:tabs>
+            <w:spacing w:after="100" w:before="0" w:line="360" w:lineRule="auto"/>
+            <w:ind w:left="0" w:right="0" w:firstLine="0"/>
+            <w:jc w:val="left"/>
+            <w:rPr>
+              <w:rFonts w:ascii="Times New Roman" w:cs="Times New Roman" w:eastAsia="Times New Roman" w:hAnsi="Times New Roman"/>
+              <w:b w:val="0"/>
+              <w:bCs w:val="0"/>
+              <w:i w:val="0"/>
+              <w:iCs w:val="0"/>
+              <w:smallCaps w:val="0"/>
+              <w:strike w:val="0"/>
+              <w:color w:val="000000"/>
+              <w:sz w:val="24"/>
+              <w:szCs w:val="24"/>
+              <w:u w:val="none"/>
+              <w:shd w:fill="auto" w:val="clear"/>
+              <w:vertAlign w:val="baseline"/>
+            </w:rPr>
+          </w:pPr>
+          <w:hyperlink w:anchor="_k8bys56idod0">
+            <w:r>
+              <w:rPr>
+                <w:rFonts w:ascii="Times New Roman" w:cs="Times New Roman" w:eastAsia="Times New Roman" w:hAnsi="Times New Roman"/>
+                <w:b w:val="0"/>
+                <w:bCs w:val="0"/>
+                <w:i w:val="0"/>
+                <w:iCs w:val="0"/>
+                <w:smallCaps w:val="0"/>
+                <w:strike w:val="0"/>
+                <w:color w:val="000000"/>
+                <w:sz w:val="24"/>
+                <w:szCs w:val="24"/>
+                <w:u w:val="none"/>
+                <w:shd w:fill="auto" w:val="clear"/>
+                <w:vertAlign w:val="baseline"/>
+                <w:rtl w:val="0"/>
+              </w:rPr>
+              <w:t xml:space="preserve">7.Épületek energetikai értékelése</w:t>
+              <w:tab/>
+              <w:t xml:space="preserve">11</w:t>
+            </w:r>
+          </w:hyperlink>
+          <w:r>
+            <w:rPr>
+              <w:rtl w:val="0"/>
+            </w:rPr>
+          </w:r>
+        </w:p>
+        <w:p>
+          <w:pPr>
+            <w:keepNext w:val="0"/>
+            <w:keepLines w:val="0"/>
+            <w:pageBreakBefore w:val="0"/>
+            <w:widowControl w:val="1"/>
+            <w:pBdr>
+              <w:top w:space="0" w:sz="0" w:val="nil"/>
+              <w:left w:space="0" w:sz="0" w:val="nil"/>
+              <w:bottom w:space="0" w:sz="0" w:val="nil"/>
+              <w:right w:space="0" w:sz="0" w:val="nil"/>
+              <w:between w:space="0" w:sz="0" w:val="nil"/>
+            </w:pBdr>
+            <w:shd w:fill="auto" w:val="clear"/>
+            <w:tabs>
+              <w:tab w:val="right" w:leader="none" w:pos="9016"/>
+            </w:tabs>
+            <w:spacing w:after="100" w:before="0" w:line="360" w:lineRule="auto"/>
+            <w:ind w:left="240" w:right="0" w:firstLine="0"/>
+            <w:jc w:val="left"/>
+            <w:rPr>
+              <w:rFonts w:ascii="Times New Roman" w:cs="Times New Roman" w:eastAsia="Times New Roman" w:hAnsi="Times New Roman"/>
+              <w:b w:val="0"/>
+              <w:bCs w:val="0"/>
+              <w:i w:val="0"/>
+              <w:iCs w:val="0"/>
+              <w:smallCaps w:val="0"/>
+              <w:strike w:val="0"/>
+              <w:color w:val="000000"/>
+              <w:sz w:val="24"/>
+              <w:szCs w:val="24"/>
+              <w:u w:val="none"/>
+              <w:shd w:fill="auto" w:val="clear"/>
+              <w:vertAlign w:val="baseline"/>
+            </w:rPr>
+          </w:pPr>
+          <w:hyperlink w:anchor="_n99uy33rqo1f">
+            <w:r>
+              <w:rPr>
+                <w:rFonts w:ascii="Times New Roman" w:cs="Times New Roman" w:eastAsia="Times New Roman" w:hAnsi="Times New Roman"/>
+                <w:b w:val="0"/>
+                <w:bCs w:val="0"/>
+                <w:i w:val="0"/>
+                <w:iCs w:val="0"/>
+                <w:smallCaps w:val="0"/>
+                <w:strike w:val="0"/>
+                <w:color w:val="000000"/>
+                <w:sz w:val="24"/>
+                <w:szCs w:val="24"/>
+                <w:u w:val="none"/>
+                <w:shd w:fill="auto" w:val="clear"/>
+                <w:vertAlign w:val="baseline"/>
+                <w:rtl w:val="0"/>
+              </w:rPr>
+              <w:t xml:space="preserve">7.1.Épületfizikai értékelés</w:t>
+              <w:tab/>
+              <w:t xml:space="preserve">11</w:t>
+            </w:r>
+          </w:hyperlink>
+          <w:r>
+            <w:rPr>
+              <w:rtl w:val="0"/>
+            </w:rPr>
+          </w:r>
+        </w:p>
+        <w:p>
+          <w:pPr>
+            <w:keepNext w:val="0"/>
+            <w:keepLines w:val="0"/>
+            <w:pageBreakBefore w:val="0"/>
+            <w:widowControl w:val="1"/>
+            <w:pBdr>
+              <w:top w:space="0" w:sz="0" w:val="nil"/>
+              <w:left w:space="0" w:sz="0" w:val="nil"/>
+              <w:bottom w:space="0" w:sz="0" w:val="nil"/>
+              <w:right w:space="0" w:sz="0" w:val="nil"/>
+              <w:between w:space="0" w:sz="0" w:val="nil"/>
+            </w:pBdr>
+            <w:shd w:fill="auto" w:val="clear"/>
+            <w:tabs>
+              <w:tab w:val="right" w:leader="none" w:pos="9016"/>
+            </w:tabs>
+            <w:spacing w:after="100" w:before="0" w:line="360" w:lineRule="auto"/>
+            <w:ind w:left="240" w:right="0" w:firstLine="0"/>
+            <w:jc w:val="left"/>
+            <w:rPr>
+              <w:rFonts w:ascii="Times New Roman" w:cs="Times New Roman" w:eastAsia="Times New Roman" w:hAnsi="Times New Roman"/>
+              <w:b w:val="0"/>
+              <w:bCs w:val="0"/>
+              <w:i w:val="0"/>
+              <w:iCs w:val="0"/>
+              <w:smallCaps w:val="0"/>
+              <w:strike w:val="0"/>
+              <w:color w:val="000000"/>
+              <w:sz w:val="24"/>
+              <w:szCs w:val="24"/>
+              <w:u w:val="none"/>
+              <w:shd w:fill="auto" w:val="clear"/>
+              <w:vertAlign w:val="baseline"/>
+            </w:rPr>
+          </w:pPr>
+          <w:hyperlink w:anchor="_jy5u9sj542cl">
+            <w:r>
+              <w:rPr>
+                <w:rFonts w:ascii="Times New Roman" w:cs="Times New Roman" w:eastAsia="Times New Roman" w:hAnsi="Times New Roman"/>
+                <w:b w:val="0"/>
+                <w:bCs w:val="0"/>
+                <w:i w:val="0"/>
+                <w:iCs w:val="0"/>
+                <w:smallCaps w:val="0"/>
+                <w:strike w:val="0"/>
+                <w:color w:val="000000"/>
+                <w:sz w:val="24"/>
+                <w:szCs w:val="24"/>
+                <w:u w:val="none"/>
+                <w:shd w:fill="auto" w:val="clear"/>
+                <w:vertAlign w:val="baseline"/>
+                <w:rtl w:val="0"/>
+              </w:rPr>
+              <w:t xml:space="preserve">7.2.Épületek fűtése</w:t>
+              <w:tab/>
+              <w:t xml:space="preserve">11</w:t>
+            </w:r>
+          </w:hyperlink>
+          <w:r>
+            <w:rPr>
+              <w:rtl w:val="0"/>
+            </w:rPr>
+          </w:r>
+        </w:p>
+        <w:p>
+          <w:pPr>
+            <w:keepNext w:val="0"/>
+            <w:keepLines w:val="0"/>
+            <w:pageBreakBefore w:val="0"/>
+            <w:widowControl w:val="1"/>
+            <w:pBdr>
+              <w:top w:space="0" w:sz="0" w:val="nil"/>
+              <w:left w:space="0" w:sz="0" w:val="nil"/>
+              <w:bottom w:space="0" w:sz="0" w:val="nil"/>
+              <w:right w:space="0" w:sz="0" w:val="nil"/>
+              <w:between w:space="0" w:sz="0" w:val="nil"/>
+            </w:pBdr>
+            <w:shd w:fill="auto" w:val="clear"/>
+            <w:tabs>
+              <w:tab w:val="right" w:leader="none" w:pos="9016"/>
+            </w:tabs>
+            <w:spacing w:after="100" w:before="0" w:line="360" w:lineRule="auto"/>
+            <w:ind w:left="240" w:right="0" w:firstLine="0"/>
+            <w:jc w:val="left"/>
+            <w:rPr>
+              <w:rFonts w:ascii="Times New Roman" w:cs="Times New Roman" w:eastAsia="Times New Roman" w:hAnsi="Times New Roman"/>
+              <w:b w:val="0"/>
+              <w:bCs w:val="0"/>
+              <w:i w:val="0"/>
+              <w:iCs w:val="0"/>
+              <w:smallCaps w:val="0"/>
+              <w:strike w:val="0"/>
+              <w:color w:val="000000"/>
+              <w:sz w:val="24"/>
+              <w:szCs w:val="24"/>
+              <w:u w:val="none"/>
+              <w:shd w:fill="auto" w:val="clear"/>
+              <w:vertAlign w:val="baseline"/>
+            </w:rPr>
+          </w:pPr>
+          <w:hyperlink w:anchor="_1e9hbahrh2ue">
+            <w:r>
+              <w:rPr>
+                <w:rFonts w:ascii="Times New Roman" w:cs="Times New Roman" w:eastAsia="Times New Roman" w:hAnsi="Times New Roman"/>
+                <w:b w:val="0"/>
+                <w:bCs w:val="0"/>
+                <w:i w:val="0"/>
+                <w:iCs w:val="0"/>
+                <w:smallCaps w:val="0"/>
+                <w:strike w:val="0"/>
+                <w:color w:val="000000"/>
+                <w:sz w:val="24"/>
+                <w:szCs w:val="24"/>
+                <w:u w:val="none"/>
+                <w:shd w:fill="auto" w:val="clear"/>
+                <w:vertAlign w:val="baseline"/>
+                <w:rtl w:val="0"/>
+              </w:rPr>
+              <w:t xml:space="preserve">7.3.Használati melegvíz készítése</w:t>
+              <w:tab/>
+              <w:t xml:space="preserve">11</w:t>
+            </w:r>
+          </w:hyperlink>
+          <w:r>
+            <w:rPr>
+              <w:rtl w:val="0"/>
+            </w:rPr>
+          </w:r>
+        </w:p>
+        <w:p>
+          <w:pPr>
+            <w:keepNext w:val="0"/>
+            <w:keepLines w:val="0"/>
+            <w:pageBreakBefore w:val="0"/>
+            <w:widowControl w:val="1"/>
+            <w:pBdr>
+              <w:top w:space="0" w:sz="0" w:val="nil"/>
+              <w:left w:space="0" w:sz="0" w:val="nil"/>
+              <w:bottom w:space="0" w:sz="0" w:val="nil"/>
+              <w:right w:space="0" w:sz="0" w:val="nil"/>
+              <w:between w:space="0" w:sz="0" w:val="nil"/>
+            </w:pBdr>
+            <w:shd w:fill="auto" w:val="clear"/>
+            <w:tabs>
+              <w:tab w:val="right" w:leader="none" w:pos="9016"/>
+            </w:tabs>
+            <w:spacing w:after="100" w:before="0" w:line="360" w:lineRule="auto"/>
+            <w:ind w:left="240" w:right="0" w:firstLine="0"/>
+            <w:jc w:val="left"/>
+            <w:rPr>
+              <w:rFonts w:ascii="Times New Roman" w:cs="Times New Roman" w:eastAsia="Times New Roman" w:hAnsi="Times New Roman"/>
+              <w:b w:val="0"/>
+              <w:bCs w:val="0"/>
+              <w:i w:val="0"/>
+              <w:iCs w:val="0"/>
+              <w:smallCaps w:val="0"/>
+              <w:strike w:val="0"/>
+              <w:color w:val="000000"/>
+              <w:sz w:val="24"/>
+              <w:szCs w:val="24"/>
+              <w:u w:val="none"/>
+              <w:shd w:fill="auto" w:val="clear"/>
+              <w:vertAlign w:val="baseline"/>
+            </w:rPr>
+          </w:pPr>
+          <w:hyperlink w:anchor="_7pgv5sgggxr0">
+            <w:r>
+              <w:rPr>
+                <w:rFonts w:ascii="Times New Roman" w:cs="Times New Roman" w:eastAsia="Times New Roman" w:hAnsi="Times New Roman"/>
+                <w:b w:val="0"/>
+                <w:bCs w:val="0"/>
+                <w:i w:val="0"/>
+                <w:iCs w:val="0"/>
+                <w:smallCaps w:val="0"/>
+                <w:strike w:val="0"/>
+                <w:color w:val="000000"/>
+                <w:sz w:val="24"/>
+                <w:szCs w:val="24"/>
+                <w:u w:val="none"/>
+                <w:shd w:fill="auto" w:val="clear"/>
+                <w:vertAlign w:val="baseline"/>
+                <w:rtl w:val="0"/>
+              </w:rPr>
+              <w:t xml:space="preserve">7.4.Épületek világítása</w:t>
+              <w:tab/>
+              <w:t xml:space="preserve">11</w:t>
+            </w:r>
+          </w:hyperlink>
+          <w:r>
+            <w:rPr>
+              <w:rtl w:val="0"/>
+            </w:rPr>
+          </w:r>
+        </w:p>
+        <w:p>
+          <w:pPr>
+            <w:keepNext w:val="0"/>
+            <w:keepLines w:val="0"/>
+            <w:pageBreakBefore w:val="0"/>
+            <w:widowControl w:val="1"/>
+            <w:pBdr>
+              <w:top w:space="0" w:sz="0" w:val="nil"/>
+              <w:left w:space="0" w:sz="0" w:val="nil"/>
+              <w:bottom w:space="0" w:sz="0" w:val="nil"/>
+              <w:right w:space="0" w:sz="0" w:val="nil"/>
+              <w:between w:space="0" w:sz="0" w:val="nil"/>
+            </w:pBdr>
+            <w:shd w:fill="auto" w:val="clear"/>
+            <w:tabs>
+              <w:tab w:val="right" w:leader="none" w:pos="9016"/>
+            </w:tabs>
+            <w:spacing w:after="100" w:before="0" w:line="360" w:lineRule="auto"/>
+            <w:ind w:left="240" w:right="0" w:firstLine="0"/>
+            <w:jc w:val="left"/>
+            <w:rPr>
+              <w:rFonts w:ascii="Times New Roman" w:cs="Times New Roman" w:eastAsia="Times New Roman" w:hAnsi="Times New Roman"/>
+              <w:b w:val="0"/>
+              <w:bCs w:val="0"/>
+              <w:i w:val="0"/>
+              <w:iCs w:val="0"/>
+              <w:smallCaps w:val="0"/>
+              <w:strike w:val="0"/>
+              <w:color w:val="000000"/>
+              <w:sz w:val="24"/>
+              <w:szCs w:val="24"/>
+              <w:u w:val="none"/>
+              <w:shd w:fill="auto" w:val="clear"/>
+              <w:vertAlign w:val="baseline"/>
+            </w:rPr>
+          </w:pPr>
+          <w:hyperlink w:anchor="_la73okpjopus">
+            <w:r>
+              <w:rPr>
+                <w:rFonts w:ascii="Times New Roman" w:cs="Times New Roman" w:eastAsia="Times New Roman" w:hAnsi="Times New Roman"/>
+                <w:b w:val="0"/>
+                <w:bCs w:val="0"/>
+                <w:i w:val="0"/>
+                <w:iCs w:val="0"/>
+                <w:smallCaps w:val="0"/>
+                <w:strike w:val="0"/>
+                <w:color w:val="000000"/>
+                <w:sz w:val="24"/>
+                <w:szCs w:val="24"/>
+                <w:u w:val="none"/>
+                <w:shd w:fill="auto" w:val="clear"/>
+                <w:vertAlign w:val="baseline"/>
+                <w:rtl w:val="0"/>
+              </w:rPr>
+              <w:t xml:space="preserve">7.5.Épületek komforthűtése</w:t>
+              <w:tab/>
+              <w:t xml:space="preserve">11</w:t>
+            </w:r>
+          </w:hyperlink>
+          <w:r>
+            <w:rPr>
+              <w:rtl w:val="0"/>
+            </w:rPr>
+          </w:r>
+        </w:p>
+        <w:p>
+          <w:pPr>
+            <w:keepNext w:val="0"/>
+            <w:keepLines w:val="0"/>
+            <w:pageBreakBefore w:val="0"/>
+            <w:widowControl w:val="1"/>
+            <w:pBdr>
+              <w:top w:space="0" w:sz="0" w:val="nil"/>
+              <w:left w:space="0" w:sz="0" w:val="nil"/>
+              <w:bottom w:space="0" w:sz="0" w:val="nil"/>
+              <w:right w:space="0" w:sz="0" w:val="nil"/>
+              <w:between w:space="0" w:sz="0" w:val="nil"/>
+            </w:pBdr>
+            <w:shd w:fill="auto" w:val="clear"/>
+            <w:tabs>
+              <w:tab w:val="right" w:leader="none" w:pos="9016"/>
+            </w:tabs>
+            <w:spacing w:after="100" w:before="0" w:line="360" w:lineRule="auto"/>
+            <w:ind w:left="240" w:right="0" w:firstLine="0"/>
+            <w:jc w:val="left"/>
+            <w:rPr>
+              <w:rFonts w:ascii="Times New Roman" w:cs="Times New Roman" w:eastAsia="Times New Roman" w:hAnsi="Times New Roman"/>
+              <w:b w:val="0"/>
+              <w:bCs w:val="0"/>
+              <w:i w:val="0"/>
+              <w:iCs w:val="0"/>
+              <w:smallCaps w:val="0"/>
+              <w:strike w:val="0"/>
+              <w:color w:val="000000"/>
+              <w:sz w:val="24"/>
+              <w:szCs w:val="24"/>
+              <w:u w:val="none"/>
+              <w:shd w:fill="auto" w:val="clear"/>
+              <w:vertAlign w:val="baseline"/>
+            </w:rPr>
+          </w:pPr>
+          <w:hyperlink w:anchor="_hmjvqk3swb3t">
+            <w:r>
+              <w:rPr>
+                <w:rFonts w:ascii="Times New Roman" w:cs="Times New Roman" w:eastAsia="Times New Roman" w:hAnsi="Times New Roman"/>
+                <w:b w:val="0"/>
+                <w:bCs w:val="0"/>
+                <w:i w:val="0"/>
+                <w:iCs w:val="0"/>
+                <w:smallCaps w:val="0"/>
+                <w:strike w:val="0"/>
+                <w:color w:val="000000"/>
+                <w:sz w:val="24"/>
+                <w:szCs w:val="24"/>
+                <w:u w:val="none"/>
+                <w:shd w:fill="auto" w:val="clear"/>
+                <w:vertAlign w:val="baseline"/>
+                <w:rtl w:val="0"/>
+              </w:rPr>
+              <w:t xml:space="preserve">7.6.Légtechnikai rendszerek</w:t>
+              <w:tab/>
+              <w:t xml:space="preserve">11</w:t>
+            </w:r>
+          </w:hyperlink>
+          <w:r>
+            <w:rPr>
+              <w:rtl w:val="0"/>
+            </w:rPr>
+          </w:r>
+        </w:p>
+        <w:p>
+          <w:pPr>
+            <w:keepNext w:val="0"/>
+            <w:keepLines w:val="0"/>
+            <w:pageBreakBefore w:val="0"/>
+            <w:widowControl w:val="1"/>
+            <w:pBdr>
+              <w:top w:space="0" w:sz="0" w:val="nil"/>
+              <w:left w:space="0" w:sz="0" w:val="nil"/>
+              <w:bottom w:space="0" w:sz="0" w:val="nil"/>
+              <w:right w:space="0" w:sz="0" w:val="nil"/>
+              <w:between w:space="0" w:sz="0" w:val="nil"/>
+            </w:pBdr>
+            <w:shd w:fill="auto" w:val="clear"/>
+            <w:tabs>
+              <w:tab w:val="right" w:leader="none" w:pos="9016"/>
+            </w:tabs>
+            <w:spacing w:after="100" w:before="0" w:line="360" w:lineRule="auto"/>
+            <w:ind w:left="0" w:right="0" w:firstLine="0"/>
+            <w:jc w:val="left"/>
+            <w:rPr>
+              <w:rFonts w:ascii="Times New Roman" w:cs="Times New Roman" w:eastAsia="Times New Roman" w:hAnsi="Times New Roman"/>
+              <w:b w:val="0"/>
+              <w:bCs w:val="0"/>
+              <w:i w:val="0"/>
+              <w:iCs w:val="0"/>
+              <w:smallCaps w:val="0"/>
+              <w:strike w:val="0"/>
+              <w:color w:val="000000"/>
+              <w:sz w:val="24"/>
+              <w:szCs w:val="24"/>
+              <w:u w:val="none"/>
+              <w:shd w:fill="auto" w:val="clear"/>
+              <w:vertAlign w:val="baseline"/>
+            </w:rPr>
+          </w:pPr>
+          <w:hyperlink w:anchor="_70pdftb0uw6m">
+            <w:r>
+              <w:rPr>
+                <w:rFonts w:ascii="Times New Roman" w:cs="Times New Roman" w:eastAsia="Times New Roman" w:hAnsi="Times New Roman"/>
+                <w:b w:val="0"/>
+                <w:bCs w:val="0"/>
+                <w:i w:val="0"/>
+                <w:iCs w:val="0"/>
+                <w:smallCaps w:val="0"/>
+                <w:strike w:val="0"/>
+                <w:color w:val="000000"/>
+                <w:sz w:val="24"/>
+                <w:szCs w:val="24"/>
+                <w:u w:val="none"/>
+                <w:shd w:fill="auto" w:val="clear"/>
+                <w:vertAlign w:val="baseline"/>
+                <w:rtl w:val="0"/>
+              </w:rPr>
+              <w:t xml:space="preserve">Szállítás energetikai értékelése</w:t>
+              <w:tab/>
+              <w:t xml:space="preserve">12</w:t>
+            </w:r>
+          </w:hyperlink>
+          <w:r>
+            <w:rPr>
+              <w:rtl w:val="0"/>
+            </w:rPr>
+          </w:r>
+        </w:p>
+        <w:p>
+          <w:pPr>
+            <w:keepNext w:val="0"/>
+            <w:keepLines w:val="0"/>
+            <w:pageBreakBefore w:val="0"/>
+            <w:widowControl w:val="1"/>
+            <w:pBdr>
+              <w:top w:space="0" w:sz="0" w:val="nil"/>
+              <w:left w:space="0" w:sz="0" w:val="nil"/>
+              <w:bottom w:space="0" w:sz="0" w:val="nil"/>
+              <w:right w:space="0" w:sz="0" w:val="nil"/>
+              <w:between w:space="0" w:sz="0" w:val="nil"/>
+            </w:pBdr>
+            <w:shd w:fill="auto" w:val="clear"/>
+            <w:tabs>
+              <w:tab w:val="right" w:leader="none" w:pos="9016"/>
+            </w:tabs>
+            <w:spacing w:after="100" w:before="0" w:line="360" w:lineRule="auto"/>
+            <w:ind w:left="0" w:right="0" w:firstLine="0"/>
+            <w:jc w:val="left"/>
+            <w:rPr>
+              <w:rFonts w:ascii="Times New Roman" w:cs="Times New Roman" w:eastAsia="Times New Roman" w:hAnsi="Times New Roman"/>
+              <w:b w:val="0"/>
+              <w:bCs w:val="0"/>
+              <w:i w:val="0"/>
+              <w:iCs w:val="0"/>
+              <w:smallCaps w:val="0"/>
+              <w:strike w:val="0"/>
+              <w:color w:val="000000"/>
+              <w:sz w:val="24"/>
+              <w:szCs w:val="24"/>
+              <w:u w:val="none"/>
+              <w:shd w:fill="auto" w:val="clear"/>
+              <w:vertAlign w:val="baseline"/>
+            </w:rPr>
+          </w:pPr>
+          <w:hyperlink w:anchor="_2m5ncglbezv5">
+            <w:r>
+              <w:rPr>
+                <w:rFonts w:ascii="Times New Roman" w:cs="Times New Roman" w:eastAsia="Times New Roman" w:hAnsi="Times New Roman"/>
+                <w:b w:val="0"/>
+                <w:bCs w:val="0"/>
+                <w:i w:val="0"/>
+                <w:iCs w:val="0"/>
+                <w:smallCaps w:val="0"/>
+                <w:strike w:val="0"/>
+                <w:color w:val="000000"/>
+                <w:sz w:val="24"/>
+                <w:szCs w:val="24"/>
+                <w:u w:val="none"/>
+                <w:shd w:fill="auto" w:val="clear"/>
+                <w:vertAlign w:val="baseline"/>
+                <w:rtl w:val="0"/>
+              </w:rPr>
+              <w:t xml:space="preserve">${technology_title}</w:t>
+              <w:tab/>
+              <w:t xml:space="preserve">13</w:t>
+            </w:r>
+          </w:hyperlink>
+          <w:r>
+            <w:rPr>
+              <w:rtl w:val="0"/>
+            </w:rPr>
+          </w:r>
+        </w:p>
+        <w:p>
+          <w:pPr>
+            <w:keepNext w:val="0"/>
+            <w:keepLines w:val="0"/>
+            <w:pageBreakBefore w:val="0"/>
+            <w:widowControl w:val="1"/>
+            <w:pBdr>
+              <w:top w:space="0" w:sz="0" w:val="nil"/>
+              <w:left w:space="0" w:sz="0" w:val="nil"/>
+              <w:bottom w:space="0" w:sz="0" w:val="nil"/>
+              <w:right w:space="0" w:sz="0" w:val="nil"/>
+              <w:between w:space="0" w:sz="0" w:val="nil"/>
+            </w:pBdr>
+            <w:shd w:fill="auto" w:val="clear"/>
+            <w:tabs>
+              <w:tab w:val="right" w:leader="none" w:pos="9016"/>
+            </w:tabs>
+            <w:spacing w:after="100" w:before="0" w:line="360" w:lineRule="auto"/>
+            <w:ind w:left="0" w:right="0" w:firstLine="0"/>
+            <w:jc w:val="left"/>
+            <w:rPr>
+              <w:rFonts w:ascii="Times New Roman" w:cs="Times New Roman" w:eastAsia="Times New Roman" w:hAnsi="Times New Roman"/>
+              <w:b w:val="0"/>
+              <w:bCs w:val="0"/>
+              <w:i w:val="0"/>
+              <w:iCs w:val="0"/>
+              <w:smallCaps w:val="0"/>
+              <w:strike w:val="0"/>
+              <w:color w:val="000000"/>
+              <w:sz w:val="24"/>
+              <w:szCs w:val="24"/>
+              <w:u w:val="none"/>
+              <w:shd w:fill="auto" w:val="clear"/>
+              <w:vertAlign w:val="baseline"/>
+            </w:rPr>
+          </w:pPr>
+          <w:hyperlink w:anchor="_rlxwwkgf7bjv">
+            <w:r>
+              <w:rPr>
+                <w:rFonts w:ascii="Times New Roman" w:cs="Times New Roman" w:eastAsia="Times New Roman" w:hAnsi="Times New Roman"/>
+                <w:b w:val="0"/>
+                <w:bCs w:val="0"/>
+                <w:i w:val="0"/>
+                <w:iCs w:val="0"/>
+                <w:smallCaps w:val="0"/>
+                <w:strike w:val="0"/>
+                <w:color w:val="000000"/>
+                <w:sz w:val="24"/>
+                <w:szCs w:val="24"/>
+                <w:u w:val="none"/>
+                <w:shd w:fill="auto" w:val="clear"/>
+                <w:vertAlign w:val="baseline"/>
+                <w:rtl w:val="0"/>
+              </w:rPr>
+              <w:t xml:space="preserve">A fogyasztások felosztása</w:t>
+              <w:tab/>
+              <w:t xml:space="preserve">14</w:t>
+            </w:r>
+          </w:hyperlink>
+          <w:r>
+            <w:rPr>
+              <w:rtl w:val="0"/>
+            </w:rPr>
+          </w:r>
+        </w:p>
+        <w:p>
+          <w:pPr>
+            <w:keepNext w:val="0"/>
+            <w:keepLines w:val="0"/>
+            <w:pageBreakBefore w:val="0"/>
+            <w:widowControl w:val="1"/>
+            <w:pBdr>
+              <w:top w:space="0" w:sz="0" w:val="nil"/>
+              <w:left w:space="0" w:sz="0" w:val="nil"/>
+              <w:bottom w:space="0" w:sz="0" w:val="nil"/>
+              <w:right w:space="0" w:sz="0" w:val="nil"/>
+              <w:between w:space="0" w:sz="0" w:val="nil"/>
+            </w:pBdr>
+            <w:shd w:fill="auto" w:val="clear"/>
+            <w:tabs>
+              <w:tab w:val="right" w:leader="none" w:pos="9016"/>
+            </w:tabs>
+            <w:spacing w:after="100" w:before="0" w:line="360" w:lineRule="auto"/>
+            <w:ind w:left="0" w:right="0" w:firstLine="0"/>
+            <w:jc w:val="left"/>
+            <w:rPr>
+              <w:rFonts w:ascii="Times New Roman" w:cs="Times New Roman" w:eastAsia="Times New Roman" w:hAnsi="Times New Roman"/>
+              <w:b w:val="0"/>
+              <w:bCs w:val="0"/>
+              <w:i w:val="0"/>
+              <w:iCs w:val="0"/>
+              <w:smallCaps w:val="0"/>
+              <w:strike w:val="0"/>
+              <w:color w:val="000000"/>
+              <w:sz w:val="24"/>
+              <w:szCs w:val="24"/>
+              <w:u w:val="none"/>
+              <w:shd w:fill="auto" w:val="clear"/>
+              <w:vertAlign w:val="baseline"/>
+            </w:rPr>
+          </w:pPr>
+          <w:hyperlink w:anchor="_fs0jfvd37bwn">
+            <w:r>
+              <w:rPr>
+                <w:rFonts w:ascii="Times New Roman" w:cs="Times New Roman" w:eastAsia="Times New Roman" w:hAnsi="Times New Roman"/>
+                <w:b w:val="0"/>
+                <w:bCs w:val="0"/>
+                <w:i w:val="0"/>
+                <w:iCs w:val="0"/>
+                <w:smallCaps w:val="0"/>
+                <w:strike w:val="0"/>
+                <w:color w:val="000000"/>
+                <w:sz w:val="24"/>
+                <w:szCs w:val="24"/>
+                <w:u w:val="none"/>
+                <w:shd w:fill="auto" w:val="clear"/>
+                <w:vertAlign w:val="baseline"/>
+                <w:rtl w:val="0"/>
+              </w:rPr>
+              <w:t xml:space="preserve">Energia teljesítmény mutató meghatározása</w:t>
+              <w:tab/>
+              <w:t xml:space="preserve">15</w:t>
+            </w:r>
+          </w:hyperlink>
+          <w:r>
+            <w:rPr>
+              <w:rtl w:val="0"/>
+            </w:rPr>
+          </w:r>
+        </w:p>
+        <w:p>
+          <w:pPr>
+            <w:keepNext w:val="0"/>
+            <w:keepLines w:val="0"/>
+            <w:pageBreakBefore w:val="0"/>
+            <w:widowControl w:val="1"/>
+            <w:pBdr>
+              <w:top w:space="0" w:sz="0" w:val="nil"/>
+              <w:left w:space="0" w:sz="0" w:val="nil"/>
+              <w:bottom w:space="0" w:sz="0" w:val="nil"/>
+              <w:right w:space="0" w:sz="0" w:val="nil"/>
+              <w:between w:space="0" w:sz="0" w:val="nil"/>
+            </w:pBdr>
+            <w:shd w:fill="auto" w:val="clear"/>
+            <w:tabs>
+              <w:tab w:val="right" w:leader="none" w:pos="9016"/>
+            </w:tabs>
+            <w:spacing w:after="100" w:before="0" w:line="360" w:lineRule="auto"/>
+            <w:ind w:left="0" w:right="0" w:firstLine="0"/>
+            <w:jc w:val="left"/>
+            <w:rPr>
+              <w:rFonts w:ascii="Times New Roman" w:cs="Times New Roman" w:eastAsia="Times New Roman" w:hAnsi="Times New Roman"/>
+              <w:b w:val="0"/>
+              <w:bCs w:val="0"/>
+              <w:i w:val="0"/>
+              <w:iCs w:val="0"/>
+              <w:smallCaps w:val="0"/>
+              <w:strike w:val="0"/>
+              <w:color w:val="000000"/>
+              <w:sz w:val="24"/>
+              <w:szCs w:val="24"/>
+              <w:u w:val="none"/>
+              <w:shd w:fill="auto" w:val="clear"/>
+              <w:vertAlign w:val="baseline"/>
+            </w:rPr>
+          </w:pPr>
+          <w:hyperlink w:anchor="_j4stjd8zgygh">
+            <w:r>
+              <w:rPr>
+                <w:rFonts w:ascii="Times New Roman" w:cs="Times New Roman" w:eastAsia="Times New Roman" w:hAnsi="Times New Roman"/>
+                <w:b w:val="0"/>
+                <w:bCs w:val="0"/>
+                <w:i w:val="0"/>
+                <w:iCs w:val="0"/>
+                <w:smallCaps w:val="0"/>
+                <w:strike w:val="0"/>
+                <w:color w:val="000000"/>
+                <w:sz w:val="24"/>
+                <w:szCs w:val="24"/>
+                <w:u w:val="none"/>
+                <w:shd w:fill="auto" w:val="clear"/>
+                <w:vertAlign w:val="baseline"/>
+                <w:rtl w:val="0"/>
+              </w:rPr>
+              <w:t xml:space="preserve">Javaslatok és források</w:t>
+              <w:tab/>
+              <w:t xml:space="preserve">16</w:t>
             </w:r>
           </w:hyperlink>
           <w:r>
@@ -385,13 +1275,13 @@
         <w:pStyle w:val="Heading1"/>
         <w:rPr/>
       </w:pPr>
-      <w:bookmarkStart w:colFirst="0" w:colLast="0" w:name="_poaunr5vl9ew" w:id="0"/>
+      <w:bookmarkStart w:colFirst="0" w:colLast="0" w:name="_ni38zpbjo3vp" w:id="0"/>
       <w:bookmarkEnd w:id="0"/>
       <w:r>
         <w:rPr>
           <w:rtl w:val="0"/>
         </w:rPr>
-        <w:t xml:space="preserve">Vezetői összefoglaló</w:t>
+        <w:t xml:space="preserve">1.Vezetői összefoglaló</w:t>
       </w:r>
     </w:p>
     <w:p>
@@ -675,13 +1565,13 @@
         <w:pStyle w:val="Heading1"/>
         <w:rPr/>
       </w:pPr>
-      <w:bookmarkStart w:colFirst="0" w:colLast="0" w:name="_jyleb9oakg65" w:id="1"/>
+      <w:bookmarkStart w:colFirst="0" w:colLast="0" w:name="_19axcrultbpu" w:id="1"/>
       <w:bookmarkEnd w:id="1"/>
       <w:r>
         <w:rPr>
           <w:rtl w:val="0"/>
         </w:rPr>
-        <w:t xml:space="preserve">Vállalkozás bemutatása</w:t>
+        <w:t xml:space="preserve">2.Vállalkozás bemutatása</w:t>
       </w:r>
     </w:p>
     <w:p>
@@ -722,13 +1612,13 @@
         <w:pStyle w:val="Heading1"/>
         <w:rPr/>
       </w:pPr>
-      <w:bookmarkStart w:colFirst="0" w:colLast="0" w:name="_1judf6aiosh8" w:id="2"/>
+      <w:bookmarkStart w:colFirst="0" w:colLast="0" w:name="_uzkertphoojv" w:id="2"/>
       <w:bookmarkEnd w:id="2"/>
       <w:r>
         <w:rPr>
           <w:rtl w:val="0"/>
         </w:rPr>
-        <w:t xml:space="preserve">Fogyasztási adatok</w:t>
+        <w:t xml:space="preserve">3.Fogyasztási adatok</w:t>
       </w:r>
     </w:p>
     <w:p>
@@ -758,13 +1648,13 @@
         <w:pStyle w:val="Heading1"/>
         <w:rPr/>
       </w:pPr>
-      <w:bookmarkStart w:colFirst="0" w:colLast="0" w:name="_pgil67bhu4rv" w:id="3"/>
+      <w:bookmarkStart w:colFirst="0" w:colLast="0" w:name="_pd8ax8n1cvhf" w:id="3"/>
       <w:bookmarkEnd w:id="3"/>
       <w:r>
         <w:rPr>
           <w:rtl w:val="0"/>
         </w:rPr>
-        <w:t xml:space="preserve">Mérési hálózatok</w:t>
+        <w:t xml:space="preserve">4.Mérési hálózatok</w:t>
       </w:r>
     </w:p>
     <w:p>
@@ -816,11 +1706,13 @@
         <w:pStyle w:val="Heading1"/>
         <w:rPr/>
       </w:pPr>
-      <w:r>
-        <w:rPr>
-          <w:rtl w:val="0"/>
-        </w:rPr>
-        <w:t xml:space="preserve">Költségek kalkulációja</w:t>
+      <w:bookmarkStart w:colFirst="0" w:colLast="0" w:name="_ccg07hacib0w" w:id="4"/>
+      <w:bookmarkEnd w:id="4"/>
+      <w:r>
+        <w:rPr>
+          <w:rtl w:val="0"/>
+        </w:rPr>
+        <w:t xml:space="preserve">5.Költségek kalkulációja</w:t>
       </w:r>
     </w:p>
     <w:p>
@@ -895,7 +1787,7 @@
         <w:rPr>
           <w:rtl w:val="0"/>
         </w:rPr>
-        <w:t xml:space="preserve">Villamos energia:  ${electric_energy_price}EUR/MWh.</w:t>
+        <w:t xml:space="preserve">Villamos energia:  ${electric_energy_price} EUR/MWh.</w:t>
       </w:r>
     </w:p>
     <w:p>
@@ -2190,18 +3082,18 @@
         <w:rPr>
           <w:rtl w:val="0"/>
         </w:rPr>
-        <w:t xml:space="preserve"> ${natural_gas_price} Ft/kWh + 15 Ft/kWh = ${natural_gas_specific} Ft/kWh földgázra,</w:t>
-      </w:r>
-    </w:p>
-    <w:p>
-      <w:pPr>
-        <w:rPr/>
-      </w:pPr>
-      <w:r>
-        <w:rPr>
-          <w:rtl w:val="0"/>
-        </w:rPr>
-        <w:t xml:space="preserve">a villamos energia esetében pedig ${electric_energy_price} Ft/kWh + 30,915 Ft/kWh =  ${electric_energy_specific} Ft/kWh.</w:t>
+        <w:t xml:space="preserve"> ${natural_gas_converted} Ft/kWh + 15 Ft/kWh = ${natural_gas_specific} Ft/kWh földgázra,</w:t>
+      </w:r>
+    </w:p>
+    <w:p>
+      <w:pPr>
+        <w:rPr/>
+      </w:pPr>
+      <w:r>
+        <w:rPr>
+          <w:rtl w:val="0"/>
+        </w:rPr>
+        <w:t xml:space="preserve">a villamos energia esetében pedig ${electric_converted} Ft/kWh + 30,915 Ft/kWh =  ${electric_energy_specific} Ft/kWh.</w:t>
       </w:r>
     </w:p>
     <w:p>
@@ -2209,11 +3101,13 @@
         <w:pStyle w:val="Heading1"/>
         <w:rPr/>
       </w:pPr>
-      <w:r>
-        <w:rPr>
-          <w:rtl w:val="0"/>
-        </w:rPr>
-        <w:t xml:space="preserve">Pénzügyi környezet kalkuláció</w:t>
+      <w:bookmarkStart w:colFirst="0" w:colLast="0" w:name="_q0qgfw2d2u8d" w:id="5"/>
+      <w:bookmarkEnd w:id="5"/>
+      <w:r>
+        <w:rPr>
+          <w:rtl w:val="0"/>
+        </w:rPr>
+        <w:t xml:space="preserve">6.Pénzügyi környezet kalkuláció</w:t>
       </w:r>
     </w:p>
     <w:p>
@@ -2766,22 +3660,38 @@
         <w:pStyle w:val="Heading1"/>
         <w:rPr/>
       </w:pPr>
-      <w:r>
-        <w:rPr>
-          <w:rtl w:val="0"/>
-        </w:rPr>
-        <w:t xml:space="preserve">Épületek energetikai értékelése</w:t>
-      </w:r>
-    </w:p>
-    <w:p>
-      <w:pPr>
-        <w:rPr/>
-      </w:pPr>
-      <w:r>
-        <w:rPr>
-          <w:rtl w:val="0"/>
-        </w:rPr>
-        <w:t xml:space="preserve">A ${company_name}- az alábbi épületekkel rendelkezik:</w:t>
+      <w:bookmarkStart w:colFirst="0" w:colLast="0" w:name="_k8bys56idod0" w:id="6"/>
+      <w:bookmarkEnd w:id="6"/>
+      <w:r>
+        <w:rPr>
+          <w:rtl w:val="0"/>
+        </w:rPr>
+        <w:t xml:space="preserve">7.Épületek energetikai értékelése</w:t>
+      </w:r>
+    </w:p>
+    <w:p>
+      <w:pPr>
+        <w:pStyle w:val="Heading2"/>
+        <w:rPr/>
+      </w:pPr>
+      <w:bookmarkStart w:colFirst="0" w:colLast="0" w:name="_n99uy33rqo1f" w:id="7"/>
+      <w:bookmarkEnd w:id="7"/>
+      <w:r>
+        <w:rPr>
+          <w:rtl w:val="0"/>
+        </w:rPr>
+        <w:t xml:space="preserve">7.1.Épületfizikai értékelés </w:t>
+      </w:r>
+    </w:p>
+    <w:p>
+      <w:pPr>
+        <w:rPr/>
+      </w:pPr>
+      <w:r>
+        <w:rPr>
+          <w:rtl w:val="0"/>
+        </w:rPr>
+        <w:t xml:space="preserve">A ${company_name} az alábbi épületekkel rendelkezik:</w:t>
       </w:r>
     </w:p>
     <w:p>
@@ -2797,9 +3707,191 @@
     </w:p>
     <w:p>
       <w:pPr>
+        <w:pStyle w:val="Heading2"/>
+        <w:rPr/>
+      </w:pPr>
+      <w:bookmarkStart w:colFirst="0" w:colLast="0" w:name="_jy5u9sj542cl" w:id="8"/>
+      <w:bookmarkEnd w:id="8"/>
+      <w:r>
+        <w:rPr>
+          <w:rtl w:val="0"/>
+        </w:rPr>
+        <w:t xml:space="preserve">7.2.Épületek fűtése</w:t>
+      </w:r>
+    </w:p>
+    <w:p>
+      <w:pPr>
+        <w:rPr/>
+      </w:pPr>
+      <w:r>
+        <w:rPr>
+          <w:rtl w:val="0"/>
+        </w:rPr>
+        <w:t xml:space="preserve">A ${company_name} az alábbi fűtési rendszerekkel rendelkezik:</w:t>
+      </w:r>
+    </w:p>
+    <w:p>
+      <w:pPr>
+        <w:rPr/>
+      </w:pPr>
+      <w:r>
+        <w:rPr>
+          <w:rtl w:val="0"/>
+        </w:rPr>
+        <w:t xml:space="preserve">${heating_listing}</w:t>
+      </w:r>
+    </w:p>
+    <w:p>
+      <w:pPr>
+        <w:pStyle w:val="Heading2"/>
+        <w:rPr/>
+      </w:pPr>
+      <w:bookmarkStart w:colFirst="0" w:colLast="0" w:name="_1e9hbahrh2ue" w:id="9"/>
+      <w:bookmarkEnd w:id="9"/>
+      <w:r>
+        <w:rPr>
+          <w:rtl w:val="0"/>
+        </w:rPr>
+        <w:t xml:space="preserve">7.3.Használati melegvíz készítése</w:t>
+      </w:r>
+    </w:p>
+    <w:p>
+      <w:pPr>
+        <w:rPr/>
+      </w:pPr>
+      <w:r>
+        <w:rPr>
+          <w:rtl w:val="0"/>
+        </w:rPr>
+        <w:t xml:space="preserve">A ${company_name} az alábbi használati melegvizes rendszerekkel rendelkezik:</w:t>
+      </w:r>
+    </w:p>
+    <w:p>
+      <w:pPr>
+        <w:rPr/>
+      </w:pPr>
+      <w:r>
+        <w:rPr>
+          <w:rtl w:val="0"/>
+        </w:rPr>
+        <w:t xml:space="preserve">${hmv_listing}</w:t>
+      </w:r>
+    </w:p>
+    <w:p>
+      <w:pPr>
+        <w:pStyle w:val="Heading2"/>
+        <w:rPr/>
+      </w:pPr>
+      <w:bookmarkStart w:colFirst="0" w:colLast="0" w:name="_7pgv5sgggxr0" w:id="10"/>
+      <w:bookmarkEnd w:id="10"/>
+      <w:r>
+        <w:rPr>
+          <w:rtl w:val="0"/>
+        </w:rPr>
+        <w:t xml:space="preserve">7.4.Épületek világítása</w:t>
+      </w:r>
+    </w:p>
+    <w:p>
+      <w:pPr>
+        <w:rPr/>
+      </w:pPr>
+      <w:r>
+        <w:rPr>
+          <w:rtl w:val="0"/>
+        </w:rPr>
+        <w:t xml:space="preserve">A ${company_name} az alábbi világítási zónákkal és rendszerekkel rendelkezik:</w:t>
+      </w:r>
+    </w:p>
+    <w:p>
+      <w:pPr>
+        <w:rPr/>
+      </w:pPr>
+      <w:r>
+        <w:rPr>
+          <w:rtl w:val="0"/>
+        </w:rPr>
+        <w:t xml:space="preserve">${lighting_listing}</w:t>
+      </w:r>
+    </w:p>
+    <w:p>
+      <w:pPr>
+        <w:pStyle w:val="Heading2"/>
+        <w:rPr/>
+      </w:pPr>
+      <w:bookmarkStart w:colFirst="0" w:colLast="0" w:name="_la73okpjopus" w:id="11"/>
+      <w:bookmarkEnd w:id="11"/>
+      <w:r>
+        <w:rPr>
+          <w:rtl w:val="0"/>
+        </w:rPr>
+        <w:t xml:space="preserve">7.5.Épületek komforthűtése</w:t>
+      </w:r>
+    </w:p>
+    <w:p>
+      <w:pPr>
+        <w:rPr/>
+      </w:pPr>
+      <w:r>
+        <w:rPr>
+          <w:rtl w:val="0"/>
+        </w:rPr>
+        <w:t xml:space="preserve">A ${company_name} az alábbi komforthűtési rendszerekkel rendelkezik:</w:t>
+      </w:r>
+    </w:p>
+    <w:p>
+      <w:pPr>
+        <w:rPr/>
+      </w:pPr>
+      <w:r>
+        <w:rPr>
+          <w:rtl w:val="0"/>
+        </w:rPr>
+        <w:t xml:space="preserve">${cooling_listing}</w:t>
+      </w:r>
+    </w:p>
+    <w:p>
+      <w:pPr>
+        <w:pStyle w:val="Heading2"/>
+        <w:rPr/>
+      </w:pPr>
+      <w:bookmarkStart w:colFirst="0" w:colLast="0" w:name="_hmjvqk3swb3t" w:id="12"/>
+      <w:bookmarkEnd w:id="12"/>
+      <w:r>
+        <w:rPr>
+          <w:rtl w:val="0"/>
+        </w:rPr>
+        <w:t xml:space="preserve">7.6.Légtechnikai rendszerek</w:t>
+      </w:r>
+    </w:p>
+    <w:p>
+      <w:pPr>
+        <w:rPr/>
+      </w:pPr>
+      <w:r>
+        <w:rPr>
+          <w:rtl w:val="0"/>
+        </w:rPr>
+        <w:t xml:space="preserve">A ${company_name} az alábbi légtechnikai rendszerekkel rendelkezik:</w:t>
+      </w:r>
+    </w:p>
+    <w:p>
+      <w:pPr>
+        <w:rPr/>
+      </w:pPr>
+      <w:r>
+        <w:rPr>
+          <w:rtl w:val="0"/>
+        </w:rPr>
+        <w:t xml:space="preserve">${hvac_listing}</w:t>
+      </w:r>
+    </w:p>
+    <w:p>
+      <w:pPr>
         <w:pStyle w:val="Heading1"/>
         <w:rPr/>
       </w:pPr>
+      <w:bookmarkStart w:colFirst="0" w:colLast="0" w:name="_70pdftb0uw6m" w:id="13"/>
+      <w:bookmarkEnd w:id="13"/>
       <w:r>
         <w:rPr>
           <w:rtl w:val="0"/>
@@ -2834,8 +3926,8 @@
         <w:pStyle w:val="Heading1"/>
         <w:rPr/>
       </w:pPr>
-      <w:bookmarkStart w:colFirst="0" w:colLast="0" w:name="_ah77jle03xqd" w:id="4"/>
-      <w:bookmarkEnd w:id="4"/>
+      <w:bookmarkStart w:colFirst="0" w:colLast="0" w:name="_2m5ncglbezv5" w:id="14"/>
+      <w:bookmarkEnd w:id="14"/>
       <w:r>
         <w:rPr>
           <w:rtl w:val="0"/>
@@ -2859,6 +3951,8 @@
         <w:pStyle w:val="Heading1"/>
         <w:rPr/>
       </w:pPr>
+      <w:bookmarkStart w:colFirst="0" w:colLast="0" w:name="_rlxwwkgf7bjv" w:id="15"/>
+      <w:bookmarkEnd w:id="15"/>
       <w:r>
         <w:rPr>
           <w:rtl w:val="0"/>
@@ -3152,6 +4246,8 @@
         <w:pStyle w:val="Heading1"/>
         <w:rPr/>
       </w:pPr>
+      <w:bookmarkStart w:colFirst="0" w:colLast="0" w:name="_fs0jfvd37bwn" w:id="16"/>
+      <w:bookmarkEnd w:id="16"/>
       <w:r>
         <w:rPr>
           <w:rtl w:val="0"/>
@@ -3287,6 +4383,8 @@
         <w:pStyle w:val="Heading1"/>
         <w:rPr/>
       </w:pPr>
+      <w:bookmarkStart w:colFirst="0" w:colLast="0" w:name="_j4stjd8zgygh" w:id="17"/>
+      <w:bookmarkEnd w:id="17"/>
       <w:r>
         <w:rPr>
           <w:rtl w:val="0"/>
@@ -3308,9 +4406,6 @@
 <w:ftr xmlns:mc="http://schemas.openxmlformats.org/markup-compatibility/2006" xmlns:o="urn:schemas-microsoft-com:office:office" xmlns:r="http://schemas.openxmlformats.org/officeDocument/2006/relationships" xmlns:m="http://schemas.openxmlformats.org/officeDocument/2006/math" xmlns:v="urn:schemas-microsoft-com:vml" xmlns:wp="http://schemas.openxmlformats.org/drawingml/2006/wordprocessingDrawing" xmlns:w10="urn:schemas-microsoft-com:office:word" xmlns:w="http://schemas.openxmlformats.org/wordprocessingml/2006/main" xmlns:wne="http://schemas.microsoft.com/office/word/2006/wordml" xmlns:sl="http://schemas.openxmlformats.org/schemaLibrary/2006/main" xmlns:a="http://schemas.openxmlformats.org/drawingml/2006/main" xmlns:pic="http://schemas.openxmlformats.org/drawingml/2006/picture" xmlns:c="http://schemas.openxmlformats.org/drawingml/2006/chart" xmlns:lc="http://schemas.openxmlformats.org/drawingml/2006/lockedCanvas" xmlns:dgm="http://schemas.openxmlformats.org/drawingml/2006/diagram" xmlns:wps="http://schemas.microsoft.com/office/word/2010/wordprocessingShape" xmlns:wpg="http://schemas.microsoft.com/office/word/2010/wordprocessingGroup" xmlns:w14="http://schemas.microsoft.com/office/word/2010/wordml" xmlns:w15="http://schemas.microsoft.com/office/word/2012/wordml" xmlns:w16="http://schemas.microsoft.com/office/word/2018/wordml" xmlns:w16cex="http://schemas.microsoft.com/office/word/2018/wordml/cex" xmlns:w16cid="http://schemas.microsoft.com/office/word/2016/wordml/cid" xmlns="http://schemas.microsoft.com/office/tasks/2019/documenttasks" xmlns:cr="http://schemas.microsoft.com/office/comments/2020/reactions">
   <w:p>
     <w:pPr>
-      <w:keepNext w:val="0"/>
-      <w:keepLines w:val="0"/>
-      <w:widowControl w:val="1"/>
       <w:pBdr>
         <w:top w:space="0" w:sz="0" w:val="nil"/>
         <w:left w:space="0" w:sz="0" w:val="nil"/>
@@ -3318,45 +4413,18 @@
         <w:right w:space="0" w:sz="0" w:val="nil"/>
         <w:between w:space="0" w:sz="0" w:val="nil"/>
       </w:pBdr>
-      <w:shd w:fill="auto" w:val="clear"/>
       <w:tabs>
         <w:tab w:val="center" w:leader="none" w:pos="4513"/>
         <w:tab w:val="right" w:leader="none" w:pos="9026"/>
       </w:tabs>
-      <w:spacing w:after="0" w:before="0" w:line="240" w:lineRule="auto"/>
-      <w:ind w:left="0" w:right="0" w:firstLine="0"/>
-      <w:jc w:val="left"/>
+      <w:spacing w:after="0" w:line="240" w:lineRule="auto"/>
       <w:rPr>
-        <w:rFonts w:ascii="Times New Roman" w:cs="Times New Roman" w:eastAsia="Times New Roman" w:hAnsi="Times New Roman"/>
-        <w:b w:val="0"/>
-        <w:bCs w:val="0"/>
-        <w:i w:val="0"/>
-        <w:iCs w:val="0"/>
-        <w:smallCaps w:val="0"/>
-        <w:strike w:val="0"/>
         <w:color w:val="000000"/>
-        <w:sz w:val="24"/>
-        <w:szCs w:val="24"/>
-        <w:u w:val="none"/>
-        <w:shd w:fill="auto" w:val="clear"/>
-        <w:vertAlign w:val="baseline"/>
       </w:rPr>
     </w:pPr>
     <w:r>
       <w:rPr>
-        <w:rFonts w:ascii="Times New Roman" w:cs="Times New Roman" w:eastAsia="Times New Roman" w:hAnsi="Times New Roman"/>
-        <w:b w:val="0"/>
-        <w:bCs w:val="0"/>
-        <w:i w:val="0"/>
-        <w:iCs w:val="0"/>
-        <w:smallCaps w:val="0"/>
-        <w:strike w:val="0"/>
         <w:color w:val="000000"/>
-        <w:sz w:val="24"/>
-        <w:szCs w:val="24"/>
-        <w:u w:val="none"/>
-        <w:shd w:fill="auto" w:val="clear"/>
-        <w:vertAlign w:val="baseline"/>
         <w:rtl w:val="0"/>
       </w:rPr>
       <w:t xml:space="preserve">Balajti Energetika Kft.</w:t>
@@ -3431,8 +4499,7 @@
       <w:spacing w:after="80" w:before="160" w:lineRule="auto"/>
     </w:pPr>
     <w:rPr>
-      <w:rFonts w:ascii="Play" w:cs="Play" w:eastAsia="Play" w:hAnsi="Play"/>
-      <w:color w:val="0f4761"/>
+      <w:color w:val="404040"/>
       <w:sz w:val="32"/>
       <w:szCs w:val="32"/>
     </w:rPr>

</xml_diff>

<commit_message>
Final touches added, project done
</commit_message>
<xml_diff>
--- a/pyros_be/controllers/audit_template.docx
+++ b/pyros_be/controllers/audit_template.docx
@@ -73,7 +73,7 @@
     </w:p>
     <w:sdt>
       <w:sdtPr>
-        <w:id w:val="2123348276"/>
+        <w:id w:val="-410517175"/>
         <w:docPartObj>
           <w:docPartGallery w:val="Table of Contents"/>
           <w:docPartUnique w:val="1"/>
@@ -1744,7 +1744,7 @@
         <w:rPr>
           <w:rtl w:val="0"/>
         </w:rPr>
-        <w:t xml:space="preserve">Az energiaköltségek vizsgálata során ${fine} Ft összeget tártunk fel, mint felelős gazdálkodással és odafigyeléssel megtakarítható költség. A költségek vizsgálatából az energiahordozók fajlagos értékei:</w:t>
+        <w:t xml:space="preserve">Az energiaköltségek vizsgálata során &lt;BÜNTETÉS ÖSSZEGE&gt; Ft összeget tártunk fel, mint felelős gazdálkodással és odafigyeléssel megtakarítható költség. A költségek vizsgálatából az energiahordozók fajlagos értékei:</w:t>
       </w:r>
     </w:p>
     <w:p>
@@ -3896,7 +3896,7 @@
         <w:rPr>
           <w:rtl w:val="0"/>
         </w:rPr>
-        <w:t xml:space="preserve">Szállítás energetikai értékelése</w:t>
+        <w:t xml:space="preserve">8.Szállítás energetikai értékelése</w:t>
       </w:r>
     </w:p>
     <w:p>
@@ -3919,6 +3919,17 @@
           <w:rtl w:val="0"/>
         </w:rPr>
         <w:t xml:space="preserve">${vehicle_listing}</w:t>
+      </w:r>
+    </w:p>
+    <w:p>
+      <w:pPr>
+        <w:rPr/>
+      </w:pPr>
+      <w:r>
+        <w:rPr>
+          <w:rtl w:val="0"/>
+        </w:rPr>
+        <w:t xml:space="preserve">${block_technology}</w:t>
       </w:r>
     </w:p>
     <w:p>
@@ -3948,6 +3959,17 @@
     </w:p>
     <w:p>
       <w:pPr>
+        <w:rPr/>
+      </w:pPr>
+      <w:r>
+        <w:rPr>
+          <w:rtl w:val="0"/>
+        </w:rPr>
+        <w:t xml:space="preserve">${/block_technology}</w:t>
+      </w:r>
+    </w:p>
+    <w:p>
+      <w:pPr>
         <w:pStyle w:val="Heading1"/>
         <w:rPr/>
       </w:pPr>
@@ -3957,7 +3979,7 @@
         <w:rPr>
           <w:rtl w:val="0"/>
         </w:rPr>
-        <w:t xml:space="preserve">A fogyasztások felosztása</w:t>
+        <w:t xml:space="preserve">${technology_offset_index}.A fogyasztások felosztása</w:t>
       </w:r>
     </w:p>
     <w:p>
@@ -4252,119 +4274,29 @@
         <w:rPr>
           <w:rtl w:val="0"/>
         </w:rPr>
-        <w:t xml:space="preserve">Energia teljesítmény mutató meghatározása</w:t>
-      </w:r>
-    </w:p>
-    <w:p>
-      <w:pPr>
-        <w:rPr/>
-      </w:pPr>
-      <w:r>
-        <w:rPr>
-          <w:rtl w:val="0"/>
-        </w:rPr>
-        <w:t xml:space="preserve">Minden gazdálkodó szervezet esetében fontos, hogy ne önmagában kerüljön meghatározásra az energiafogyasztás. Az ETM (Energia Teljesítmény Mutató) olyan mérőszám, amely az energiafelhasználást egy releváns teljesítményjellemzőhöz – például termelési mennyiséghez, alapterülethez vagy üzemórához – viszonyítva teszi mérhetővé és összehasonlíthatóvá az energetikai teljesítményt. A ${company_name} gazdálkodásában ez a mutató a ${product_name}. A ${audit_interval} időszak ${product_name} számai az alábbi táblázat szerint alakultak:</w:t>
-      </w:r>
-    </w:p>
-    <w:tbl>
-      <w:tblPr>
-        <w:tblStyle w:val="Table5"/>
-        <w:tblW w:w="9016.0" w:type="dxa"/>
-        <w:jc w:val="left"/>
-        <w:tblBorders>
-          <w:top w:color="000000" w:space="0" w:sz="4" w:val="single"/>
-          <w:left w:color="000000" w:space="0" w:sz="4" w:val="single"/>
-          <w:bottom w:color="000000" w:space="0" w:sz="4" w:val="single"/>
-          <w:right w:color="000000" w:space="0" w:sz="4" w:val="single"/>
-          <w:insideH w:color="000000" w:space="0" w:sz="4" w:val="single"/>
-          <w:insideV w:color="000000" w:space="0" w:sz="4" w:val="single"/>
-        </w:tblBorders>
-        <w:tblLayout w:type="fixed"/>
-        <w:tblLook w:val="0400"/>
-      </w:tblPr>
-      <w:tblGrid>
-        <w:gridCol w:w="4508"/>
-        <w:gridCol w:w="4508"/>
-        <w:tblGridChange w:id="0">
-          <w:tblGrid>
-            <w:gridCol w:w="4508"/>
-            <w:gridCol w:w="4508"/>
-          </w:tblGrid>
-        </w:tblGridChange>
-      </w:tblGrid>
-      <w:tr>
-        <w:trPr>
-          <w:cantSplit w:val="0"/>
-          <w:tblHeader w:val="0"/>
-        </w:trPr>
-        <w:tc>
-          <w:tcPr/>
-          <w:p>
-            <w:pPr>
-              <w:rPr/>
-            </w:pPr>
-            <w:r>
-              <w:rPr>
-                <w:rtl w:val="0"/>
-              </w:rPr>
-            </w:r>
-          </w:p>
-        </w:tc>
-        <w:tc>
-          <w:tcPr/>
-          <w:p>
-            <w:pPr>
-              <w:rPr/>
-            </w:pPr>
-            <w:r>
-              <w:rPr>
-                <w:rtl w:val="0"/>
-              </w:rPr>
-            </w:r>
-          </w:p>
-        </w:tc>
-      </w:tr>
-      <w:tr>
-        <w:trPr>
-          <w:cantSplit w:val="0"/>
-          <w:tblHeader w:val="0"/>
-        </w:trPr>
-        <w:tc>
-          <w:tcPr/>
-          <w:p>
-            <w:pPr>
-              <w:rPr/>
-            </w:pPr>
-            <w:r>
-              <w:rPr>
-                <w:rtl w:val="0"/>
-              </w:rPr>
-            </w:r>
-          </w:p>
-        </w:tc>
-        <w:tc>
-          <w:tcPr/>
-          <w:p>
-            <w:pPr>
-              <w:rPr/>
-            </w:pPr>
-            <w:r>
-              <w:rPr>
-                <w:rtl w:val="0"/>
-              </w:rPr>
-            </w:r>
-          </w:p>
-        </w:tc>
-      </w:tr>
-    </w:tbl>
-    <w:p>
-      <w:pPr>
-        <w:rPr/>
-      </w:pPr>
-      <w:r>
-        <w:rPr>
-          <w:rtl w:val="0"/>
-        </w:rPr>
+        <w:t xml:space="preserve">${technology_offset_2_index}.Energia teljesítmény mutató meghatározása</w:t>
+      </w:r>
+    </w:p>
+    <w:p>
+      <w:pPr>
+        <w:rPr/>
+      </w:pPr>
+      <w:r>
+        <w:rPr>
+          <w:rtl w:val="0"/>
+        </w:rPr>
+        <w:t xml:space="preserve">Minden gazdálkodó szervezet esetében fontos, hogy ne önmagában kerüljön meghatározásra az energiafogyasztás. Az ETM (Energia Teljesítmény Mutató) olyan mérőszám, amely az energiafelhasználást egy releváns teljesítmény jellemzőhöz – például termelési mennyiséghez, alapterülethez vagy üzemórához – viszonyítva teszi mérhetővé és összehasonlíthatóvá az energetikai teljesítményt. A ${company_name} gazdálkodásában ez a mutató a ${product_name}. A ${audit_interval} időszak termelés számai az alábbi táblázat szerint alakultak:</w:t>
+      </w:r>
+    </w:p>
+    <w:p>
+      <w:pPr>
+        <w:rPr/>
+      </w:pPr>
+      <w:r>
+        <w:rPr>
+          <w:rtl w:val="0"/>
+        </w:rPr>
+        <w:t xml:space="preserve">${product_listing}</w:t>
       </w:r>
     </w:p>
     <w:p>
@@ -4389,7 +4321,23 @@
         <w:rPr>
           <w:rtl w:val="0"/>
         </w:rPr>
-        <w:t xml:space="preserve">Javaslatok és források</w:t>
+        <w:t xml:space="preserve">${technology_offset_3_index}.Javaslatok és források</w:t>
+      </w:r>
+    </w:p>
+    <w:p>
+      <w:pPr>
+        <w:rPr/>
+      </w:pPr>
+      <w:r>
+        <w:rPr>
+          <w:rtl w:val="0"/>
+        </w:rPr>
+        <w:t xml:space="preserve">${replaceable_listing}</w:t>
+      </w:r>
+      <w:r>
+        <w:rPr>
+          <w:rtl w:val="0"/>
+        </w:rPr>
       </w:r>
     </w:p>
     <w:sectPr>
@@ -4628,22 +4576,6 @@
     </w:tblPr>
   </w:style>
   <w:style w:type="table" w:styleId="Table4">
-    <w:basedOn w:val="TableNormal"/>
-    <w:pPr>
-      <w:spacing w:after="0" w:line="240" w:lineRule="auto"/>
-    </w:pPr>
-    <w:tblPr>
-      <w:tblStyleRowBandSize w:val="1"/>
-      <w:tblStyleColBandSize w:val="1"/>
-      <w:tblCellMar>
-        <w:top w:w="0.0" w:type="dxa"/>
-        <w:left w:w="108.0" w:type="dxa"/>
-        <w:bottom w:w="0.0" w:type="dxa"/>
-        <w:right w:w="108.0" w:type="dxa"/>
-      </w:tblCellMar>
-    </w:tblPr>
-  </w:style>
-  <w:style w:type="table" w:styleId="Table5">
     <w:basedOn w:val="TableNormal"/>
     <w:pPr>
       <w:spacing w:after="0" w:line="240" w:lineRule="auto"/>

</xml_diff>

<commit_message>
3 sections reworked, more tomorrow
</commit_message>
<xml_diff>
--- a/pyros_be/controllers/audit_template.docx
+++ b/pyros_be/controllers/audit_template.docx
@@ -24,15 +24,7 @@
         <w:pStyle w:val="Title"/>
       </w:pPr>
       <w:r>
-        <w:t>${</w:t>
-      </w:r>
-      <w:proofErr w:type="spellStart"/>
-      <w:r>
-        <w:t>company_name</w:t>
-      </w:r>
-      <w:proofErr w:type="spellEnd"/>
-      <w:r>
-        <w:t>}</w:t>
+        <w:t>${company_name}</w:t>
       </w:r>
     </w:p>
     <w:p/>
@@ -1367,23 +1359,13 @@
     </w:p>
     <w:p>
       <w:r>
-        <w:t>A ${</w:t>
-      </w:r>
-      <w:proofErr w:type="spellStart"/>
-      <w:r>
-        <w:t>company_name</w:t>
-      </w:r>
-      <w:proofErr w:type="spellEnd"/>
-      <w:r>
-        <w:t xml:space="preserve">} mindamellett, hogy eleget kíván tenni a számára is kötelezően előírt, az energiahatékonyságról szóló 2015. évi LVII. törvényben foglalt energetikai auditálási kötelezettségeinek, egyúttal a hosszabb távú céljainak elérése érdekében meg kívánja vizsgálni, hogy jelenlegi magyarországi ${telephelyein} milyen energetikai fejlesztési potenciálok találhatóak. A </w:t>
-      </w:r>
-      <w:proofErr w:type="spellStart"/>
-      <w:r>
-        <w:t>Balajti</w:t>
-      </w:r>
-      <w:proofErr w:type="spellEnd"/>
-      <w:r>
-        <w:t xml:space="preserve"> Energetika Kft. ezen veszteségfeltáró auditálási feladatra adott ajánlatával elnyerte a munkát, az alábbi tanulmány ezen elkészült energiahatékonysági audit írásos dokumentációja.</w:t>
+        <w:t>A ${company_name} mindamellett, hogy eleget kíván tenni a számára is kötelezően előírt, az energiahatékonyságról szóló 2015. évi LVII. törvényben foglalt energetikai auditálási kötelezettségeinek, egyúttal a hosszabb távú céljainak elérése érdekében meg kívánja vizsgálni, hogy jelenlegi magyarországi ${telephelyein} milyen energetikai fejlesztési potenciálok találhatóak. A</w:t>
+      </w:r>
+      <w:r>
+        <w:t xml:space="preserve"> </w:t>
+      </w:r>
+      <w:r>
+        <w:t>Balajti Energetika Kft. ezen veszteségfeltáró auditálási feladatra adott ajánlatával elnyerte a munkát, az alábbi tanulmány ezen elkészült energiahatékonysági audit írásos dokumentációja.</w:t>
       </w:r>
     </w:p>
     <w:p>
@@ -1394,23 +1376,7 @@
         </w:rPr>
       </w:pPr>
       <w:r>
-        <w:t>A ${</w:t>
-      </w:r>
-      <w:proofErr w:type="spellStart"/>
-      <w:r>
-        <w:t>company_name</w:t>
-      </w:r>
-      <w:proofErr w:type="spellEnd"/>
-      <w:r>
-        <w:t>} az ${</w:t>
-      </w:r>
-      <w:proofErr w:type="spellStart"/>
-      <w:r>
-        <w:t>audit_interval</w:t>
-      </w:r>
-      <w:proofErr w:type="spellEnd"/>
-      <w:r>
-        <w:t>} időszakban az alábbi fogyasztásokat realizálta:</w:t>
+        <w:t>A ${company_name} az ${audit_interval} időszakban az alábbi fogyasztásokat realizálta:</w:t>
       </w:r>
     </w:p>
     <w:tbl>
@@ -1555,15 +1521,7 @@
           </w:tcPr>
           <w:p>
             <w:r>
-              <w:t>${</w:t>
-            </w:r>
-            <w:proofErr w:type="spellStart"/>
-            <w:r>
-              <w:t>carrier</w:t>
-            </w:r>
-            <w:proofErr w:type="spellEnd"/>
-            <w:r>
-              <w:t>}</w:t>
+              <w:t>${carrier}</w:t>
             </w:r>
           </w:p>
         </w:tc>
@@ -1573,15 +1531,7 @@
           </w:tcPr>
           <w:p>
             <w:r>
-              <w:t>${</w:t>
-            </w:r>
-            <w:proofErr w:type="spellStart"/>
-            <w:r>
-              <w:t>carrier_building</w:t>
-            </w:r>
-            <w:proofErr w:type="spellEnd"/>
-            <w:r>
-              <w:t>}</w:t>
+              <w:t>${carrier_building}</w:t>
             </w:r>
           </w:p>
         </w:tc>
@@ -1591,15 +1541,7 @@
           </w:tcPr>
           <w:p>
             <w:r>
-              <w:t>${</w:t>
-            </w:r>
-            <w:proofErr w:type="spellStart"/>
-            <w:r>
-              <w:t>carrier_product</w:t>
-            </w:r>
-            <w:proofErr w:type="spellEnd"/>
-            <w:r>
-              <w:t>}</w:t>
+              <w:t>${carrier_product}</w:t>
             </w:r>
           </w:p>
         </w:tc>
@@ -1609,15 +1551,7 @@
           </w:tcPr>
           <w:p>
             <w:r>
-              <w:t>${</w:t>
-            </w:r>
-            <w:proofErr w:type="spellStart"/>
-            <w:r>
-              <w:t>carrier_vehicle</w:t>
-            </w:r>
-            <w:proofErr w:type="spellEnd"/>
-            <w:r>
-              <w:t>}</w:t>
+              <w:t>${carrier_vehicle}</w:t>
             </w:r>
           </w:p>
         </w:tc>
@@ -1627,15 +1561,7 @@
           </w:tcPr>
           <w:p>
             <w:r>
-              <w:t>${</w:t>
-            </w:r>
-            <w:proofErr w:type="spellStart"/>
-            <w:r>
-              <w:t>carrier_total</w:t>
-            </w:r>
-            <w:proofErr w:type="spellEnd"/>
-            <w:r>
-              <w:t>}</w:t>
+              <w:t>${carrier_total}</w:t>
             </w:r>
           </w:p>
         </w:tc>
@@ -1643,40 +1569,13 @@
     </w:tbl>
     <w:p/>
     <w:p>
-      <w:pPr>
-        <w:jc w:val="center"/>
-      </w:pPr>
-      <w:r>
-        <w:t>${</w:t>
-      </w:r>
-      <w:proofErr w:type="spellStart"/>
-      <w:r>
-        <w:t>sankey_diagram</w:t>
-      </w:r>
-      <w:proofErr w:type="spellEnd"/>
-      <w:r>
-        <w:t>}</w:t>
-      </w:r>
-    </w:p>
-    <w:p>
-      <w:r>
-        <w:t xml:space="preserve"> A ${</w:t>
-      </w:r>
-      <w:proofErr w:type="spellStart"/>
-      <w:r>
-        <w:t>company_name</w:t>
-      </w:r>
-      <w:proofErr w:type="spellEnd"/>
-      <w:r>
-        <w:t xml:space="preserve">} vizsgálata alapján az </w:t>
-      </w:r>
-      <w:proofErr w:type="spellStart"/>
-      <w:r>
-        <w:t>auditor</w:t>
-      </w:r>
-      <w:proofErr w:type="spellEnd"/>
-      <w:r>
-        <w:t xml:space="preserve"> az alábbi megtakarítási potenciálokat találta:</w:t>
+      <w:r>
+        <w:t>${sankey_diagram}</w:t>
+      </w:r>
+    </w:p>
+    <w:p>
+      <w:r>
+        <w:t xml:space="preserve"> A ${company_name} vizsgálata alapján az auditor az alábbi megtakarítási potenciálokat találta:</w:t>
       </w:r>
     </w:p>
     <w:p>
@@ -1692,153 +1591,133 @@
     </w:p>
     <w:p>
       <w:r>
-        <w:t>A(z) ${</w:t>
-      </w:r>
-      <w:proofErr w:type="spellStart"/>
-      <w:r>
-        <w:t>company_</w:t>
-      </w:r>
-      <w:proofErr w:type="gramStart"/>
-      <w:r>
-        <w:t>name</w:t>
-      </w:r>
-      <w:proofErr w:type="spellEnd"/>
-      <w:r>
-        <w:t>}-</w:t>
-      </w:r>
-      <w:proofErr w:type="gramEnd"/>
-      <w:r>
-        <w:t>t ${</w:t>
-      </w:r>
-      <w:proofErr w:type="spellStart"/>
-      <w:r>
-        <w:t>foundation_</w:t>
-      </w:r>
-      <w:proofErr w:type="gramStart"/>
-      <w:r>
-        <w:t>year</w:t>
-      </w:r>
-      <w:proofErr w:type="spellEnd"/>
-      <w:r>
-        <w:t>}-</w:t>
-      </w:r>
-      <w:proofErr w:type="gramEnd"/>
-      <w:r>
-        <w:t>ban/</w:t>
-      </w:r>
-      <w:proofErr w:type="spellStart"/>
-      <w:r>
-        <w:t>ben</w:t>
-      </w:r>
-      <w:proofErr w:type="spellEnd"/>
-      <w:r>
-        <w:t xml:space="preserve"> alapították, ${</w:t>
-      </w:r>
-      <w:proofErr w:type="spellStart"/>
-      <w:r>
-        <w:t>owner_</w:t>
-      </w:r>
-      <w:proofErr w:type="gramStart"/>
-      <w:r>
-        <w:t>percentage</w:t>
-      </w:r>
-      <w:proofErr w:type="spellEnd"/>
-      <w:r>
-        <w:t>}  tulajdonban</w:t>
-      </w:r>
-      <w:proofErr w:type="gramEnd"/>
-      <w:r>
-        <w:t xml:space="preserve"> álló vállalkozás.  Fő tevékenysége a ${</w:t>
-      </w:r>
-      <w:proofErr w:type="spellStart"/>
-      <w:r>
-        <w:t>company_product</w:t>
-      </w:r>
-      <w:proofErr w:type="spellEnd"/>
-      <w:r>
-        <w:t xml:space="preserve">}. Székhelye </w:t>
-      </w:r>
-      <w:proofErr w:type="gramStart"/>
-      <w:r>
-        <w:t>a  $</w:t>
-      </w:r>
-      <w:proofErr w:type="gramEnd"/>
-      <w:r>
-        <w:t>{</w:t>
-      </w:r>
-      <w:proofErr w:type="spellStart"/>
-      <w:r>
-        <w:t>company_place</w:t>
-      </w:r>
-      <w:proofErr w:type="spellEnd"/>
-      <w:r>
-        <w:t>} alatt van.</w:t>
-      </w:r>
-    </w:p>
-    <w:p>
-      <w:r>
-        <w:t>A ${</w:t>
-      </w:r>
-      <w:proofErr w:type="spellStart"/>
-      <w:r>
-        <w:t>data_year</w:t>
-      </w:r>
-      <w:proofErr w:type="spellEnd"/>
-      <w:r>
-        <w:t>} év adatai alapján az alkalmazotti létszáma ${</w:t>
-      </w:r>
-      <w:proofErr w:type="spellStart"/>
-      <w:r>
-        <w:t>employee_count</w:t>
-      </w:r>
-      <w:proofErr w:type="spellEnd"/>
-      <w:r>
-        <w:t>} fő, a ${</w:t>
-      </w:r>
-      <w:proofErr w:type="spellStart"/>
-      <w:r>
-        <w:t>data_year</w:t>
-      </w:r>
-      <w:proofErr w:type="spellEnd"/>
-      <w:r>
-        <w:t>} évi árbevétele ${profit}</w:t>
-      </w:r>
-      <w:proofErr w:type="spellStart"/>
-      <w:r>
-        <w:t>eFt</w:t>
-      </w:r>
-      <w:proofErr w:type="spellEnd"/>
-      <w:r>
-        <w:t xml:space="preserve"> volt. Az audit készítésének idején a telephely(</w:t>
-      </w:r>
-      <w:proofErr w:type="spellStart"/>
-      <w:r>
-        <w:t>ek</w:t>
-      </w:r>
-      <w:proofErr w:type="spellEnd"/>
-      <w:r>
-        <w:t>)</w:t>
-      </w:r>
-      <w:proofErr w:type="spellStart"/>
-      <w:r>
-        <w:t>en</w:t>
-      </w:r>
-      <w:proofErr w:type="spellEnd"/>
-      <w:r>
-        <w:t xml:space="preserve"> az alábbi tevékenységek és munkarendek kerültek megállapításra:</w:t>
-      </w:r>
-    </w:p>
-    <w:p>
-      <w:r>
-        <w:t>${</w:t>
-      </w:r>
-      <w:proofErr w:type="spellStart"/>
-      <w:r>
-        <w:t>complex_data</w:t>
-      </w:r>
-      <w:proofErr w:type="spellEnd"/>
-      <w:r>
-        <w:t>}</w:t>
+        <w:t>A(z) ${company_name}-t ${foundation_year}-ban/ben alapították, ${owner_percentage}  tulajdonban álló vállalkozás.  Fő tevékenysége a ${company_product}. Székhelye a  ${company_place} alatt van.</w:t>
+      </w:r>
+    </w:p>
+    <w:p>
+      <w:r>
+        <w:t>A ${data_year} év adatai alapján az alkalmazotti létszáma ${employee_count} fő, a ${data_year} évi árbevétele ${profit}eFt volt. Az audit készítésének idején a telephely(ek)en az alábbi tevékenységek és munkarendek kerültek megállapításra:</w:t>
+      </w:r>
+    </w:p>
+    <w:p>
+      <w:r>
+        <w:t>${block_complex}</w:t>
+      </w:r>
+    </w:p>
+    <w:tbl>
+      <w:tblPr>
+        <w:tblStyle w:val="TableGrid"/>
+        <w:tblW w:w="0" w:type="auto"/>
+        <w:tblLook w:val="04A0" w:firstRow="1" w:lastRow="0" w:firstColumn="1" w:lastColumn="0" w:noHBand="0" w:noVBand="1"/>
+      </w:tblPr>
+      <w:tblGrid>
+        <w:gridCol w:w="399"/>
+        <w:gridCol w:w="4764"/>
+        <w:gridCol w:w="3853"/>
+      </w:tblGrid>
+      <w:tr>
+        <w:tc>
+          <w:tcPr>
+            <w:tcW w:w="279" w:type="dxa"/>
+          </w:tcPr>
+          <w:p>
+            <w:pPr>
+              <w:rPr>
+                <w:b/>
+                <w:bCs/>
+              </w:rPr>
+            </w:pPr>
+          </w:p>
+        </w:tc>
+        <w:tc>
+          <w:tcPr>
+            <w:tcW w:w="8737" w:type="dxa"/>
+            <w:gridSpan w:val="2"/>
+          </w:tcPr>
+          <w:p>
+            <w:pPr>
+              <w:ind w:left="720" w:hanging="720"/>
+              <w:rPr>
+                <w:b/>
+                <w:bCs/>
+              </w:rPr>
+            </w:pPr>
+            <w:r>
+              <w:rPr>
+                <w:b/>
+                <w:bCs/>
+              </w:rPr>
+              <w:t>${complex_name}</w:t>
+            </w:r>
+          </w:p>
+        </w:tc>
+      </w:tr>
+      <w:tr>
+        <w:tc>
+          <w:tcPr>
+            <w:tcW w:w="279" w:type="dxa"/>
+          </w:tcPr>
+          <w:p>
+            <w:pPr>
+              <w:rPr>
+                <w:color w:val="FFFFFF" w:themeColor="background1"/>
+                <w:sz w:val="2"/>
+                <w:szCs w:val="2"/>
+              </w:rPr>
+            </w:pPr>
+            <w:r>
+              <w:rPr>
+                <w:color w:val="FFFFFF" w:themeColor="background1"/>
+                <w:sz w:val="2"/>
+                <w:szCs w:val="2"/>
+              </w:rPr>
+              <w:t>${function_shift_row}</w:t>
+            </w:r>
+          </w:p>
+          <w:p>
+            <w:pPr>
+              <w:rPr>
+                <w:color w:val="FFFFFF" w:themeColor="background1"/>
+                <w:sz w:val="2"/>
+                <w:szCs w:val="2"/>
+              </w:rPr>
+            </w:pPr>
+          </w:p>
+          <w:p>
+            <w:pPr>
+              <w:rPr>
+                <w:color w:val="FFFFFF" w:themeColor="background1"/>
+                <w:sz w:val="2"/>
+                <w:szCs w:val="2"/>
+              </w:rPr>
+            </w:pPr>
+          </w:p>
+        </w:tc>
+        <w:tc>
+          <w:tcPr>
+            <w:tcW w:w="4831" w:type="dxa"/>
+          </w:tcPr>
+          <w:p>
+            <w:r>
+              <w:t>${complex_function}</w:t>
+            </w:r>
+          </w:p>
+        </w:tc>
+        <w:tc>
+          <w:tcPr>
+            <w:tcW w:w="3906" w:type="dxa"/>
+          </w:tcPr>
+          <w:p>
+            <w:r>
+              <w:t>${complex_shift}</w:t>
+            </w:r>
+          </w:p>
+        </w:tc>
+      </w:tr>
+    </w:tbl>
+    <w:p>
+      <w:r>
+        <w:t>${/block_complex}</w:t>
       </w:r>
     </w:p>
     <w:p>
@@ -1854,44 +1733,160 @@
     </w:p>
     <w:p>
       <w:r>
-        <w:t>A ${</w:t>
-      </w:r>
-      <w:proofErr w:type="spellStart"/>
-      <w:r>
-        <w:t>company_</w:t>
-      </w:r>
-      <w:proofErr w:type="gramStart"/>
-      <w:r>
-        <w:t>name</w:t>
-      </w:r>
-      <w:proofErr w:type="spellEnd"/>
-      <w:r>
-        <w:t>}a</w:t>
-      </w:r>
-      <w:proofErr w:type="gramEnd"/>
-      <w:r>
-        <w:t xml:space="preserve"> vizsgálati időszakban (${</w:t>
-      </w:r>
-      <w:proofErr w:type="spellStart"/>
-      <w:r>
-        <w:t>audit_interval</w:t>
-      </w:r>
-      <w:proofErr w:type="spellEnd"/>
-      <w:r>
-        <w:t>}) mért energiafogyasztási adatait az alábbi táblázatok foglalják össze:</w:t>
-      </w:r>
-    </w:p>
-    <w:p>
-      <w:r>
-        <w:t>${</w:t>
-      </w:r>
-      <w:proofErr w:type="spellStart"/>
-      <w:r>
-        <w:t>standings_data_by_complex</w:t>
-      </w:r>
-      <w:proofErr w:type="spellEnd"/>
-      <w:r>
-        <w:t>}</w:t>
+        <w:t>A ${company_name}a vizsgálati időszakban (${audit_interval}) mért energiafogyasztási adatait az alábbi táblázatok foglalják össze:</w:t>
+      </w:r>
+    </w:p>
+    <w:p>
+      <w:r>
+        <w:t>${block_consumption}</w:t>
+      </w:r>
+    </w:p>
+    <w:tbl>
+      <w:tblPr>
+        <w:tblStyle w:val="TableGrid"/>
+        <w:tblW w:w="0" w:type="auto"/>
+        <w:tblLook w:val="04A0" w:firstRow="1" w:lastRow="0" w:firstColumn="1" w:lastColumn="0" w:noHBand="0" w:noVBand="1"/>
+      </w:tblPr>
+      <w:tblGrid>
+        <w:gridCol w:w="505"/>
+        <w:gridCol w:w="2831"/>
+        <w:gridCol w:w="2793"/>
+        <w:gridCol w:w="2887"/>
+      </w:tblGrid>
+      <w:tr>
+        <w:tc>
+          <w:tcPr>
+            <w:tcW w:w="505" w:type="dxa"/>
+          </w:tcPr>
+          <w:p>
+            <w:pPr>
+              <w:jc w:val="center"/>
+            </w:pPr>
+          </w:p>
+        </w:tc>
+        <w:tc>
+          <w:tcPr>
+            <w:tcW w:w="8511" w:type="dxa"/>
+            <w:gridSpan w:val="3"/>
+          </w:tcPr>
+          <w:p>
+            <w:pPr>
+              <w:jc w:val="center"/>
+            </w:pPr>
+            <w:r>
+              <w:t>Telephely: ${consumption_complex_name}</w:t>
+            </w:r>
+          </w:p>
+        </w:tc>
+      </w:tr>
+      <w:tr>
+        <w:tc>
+          <w:tcPr>
+            <w:tcW w:w="505" w:type="dxa"/>
+          </w:tcPr>
+          <w:p>
+            <w:pPr>
+              <w:jc w:val="center"/>
+            </w:pPr>
+          </w:p>
+        </w:tc>
+        <w:tc>
+          <w:tcPr>
+            <w:tcW w:w="2831" w:type="dxa"/>
+          </w:tcPr>
+          <w:p>
+            <w:pPr>
+              <w:jc w:val="center"/>
+            </w:pPr>
+            <w:r>
+              <w:t>Hónap</w:t>
+            </w:r>
+          </w:p>
+        </w:tc>
+        <w:tc>
+          <w:tcPr>
+            <w:tcW w:w="2793" w:type="dxa"/>
+          </w:tcPr>
+          <w:p>
+            <w:pPr>
+              <w:jc w:val="center"/>
+            </w:pPr>
+            <w:r>
+              <w:t>Energiahordozó</w:t>
+            </w:r>
+          </w:p>
+        </w:tc>
+        <w:tc>
+          <w:tcPr>
+            <w:tcW w:w="2887" w:type="dxa"/>
+          </w:tcPr>
+          <w:p>
+            <w:pPr>
+              <w:jc w:val="center"/>
+            </w:pPr>
+            <w:r>
+              <w:t>Fogyasztás</w:t>
+            </w:r>
+          </w:p>
+        </w:tc>
+      </w:tr>
+      <w:tr>
+        <w:tc>
+          <w:tcPr>
+            <w:tcW w:w="505" w:type="dxa"/>
+          </w:tcPr>
+          <w:p>
+            <w:pPr>
+              <w:rPr>
+                <w:sz w:val="2"/>
+                <w:szCs w:val="2"/>
+              </w:rPr>
+            </w:pPr>
+            <w:r>
+              <w:rPr>
+                <w:color w:val="FFFFFF" w:themeColor="background1"/>
+                <w:sz w:val="2"/>
+                <w:szCs w:val="2"/>
+              </w:rPr>
+              <w:t>${consumption_month_row}</w:t>
+            </w:r>
+          </w:p>
+        </w:tc>
+        <w:tc>
+          <w:tcPr>
+            <w:tcW w:w="2831" w:type="dxa"/>
+          </w:tcPr>
+          <w:p>
+            <w:r>
+              <w:t>${consumption_month}</w:t>
+            </w:r>
+          </w:p>
+        </w:tc>
+        <w:tc>
+          <w:tcPr>
+            <w:tcW w:w="2793" w:type="dxa"/>
+          </w:tcPr>
+          <w:p>
+            <w:r>
+              <w:t>${consumption_carrier}</w:t>
+            </w:r>
+          </w:p>
+        </w:tc>
+        <w:tc>
+          <w:tcPr>
+            <w:tcW w:w="2887" w:type="dxa"/>
+          </w:tcPr>
+          <w:p>
+            <w:r>
+              <w:t>${consumption_amount}</w:t>
+            </w:r>
+          </w:p>
+        </w:tc>
+      </w:tr>
+    </w:tbl>
+    <w:p>
+      <w:r>
+        <w:t>${/block_consumption}</w:t>
       </w:r>
     </w:p>
     <w:p>
@@ -1907,45 +1902,113 @@
     </w:p>
     <w:p>
       <w:r>
-        <w:t>A ${</w:t>
-      </w:r>
-      <w:proofErr w:type="spellStart"/>
-      <w:r>
-        <w:t>company_name</w:t>
-      </w:r>
-      <w:proofErr w:type="spellEnd"/>
-      <w:r>
-        <w:t>} az alábbi mérőkkel, illetve számított fogyasztásokkal rendelkezik:</w:t>
-      </w:r>
-    </w:p>
-    <w:p>
-      <w:pPr>
-        <w:rPr>
-          <w:i/>
-          <w:iCs/>
-        </w:rPr>
-      </w:pPr>
-      <w:r>
-        <w:t>${</w:t>
-      </w:r>
-      <w:proofErr w:type="spellStart"/>
-      <w:r>
-        <w:t>standing_hierarchy</w:t>
-      </w:r>
-      <w:proofErr w:type="spellEnd"/>
-      <w:r>
-        <w:t>}</w:t>
-      </w:r>
-    </w:p>
-    <w:p>
-      <w:pPr>
-        <w:ind w:left="4253" w:hanging="4253"/>
-        <w:rPr>
-          <w:i/>
-          <w:iCs/>
-        </w:rPr>
-      </w:pPr>
-    </w:p>
+        <w:t>A ${company_name} az alábbi mérőkkel, illetve számított fogyasztásokkal rendelkezik:</w:t>
+      </w:r>
+    </w:p>
+    <w:tbl>
+      <w:tblPr>
+        <w:tblStyle w:val="TableGrid"/>
+        <w:tblW w:w="0" w:type="auto"/>
+        <w:tblLook w:val="04A0" w:firstRow="1" w:lastRow="0" w:firstColumn="1" w:lastColumn="0" w:noHBand="0" w:noVBand="1"/>
+      </w:tblPr>
+      <w:tblGrid>
+        <w:gridCol w:w="3006"/>
+        <w:gridCol w:w="3004"/>
+        <w:gridCol w:w="3006"/>
+      </w:tblGrid>
+      <w:tr>
+        <w:tc>
+          <w:tcPr>
+            <w:tcW w:w="3005" w:type="dxa"/>
+          </w:tcPr>
+          <w:p>
+            <w:pPr>
+              <w:jc w:val="center"/>
+            </w:pPr>
+            <w:r>
+              <w:t>Főmérő</w:t>
+            </w:r>
+          </w:p>
+        </w:tc>
+        <w:tc>
+          <w:tcPr>
+            <w:tcW w:w="3005" w:type="dxa"/>
+          </w:tcPr>
+          <w:p>
+            <w:pPr>
+              <w:jc w:val="center"/>
+            </w:pPr>
+            <w:r>
+              <w:t>Almérői</w:t>
+            </w:r>
+          </w:p>
+        </w:tc>
+        <w:tc>
+          <w:tcPr>
+            <w:tcW w:w="3006" w:type="dxa"/>
+          </w:tcPr>
+          <w:p>
+            <w:pPr>
+              <w:jc w:val="center"/>
+            </w:pPr>
+            <w:r>
+              <w:t>Fogyasztás</w:t>
+            </w:r>
+          </w:p>
+        </w:tc>
+      </w:tr>
+      <w:tr>
+        <w:tc>
+          <w:tcPr>
+            <w:tcW w:w="3005" w:type="dxa"/>
+          </w:tcPr>
+          <w:p>
+            <w:r>
+              <w:t>${network_mainstanding</w:t>
+            </w:r>
+            <w:r>
+              <w:t>#1</w:t>
+            </w:r>
+            <w:r>
+              <w:t>}</w:t>
+            </w:r>
+          </w:p>
+        </w:tc>
+        <w:tc>
+          <w:tcPr>
+            <w:tcW w:w="3005" w:type="dxa"/>
+          </w:tcPr>
+          <w:p>
+            <w:r>
+              <w:t>${network_subto</w:t>
+            </w:r>
+            <w:r>
+              <w:t>#1</w:t>
+            </w:r>
+            <w:r>
+              <w:t>}</w:t>
+            </w:r>
+          </w:p>
+        </w:tc>
+        <w:tc>
+          <w:tcPr>
+            <w:tcW w:w="3006" w:type="dxa"/>
+          </w:tcPr>
+          <w:p>
+            <w:r>
+              <w:t>${network_consumption</w:t>
+            </w:r>
+            <w:r>
+              <w:t>#</w:t>
+            </w:r>
+            <w:r>
+              <w:t>1}</w:t>
+            </w:r>
+          </w:p>
+        </w:tc>
+      </w:tr>
+    </w:tbl>
+    <w:p/>
     <w:p>
       <w:pPr>
         <w:pStyle w:val="Heading1"/>
@@ -1959,15 +2022,7 @@
     </w:p>
     <w:p>
       <w:r>
-        <w:t>A ${</w:t>
-      </w:r>
-      <w:proofErr w:type="spellStart"/>
-      <w:r>
-        <w:t>company_name</w:t>
-      </w:r>
-      <w:proofErr w:type="spellEnd"/>
-      <w:r>
-        <w:t>} energiaköltségeinek vizsgálata során az alábbi tényértékeket tudtuk rögzíteni:</w:t>
+        <w:t>A ${company_name} energiaköltségeinek vizsgálata során az alábbi tényértékeket tudtuk rögzíteni:</w:t>
       </w:r>
     </w:p>
     <w:p/>
@@ -1979,83 +2034,22 @@
     <w:p/>
     <w:p>
       <w:r>
-        <w:t>Megtérülési számításainkban a földgáz és villamos energia esetében az amszterdami földgáz-, és villamosenergia tőzsde aktuálisan legtávolabbi időpontra leköthető egységárait vesszük alapul, egyéb energiahordozók esetében az auditírás időpontjában elérhető piaci egységárral számolunk. Az auditkészítés időpontjában, azaz ${</w:t>
-      </w:r>
-      <w:proofErr w:type="spellStart"/>
-      <w:r>
-        <w:t>current_</w:t>
-      </w:r>
-      <w:proofErr w:type="gramStart"/>
-      <w:r>
-        <w:t>date</w:t>
-      </w:r>
-      <w:proofErr w:type="spellEnd"/>
-      <w:r>
-        <w:t>}-</w:t>
-      </w:r>
-      <w:proofErr w:type="gramEnd"/>
-      <w:r>
-        <w:t>n elérhető legtávolabbi energiahordozó egységárak:</w:t>
-      </w:r>
-    </w:p>
-    <w:p>
-      <w:r>
-        <w:t>Földgáz: ${</w:t>
-      </w:r>
-      <w:proofErr w:type="spellStart"/>
-      <w:r>
-        <w:t>natural_gas_price</w:t>
-      </w:r>
-      <w:proofErr w:type="spellEnd"/>
-      <w:r>
-        <w:t>} EUR/</w:t>
-      </w:r>
-      <w:proofErr w:type="spellStart"/>
-      <w:r>
-        <w:t>MWh</w:t>
-      </w:r>
-      <w:proofErr w:type="spellEnd"/>
-    </w:p>
-    <w:p>
-      <w:r>
-        <w:t xml:space="preserve">Villamos </w:t>
-      </w:r>
-      <w:proofErr w:type="gramStart"/>
-      <w:r>
-        <w:t>energia:  $</w:t>
-      </w:r>
-      <w:proofErr w:type="gramEnd"/>
-      <w:r>
-        <w:t>{</w:t>
-      </w:r>
-      <w:proofErr w:type="spellStart"/>
-      <w:r>
-        <w:t>electric_energy_price</w:t>
-      </w:r>
-      <w:proofErr w:type="spellEnd"/>
-      <w:r>
-        <w:t>} EUR/</w:t>
-      </w:r>
-      <w:proofErr w:type="spellStart"/>
-      <w:r>
-        <w:t>MWh</w:t>
-      </w:r>
-      <w:proofErr w:type="spellEnd"/>
-      <w:r>
-        <w:t>.</w:t>
-      </w:r>
-    </w:p>
-    <w:p>
-      <w:r>
-        <w:t>Az érvényes Euro árfolyam: ${</w:t>
-      </w:r>
-      <w:proofErr w:type="spellStart"/>
-      <w:r>
-        <w:t>eur_huf_rate</w:t>
-      </w:r>
-      <w:proofErr w:type="spellEnd"/>
-      <w:r>
-        <w:t>} Ft/EURO</w:t>
+        <w:t>Megtérülési számításainkban a földgáz és villamos energia esetében az amszterdami földgáz-, és villamosenergia tőzsde aktuálisan legtávolabbi időpontra leköthető egységárait vesszük alapul, egyéb energiahordozók esetében az auditírás időpontjában elérhető piaci egységárral számolunk. Az auditkészítés időpontjában, azaz ${current_date}-n elérhető legtávolabbi energiahordozó egységárak:</w:t>
+      </w:r>
+    </w:p>
+    <w:p>
+      <w:r>
+        <w:t>Földgáz: ${natural_gas_price} EUR/MWh</w:t>
+      </w:r>
+    </w:p>
+    <w:p>
+      <w:r>
+        <w:t>Villamos energia:  ${electric_energy_price} EUR/MWh.</w:t>
+      </w:r>
+    </w:p>
+    <w:p>
+      <w:r>
+        <w:t>Az érvényes Euro árfolyam: ${eur_huf_rate} Ft/EURO</w:t>
       </w:r>
     </w:p>
     <w:p>
@@ -2388,17 +2382,8 @@
                 <w:i/>
                 <w:iCs/>
               </w:rPr>
-              <w:t>7,5 Ft/</w:t>
-            </w:r>
-            <w:proofErr w:type="spellStart"/>
-            <w:r>
-              <w:rPr>
-                <w:i/>
-                <w:iCs/>
-              </w:rPr>
-              <w:t>MWh</w:t>
-            </w:r>
-            <w:proofErr w:type="spellEnd"/>
+              <w:t>7,5 Ft/MWh</w:t>
+            </w:r>
           </w:p>
         </w:tc>
       </w:tr>
@@ -2472,17 +2457,8 @@
                 <w:i/>
                 <w:iCs/>
               </w:rPr>
-              <w:t>1,5 Ft/</w:t>
-            </w:r>
-            <w:proofErr w:type="spellStart"/>
-            <w:r>
-              <w:rPr>
-                <w:i/>
-                <w:iCs/>
-              </w:rPr>
-              <w:t>MWh</w:t>
-            </w:r>
-            <w:proofErr w:type="spellEnd"/>
+              <w:t>1,5 Ft/MWh</w:t>
+            </w:r>
           </w:p>
         </w:tc>
       </w:tr>
@@ -2556,17 +2532,8 @@
                 <w:i/>
                 <w:iCs/>
               </w:rPr>
-              <w:t>2,0 Ft/</w:t>
-            </w:r>
-            <w:proofErr w:type="spellStart"/>
-            <w:r>
-              <w:rPr>
-                <w:i/>
-                <w:iCs/>
-              </w:rPr>
-              <w:t>MWh</w:t>
-            </w:r>
-            <w:proofErr w:type="spellEnd"/>
+              <w:t>2,0 Ft/MWh</w:t>
+            </w:r>
           </w:p>
         </w:tc>
       </w:tr>
@@ -2915,17 +2882,8 @@
                 <w:i/>
                 <w:iCs/>
               </w:rPr>
-              <w:t>6,0 Ft/</w:t>
-            </w:r>
-            <w:proofErr w:type="spellStart"/>
-            <w:r>
-              <w:rPr>
-                <w:i/>
-                <w:iCs/>
-              </w:rPr>
-              <w:t>MWh</w:t>
-            </w:r>
-            <w:proofErr w:type="spellEnd"/>
+              <w:t>6,0 Ft/MWh</w:t>
+            </w:r>
           </w:p>
         </w:tc>
       </w:tr>
@@ -3000,17 +2958,8 @@
                 <w:i/>
                 <w:iCs/>
               </w:rPr>
-              <w:t>3,5 Ft/</w:t>
-            </w:r>
-            <w:proofErr w:type="spellStart"/>
-            <w:r>
-              <w:rPr>
-                <w:i/>
-                <w:iCs/>
-              </w:rPr>
-              <w:t>MWh</w:t>
-            </w:r>
-            <w:proofErr w:type="spellEnd"/>
+              <w:t>3,5 Ft/MWh</w:t>
+            </w:r>
           </w:p>
         </w:tc>
       </w:tr>
@@ -3084,17 +3033,8 @@
                 <w:i/>
                 <w:iCs/>
               </w:rPr>
-              <w:t>3,0 Ft/</w:t>
-            </w:r>
-            <w:proofErr w:type="spellStart"/>
-            <w:r>
-              <w:rPr>
-                <w:i/>
-                <w:iCs/>
-              </w:rPr>
-              <w:t>MWh</w:t>
-            </w:r>
-            <w:proofErr w:type="spellEnd"/>
+              <w:t>3,0 Ft/MWh</w:t>
+            </w:r>
           </w:p>
         </w:tc>
       </w:tr>
@@ -3339,52 +3279,12 @@
     </w:p>
     <w:p>
       <w:r>
-        <w:t xml:space="preserve"> ${</w:t>
-      </w:r>
-      <w:proofErr w:type="spellStart"/>
-      <w:r>
-        <w:t>natural_gas_converted</w:t>
-      </w:r>
-      <w:proofErr w:type="spellEnd"/>
-      <w:r>
-        <w:t>} Ft/kWh + 15 Ft/kWh = ${</w:t>
-      </w:r>
-      <w:proofErr w:type="spellStart"/>
-      <w:r>
-        <w:t>natural_gas_specific</w:t>
-      </w:r>
-      <w:proofErr w:type="spellEnd"/>
-      <w:r>
-        <w:t>} Ft/kWh földgázra,</w:t>
-      </w:r>
-    </w:p>
-    <w:p>
-      <w:r>
-        <w:t>a villamos energia esetében pedig ${</w:t>
-      </w:r>
-      <w:proofErr w:type="spellStart"/>
-      <w:r>
-        <w:t>electric_converted</w:t>
-      </w:r>
-      <w:proofErr w:type="spellEnd"/>
-      <w:r>
-        <w:t xml:space="preserve">} Ft/kWh + 30,915 Ft/kWh </w:t>
-      </w:r>
-      <w:proofErr w:type="gramStart"/>
-      <w:r>
-        <w:t>=  $</w:t>
-      </w:r>
-      <w:proofErr w:type="gramEnd"/>
-      <w:r>
-        <w:t>{</w:t>
-      </w:r>
-      <w:proofErr w:type="spellStart"/>
-      <w:r>
-        <w:t>electric_energy_specific</w:t>
-      </w:r>
-      <w:proofErr w:type="spellEnd"/>
-      <w:r>
-        <w:t>} Ft/kWh.</w:t>
+        <w:t xml:space="preserve"> ${natural_gas_converted} Ft/kWh + 15 Ft/kWh = ${natural_gas_specific} Ft/kWh földgázra,</w:t>
+      </w:r>
+    </w:p>
+    <w:p>
+      <w:r>
+        <w:t>a villamos energia esetében pedig ${electric_converted} Ft/kWh + 30,915 Ft/kWh =  ${electric_energy_specific} Ft/kWh.</w:t>
       </w:r>
     </w:p>
     <w:p>
@@ -3576,60 +3476,18 @@
     </w:p>
     <w:p>
       <w:r>
-        <w:t>BUBOR = ${</w:t>
-      </w:r>
-      <w:proofErr w:type="spellStart"/>
-      <w:r>
-        <w:t>bubor_</w:t>
-      </w:r>
-      <w:proofErr w:type="gramStart"/>
-      <w:r>
-        <w:t>rate</w:t>
-      </w:r>
-      <w:proofErr w:type="spellEnd"/>
-      <w:r>
-        <w:t>}%</w:t>
-      </w:r>
-      <w:proofErr w:type="gramEnd"/>
-    </w:p>
-    <w:p>
-      <w:r>
-        <w:t>Államkötvény hozam = ${</w:t>
-      </w:r>
-      <w:proofErr w:type="spellStart"/>
-      <w:r>
-        <w:t>bond_</w:t>
-      </w:r>
-      <w:proofErr w:type="gramStart"/>
-      <w:r>
-        <w:t>rate</w:t>
-      </w:r>
-      <w:proofErr w:type="spellEnd"/>
-      <w:r>
-        <w:t>}%</w:t>
-      </w:r>
-      <w:proofErr w:type="gramEnd"/>
-      <w:r>
-        <w:t xml:space="preserve"> </w:t>
-      </w:r>
-    </w:p>
-    <w:p>
-      <w:r>
-        <w:t>MNB alapkamat: ${</w:t>
-      </w:r>
-      <w:proofErr w:type="spellStart"/>
-      <w:r>
-        <w:t>mnb_</w:t>
-      </w:r>
-      <w:proofErr w:type="gramStart"/>
-      <w:r>
-        <w:t>rate</w:t>
-      </w:r>
-      <w:proofErr w:type="spellEnd"/>
-      <w:r>
-        <w:t>}%</w:t>
-      </w:r>
-      <w:proofErr w:type="gramEnd"/>
+        <w:t>BUBOR = ${bubor_rate}%</w:t>
+      </w:r>
+    </w:p>
+    <w:p>
+      <w:r>
+        <w:t xml:space="preserve">Államkötvény hozam = ${bond_rate}% </w:t>
+      </w:r>
+    </w:p>
+    <w:p>
+      <w:r>
+        <w:t>MNB alapkamat: ${mnb_rate}%</w:t>
+      </w:r>
     </w:p>
     <w:p/>
     <w:p>
@@ -3639,23 +3497,7 @@
     </w:p>
     <w:p>
       <w:r>
-        <w:t>A kamatráta az auditírás időpontjában tehát ${</w:t>
-      </w:r>
-      <w:proofErr w:type="spellStart"/>
-      <w:r>
-        <w:t>interest_</w:t>
-      </w:r>
-      <w:proofErr w:type="gramStart"/>
-      <w:r>
-        <w:t>rate</w:t>
-      </w:r>
-      <w:proofErr w:type="spellEnd"/>
-      <w:r>
-        <w:t>}%</w:t>
-      </w:r>
-      <w:proofErr w:type="gramEnd"/>
-      <w:r>
-        <w:t>.</w:t>
+        <w:t>A kamatráta az auditírás időpontjában tehát ${interest_rate}%.</w:t>
       </w:r>
     </w:p>
     <w:p/>
@@ -3674,22 +3516,7 @@
         <w:rPr>
           <w:rFonts w:ascii="Gungsuh" w:eastAsia="Gungsuh" w:hAnsi="Gungsuh" w:cs="Gungsuh"/>
         </w:rPr>
-        <w:t>NPV=</w:t>
-      </w:r>
-      <w:proofErr w:type="gramStart"/>
-      <w:r>
-        <w:rPr>
-          <w:rFonts w:ascii="Gungsuh" w:eastAsia="Gungsuh" w:hAnsi="Gungsuh" w:cs="Gungsuh"/>
-        </w:rPr>
-        <w:t>∑(</w:t>
-      </w:r>
-      <w:proofErr w:type="spellStart"/>
-      <w:proofErr w:type="gramEnd"/>
-      <w:r>
-        <w:rPr>
-          <w:rFonts w:ascii="Gungsuh" w:eastAsia="Gungsuh" w:hAnsi="Gungsuh" w:cs="Gungsuh"/>
-        </w:rPr>
-        <w:t>CF</w:t>
+        <w:t>NPV=∑(CF</w:t>
       </w:r>
       <w:r>
         <w:rPr>
@@ -3697,13 +3524,8 @@
         </w:rPr>
         <w:t>t</w:t>
       </w:r>
-      <w:proofErr w:type="spellEnd"/>
-      <w:r>
-        <w:t xml:space="preserve"> /(1+</w:t>
-      </w:r>
-      <w:proofErr w:type="gramStart"/>
-      <w:r>
-        <w:t>r)</w:t>
+      <w:r>
+        <w:t xml:space="preserve"> /(1+r)</w:t>
       </w:r>
       <w:r>
         <w:rPr>
@@ -3715,14 +3537,7 @@
         <w:rPr>
           <w:rFonts w:ascii="Gungsuh" w:eastAsia="Gungsuh" w:hAnsi="Gungsuh" w:cs="Gungsuh"/>
         </w:rPr>
-        <w:t>​​</w:t>
-      </w:r>
-      <w:proofErr w:type="gramEnd"/>
-      <w:r>
-        <w:rPr>
-          <w:rFonts w:ascii="Gungsuh" w:eastAsia="Gungsuh" w:hAnsi="Gungsuh" w:cs="Gungsuh"/>
-        </w:rPr>
-        <w:t>)−Beruházási költség</w:t>
+        <w:t>​​)−Beruházási költség</w:t>
       </w:r>
     </w:p>
     <w:p>
@@ -3752,15 +3567,7 @@
     <w:p/>
     <w:p>
       <w:r>
-        <w:t xml:space="preserve">A projektek </w:t>
-      </w:r>
-      <w:proofErr w:type="gramStart"/>
-      <w:r>
-        <w:t>megítélésénél</w:t>
-      </w:r>
-      <w:proofErr w:type="gramEnd"/>
-      <w:r>
-        <w:t xml:space="preserve"> Ha az IRR&gt;r akkor megéri megcsinálni, ha IRR&lt;r, akkor nem.</w:t>
+        <w:t>A projektek megítélésénél Ha az IRR&gt;r akkor megéri megcsinálni, ha IRR&lt;r, akkor nem.</w:t>
       </w:r>
     </w:p>
     <w:p>
@@ -3789,314 +3596,122 @@
     </w:p>
     <w:p>
       <w:r>
-        <w:t>A ${</w:t>
-      </w:r>
-      <w:proofErr w:type="spellStart"/>
-      <w:r>
-        <w:t>company_name</w:t>
-      </w:r>
-      <w:proofErr w:type="spellEnd"/>
-      <w:r>
-        <w:t>} az alábbi épületekkel rendelkezik:</w:t>
-      </w:r>
-    </w:p>
-    <w:p>
-      <w:r>
-        <w:t>${</w:t>
-      </w:r>
-      <w:proofErr w:type="spellStart"/>
-      <w:r>
-        <w:t>building_listing</w:t>
-      </w:r>
-      <w:proofErr w:type="spellEnd"/>
-      <w:r>
-        <w:t xml:space="preserve">} </w:t>
-      </w:r>
-    </w:p>
-    <w:p>
-      <w:pPr>
-        <w:pStyle w:val="Heading2"/>
-      </w:pPr>
+        <w:t>A ${company_name} az alábbi épületekkel rendelkezik:</w:t>
+      </w:r>
+    </w:p>
+    <w:p>
+      <w:r>
+        <w:t xml:space="preserve">${building_listing} </w:t>
+      </w:r>
+    </w:p>
+    <w:p>
       <w:bookmarkStart w:id="8" w:name="_Toc239899315"/>
       <w:r>
-        <w:t>${</w:t>
-      </w:r>
-      <w:proofErr w:type="spellStart"/>
-      <w:r>
-        <w:t>subheading_building_heating</w:t>
-      </w:r>
-      <w:proofErr w:type="spellEnd"/>
-      <w:r>
-        <w:t>}</w:t>
+        <w:t>${subheading_building_heating}</w:t>
       </w:r>
       <w:bookmarkEnd w:id="8"/>
     </w:p>
     <w:p>
       <w:r>
-        <w:t>${</w:t>
-      </w:r>
-      <w:proofErr w:type="spellStart"/>
-      <w:r>
-        <w:t>heating_intro</w:t>
-      </w:r>
-      <w:proofErr w:type="spellEnd"/>
-      <w:r>
-        <w:t>}</w:t>
-      </w:r>
-    </w:p>
-    <w:p>
-      <w:r>
-        <w:t>${</w:t>
-      </w:r>
-      <w:proofErr w:type="spellStart"/>
-      <w:r>
-        <w:t>heating_listing</w:t>
-      </w:r>
-      <w:proofErr w:type="spellEnd"/>
-      <w:r>
-        <w:t>}</w:t>
-      </w:r>
-    </w:p>
-    <w:p>
-      <w:r>
-        <w:t>${</w:t>
-      </w:r>
-      <w:proofErr w:type="spellStart"/>
-      <w:r>
-        <w:t>heating_subtext</w:t>
-      </w:r>
-      <w:proofErr w:type="spellEnd"/>
-      <w:r>
-        <w:t>}</w:t>
-      </w:r>
-    </w:p>
-    <w:p>
-      <w:pPr>
-        <w:pStyle w:val="Heading2"/>
-      </w:pPr>
+        <w:t>${heating_intro}</w:t>
+      </w:r>
+    </w:p>
+    <w:p>
+      <w:r>
+        <w:t>${heating_listing}</w:t>
+      </w:r>
+    </w:p>
+    <w:p>
+      <w:r>
+        <w:t>${heating_subtext}</w:t>
+      </w:r>
+    </w:p>
+    <w:p>
       <w:bookmarkStart w:id="9" w:name="_Toc239899316"/>
       <w:r>
-        <w:t>${</w:t>
-      </w:r>
-      <w:proofErr w:type="spellStart"/>
-      <w:r>
-        <w:t>subheading_building_hmv</w:t>
-      </w:r>
-      <w:proofErr w:type="spellEnd"/>
-      <w:r>
-        <w:t>}</w:t>
+        <w:t>${subheading_building_hmv}</w:t>
       </w:r>
       <w:bookmarkEnd w:id="9"/>
     </w:p>
     <w:p>
       <w:r>
-        <w:t>${</w:t>
-      </w:r>
-      <w:proofErr w:type="spellStart"/>
-      <w:r>
-        <w:t>hmv_intro</w:t>
-      </w:r>
-      <w:proofErr w:type="spellEnd"/>
-      <w:r>
-        <w:t>}</w:t>
-      </w:r>
-    </w:p>
-    <w:p>
-      <w:r>
-        <w:t>${</w:t>
-      </w:r>
-      <w:proofErr w:type="spellStart"/>
-      <w:r>
-        <w:t>hmv_listing</w:t>
-      </w:r>
-      <w:proofErr w:type="spellEnd"/>
-      <w:r>
-        <w:t>}</w:t>
-      </w:r>
-    </w:p>
-    <w:p>
-      <w:r>
-        <w:t>${</w:t>
-      </w:r>
-      <w:proofErr w:type="spellStart"/>
-      <w:r>
-        <w:t>hmv_subtext</w:t>
-      </w:r>
-      <w:proofErr w:type="spellEnd"/>
-      <w:r>
-        <w:t>}</w:t>
-      </w:r>
-    </w:p>
-    <w:p>
-      <w:pPr>
-        <w:pStyle w:val="Heading2"/>
-      </w:pPr>
+        <w:t>${hmv_intro}</w:t>
+      </w:r>
+    </w:p>
+    <w:p>
+      <w:r>
+        <w:t>${hmv_listing}</w:t>
+      </w:r>
+    </w:p>
+    <w:p>
+      <w:r>
+        <w:t>${hmv_subtext}</w:t>
+      </w:r>
+    </w:p>
+    <w:p>
       <w:bookmarkStart w:id="10" w:name="_Toc239899317"/>
       <w:r>
-        <w:t>${</w:t>
-      </w:r>
-      <w:proofErr w:type="spellStart"/>
-      <w:r>
-        <w:t>subheading_building_lighting</w:t>
-      </w:r>
-      <w:proofErr w:type="spellEnd"/>
-      <w:r>
-        <w:t>}</w:t>
+        <w:t>${subheading_building_lighting}</w:t>
       </w:r>
       <w:bookmarkEnd w:id="10"/>
     </w:p>
     <w:p>
       <w:r>
-        <w:t>${</w:t>
-      </w:r>
-      <w:proofErr w:type="spellStart"/>
-      <w:r>
-        <w:t>lighting_intro</w:t>
-      </w:r>
-      <w:proofErr w:type="spellEnd"/>
-      <w:r>
-        <w:t>}</w:t>
-      </w:r>
-    </w:p>
-    <w:p>
-      <w:r>
-        <w:t>${</w:t>
-      </w:r>
-      <w:proofErr w:type="spellStart"/>
-      <w:r>
-        <w:t>lighting_listing</w:t>
-      </w:r>
-      <w:proofErr w:type="spellEnd"/>
-      <w:r>
-        <w:t>}</w:t>
-      </w:r>
-    </w:p>
-    <w:p>
-      <w:r>
-        <w:t>${</w:t>
-      </w:r>
-      <w:proofErr w:type="spellStart"/>
-      <w:r>
-        <w:t>lighting_subtext</w:t>
-      </w:r>
-      <w:proofErr w:type="spellEnd"/>
-      <w:r>
-        <w:t>}</w:t>
-      </w:r>
-    </w:p>
-    <w:p>
-      <w:pPr>
-        <w:pStyle w:val="Heading2"/>
-      </w:pPr>
+        <w:t>${lighting_intro}</w:t>
+      </w:r>
+    </w:p>
+    <w:p>
+      <w:r>
+        <w:t>${lighting_listing}</w:t>
+      </w:r>
+    </w:p>
+    <w:p>
+      <w:r>
+        <w:t>${lighting_subtext}</w:t>
+      </w:r>
+    </w:p>
+    <w:p>
       <w:bookmarkStart w:id="11" w:name="_Toc239899318"/>
       <w:r>
-        <w:t>${</w:t>
-      </w:r>
-      <w:proofErr w:type="spellStart"/>
-      <w:r>
-        <w:t>subheading_building_cooling</w:t>
-      </w:r>
-      <w:proofErr w:type="spellEnd"/>
-      <w:r>
-        <w:t>}</w:t>
+        <w:t>${subheading_building_cooling}</w:t>
       </w:r>
       <w:bookmarkEnd w:id="11"/>
     </w:p>
     <w:p>
       <w:r>
-        <w:t>${</w:t>
-      </w:r>
-      <w:proofErr w:type="spellStart"/>
-      <w:r>
-        <w:t>cooling_intro</w:t>
-      </w:r>
-      <w:proofErr w:type="spellEnd"/>
-      <w:r>
-        <w:t>}</w:t>
-      </w:r>
-    </w:p>
-    <w:p>
-      <w:r>
-        <w:t>${</w:t>
-      </w:r>
-      <w:proofErr w:type="spellStart"/>
-      <w:r>
-        <w:t>cooling_listing</w:t>
-      </w:r>
-      <w:proofErr w:type="spellEnd"/>
-      <w:r>
-        <w:t>}</w:t>
-      </w:r>
-    </w:p>
-    <w:p>
-      <w:r>
-        <w:t>${</w:t>
-      </w:r>
-      <w:proofErr w:type="spellStart"/>
-      <w:r>
-        <w:t>cooling_subtext</w:t>
-      </w:r>
-      <w:proofErr w:type="spellEnd"/>
-      <w:r>
-        <w:t>}</w:t>
-      </w:r>
-    </w:p>
-    <w:p>
-      <w:pPr>
-        <w:pStyle w:val="Heading2"/>
-      </w:pPr>
+        <w:t>${cooling_intro}</w:t>
+      </w:r>
+    </w:p>
+    <w:p>
+      <w:r>
+        <w:t>${cooling_listing}</w:t>
+      </w:r>
+    </w:p>
+    <w:p>
+      <w:r>
+        <w:t>${cooling_subtext}</w:t>
+      </w:r>
+    </w:p>
+    <w:p>
       <w:bookmarkStart w:id="12" w:name="_Toc239899319"/>
       <w:r>
-        <w:t>${</w:t>
-      </w:r>
-      <w:proofErr w:type="spellStart"/>
-      <w:r>
-        <w:t>subheading_building_hvac</w:t>
-      </w:r>
-      <w:proofErr w:type="spellEnd"/>
-      <w:r>
-        <w:t>}</w:t>
+        <w:t>${subheading_building_hvac}</w:t>
       </w:r>
       <w:bookmarkEnd w:id="12"/>
     </w:p>
     <w:p>
       <w:r>
-        <w:t>${</w:t>
-      </w:r>
-      <w:proofErr w:type="spellStart"/>
-      <w:r>
-        <w:t>hvac_intro</w:t>
-      </w:r>
-      <w:proofErr w:type="spellEnd"/>
-      <w:r>
-        <w:t>}</w:t>
-      </w:r>
-    </w:p>
-    <w:p>
-      <w:r>
-        <w:t>${</w:t>
-      </w:r>
-      <w:proofErr w:type="spellStart"/>
-      <w:r>
-        <w:t>hvac_listing</w:t>
-      </w:r>
-      <w:proofErr w:type="spellEnd"/>
-      <w:r>
-        <w:t>}</w:t>
-      </w:r>
-    </w:p>
-    <w:p>
-      <w:r>
-        <w:lastRenderedPageBreak/>
-        <w:t>${</w:t>
-      </w:r>
-      <w:proofErr w:type="spellStart"/>
-      <w:r>
-        <w:t>hvac_subtext</w:t>
-      </w:r>
-      <w:proofErr w:type="spellEnd"/>
-      <w:r>
-        <w:t>}</w:t>
+        <w:t>${hvac_intro}</w:t>
+      </w:r>
+    </w:p>
+    <w:p>
+      <w:r>
+        <w:t>${hvac_listing}</w:t>
+      </w:r>
+    </w:p>
+    <w:p>
+      <w:r>
+        <w:t>${hvac_subtext}</w:t>
       </w:r>
     </w:p>
     <w:p>
@@ -4112,123 +3727,46 @@
     </w:p>
     <w:p>
       <w:r>
-        <w:t>A ${</w:t>
-      </w:r>
-      <w:proofErr w:type="spellStart"/>
-      <w:r>
-        <w:t>company_name</w:t>
-      </w:r>
-      <w:proofErr w:type="spellEnd"/>
-      <w:r>
-        <w:t>} az alábbi járműveket üzemelteti:</w:t>
-      </w:r>
-    </w:p>
-    <w:p>
-      <w:r>
-        <w:t>${</w:t>
-      </w:r>
-      <w:proofErr w:type="spellStart"/>
-      <w:r>
-        <w:t>vehicle_listing</w:t>
-      </w:r>
-      <w:proofErr w:type="spellEnd"/>
-      <w:r>
-        <w:t>}</w:t>
-      </w:r>
-    </w:p>
-    <w:p>
-      <w:r>
-        <w:t>${</w:t>
-      </w:r>
-      <w:proofErr w:type="spellStart"/>
-      <w:r>
-        <w:t>block_technology</w:t>
-      </w:r>
-      <w:proofErr w:type="spellEnd"/>
-      <w:r>
-        <w:t>}</w:t>
-      </w:r>
-    </w:p>
-    <w:p>
-      <w:pPr>
-        <w:pStyle w:val="Heading1"/>
-      </w:pPr>
+        <w:t>A ${company_name} az alábbi járműveket üzemelteti:</w:t>
+      </w:r>
+    </w:p>
+    <w:p>
+      <w:r>
+        <w:t>${vehicle_listing}</w:t>
+      </w:r>
+    </w:p>
+    <w:p>
+      <w:r>
+        <w:t>${block_technology}</w:t>
+      </w:r>
+    </w:p>
+    <w:p>
       <w:bookmarkStart w:id="14" w:name="_Toc239899321"/>
       <w:r>
-        <w:lastRenderedPageBreak/>
-        <w:t>${</w:t>
-      </w:r>
-      <w:proofErr w:type="spellStart"/>
-      <w:r>
-        <w:t>technology_title</w:t>
-      </w:r>
-      <w:proofErr w:type="spellEnd"/>
-      <w:r>
-        <w:t>}</w:t>
+        <w:t>${technology_title}</w:t>
       </w:r>
       <w:bookmarkEnd w:id="14"/>
     </w:p>
     <w:p>
       <w:r>
-        <w:t>${</w:t>
-      </w:r>
-      <w:proofErr w:type="spellStart"/>
-      <w:r>
-        <w:t>technology_content</w:t>
-      </w:r>
-      <w:proofErr w:type="spellEnd"/>
-      <w:r>
-        <w:t>}</w:t>
-      </w:r>
-    </w:p>
-    <w:p>
-      <w:r>
-        <w:t>${/</w:t>
-      </w:r>
-      <w:proofErr w:type="spellStart"/>
-      <w:r>
-        <w:t>block_technology</w:t>
-      </w:r>
-      <w:proofErr w:type="spellEnd"/>
-      <w:r>
-        <w:t>}</w:t>
-      </w:r>
-    </w:p>
-    <w:p>
-      <w:pPr>
-        <w:pStyle w:val="Heading1"/>
-      </w:pPr>
+        <w:t>${technology_content}</w:t>
+      </w:r>
+    </w:p>
+    <w:p>
+      <w:r>
+        <w:t>${/block_technology}</w:t>
+      </w:r>
+    </w:p>
+    <w:p>
       <w:bookmarkStart w:id="15" w:name="_Toc239899322"/>
       <w:r>
-        <w:lastRenderedPageBreak/>
-        <w:t>${</w:t>
-      </w:r>
-      <w:proofErr w:type="spellStart"/>
-      <w:r>
-        <w:t>technology_offset_index</w:t>
-      </w:r>
-      <w:proofErr w:type="spellEnd"/>
-      <w:proofErr w:type="gramStart"/>
-      <w:r>
-        <w:t>}.A</w:t>
-      </w:r>
-      <w:proofErr w:type="gramEnd"/>
-      <w:r>
-        <w:t xml:space="preserve"> fogyasztások felosztása</w:t>
+        <w:t>${technology_offset_index}.A fogyasztások felosztása</w:t>
       </w:r>
       <w:bookmarkEnd w:id="15"/>
     </w:p>
     <w:p>
       <w:r>
-        <w:t>A ${</w:t>
-      </w:r>
-      <w:proofErr w:type="spellStart"/>
-      <w:r>
-        <w:t>company_name</w:t>
-      </w:r>
-      <w:proofErr w:type="spellEnd"/>
-      <w:r>
-        <w:t>} az ismertetett rendszerek mért vagy számított fogyasztásai alapján az alábbi energiafogyasztási profillal rendelkezik:</w:t>
+        <w:t>A ${company_name} az ismertetett rendszerek mért vagy számított fogyasztásai alapján az alábbi energiafogyasztási profillal rendelkezik:</w:t>
       </w:r>
     </w:p>
     <w:tbl>
@@ -4452,148 +3990,97 @@
     </w:tbl>
     <w:p/>
     <w:p>
-      <w:pPr>
-        <w:jc w:val="center"/>
-      </w:pPr>
-      <w:r>
-        <w:t>${</w:t>
-      </w:r>
-      <w:proofErr w:type="spellStart"/>
-      <w:r>
-        <w:t>sankey_diagram</w:t>
-      </w:r>
-      <w:proofErr w:type="spellEnd"/>
-      <w:r>
-        <w:t>}</w:t>
-      </w:r>
-    </w:p>
-    <w:p>
-      <w:pPr>
-        <w:pStyle w:val="Heading1"/>
-      </w:pPr>
+      <w:r>
+        <w:t>${sankey_diagram}</w:t>
+      </w:r>
+    </w:p>
+    <w:p>
       <w:bookmarkStart w:id="16" w:name="_Toc239899323"/>
       <w:r>
+        <w:t>${technology_offset_2_index}.Energia teljesítmény mutató meghatározása</w:t>
+      </w:r>
+      <w:bookmarkEnd w:id="16"/>
+    </w:p>
+    <w:p>
+      <w:r>
+        <w:t>Minden gazdálkodó szervezet esetében fontos, hogy ne önmagában kerüljön meghatározásra az energiafogyasztás. Az ETM (Energia Teljesítmény Mutató) olyan mérőszám, amely az energiafelhasználást egy releváns teljesítmény jellemzőhöz – például termelési mennyiséghez, alapterülethez vagy üzemórához – viszonyítva teszi mérhetővé és összehasonlíthatóvá az energetikai teljesítményt. A ${company_name} gazdálkodásában ez a mutató a ${product_name}-ra/re vonatkoztatott fajlagos energia felhasználás. A ${audit_interval} időszak termelés számai az alábbi táblázat szerint alakultak:</w:t>
+      </w:r>
+    </w:p>
+    <w:p>
+      <w:r>
+        <w:t>${product_listing}</w:t>
+      </w:r>
+    </w:p>
+    <w:p>
+      <w:r>
+        <w:t>Az indexbe nem kerülnek beleszámításra az Épület és Szállítás jellegű fogyasztások, csak a Tevékenység energiafelhasználásai. Ezek alapján az ETM értéke ${ETM}. Minden jövőbeni, az energiahatékonyságot növelő technológiai beruházást ezen érték javulásában célszerű lemérni.</w:t>
+      </w:r>
+    </w:p>
+    <w:p>
+      <w:bookmarkStart w:id="17" w:name="_Toc239899324"/>
+      <w:r>
         <w:lastRenderedPageBreak/>
-        <w:t>${technology_offset_2_index</w:t>
-      </w:r>
-      <w:proofErr w:type="gramStart"/>
-      <w:r>
-        <w:t>}.Energia</w:t>
-      </w:r>
-      <w:proofErr w:type="gramEnd"/>
-      <w:r>
-        <w:t xml:space="preserve"> teljesítmény mutató meghatározása</w:t>
-      </w:r>
-      <w:bookmarkEnd w:id="16"/>
-    </w:p>
-    <w:p>
-      <w:r>
-        <w:t>Minden gazdálkodó szervezet esetében fontos, hogy ne önmagában kerüljön meghatározásra az energiafogyasztás. Az ETM (Energia Teljesítmény Mutató) olyan mérőszám, amely az energiafelhasználást egy releváns teljesítmény jellemzőhöz – például termelési mennyiséghez, alapterülethez vagy üzemórához – viszonyítva teszi mérhetővé és összehasonlíthatóvá az energetikai teljesítményt. A ${</w:t>
-      </w:r>
-      <w:proofErr w:type="spellStart"/>
-      <w:r>
-        <w:t>company_name</w:t>
-      </w:r>
-      <w:proofErr w:type="spellEnd"/>
-      <w:r>
-        <w:t>} gazdálkodásában ez a mutató a ${</w:t>
-      </w:r>
-      <w:proofErr w:type="spellStart"/>
-      <w:r>
-        <w:t>product_</w:t>
-      </w:r>
-      <w:proofErr w:type="gramStart"/>
-      <w:r>
-        <w:t>name</w:t>
-      </w:r>
-      <w:proofErr w:type="spellEnd"/>
-      <w:r>
-        <w:t>}-</w:t>
-      </w:r>
-      <w:proofErr w:type="spellStart"/>
-      <w:proofErr w:type="gramEnd"/>
-      <w:r>
-        <w:t>ra</w:t>
-      </w:r>
-      <w:proofErr w:type="spellEnd"/>
-      <w:r>
-        <w:t xml:space="preserve">/re vonatkoztatott fajlagos </w:t>
-      </w:r>
-      <w:proofErr w:type="gramStart"/>
-      <w:r>
-        <w:t>energia felhasználás</w:t>
-      </w:r>
-      <w:proofErr w:type="gramEnd"/>
-      <w:r>
-        <w:t>. A ${</w:t>
-      </w:r>
-      <w:proofErr w:type="spellStart"/>
-      <w:r>
-        <w:t>audit_interval</w:t>
-      </w:r>
-      <w:proofErr w:type="spellEnd"/>
-      <w:r>
-        <w:t>} időszak termelés számai az alábbi táblázat szerint alakultak:</w:t>
-      </w:r>
-    </w:p>
-    <w:p>
-      <w:r>
-        <w:t>${</w:t>
-      </w:r>
-      <w:proofErr w:type="spellStart"/>
-      <w:r>
-        <w:t>product_listing</w:t>
-      </w:r>
-      <w:proofErr w:type="spellEnd"/>
-      <w:r>
-        <w:t>}</w:t>
-      </w:r>
-    </w:p>
-    <w:p>
-      <w:r>
-        <w:t>Az indexbe nem kerülnek beleszámításra az Épület és Szállítás jellegű fogyasztások, csak a Tevékenység energiafelhasználásai. Ezek alapján az ETM értéke ${ETM}. Minden jövőbeni, az energiahatékonyságot növelő technológiai beruházást ezen érték javulásában célszerű lemérni.</w:t>
-      </w:r>
-    </w:p>
-    <w:p>
-      <w:pPr>
-        <w:pStyle w:val="Heading1"/>
-      </w:pPr>
-      <w:bookmarkStart w:id="17" w:name="_Toc239899324"/>
-      <w:r>
-        <w:lastRenderedPageBreak/>
-        <w:t>${technology_offset_3_index</w:t>
-      </w:r>
-      <w:proofErr w:type="gramStart"/>
-      <w:r>
-        <w:t>}.Javaslatok</w:t>
-      </w:r>
-      <w:proofErr w:type="gramEnd"/>
-      <w:r>
-        <w:t xml:space="preserve"> és források</w:t>
+        <w:t>${technology_offset_3_index}.Javaslatok és források</w:t>
       </w:r>
       <w:bookmarkEnd w:id="17"/>
     </w:p>
     <w:p>
-      <w:proofErr w:type="gramStart"/>
-      <w:r>
-        <w:t>a)Kapacitás</w:t>
-      </w:r>
-      <w:proofErr w:type="gramEnd"/>
-      <w:r>
-        <w:t>-optimalizálás:</w:t>
-      </w:r>
-    </w:p>
-    <w:p>
-      <w:r>
-        <w:t>${</w:t>
-      </w:r>
-      <w:proofErr w:type="spellStart"/>
-      <w:r>
-        <w:t>replaceable_listing</w:t>
-      </w:r>
-      <w:proofErr w:type="spellEnd"/>
-      <w:r>
-        <w:t>}</w:t>
+      <w:r>
+        <w:t>a)Kapacitás-optimalizálás:</w:t>
+      </w:r>
+    </w:p>
+    <w:p>
+      <w:r>
+        <w:t>b)Épületenergetikai javaslatok: ${suggestion_a}</w:t>
+      </w:r>
+    </w:p>
+    <w:p>
+      <w:r>
+        <w:t>c)Épületgépészei javaslatok:</w:t>
+      </w:r>
+      <w:r>
+        <w:t xml:space="preserve"> </w:t>
+      </w:r>
+      <w:r>
+        <w:t>${suggestion_b}</w:t>
+      </w:r>
+    </w:p>
+    <w:p>
+      <w:r>
+        <w:t>d)Technológiai javaslatok:</w:t>
+      </w:r>
+      <w:r>
+        <w:t xml:space="preserve"> </w:t>
+      </w:r>
+      <w:r>
+        <w:t>${suggestion_c}</w:t>
+      </w:r>
+    </w:p>
+    <w:p>
+      <w:r>
+        <w:t>e)Szállítás optimalizálás:</w:t>
+      </w:r>
+      <w:r>
+        <w:t xml:space="preserve"> </w:t>
+      </w:r>
+      <w:r>
+        <w:t>${suggestion_d}</w:t>
+      </w:r>
+    </w:p>
+    <w:p>
+      <w:r>
+        <w:t>f)Alternatív hőtermelési/hűtési javaslatok:</w:t>
+      </w:r>
+      <w:r>
+        <w:t xml:space="preserve"> </w:t>
+      </w:r>
+      <w:r>
+        <w:t>${suggestion_e}</w:t>
+      </w:r>
+    </w:p>
+    <w:p>
+      <w:r>
+        <w:t>g)Megújuló energiaforrás bevonási javaslatok: Kapacitásbővítés vagy napelem rendszer telepítése javasolt</w:t>
       </w:r>
     </w:p>
     <w:sectPr>
@@ -4667,19 +4154,11 @@
               <w:color w:val="000000"/>
             </w:rPr>
           </w:pPr>
-          <w:proofErr w:type="spellStart"/>
           <w:r>
             <w:rPr>
               <w:color w:val="000000"/>
             </w:rPr>
-            <w:t>Balajti</w:t>
-          </w:r>
-          <w:proofErr w:type="spellEnd"/>
-          <w:r>
-            <w:rPr>
-              <w:color w:val="000000"/>
-            </w:rPr>
-            <w:t xml:space="preserve"> Energetika Kft.</w:t>
+            <w:t>Balajti Energetika Kft.</w:t>
           </w:r>
         </w:p>
       </w:tc>
@@ -4702,32 +4181,13 @@
             <w:rPr>
               <w:color w:val="000000"/>
             </w:rPr>
-            <w:t>${</w:t>
-          </w:r>
-          <w:proofErr w:type="spellStart"/>
-          <w:r>
-            <w:rPr>
-              <w:color w:val="000000"/>
-            </w:rPr>
-            <w:t>company_name</w:t>
-          </w:r>
-          <w:proofErr w:type="spellEnd"/>
-          <w:r>
-            <w:rPr>
-              <w:color w:val="000000"/>
-            </w:rPr>
-            <w:t>}</w:t>
+            <w:t>${company_name}</w:t>
           </w:r>
           <w:r>
             <w:rPr>
               <w:color w:val="000000"/>
             </w:rPr>
             <w:br/>
-          </w:r>
-          <w:r>
-            <w:rPr>
-              <w:color w:val="000000"/>
-            </w:rPr>
             <w:t>energiahatékonysági audit</w:t>
           </w:r>
         </w:p>

</xml_diff>

<commit_message>
Technology remaining, recoding almost done
</commit_message>
<xml_diff>
--- a/pyros_be/controllers/audit_template.docx
+++ b/pyros_be/controllers/audit_template.docx
@@ -4445,10 +4445,7 @@
             </w:r>
             <w:proofErr w:type="spellStart"/>
             <w:r>
-              <w:t>building_listing_</w:t>
-            </w:r>
-            <w:r>
-              <w:t>complex</w:t>
+              <w:t>building_listing_complex</w:t>
             </w:r>
             <w:proofErr w:type="spellEnd"/>
             <w:r>
@@ -4466,10 +4463,7 @@
             </w:r>
             <w:proofErr w:type="spellStart"/>
             <w:r>
-              <w:t>building_listing_</w:t>
-            </w:r>
-            <w:r>
-              <w:t>qf</w:t>
+              <w:t>building_listing_qf</w:t>
             </w:r>
             <w:proofErr w:type="spellEnd"/>
             <w:r>
@@ -4487,10 +4481,7 @@
             </w:r>
             <w:proofErr w:type="spellStart"/>
             <w:r>
-              <w:t>building_listing_</w:t>
-            </w:r>
-            <w:r>
-              <w:t>status</w:t>
+              <w:t>building_listing_status</w:t>
             </w:r>
             <w:proofErr w:type="spellEnd"/>
             <w:r>
@@ -4685,10 +4676,7 @@
             </w:r>
             <w:proofErr w:type="spellStart"/>
             <w:r>
-              <w:t>heating_listing_</w:t>
-            </w:r>
-            <w:r>
-              <w:t>name</w:t>
+              <w:t>heating_listing_name</w:t>
             </w:r>
             <w:proofErr w:type="spellEnd"/>
             <w:r>
@@ -4706,10 +4694,7 @@
             </w:r>
             <w:proofErr w:type="spellStart"/>
             <w:r>
-              <w:t>heating_listing_</w:t>
-            </w:r>
-            <w:r>
-              <w:t>type</w:t>
+              <w:t>heating_listing_type</w:t>
             </w:r>
             <w:proofErr w:type="spellEnd"/>
             <w:r>
@@ -4727,10 +4712,7 @@
             </w:r>
             <w:proofErr w:type="spellStart"/>
             <w:r>
-              <w:t>heating_listing_</w:t>
-            </w:r>
-            <w:r>
-              <w:t>points</w:t>
+              <w:t>heating_listing_points</w:t>
             </w:r>
             <w:proofErr w:type="spellEnd"/>
             <w:r>
@@ -4748,10 +4730,7 @@
             </w:r>
             <w:proofErr w:type="spellStart"/>
             <w:r>
-              <w:t>heating_listing_</w:t>
-            </w:r>
-            <w:r>
-              <w:t>status</w:t>
+              <w:t>heating_listing_status</w:t>
             </w:r>
             <w:proofErr w:type="spellEnd"/>
             <w:r>
@@ -4975,10 +4954,7 @@
             </w:r>
             <w:proofErr w:type="spellStart"/>
             <w:r>
-              <w:t>hmv_listing_</w:t>
-            </w:r>
-            <w:r>
-              <w:t>name</w:t>
+              <w:t>hmv_listing_name</w:t>
             </w:r>
             <w:proofErr w:type="spellEnd"/>
             <w:r>
@@ -4996,10 +4972,7 @@
             </w:r>
             <w:proofErr w:type="spellStart"/>
             <w:r>
-              <w:t>hmv_listing_</w:t>
-            </w:r>
-            <w:r>
-              <w:t>points</w:t>
+              <w:t>hmv_listing_points</w:t>
             </w:r>
             <w:proofErr w:type="spellEnd"/>
             <w:r>
@@ -5017,10 +4990,7 @@
             </w:r>
             <w:proofErr w:type="spellStart"/>
             <w:r>
-              <w:t>hmv_listing_</w:t>
-            </w:r>
-            <w:r>
-              <w:t>status</w:t>
+              <w:t>hmv_listing_status</w:t>
             </w:r>
             <w:proofErr w:type="spellEnd"/>
             <w:r>
@@ -5038,10 +5008,7 @@
             </w:r>
             <w:proofErr w:type="spellStart"/>
             <w:r>
-              <w:t>hmv_listing_</w:t>
-            </w:r>
-            <w:r>
-              <w:t>desc</w:t>
+              <w:t>hmv_listing_desc</w:t>
             </w:r>
             <w:proofErr w:type="spellEnd"/>
             <w:r>
@@ -5263,10 +5230,7 @@
             </w:r>
             <w:proofErr w:type="spellStart"/>
             <w:r>
-              <w:t>lighting_listing_</w:t>
-            </w:r>
-            <w:r>
-              <w:t>zone</w:t>
+              <w:t>lighting_listing_zone</w:t>
             </w:r>
             <w:proofErr w:type="spellEnd"/>
             <w:r>
@@ -5284,10 +5248,7 @@
             </w:r>
             <w:proofErr w:type="spellStart"/>
             <w:r>
-              <w:t>lighting_listing_</w:t>
-            </w:r>
-            <w:r>
-              <w:t>qf</w:t>
+              <w:t>lighting_listing_qf</w:t>
             </w:r>
             <w:proofErr w:type="spellEnd"/>
             <w:r>
@@ -5305,10 +5266,7 @@
             </w:r>
             <w:proofErr w:type="spellStart"/>
             <w:r>
-              <w:t>lighting_listing_</w:t>
-            </w:r>
-            <w:r>
-              <w:t>annual</w:t>
+              <w:t>lighting_listing_annual</w:t>
             </w:r>
             <w:proofErr w:type="spellEnd"/>
             <w:r>
@@ -5326,10 +5284,7 @@
             </w:r>
             <w:proofErr w:type="spellStart"/>
             <w:r>
-              <w:t>lighting_listing_</w:t>
-            </w:r>
-            <w:r>
-              <w:t>status</w:t>
+              <w:t>lighting_listing_status</w:t>
             </w:r>
             <w:proofErr w:type="spellEnd"/>
             <w:r>
@@ -5561,10 +5516,7 @@
             </w:r>
             <w:proofErr w:type="spellStart"/>
             <w:r>
-              <w:t>cooling_listing_</w:t>
-            </w:r>
-            <w:r>
-              <w:t>name</w:t>
+              <w:t>cooling_listing_name</w:t>
             </w:r>
             <w:proofErr w:type="spellEnd"/>
             <w:r>
@@ -5582,10 +5534,7 @@
             </w:r>
             <w:proofErr w:type="spellStart"/>
             <w:r>
-              <w:t>cooling_listing_</w:t>
-            </w:r>
-            <w:r>
-              <w:t>type</w:t>
+              <w:t>cooling_listing_type</w:t>
             </w:r>
             <w:proofErr w:type="spellEnd"/>
             <w:r>
@@ -5603,10 +5552,7 @@
             </w:r>
             <w:proofErr w:type="spellStart"/>
             <w:r>
-              <w:t>cooling_listing_</w:t>
-            </w:r>
-            <w:r>
-              <w:t>base</w:t>
+              <w:t>cooling_listing_base</w:t>
             </w:r>
             <w:proofErr w:type="spellEnd"/>
             <w:r>
@@ -5624,10 +5570,7 @@
             </w:r>
             <w:proofErr w:type="spellStart"/>
             <w:r>
-              <w:t>cooling_listing_</w:t>
-            </w:r>
-            <w:r>
-              <w:t>reg</w:t>
+              <w:t>cooling_listing_reg</w:t>
             </w:r>
             <w:proofErr w:type="spellEnd"/>
             <w:r>
@@ -5645,10 +5588,7 @@
             </w:r>
             <w:proofErr w:type="spellStart"/>
             <w:r>
-              <w:t>cooling_listing_</w:t>
-            </w:r>
-            <w:r>
-              <w:t>combined</w:t>
+              <w:t>cooling_listing_combined</w:t>
             </w:r>
             <w:proofErr w:type="spellEnd"/>
             <w:r>
@@ -5896,10 +5836,7 @@
             </w:r>
             <w:proofErr w:type="spellStart"/>
             <w:r>
-              <w:t>hvac_listing_</w:t>
-            </w:r>
-            <w:r>
-              <w:t>name</w:t>
+              <w:t>hvac_listing_name</w:t>
             </w:r>
             <w:proofErr w:type="spellEnd"/>
             <w:r>
@@ -5917,10 +5854,7 @@
             </w:r>
             <w:proofErr w:type="spellStart"/>
             <w:r>
-              <w:t>hvac_listing_</w:t>
-            </w:r>
-            <w:r>
-              <w:t>sfp</w:t>
+              <w:t>hvac_listing_sfp</w:t>
             </w:r>
             <w:proofErr w:type="spellEnd"/>
             <w:r>
@@ -5938,10 +5872,7 @@
             </w:r>
             <w:proofErr w:type="spellStart"/>
             <w:r>
-              <w:t>hvac_listing_</w:t>
-            </w:r>
-            <w:r>
-              <w:t>sfp_points</w:t>
+              <w:t>hvac_listing_sfp_points</w:t>
             </w:r>
             <w:proofErr w:type="spellEnd"/>
             <w:r>
@@ -5959,10 +5890,7 @@
             </w:r>
             <w:proofErr w:type="spellStart"/>
             <w:r>
-              <w:t>hvac_listing_</w:t>
-            </w:r>
-            <w:r>
-              <w:t>heat</w:t>
+              <w:t>hvac_listing_heat</w:t>
             </w:r>
             <w:proofErr w:type="spellEnd"/>
             <w:r>
@@ -5980,10 +5908,7 @@
             </w:r>
             <w:proofErr w:type="spellStart"/>
             <w:r>
-              <w:t>hvac_listing_</w:t>
-            </w:r>
-            <w:r>
-              <w:t>heat_points</w:t>
+              <w:t>hvac_listing_heat_points</w:t>
             </w:r>
             <w:proofErr w:type="spellEnd"/>
             <w:r>
@@ -6001,10 +5926,7 @@
             </w:r>
             <w:proofErr w:type="spellStart"/>
             <w:r>
-              <w:t>hvac_listing_</w:t>
-            </w:r>
-            <w:r>
-              <w:t>insulation</w:t>
+              <w:t>hvac_listing_insulation</w:t>
             </w:r>
             <w:proofErr w:type="spellEnd"/>
             <w:r>
@@ -6065,26 +5987,209 @@
         <w:t>} az alábbi járműveket üzemelteti:</w:t>
       </w:r>
     </w:p>
-    <w:p>
-      <w:r>
+    <w:tbl>
+      <w:tblPr>
+        <w:tblStyle w:val="TableGrid"/>
+        <w:tblW w:w="0" w:type="auto"/>
+        <w:tblLook w:val="04A0" w:firstRow="1" w:lastRow="0" w:firstColumn="1" w:lastColumn="0" w:noHBand="0" w:noVBand="1"/>
+      </w:tblPr>
+      <w:tblGrid>
+        <w:gridCol w:w="369"/>
+        <w:gridCol w:w="2159"/>
+        <w:gridCol w:w="2398"/>
+        <w:gridCol w:w="1910"/>
+        <w:gridCol w:w="2180"/>
+      </w:tblGrid>
+      <w:tr>
+        <w:tc>
+          <w:tcPr>
+            <w:tcW w:w="279" w:type="dxa"/>
+          </w:tcPr>
+          <w:p/>
+        </w:tc>
+        <w:tc>
+          <w:tcPr>
+            <w:tcW w:w="2249" w:type="dxa"/>
+          </w:tcPr>
+          <w:p>
+            <w:r>
+              <w:t>Jármű megnevezése</w:t>
+            </w:r>
+          </w:p>
+        </w:tc>
+        <w:tc>
+          <w:tcPr>
+            <w:tcW w:w="2398" w:type="dxa"/>
+          </w:tcPr>
+          <w:p>
+            <w:r>
+              <w:t>Telephely</w:t>
+            </w:r>
+          </w:p>
+        </w:tc>
+        <w:tc>
+          <w:tcPr>
+            <w:tcW w:w="1910" w:type="dxa"/>
+          </w:tcPr>
+          <w:p>
+            <w:r>
+              <w:t>Kalkulált fajlagos energiafelhasználás</w:t>
+            </w:r>
+          </w:p>
+        </w:tc>
+        <w:tc>
+          <w:tcPr>
+            <w:tcW w:w="2180" w:type="dxa"/>
+          </w:tcPr>
+          <w:p>
+            <w:r>
+              <w:t>Besorolás</w:t>
+            </w:r>
+          </w:p>
+        </w:tc>
+      </w:tr>
+      <w:tr>
+        <w:tc>
+          <w:tcPr>
+            <w:tcW w:w="279" w:type="dxa"/>
+          </w:tcPr>
+          <w:p>
+            <w:pPr>
+              <w:rPr>
+                <w:sz w:val="2"/>
+                <w:szCs w:val="2"/>
+              </w:rPr>
+            </w:pPr>
+            <w:r>
+              <w:rPr>
+                <w:color w:val="FFFFFF" w:themeColor="background1"/>
+                <w:sz w:val="2"/>
+                <w:szCs w:val="2"/>
+              </w:rPr>
+              <w:t>${</w:t>
+            </w:r>
+            <w:proofErr w:type="spellStart"/>
+            <w:r>
+              <w:rPr>
+                <w:color w:val="FFFFFF" w:themeColor="background1"/>
+                <w:sz w:val="2"/>
+                <w:szCs w:val="2"/>
+              </w:rPr>
+              <w:t>vehicles_listing_row</w:t>
+            </w:r>
+            <w:proofErr w:type="spellEnd"/>
+            <w:r>
+              <w:rPr>
+                <w:color w:val="FFFFFF" w:themeColor="background1"/>
+                <w:sz w:val="2"/>
+                <w:szCs w:val="2"/>
+              </w:rPr>
+              <w:t>}</w:t>
+            </w:r>
+          </w:p>
+        </w:tc>
+        <w:tc>
+          <w:tcPr>
+            <w:tcW w:w="2249" w:type="dxa"/>
+          </w:tcPr>
+          <w:p>
+            <w:r>
+              <w:t>${</w:t>
+            </w:r>
+            <w:proofErr w:type="spellStart"/>
+            <w:r>
+              <w:t>vehicles_listing_name</w:t>
+            </w:r>
+            <w:proofErr w:type="spellEnd"/>
+            <w:r>
+              <w:t>}</w:t>
+            </w:r>
+          </w:p>
+        </w:tc>
+        <w:tc>
+          <w:tcPr>
+            <w:tcW w:w="2398" w:type="dxa"/>
+          </w:tcPr>
+          <w:p>
+            <w:r>
+              <w:t>${</w:t>
+            </w:r>
+            <w:proofErr w:type="spellStart"/>
+            <w:r>
+              <w:t>vehicles_listing_complex</w:t>
+            </w:r>
+            <w:proofErr w:type="spellEnd"/>
+            <w:r>
+              <w:t>}</w:t>
+            </w:r>
+          </w:p>
+        </w:tc>
+        <w:tc>
+          <w:tcPr>
+            <w:tcW w:w="1910" w:type="dxa"/>
+          </w:tcPr>
+          <w:p>
+            <w:r>
+              <w:t>${</w:t>
+            </w:r>
+            <w:proofErr w:type="spellStart"/>
+            <w:r>
+              <w:t>vehicles_listing_qf</w:t>
+            </w:r>
+            <w:proofErr w:type="spellEnd"/>
+            <w:r>
+              <w:t>}</w:t>
+            </w:r>
+          </w:p>
+        </w:tc>
+        <w:tc>
+          <w:tcPr>
+            <w:tcW w:w="2180" w:type="dxa"/>
+          </w:tcPr>
+          <w:p>
+            <w:r>
+              <w:t>${</w:t>
+            </w:r>
+            <w:proofErr w:type="spellStart"/>
+            <w:r>
+              <w:t>vehicles_listing_status</w:t>
+            </w:r>
+            <w:proofErr w:type="spellEnd"/>
+            <w:r>
+              <w:t>}</w:t>
+            </w:r>
+          </w:p>
+        </w:tc>
+      </w:tr>
+    </w:tbl>
+    <w:p/>
+    <w:p>
+      <w:pPr>
+        <w:pStyle w:val="Heading1"/>
+      </w:pPr>
+      <w:bookmarkStart w:id="14" w:name="_Toc239899321"/>
+      <w:r>
+        <w:lastRenderedPageBreak/>
         <w:t>${</w:t>
       </w:r>
       <w:proofErr w:type="spellStart"/>
       <w:r>
-        <w:t>vehicle_listing</w:t>
+        <w:t>technology_title</w:t>
       </w:r>
       <w:proofErr w:type="spellEnd"/>
       <w:r>
         <w:t>}</w:t>
       </w:r>
-    </w:p>
-    <w:p>
+      <w:bookmarkEnd w:id="14"/>
+    </w:p>
+    <w:p>
+      <w:bookmarkStart w:id="15" w:name="_Toc239899322"/>
       <w:r>
         <w:t>${</w:t>
       </w:r>
       <w:proofErr w:type="spellStart"/>
       <w:r>
-        <w:t>block_technology</w:t>
+        <w:t>technology_intro</w:t>
       </w:r>
       <w:proofErr w:type="spellEnd"/>
       <w:r>
@@ -6092,19 +6197,17 @@
       </w:r>
     </w:p>
     <w:p>
-      <w:bookmarkStart w:id="14" w:name="_Toc239899321"/>
       <w:r>
         <w:t>${</w:t>
       </w:r>
       <w:proofErr w:type="spellStart"/>
       <w:r>
-        <w:t>technology_title</w:t>
+        <w:t>block_compressed_air</w:t>
       </w:r>
       <w:proofErr w:type="spellEnd"/>
       <w:r>
         <w:t>}</w:t>
       </w:r>
-      <w:bookmarkEnd w:id="14"/>
     </w:p>
     <w:p>
       <w:r>
@@ -6112,20 +6215,392 @@
       </w:r>
       <w:proofErr w:type="spellStart"/>
       <w:r>
-        <w:t>technology_content</w:t>
+        <w:t>compressed_air_sub</w:t>
       </w:r>
       <w:proofErr w:type="spellEnd"/>
       <w:r>
         <w:t>}</w:t>
       </w:r>
     </w:p>
+    <w:tbl>
+      <w:tblPr>
+        <w:tblStyle w:val="TableGrid"/>
+        <w:tblW w:w="0" w:type="auto"/>
+        <w:tblLook w:val="04A0" w:firstRow="1" w:lastRow="0" w:firstColumn="1" w:lastColumn="0" w:noHBand="0" w:noVBand="1"/>
+      </w:tblPr>
+      <w:tblGrid>
+        <w:gridCol w:w="4223"/>
+        <w:gridCol w:w="4793"/>
+      </w:tblGrid>
+      <w:tr>
+        <w:tc>
+          <w:tcPr>
+            <w:tcW w:w="4508" w:type="dxa"/>
+          </w:tcPr>
+          <w:p>
+            <w:r>
+              <w:t>Rendszer megnevezése</w:t>
+            </w:r>
+          </w:p>
+        </w:tc>
+        <w:tc>
+          <w:tcPr>
+            <w:tcW w:w="4508" w:type="dxa"/>
+          </w:tcPr>
+          <w:p>
+            <w:r>
+              <w:t>${</w:t>
+            </w:r>
+            <w:proofErr w:type="spellStart"/>
+            <w:r>
+              <w:t>compressed_air_name</w:t>
+            </w:r>
+            <w:proofErr w:type="spellEnd"/>
+            <w:r>
+              <w:t>}</w:t>
+            </w:r>
+          </w:p>
+        </w:tc>
+      </w:tr>
+      <w:tr>
+        <w:tc>
+          <w:tcPr>
+            <w:tcW w:w="4508" w:type="dxa"/>
+          </w:tcPr>
+          <w:p>
+            <w:r>
+              <w:t>Telephely</w:t>
+            </w:r>
+          </w:p>
+        </w:tc>
+        <w:tc>
+          <w:tcPr>
+            <w:tcW w:w="4508" w:type="dxa"/>
+          </w:tcPr>
+          <w:p>
+            <w:r>
+              <w:t>${</w:t>
+            </w:r>
+            <w:proofErr w:type="spellStart"/>
+            <w:r>
+              <w:t>compressed_air_complex</w:t>
+            </w:r>
+            <w:proofErr w:type="spellEnd"/>
+            <w:r>
+              <w:t>}</w:t>
+            </w:r>
+          </w:p>
+        </w:tc>
+      </w:tr>
+      <w:tr>
+        <w:tc>
+          <w:tcPr>
+            <w:tcW w:w="4508" w:type="dxa"/>
+          </w:tcPr>
+          <w:p>
+            <w:r>
+              <w:t>Hálózati nyomás (bar)</w:t>
+            </w:r>
+          </w:p>
+        </w:tc>
+        <w:tc>
+          <w:tcPr>
+            <w:tcW w:w="4508" w:type="dxa"/>
+          </w:tcPr>
+          <w:p>
+            <w:r>
+              <w:t>${</w:t>
+            </w:r>
+            <w:proofErr w:type="spellStart"/>
+            <w:r>
+              <w:t>compressed_air_pressure</w:t>
+            </w:r>
+            <w:proofErr w:type="spellEnd"/>
+            <w:r>
+              <w:t>}</w:t>
+            </w:r>
+          </w:p>
+        </w:tc>
+      </w:tr>
+      <w:tr>
+        <w:tc>
+          <w:tcPr>
+            <w:tcW w:w="4508" w:type="dxa"/>
+          </w:tcPr>
+          <w:p>
+            <w:r>
+              <w:t>Kompresszor típusa</w:t>
+            </w:r>
+          </w:p>
+        </w:tc>
+        <w:tc>
+          <w:tcPr>
+            <w:tcW w:w="4508" w:type="dxa"/>
+          </w:tcPr>
+          <w:p>
+            <w:r>
+              <w:t>${</w:t>
+            </w:r>
+            <w:proofErr w:type="spellStart"/>
+            <w:r>
+              <w:t>compressed_air_compressor_type</w:t>
+            </w:r>
+            <w:proofErr w:type="spellEnd"/>
+            <w:r>
+              <w:t>}</w:t>
+            </w:r>
+          </w:p>
+        </w:tc>
+      </w:tr>
+      <w:tr>
+        <w:tc>
+          <w:tcPr>
+            <w:tcW w:w="4508" w:type="dxa"/>
+          </w:tcPr>
+          <w:p>
+            <w:r>
+              <w:t>Mennyisége (db)</w:t>
+            </w:r>
+          </w:p>
+        </w:tc>
+        <w:tc>
+          <w:tcPr>
+            <w:tcW w:w="4508" w:type="dxa"/>
+          </w:tcPr>
+          <w:p>
+            <w:r>
+              <w:t>${</w:t>
+            </w:r>
+            <w:proofErr w:type="spellStart"/>
+            <w:r>
+              <w:t>compressed_air_compressor_amount</w:t>
+            </w:r>
+            <w:proofErr w:type="spellEnd"/>
+            <w:r>
+              <w:t>}</w:t>
+            </w:r>
+          </w:p>
+        </w:tc>
+      </w:tr>
+      <w:tr>
+        <w:tc>
+          <w:tcPr>
+            <w:tcW w:w="4508" w:type="dxa"/>
+          </w:tcPr>
+          <w:p>
+            <w:r>
+              <w:t>Névleges teljesítmény (kW/db)</w:t>
+            </w:r>
+          </w:p>
+        </w:tc>
+        <w:tc>
+          <w:tcPr>
+            <w:tcW w:w="4508" w:type="dxa"/>
+          </w:tcPr>
+          <w:p>
+            <w:r>
+              <w:t>${</w:t>
+            </w:r>
+            <w:proofErr w:type="spellStart"/>
+            <w:r>
+              <w:t>compressed_air_compressor_nominal</w:t>
+            </w:r>
+            <w:proofErr w:type="spellEnd"/>
+            <w:r>
+              <w:t>}</w:t>
+            </w:r>
+          </w:p>
+        </w:tc>
+      </w:tr>
+      <w:tr>
+        <w:tc>
+          <w:tcPr>
+            <w:tcW w:w="4508" w:type="dxa"/>
+          </w:tcPr>
+          <w:p>
+            <w:r>
+              <w:t>Működési mód</w:t>
+            </w:r>
+          </w:p>
+        </w:tc>
+        <w:tc>
+          <w:tcPr>
+            <w:tcW w:w="4508" w:type="dxa"/>
+          </w:tcPr>
+          <w:p>
+            <w:r>
+              <w:t>${</w:t>
+            </w:r>
+            <w:proofErr w:type="spellStart"/>
+            <w:r>
+              <w:t>compressed_air_compressor_mode</w:t>
+            </w:r>
+            <w:proofErr w:type="spellEnd"/>
+            <w:r>
+              <w:t>}</w:t>
+            </w:r>
+          </w:p>
+        </w:tc>
+      </w:tr>
+      <w:tr>
+        <w:tc>
+          <w:tcPr>
+            <w:tcW w:w="4508" w:type="dxa"/>
+          </w:tcPr>
+          <w:p>
+            <w:r>
+              <w:t>Hozzá tartozó almérés</w:t>
+            </w:r>
+          </w:p>
+        </w:tc>
+        <w:tc>
+          <w:tcPr>
+            <w:tcW w:w="4508" w:type="dxa"/>
+          </w:tcPr>
+          <w:p>
+            <w:r>
+              <w:t>${</w:t>
+            </w:r>
+            <w:proofErr w:type="spellStart"/>
+            <w:r>
+              <w:t>compressed_air_compressor_standing</w:t>
+            </w:r>
+            <w:proofErr w:type="spellEnd"/>
+            <w:r>
+              <w:t>}</w:t>
+            </w:r>
+          </w:p>
+        </w:tc>
+      </w:tr>
+      <w:tr>
+        <w:tc>
+          <w:tcPr>
+            <w:tcW w:w="4508" w:type="dxa"/>
+          </w:tcPr>
+          <w:p>
+            <w:r>
+              <w:t>Van lehetőség a nyomás csökkentésére?</w:t>
+            </w:r>
+          </w:p>
+        </w:tc>
+        <w:tc>
+          <w:tcPr>
+            <w:tcW w:w="4508" w:type="dxa"/>
+          </w:tcPr>
+          <w:p>
+            <w:r>
+              <w:t>${</w:t>
+            </w:r>
+            <w:proofErr w:type="spellStart"/>
+            <w:r>
+              <w:t>compressed_air_compressor_pressure</w:t>
+            </w:r>
+            <w:proofErr w:type="spellEnd"/>
+            <w:r>
+              <w:t>}</w:t>
+            </w:r>
+          </w:p>
+        </w:tc>
+      </w:tr>
+      <w:tr>
+        <w:tc>
+          <w:tcPr>
+            <w:tcW w:w="4508" w:type="dxa"/>
+          </w:tcPr>
+          <w:p>
+            <w:r>
+              <w:t>Van lehetőség hálózati optimalizációra?</w:t>
+            </w:r>
+          </w:p>
+        </w:tc>
+        <w:tc>
+          <w:tcPr>
+            <w:tcW w:w="4508" w:type="dxa"/>
+          </w:tcPr>
+          <w:p>
+            <w:r>
+              <w:t>${</w:t>
+            </w:r>
+            <w:proofErr w:type="spellStart"/>
+            <w:r>
+              <w:t>compressed_air_compressor_optimalisation</w:t>
+            </w:r>
+            <w:proofErr w:type="spellEnd"/>
+            <w:r>
+              <w:t>}</w:t>
+            </w:r>
+          </w:p>
+        </w:tc>
+      </w:tr>
+      <w:tr>
+        <w:tc>
+          <w:tcPr>
+            <w:tcW w:w="4508" w:type="dxa"/>
+          </w:tcPr>
+          <w:p>
+            <w:r>
+              <w:t>Van hulladékhő hasznosítás?</w:t>
+            </w:r>
+          </w:p>
+        </w:tc>
+        <w:tc>
+          <w:tcPr>
+            <w:tcW w:w="4508" w:type="dxa"/>
+          </w:tcPr>
+          <w:p>
+            <w:r>
+              <w:t>${</w:t>
+            </w:r>
+            <w:proofErr w:type="spellStart"/>
+            <w:r>
+              <w:t>compressed_air_compressor_retriever</w:t>
+            </w:r>
+            <w:proofErr w:type="spellEnd"/>
+            <w:r>
+              <w:t>}</w:t>
+            </w:r>
+          </w:p>
+        </w:tc>
+      </w:tr>
+      <w:tr>
+        <w:tc>
+          <w:tcPr>
+            <w:tcW w:w="4508" w:type="dxa"/>
+          </w:tcPr>
+          <w:p>
+            <w:r>
+              <w:t>Értékelés</w:t>
+            </w:r>
+          </w:p>
+        </w:tc>
+        <w:tc>
+          <w:tcPr>
+            <w:tcW w:w="4508" w:type="dxa"/>
+          </w:tcPr>
+          <w:p>
+            <w:r>
+              <w:t>${</w:t>
+            </w:r>
+            <w:proofErr w:type="spellStart"/>
+            <w:r>
+              <w:t>compressed_air_status</w:t>
+            </w:r>
+            <w:proofErr w:type="spellEnd"/>
+            <w:r>
+              <w:t>}</w:t>
+            </w:r>
+          </w:p>
+        </w:tc>
+      </w:tr>
+    </w:tbl>
+    <w:p/>
     <w:p>
       <w:r>
         <w:t>${/</w:t>
       </w:r>
       <w:proofErr w:type="spellStart"/>
       <w:r>
-        <w:t>block_technology</w:t>
+        <w:t>block_compressed_air</w:t>
       </w:r>
       <w:proofErr w:type="spellEnd"/>
       <w:r>
@@ -6133,8 +6608,1041 @@
       </w:r>
     </w:p>
     <w:p>
-      <w:bookmarkStart w:id="15" w:name="_Toc239899322"/>
-      <w:r>
+      <w:r>
+        <w:t>${</w:t>
+      </w:r>
+      <w:proofErr w:type="spellStart"/>
+      <w:r>
+        <w:t>block_steam</w:t>
+      </w:r>
+      <w:proofErr w:type="spellEnd"/>
+      <w:r>
+        <w:t>}</w:t>
+      </w:r>
+    </w:p>
+    <w:p>
+      <w:r>
+        <w:t>${</w:t>
+      </w:r>
+      <w:proofErr w:type="spellStart"/>
+      <w:r>
+        <w:t>steam_sub</w:t>
+      </w:r>
+      <w:proofErr w:type="spellEnd"/>
+      <w:r>
+        <w:t>}</w:t>
+      </w:r>
+    </w:p>
+    <w:tbl>
+      <w:tblPr>
+        <w:tblStyle w:val="TableGrid"/>
+        <w:tblW w:w="0" w:type="auto"/>
+        <w:tblLook w:val="04A0" w:firstRow="1" w:lastRow="0" w:firstColumn="1" w:lastColumn="0" w:noHBand="0" w:noVBand="1"/>
+      </w:tblPr>
+      <w:tblGrid>
+        <w:gridCol w:w="4508"/>
+        <w:gridCol w:w="4508"/>
+      </w:tblGrid>
+      <w:tr>
+        <w:tc>
+          <w:tcPr>
+            <w:tcW w:w="4508" w:type="dxa"/>
+          </w:tcPr>
+          <w:p>
+            <w:r>
+              <w:t>Rendszer megnevezése</w:t>
+            </w:r>
+          </w:p>
+        </w:tc>
+        <w:tc>
+          <w:tcPr>
+            <w:tcW w:w="4508" w:type="dxa"/>
+          </w:tcPr>
+          <w:p>
+            <w:r>
+              <w:t>${</w:t>
+            </w:r>
+            <w:proofErr w:type="spellStart"/>
+            <w:r>
+              <w:t>steam</w:t>
+            </w:r>
+            <w:r>
+              <w:t>_name</w:t>
+            </w:r>
+            <w:proofErr w:type="spellEnd"/>
+            <w:r>
+              <w:t>}</w:t>
+            </w:r>
+          </w:p>
+        </w:tc>
+      </w:tr>
+      <w:tr>
+        <w:tc>
+          <w:tcPr>
+            <w:tcW w:w="4508" w:type="dxa"/>
+          </w:tcPr>
+          <w:p>
+            <w:r>
+              <w:t>Telephely</w:t>
+            </w:r>
+          </w:p>
+        </w:tc>
+        <w:tc>
+          <w:tcPr>
+            <w:tcW w:w="4508" w:type="dxa"/>
+          </w:tcPr>
+          <w:p>
+            <w:r>
+              <w:t>${</w:t>
+            </w:r>
+            <w:proofErr w:type="spellStart"/>
+            <w:r>
+              <w:t>steam</w:t>
+            </w:r>
+            <w:r>
+              <w:t>_complex</w:t>
+            </w:r>
+            <w:proofErr w:type="spellEnd"/>
+            <w:r>
+              <w:t>}</w:t>
+            </w:r>
+          </w:p>
+        </w:tc>
+      </w:tr>
+      <w:tr>
+        <w:tc>
+          <w:tcPr>
+            <w:tcW w:w="4508" w:type="dxa"/>
+          </w:tcPr>
+          <w:p>
+            <w:r>
+              <w:t>Hálózati nyomás (bar)</w:t>
+            </w:r>
+          </w:p>
+        </w:tc>
+        <w:tc>
+          <w:tcPr>
+            <w:tcW w:w="4508" w:type="dxa"/>
+          </w:tcPr>
+          <w:p>
+            <w:r>
+              <w:t>${</w:t>
+            </w:r>
+            <w:proofErr w:type="spellStart"/>
+            <w:r>
+              <w:t>steam</w:t>
+            </w:r>
+            <w:r>
+              <w:t>_pressure</w:t>
+            </w:r>
+            <w:proofErr w:type="spellEnd"/>
+            <w:r>
+              <w:t>}</w:t>
+            </w:r>
+          </w:p>
+        </w:tc>
+      </w:tr>
+      <w:tr>
+        <w:tc>
+          <w:tcPr>
+            <w:tcW w:w="4508" w:type="dxa"/>
+          </w:tcPr>
+          <w:p>
+            <w:r>
+              <w:t>Kompresszor típusa</w:t>
+            </w:r>
+          </w:p>
+        </w:tc>
+        <w:tc>
+          <w:tcPr>
+            <w:tcW w:w="4508" w:type="dxa"/>
+          </w:tcPr>
+          <w:p>
+            <w:r>
+              <w:t>${</w:t>
+            </w:r>
+            <w:proofErr w:type="spellStart"/>
+            <w:r>
+              <w:t>steam</w:t>
+            </w:r>
+            <w:r>
+              <w:t>_compressor_type</w:t>
+            </w:r>
+            <w:proofErr w:type="spellEnd"/>
+            <w:r>
+              <w:t>}</w:t>
+            </w:r>
+          </w:p>
+        </w:tc>
+      </w:tr>
+      <w:tr>
+        <w:tc>
+          <w:tcPr>
+            <w:tcW w:w="4508" w:type="dxa"/>
+          </w:tcPr>
+          <w:p>
+            <w:r>
+              <w:t>Mennyisége (db)</w:t>
+            </w:r>
+          </w:p>
+        </w:tc>
+        <w:tc>
+          <w:tcPr>
+            <w:tcW w:w="4508" w:type="dxa"/>
+          </w:tcPr>
+          <w:p>
+            <w:r>
+              <w:t>${</w:t>
+            </w:r>
+            <w:proofErr w:type="spellStart"/>
+            <w:r>
+              <w:t>steam</w:t>
+            </w:r>
+            <w:r>
+              <w:t>_compressor_amount</w:t>
+            </w:r>
+            <w:proofErr w:type="spellEnd"/>
+            <w:r>
+              <w:t>}</w:t>
+            </w:r>
+          </w:p>
+        </w:tc>
+      </w:tr>
+      <w:tr>
+        <w:tc>
+          <w:tcPr>
+            <w:tcW w:w="4508" w:type="dxa"/>
+          </w:tcPr>
+          <w:p>
+            <w:r>
+              <w:t>Névleges teljesítmény (kW/db)</w:t>
+            </w:r>
+          </w:p>
+        </w:tc>
+        <w:tc>
+          <w:tcPr>
+            <w:tcW w:w="4508" w:type="dxa"/>
+          </w:tcPr>
+          <w:p>
+            <w:r>
+              <w:t>${</w:t>
+            </w:r>
+            <w:proofErr w:type="spellStart"/>
+            <w:r>
+              <w:t>steam</w:t>
+            </w:r>
+            <w:r>
+              <w:t>_compressor_nominal</w:t>
+            </w:r>
+            <w:proofErr w:type="spellEnd"/>
+            <w:r>
+              <w:t>}</w:t>
+            </w:r>
+          </w:p>
+        </w:tc>
+      </w:tr>
+      <w:tr>
+        <w:tc>
+          <w:tcPr>
+            <w:tcW w:w="4508" w:type="dxa"/>
+          </w:tcPr>
+          <w:p>
+            <w:r>
+              <w:t>Működési mód</w:t>
+            </w:r>
+          </w:p>
+        </w:tc>
+        <w:tc>
+          <w:tcPr>
+            <w:tcW w:w="4508" w:type="dxa"/>
+          </w:tcPr>
+          <w:p>
+            <w:r>
+              <w:t>${</w:t>
+            </w:r>
+            <w:proofErr w:type="spellStart"/>
+            <w:r>
+              <w:t>steam</w:t>
+            </w:r>
+            <w:r>
+              <w:t>_compressor_mode</w:t>
+            </w:r>
+            <w:proofErr w:type="spellEnd"/>
+            <w:r>
+              <w:t>}</w:t>
+            </w:r>
+          </w:p>
+        </w:tc>
+      </w:tr>
+      <w:tr>
+        <w:tc>
+          <w:tcPr>
+            <w:tcW w:w="4508" w:type="dxa"/>
+          </w:tcPr>
+          <w:p>
+            <w:r>
+              <w:t>Hozzá tartozó almérés</w:t>
+            </w:r>
+          </w:p>
+        </w:tc>
+        <w:tc>
+          <w:tcPr>
+            <w:tcW w:w="4508" w:type="dxa"/>
+          </w:tcPr>
+          <w:p>
+            <w:r>
+              <w:t>${</w:t>
+            </w:r>
+            <w:proofErr w:type="spellStart"/>
+            <w:r>
+              <w:t>steam</w:t>
+            </w:r>
+            <w:r>
+              <w:t>_compressor_standing</w:t>
+            </w:r>
+            <w:proofErr w:type="spellEnd"/>
+            <w:r>
+              <w:t>}</w:t>
+            </w:r>
+          </w:p>
+        </w:tc>
+      </w:tr>
+      <w:tr>
+        <w:tc>
+          <w:tcPr>
+            <w:tcW w:w="4508" w:type="dxa"/>
+          </w:tcPr>
+          <w:p>
+            <w:r>
+              <w:t>Van lehetőség a nyomás csökkentésére?</w:t>
+            </w:r>
+          </w:p>
+        </w:tc>
+        <w:tc>
+          <w:tcPr>
+            <w:tcW w:w="4508" w:type="dxa"/>
+          </w:tcPr>
+          <w:p>
+            <w:r>
+              <w:t>${</w:t>
+            </w:r>
+            <w:proofErr w:type="spellStart"/>
+            <w:r>
+              <w:t>steam</w:t>
+            </w:r>
+            <w:r>
+              <w:t>_compressor_pressure</w:t>
+            </w:r>
+            <w:proofErr w:type="spellEnd"/>
+            <w:r>
+              <w:t>}</w:t>
+            </w:r>
+          </w:p>
+        </w:tc>
+      </w:tr>
+      <w:tr>
+        <w:tc>
+          <w:tcPr>
+            <w:tcW w:w="4508" w:type="dxa"/>
+          </w:tcPr>
+          <w:p>
+            <w:r>
+              <w:t>Van lehetőség hálózati optimalizációra?</w:t>
+            </w:r>
+          </w:p>
+        </w:tc>
+        <w:tc>
+          <w:tcPr>
+            <w:tcW w:w="4508" w:type="dxa"/>
+          </w:tcPr>
+          <w:p>
+            <w:r>
+              <w:t>${</w:t>
+            </w:r>
+            <w:proofErr w:type="spellStart"/>
+            <w:r>
+              <w:t>steam</w:t>
+            </w:r>
+            <w:r>
+              <w:t>_compressor_optimalisation</w:t>
+            </w:r>
+            <w:proofErr w:type="spellEnd"/>
+            <w:r>
+              <w:t>}</w:t>
+            </w:r>
+          </w:p>
+        </w:tc>
+      </w:tr>
+      <w:tr>
+        <w:tc>
+          <w:tcPr>
+            <w:tcW w:w="4508" w:type="dxa"/>
+          </w:tcPr>
+          <w:p>
+            <w:r>
+              <w:t>Van hulladékhő hasznosítás?</w:t>
+            </w:r>
+          </w:p>
+        </w:tc>
+        <w:tc>
+          <w:tcPr>
+            <w:tcW w:w="4508" w:type="dxa"/>
+          </w:tcPr>
+          <w:p>
+            <w:r>
+              <w:t>${</w:t>
+            </w:r>
+            <w:proofErr w:type="spellStart"/>
+            <w:r>
+              <w:t>steam</w:t>
+            </w:r>
+            <w:r>
+              <w:t>_compressor_retriever</w:t>
+            </w:r>
+            <w:proofErr w:type="spellEnd"/>
+            <w:r>
+              <w:t>}</w:t>
+            </w:r>
+          </w:p>
+        </w:tc>
+      </w:tr>
+      <w:tr>
+        <w:tc>
+          <w:tcPr>
+            <w:tcW w:w="4508" w:type="dxa"/>
+          </w:tcPr>
+          <w:p>
+            <w:r>
+              <w:t>Értékelés</w:t>
+            </w:r>
+          </w:p>
+        </w:tc>
+        <w:tc>
+          <w:tcPr>
+            <w:tcW w:w="4508" w:type="dxa"/>
+          </w:tcPr>
+          <w:p>
+            <w:r>
+              <w:t>${</w:t>
+            </w:r>
+            <w:proofErr w:type="spellStart"/>
+            <w:r>
+              <w:t>steam</w:t>
+            </w:r>
+            <w:r>
+              <w:t>_status</w:t>
+            </w:r>
+            <w:proofErr w:type="spellEnd"/>
+            <w:r>
+              <w:t>}</w:t>
+            </w:r>
+          </w:p>
+        </w:tc>
+      </w:tr>
+    </w:tbl>
+    <w:p/>
+    <w:p>
+      <w:r>
+        <w:t>${/</w:t>
+      </w:r>
+      <w:proofErr w:type="spellStart"/>
+      <w:r>
+        <w:t>block_steam</w:t>
+      </w:r>
+      <w:proofErr w:type="spellEnd"/>
+      <w:r>
+        <w:t>}</w:t>
+      </w:r>
+    </w:p>
+    <w:p>
+      <w:r>
+        <w:t>${</w:t>
+      </w:r>
+      <w:proofErr w:type="spellStart"/>
+      <w:r>
+        <w:t>block_tech_cooling</w:t>
+      </w:r>
+      <w:proofErr w:type="spellEnd"/>
+      <w:r>
+        <w:t>}</w:t>
+      </w:r>
+    </w:p>
+    <w:p>
+      <w:r>
+        <w:t>${</w:t>
+      </w:r>
+      <w:proofErr w:type="spellStart"/>
+      <w:r>
+        <w:t>tech_cooling_sub</w:t>
+      </w:r>
+      <w:proofErr w:type="spellEnd"/>
+      <w:r>
+        <w:t>}</w:t>
+      </w:r>
+    </w:p>
+    <w:tbl>
+      <w:tblPr>
+        <w:tblStyle w:val="TableGrid"/>
+        <w:tblW w:w="0" w:type="auto"/>
+        <w:tblLook w:val="04A0" w:firstRow="1" w:lastRow="0" w:firstColumn="1" w:lastColumn="0" w:noHBand="0" w:noVBand="1"/>
+      </w:tblPr>
+      <w:tblGrid>
+        <w:gridCol w:w="4508"/>
+        <w:gridCol w:w="4508"/>
+      </w:tblGrid>
+      <w:tr>
+        <w:tc>
+          <w:tcPr>
+            <w:tcW w:w="4508" w:type="dxa"/>
+          </w:tcPr>
+          <w:p>
+            <w:r>
+              <w:lastRenderedPageBreak/>
+              <w:t>Rendszer megnevezése</w:t>
+            </w:r>
+          </w:p>
+        </w:tc>
+        <w:tc>
+          <w:tcPr>
+            <w:tcW w:w="4508" w:type="dxa"/>
+          </w:tcPr>
+          <w:p>
+            <w:r>
+              <w:t>${</w:t>
+            </w:r>
+            <w:proofErr w:type="spellStart"/>
+            <w:r>
+              <w:t>tech_cooling_name</w:t>
+            </w:r>
+            <w:proofErr w:type="spellEnd"/>
+            <w:r>
+              <w:t>}</w:t>
+            </w:r>
+          </w:p>
+        </w:tc>
+      </w:tr>
+      <w:tr>
+        <w:tc>
+          <w:tcPr>
+            <w:tcW w:w="4508" w:type="dxa"/>
+          </w:tcPr>
+          <w:p>
+            <w:r>
+              <w:t>Hűtőberendezés típusa</w:t>
+            </w:r>
+          </w:p>
+        </w:tc>
+        <w:tc>
+          <w:tcPr>
+            <w:tcW w:w="4508" w:type="dxa"/>
+          </w:tcPr>
+          <w:p>
+            <w:r>
+              <w:t>${</w:t>
+            </w:r>
+            <w:proofErr w:type="spellStart"/>
+            <w:r>
+              <w:t>tech_cooling_type</w:t>
+            </w:r>
+            <w:proofErr w:type="spellEnd"/>
+            <w:r>
+              <w:t>}</w:t>
+            </w:r>
+          </w:p>
+        </w:tc>
+      </w:tr>
+      <w:tr>
+        <w:tc>
+          <w:tcPr>
+            <w:tcW w:w="4508" w:type="dxa"/>
+          </w:tcPr>
+          <w:p>
+            <w:r>
+              <w:t>Mennyisége (db)</w:t>
+            </w:r>
+          </w:p>
+        </w:tc>
+        <w:tc>
+          <w:tcPr>
+            <w:tcW w:w="4508" w:type="dxa"/>
+          </w:tcPr>
+          <w:p>
+            <w:r>
+              <w:t>${</w:t>
+            </w:r>
+            <w:proofErr w:type="spellStart"/>
+            <w:r>
+              <w:t>tech_cooling_amount</w:t>
+            </w:r>
+            <w:proofErr w:type="spellEnd"/>
+            <w:r>
+              <w:t>}</w:t>
+            </w:r>
+          </w:p>
+        </w:tc>
+      </w:tr>
+      <w:tr>
+        <w:tc>
+          <w:tcPr>
+            <w:tcW w:w="4508" w:type="dxa"/>
+          </w:tcPr>
+          <w:p>
+            <w:r>
+              <w:t>Névleges teljesítmény (kW/db)</w:t>
+            </w:r>
+          </w:p>
+        </w:tc>
+        <w:tc>
+          <w:tcPr>
+            <w:tcW w:w="4508" w:type="dxa"/>
+          </w:tcPr>
+          <w:p>
+            <w:r>
+              <w:t>${</w:t>
+            </w:r>
+            <w:proofErr w:type="spellStart"/>
+            <w:r>
+              <w:t>tech_cooling_nominal</w:t>
+            </w:r>
+            <w:proofErr w:type="spellEnd"/>
+            <w:r>
+              <w:t>}</w:t>
+            </w:r>
+          </w:p>
+        </w:tc>
+      </w:tr>
+      <w:tr>
+        <w:tc>
+          <w:tcPr>
+            <w:tcW w:w="4508" w:type="dxa"/>
+          </w:tcPr>
+          <w:p>
+            <w:r>
+              <w:t>Működési mód</w:t>
+            </w:r>
+          </w:p>
+        </w:tc>
+        <w:tc>
+          <w:tcPr>
+            <w:tcW w:w="4508" w:type="dxa"/>
+          </w:tcPr>
+          <w:p>
+            <w:r>
+              <w:t>${</w:t>
+            </w:r>
+            <w:proofErr w:type="spellStart"/>
+            <w:r>
+              <w:t>tech_cooling_mode</w:t>
+            </w:r>
+            <w:proofErr w:type="spellEnd"/>
+            <w:r>
+              <w:t>}</w:t>
+            </w:r>
+          </w:p>
+        </w:tc>
+      </w:tr>
+      <w:tr>
+        <w:tc>
+          <w:tcPr>
+            <w:tcW w:w="4508" w:type="dxa"/>
+          </w:tcPr>
+          <w:p>
+            <w:r>
+              <w:t>Hozzá tartozó almérés</w:t>
+            </w:r>
+          </w:p>
+        </w:tc>
+        <w:tc>
+          <w:tcPr>
+            <w:tcW w:w="4508" w:type="dxa"/>
+          </w:tcPr>
+          <w:p>
+            <w:r>
+              <w:t>${</w:t>
+            </w:r>
+            <w:proofErr w:type="spellStart"/>
+            <w:r>
+              <w:t>tech_cooling_standing</w:t>
+            </w:r>
+            <w:proofErr w:type="spellEnd"/>
+            <w:r>
+              <w:t>}</w:t>
+            </w:r>
+          </w:p>
+        </w:tc>
+      </w:tr>
+      <w:tr>
+        <w:tc>
+          <w:tcPr>
+            <w:tcW w:w="4508" w:type="dxa"/>
+          </w:tcPr>
+          <w:p>
+            <w:r>
+              <w:t>Van hulladékhő hasznosítás?</w:t>
+            </w:r>
+          </w:p>
+        </w:tc>
+        <w:tc>
+          <w:tcPr>
+            <w:tcW w:w="4508" w:type="dxa"/>
+          </w:tcPr>
+          <w:p>
+            <w:r>
+              <w:t>${</w:t>
+            </w:r>
+            <w:proofErr w:type="spellStart"/>
+            <w:r>
+              <w:t>tech_cooling_retriever</w:t>
+            </w:r>
+            <w:proofErr w:type="spellEnd"/>
+            <w:r>
+              <w:t>}</w:t>
+            </w:r>
+          </w:p>
+        </w:tc>
+      </w:tr>
+      <w:tr>
+        <w:tc>
+          <w:tcPr>
+            <w:tcW w:w="4508" w:type="dxa"/>
+          </w:tcPr>
+          <w:p>
+            <w:r>
+              <w:t>Értékelés</w:t>
+            </w:r>
+          </w:p>
+        </w:tc>
+        <w:tc>
+          <w:tcPr>
+            <w:tcW w:w="4508" w:type="dxa"/>
+          </w:tcPr>
+          <w:p>
+            <w:r>
+              <w:t>${</w:t>
+            </w:r>
+            <w:proofErr w:type="spellStart"/>
+            <w:r>
+              <w:t>tech_cooling_status</w:t>
+            </w:r>
+            <w:proofErr w:type="spellEnd"/>
+            <w:r>
+              <w:t>}</w:t>
+            </w:r>
+          </w:p>
+        </w:tc>
+      </w:tr>
+    </w:tbl>
+    <w:p/>
+    <w:p>
+      <w:r>
+        <w:t>${/</w:t>
+      </w:r>
+      <w:proofErr w:type="spellStart"/>
+      <w:r>
+        <w:t>block_tech_cooling</w:t>
+      </w:r>
+      <w:proofErr w:type="spellEnd"/>
+      <w:r>
+        <w:t>}</w:t>
+      </w:r>
+    </w:p>
+    <w:p>
+      <w:r>
+        <w:t>${</w:t>
+      </w:r>
+      <w:proofErr w:type="spellStart"/>
+      <w:r>
+        <w:t>block_other</w:t>
+      </w:r>
+      <w:proofErr w:type="spellEnd"/>
+      <w:r>
+        <w:t>}</w:t>
+      </w:r>
+    </w:p>
+    <w:p>
+      <w:r>
+        <w:t>${</w:t>
+      </w:r>
+      <w:proofErr w:type="spellStart"/>
+      <w:r>
+        <w:t>other_sub</w:t>
+      </w:r>
+      <w:proofErr w:type="spellEnd"/>
+      <w:r>
+        <w:t>}</w:t>
+      </w:r>
+    </w:p>
+    <w:tbl>
+      <w:tblPr>
+        <w:tblStyle w:val="TableGrid"/>
+        <w:tblW w:w="0" w:type="auto"/>
+        <w:tblLook w:val="04A0" w:firstRow="1" w:lastRow="0" w:firstColumn="1" w:lastColumn="0" w:noHBand="0" w:noVBand="1"/>
+      </w:tblPr>
+      <w:tblGrid>
+        <w:gridCol w:w="4508"/>
+        <w:gridCol w:w="4508"/>
+      </w:tblGrid>
+      <w:tr>
+        <w:tc>
+          <w:tcPr>
+            <w:tcW w:w="4508" w:type="dxa"/>
+          </w:tcPr>
+          <w:p>
+            <w:r>
+              <w:t>Rendszer megnevezése</w:t>
+            </w:r>
+          </w:p>
+        </w:tc>
+        <w:tc>
+          <w:tcPr>
+            <w:tcW w:w="4508" w:type="dxa"/>
+          </w:tcPr>
+          <w:p>
+            <w:r>
+              <w:t>${</w:t>
+            </w:r>
+            <w:proofErr w:type="spellStart"/>
+            <w:r>
+              <w:t>other_name</w:t>
+            </w:r>
+            <w:proofErr w:type="spellEnd"/>
+            <w:r>
+              <w:t>}</w:t>
+            </w:r>
+          </w:p>
+        </w:tc>
+      </w:tr>
+      <w:tr>
+        <w:tc>
+          <w:tcPr>
+            <w:tcW w:w="4508" w:type="dxa"/>
+          </w:tcPr>
+          <w:p>
+            <w:r>
+              <w:t>Telephely</w:t>
+            </w:r>
+          </w:p>
+        </w:tc>
+        <w:tc>
+          <w:tcPr>
+            <w:tcW w:w="4508" w:type="dxa"/>
+          </w:tcPr>
+          <w:p>
+            <w:r>
+              <w:t>${</w:t>
+            </w:r>
+            <w:proofErr w:type="spellStart"/>
+            <w:r>
+              <w:t>other_complex</w:t>
+            </w:r>
+            <w:proofErr w:type="spellEnd"/>
+            <w:r>
+              <w:t>}</w:t>
+            </w:r>
+          </w:p>
+        </w:tc>
+      </w:tr>
+      <w:tr>
+        <w:tc>
+          <w:tcPr>
+            <w:tcW w:w="4508" w:type="dxa"/>
+          </w:tcPr>
+          <w:p>
+            <w:r>
+              <w:t>Technológiai berendezés típusa</w:t>
+            </w:r>
+          </w:p>
+        </w:tc>
+        <w:tc>
+          <w:tcPr>
+            <w:tcW w:w="4508" w:type="dxa"/>
+          </w:tcPr>
+          <w:p>
+            <w:r>
+              <w:t>${</w:t>
+            </w:r>
+            <w:proofErr w:type="spellStart"/>
+            <w:r>
+              <w:t>other_type</w:t>
+            </w:r>
+            <w:proofErr w:type="spellEnd"/>
+            <w:r>
+              <w:t>}</w:t>
+            </w:r>
+          </w:p>
+        </w:tc>
+      </w:tr>
+      <w:tr>
+        <w:tc>
+          <w:tcPr>
+            <w:tcW w:w="4508" w:type="dxa"/>
+          </w:tcPr>
+          <w:p>
+            <w:r>
+              <w:t>Mennyisége (db)</w:t>
+            </w:r>
+          </w:p>
+        </w:tc>
+        <w:tc>
+          <w:tcPr>
+            <w:tcW w:w="4508" w:type="dxa"/>
+          </w:tcPr>
+          <w:p>
+            <w:r>
+              <w:t>${</w:t>
+            </w:r>
+            <w:proofErr w:type="spellStart"/>
+            <w:r>
+              <w:t>other_amount</w:t>
+            </w:r>
+            <w:proofErr w:type="spellEnd"/>
+            <w:r>
+              <w:t>}</w:t>
+            </w:r>
+          </w:p>
+        </w:tc>
+      </w:tr>
+      <w:tr>
+        <w:tc>
+          <w:tcPr>
+            <w:tcW w:w="4508" w:type="dxa"/>
+          </w:tcPr>
+          <w:p>
+            <w:r>
+              <w:t>Névleges hőteljesítmény (kW/db)</w:t>
+            </w:r>
+          </w:p>
+        </w:tc>
+        <w:tc>
+          <w:tcPr>
+            <w:tcW w:w="4508" w:type="dxa"/>
+          </w:tcPr>
+          <w:p>
+            <w:r>
+              <w:t>${</w:t>
+            </w:r>
+            <w:proofErr w:type="spellStart"/>
+            <w:r>
+              <w:t>other_nominal</w:t>
+            </w:r>
+            <w:proofErr w:type="spellEnd"/>
+            <w:r>
+              <w:t>}</w:t>
+            </w:r>
+          </w:p>
+        </w:tc>
+      </w:tr>
+      <w:tr>
+        <w:tc>
+          <w:tcPr>
+            <w:tcW w:w="4508" w:type="dxa"/>
+          </w:tcPr>
+          <w:p>
+            <w:r>
+              <w:t>Hozzá tartozó almérés</w:t>
+            </w:r>
+          </w:p>
+        </w:tc>
+        <w:tc>
+          <w:tcPr>
+            <w:tcW w:w="4508" w:type="dxa"/>
+          </w:tcPr>
+          <w:p>
+            <w:r>
+              <w:t>${</w:t>
+            </w:r>
+            <w:proofErr w:type="spellStart"/>
+            <w:r>
+              <w:t>other_standing</w:t>
+            </w:r>
+            <w:proofErr w:type="spellEnd"/>
+            <w:r>
+              <w:t>}</w:t>
+            </w:r>
+          </w:p>
+        </w:tc>
+      </w:tr>
+      <w:tr>
+        <w:tc>
+          <w:tcPr>
+            <w:tcW w:w="4508" w:type="dxa"/>
+          </w:tcPr>
+          <w:p>
+            <w:r>
+              <w:t>Van hulladékhő hasznosítás?</w:t>
+            </w:r>
+          </w:p>
+        </w:tc>
+        <w:tc>
+          <w:tcPr>
+            <w:tcW w:w="4508" w:type="dxa"/>
+          </w:tcPr>
+          <w:p>
+            <w:r>
+              <w:t>${</w:t>
+            </w:r>
+            <w:proofErr w:type="spellStart"/>
+            <w:r>
+              <w:t>other_retriever</w:t>
+            </w:r>
+            <w:proofErr w:type="spellEnd"/>
+            <w:r>
+              <w:t>}</w:t>
+            </w:r>
+          </w:p>
+        </w:tc>
+      </w:tr>
+      <w:tr>
+        <w:tc>
+          <w:tcPr>
+            <w:tcW w:w="4508" w:type="dxa"/>
+          </w:tcPr>
+          <w:p>
+            <w:r>
+              <w:t>Értékelés</w:t>
+            </w:r>
+          </w:p>
+        </w:tc>
+        <w:tc>
+          <w:tcPr>
+            <w:tcW w:w="4508" w:type="dxa"/>
+          </w:tcPr>
+          <w:p>
+            <w:r>
+              <w:t>${</w:t>
+            </w:r>
+            <w:proofErr w:type="spellStart"/>
+            <w:r>
+              <w:t>other_status</w:t>
+            </w:r>
+            <w:proofErr w:type="spellEnd"/>
+            <w:r>
+              <w:t>}</w:t>
+            </w:r>
+          </w:p>
+        </w:tc>
+      </w:tr>
+    </w:tbl>
+    <w:p/>
+    <w:p>
+      <w:r>
+        <w:t>${/</w:t>
+      </w:r>
+      <w:proofErr w:type="spellStart"/>
+      <w:r>
+        <w:t>block_other</w:t>
+      </w:r>
+      <w:proofErr w:type="spellEnd"/>
+      <w:r>
+        <w:t>}</w:t>
+      </w:r>
+    </w:p>
+    <w:p>
+      <w:pPr>
+        <w:pStyle w:val="Heading1"/>
+      </w:pPr>
+      <w:r>
+        <w:lastRenderedPageBreak/>
         <w:t>${</w:t>
       </w:r>
       <w:proofErr w:type="spellStart"/>
@@ -6399,8 +7907,12 @@
       </w:r>
     </w:p>
     <w:p>
+      <w:pPr>
+        <w:pStyle w:val="Heading1"/>
+      </w:pPr>
       <w:bookmarkStart w:id="16" w:name="_Toc239899323"/>
       <w:r>
+        <w:lastRenderedPageBreak/>
         <w:t>${technology_offset_2_index</w:t>
       </w:r>
       <w:proofErr w:type="gramStart"/>
@@ -6463,25 +7975,133 @@
         <w:t>} időszak termelés számai az alábbi táblázat szerint alakultak:</w:t>
       </w:r>
     </w:p>
-    <w:p>
-      <w:r>
-        <w:t>${</w:t>
-      </w:r>
-      <w:proofErr w:type="spellStart"/>
-      <w:r>
-        <w:t>product_listing</w:t>
-      </w:r>
-      <w:proofErr w:type="spellEnd"/>
-      <w:r>
-        <w:t>}</w:t>
-      </w:r>
-    </w:p>
+    <w:tbl>
+      <w:tblPr>
+        <w:tblStyle w:val="TableGrid"/>
+        <w:tblW w:w="0" w:type="auto"/>
+        <w:tblLook w:val="04A0" w:firstRow="1" w:lastRow="0" w:firstColumn="1" w:lastColumn="0" w:noHBand="0" w:noVBand="1"/>
+      </w:tblPr>
+      <w:tblGrid>
+        <w:gridCol w:w="562"/>
+        <w:gridCol w:w="3261"/>
+        <w:gridCol w:w="5193"/>
+      </w:tblGrid>
+      <w:tr>
+        <w:tc>
+          <w:tcPr>
+            <w:tcW w:w="562" w:type="dxa"/>
+          </w:tcPr>
+          <w:p/>
+        </w:tc>
+        <w:tc>
+          <w:tcPr>
+            <w:tcW w:w="3261" w:type="dxa"/>
+          </w:tcPr>
+          <w:p>
+            <w:r>
+              <w:t>Termék megnevezése</w:t>
+            </w:r>
+          </w:p>
+        </w:tc>
+        <w:tc>
+          <w:tcPr>
+            <w:tcW w:w="5193" w:type="dxa"/>
+          </w:tcPr>
+          <w:p>
+            <w:r>
+              <w:t>Mennyiség</w:t>
+            </w:r>
+          </w:p>
+        </w:tc>
+      </w:tr>
+      <w:tr>
+        <w:tc>
+          <w:tcPr>
+            <w:tcW w:w="562" w:type="dxa"/>
+          </w:tcPr>
+          <w:p>
+            <w:pPr>
+              <w:rPr>
+                <w:sz w:val="2"/>
+                <w:szCs w:val="2"/>
+              </w:rPr>
+            </w:pPr>
+            <w:r>
+              <w:rPr>
+                <w:color w:val="FFFFFF" w:themeColor="background1"/>
+                <w:sz w:val="2"/>
+                <w:szCs w:val="2"/>
+              </w:rPr>
+              <w:t>${</w:t>
+            </w:r>
+            <w:proofErr w:type="spellStart"/>
+            <w:r>
+              <w:rPr>
+                <w:color w:val="FFFFFF" w:themeColor="background1"/>
+                <w:sz w:val="2"/>
+                <w:szCs w:val="2"/>
+              </w:rPr>
+              <w:t>product_listing_row</w:t>
+            </w:r>
+            <w:proofErr w:type="spellEnd"/>
+            <w:r>
+              <w:rPr>
+                <w:color w:val="FFFFFF" w:themeColor="background1"/>
+                <w:sz w:val="2"/>
+                <w:szCs w:val="2"/>
+              </w:rPr>
+              <w:t>}</w:t>
+            </w:r>
+          </w:p>
+        </w:tc>
+        <w:tc>
+          <w:tcPr>
+            <w:tcW w:w="3261" w:type="dxa"/>
+          </w:tcPr>
+          <w:p>
+            <w:r>
+              <w:t>${</w:t>
+            </w:r>
+            <w:proofErr w:type="spellStart"/>
+            <w:r>
+              <w:t>product_listing_name</w:t>
+            </w:r>
+            <w:proofErr w:type="spellEnd"/>
+            <w:r>
+              <w:t>}</w:t>
+            </w:r>
+          </w:p>
+        </w:tc>
+        <w:tc>
+          <w:tcPr>
+            <w:tcW w:w="5193" w:type="dxa"/>
+          </w:tcPr>
+          <w:p>
+            <w:r>
+              <w:t>${</w:t>
+            </w:r>
+            <w:proofErr w:type="spellStart"/>
+            <w:r>
+              <w:t>product_listing_amount</w:t>
+            </w:r>
+            <w:proofErr w:type="spellEnd"/>
+            <w:r>
+              <w:t>}</w:t>
+            </w:r>
+          </w:p>
+        </w:tc>
+      </w:tr>
+    </w:tbl>
+    <w:p/>
     <w:p>
       <w:r>
         <w:t>Az indexbe nem kerülnek beleszámításra az Épület és Szállítás jellegű fogyasztások, csak a Tevékenység energiafelhasználásai. Ezek alapján az ETM értéke ${ETM}. Minden jövőbeni, az energiahatékonyságot növelő technológiai beruházást ezen érték javulásában célszerű lemérni.</w:t>
       </w:r>
     </w:p>
     <w:p>
+      <w:pPr>
+        <w:pStyle w:val="Heading1"/>
+      </w:pPr>
       <w:bookmarkStart w:id="17" w:name="_Toc239899324"/>
       <w:r>
         <w:lastRenderedPageBreak/>

</xml_diff>

<commit_message>
Technology done, word is working
</commit_message>
<xml_diff>
--- a/pyros_be/controllers/audit_template.docx
+++ b/pyros_be/controllers/audit_template.docx
@@ -24,15 +24,7 @@
         <w:pStyle w:val="Title"/>
       </w:pPr>
       <w:r>
-        <w:t>${</w:t>
-      </w:r>
-      <w:proofErr w:type="spellStart"/>
-      <w:r>
-        <w:t>company_name</w:t>
-      </w:r>
-      <w:proofErr w:type="spellEnd"/>
-      <w:r>
-        <w:t>}</w:t>
+        <w:t>${company_name}</w:t>
       </w:r>
     </w:p>
     <w:p/>
@@ -1367,26 +1359,13 @@
     </w:p>
     <w:p>
       <w:r>
-        <w:t>A ${</w:t>
-      </w:r>
-      <w:proofErr w:type="spellStart"/>
-      <w:r>
-        <w:t>company_name</w:t>
-      </w:r>
-      <w:proofErr w:type="spellEnd"/>
-      <w:r>
-        <w:t>} mindamellett, hogy eleget kíván tenni a számára is kötelezően előírt, az energiahatékonyságról szóló 2015. évi LVII. törvényben foglalt energetikai auditálási kötelezettségeinek, egyúttal a hosszabb távú céljainak elérése érdekében meg kívánja vizsgálni, hogy jelenlegi magyarországi ${telephelyein} milyen energetikai fejlesztési potenciálok találhatóak. A</w:t>
+        <w:t>A ${company_name} mindamellett, hogy eleget kíván tenni a számára is kötelezően előírt, az energiahatékonyságról szóló 2015. évi LVII. törvényben foglalt energetikai auditálási kötelezettségeinek, egyúttal a hosszabb távú céljainak elérése érdekében meg kívánja vizsgálni, hogy jelenlegi magyarországi ${telephelyein} milyen energetikai fejlesztési potenciálok találhatóak. A</w:t>
       </w:r>
       <w:r>
         <w:t xml:space="preserve"> </w:t>
       </w:r>
-      <w:proofErr w:type="spellStart"/>
-      <w:r>
-        <w:t>Balajti</w:t>
-      </w:r>
-      <w:proofErr w:type="spellEnd"/>
-      <w:r>
-        <w:t xml:space="preserve"> Energetika Kft. ezen veszteségfeltáró auditálási feladatra adott ajánlatával elnyerte a munkát, az alábbi tanulmány ezen elkészült energiahatékonysági audit írásos dokumentációja.</w:t>
+      <w:r>
+        <w:t>Balajti Energetika Kft. ezen veszteségfeltáró auditálási feladatra adott ajánlatával elnyerte a munkát, az alábbi tanulmány ezen elkészült energiahatékonysági audit írásos dokumentációja.</w:t>
       </w:r>
     </w:p>
     <w:p>
@@ -1397,23 +1376,7 @@
         </w:rPr>
       </w:pPr>
       <w:r>
-        <w:t>A ${</w:t>
-      </w:r>
-      <w:proofErr w:type="spellStart"/>
-      <w:r>
-        <w:t>company_name</w:t>
-      </w:r>
-      <w:proofErr w:type="spellEnd"/>
-      <w:r>
-        <w:t>} az ${</w:t>
-      </w:r>
-      <w:proofErr w:type="spellStart"/>
-      <w:r>
-        <w:t>audit_interval</w:t>
-      </w:r>
-      <w:proofErr w:type="spellEnd"/>
-      <w:r>
-        <w:t>} időszakban az alábbi fogyasztásokat realizálta:</w:t>
+        <w:t>A ${company_name} az ${audit_interval} időszakban az alábbi fogyasztásokat realizálta:</w:t>
       </w:r>
     </w:p>
     <w:tbl>
@@ -1558,15 +1521,7 @@
           </w:tcPr>
           <w:p>
             <w:r>
-              <w:t>${</w:t>
-            </w:r>
-            <w:proofErr w:type="spellStart"/>
-            <w:r>
-              <w:t>carrier</w:t>
-            </w:r>
-            <w:proofErr w:type="spellEnd"/>
-            <w:r>
-              <w:t>}</w:t>
+              <w:t>${carrier}</w:t>
             </w:r>
           </w:p>
         </w:tc>
@@ -1576,15 +1531,7 @@
           </w:tcPr>
           <w:p>
             <w:r>
-              <w:t>${</w:t>
-            </w:r>
-            <w:proofErr w:type="spellStart"/>
-            <w:r>
-              <w:t>carrier_building</w:t>
-            </w:r>
-            <w:proofErr w:type="spellEnd"/>
-            <w:r>
-              <w:t>}</w:t>
+              <w:t>${carrier_building}</w:t>
             </w:r>
           </w:p>
         </w:tc>
@@ -1594,15 +1541,7 @@
           </w:tcPr>
           <w:p>
             <w:r>
-              <w:t>${</w:t>
-            </w:r>
-            <w:proofErr w:type="spellStart"/>
-            <w:r>
-              <w:t>carrier_product</w:t>
-            </w:r>
-            <w:proofErr w:type="spellEnd"/>
-            <w:r>
-              <w:t>}</w:t>
+              <w:t>${carrier_product}</w:t>
             </w:r>
           </w:p>
         </w:tc>
@@ -1612,15 +1551,7 @@
           </w:tcPr>
           <w:p>
             <w:r>
-              <w:t>${</w:t>
-            </w:r>
-            <w:proofErr w:type="spellStart"/>
-            <w:r>
-              <w:t>carrier_vehicle</w:t>
-            </w:r>
-            <w:proofErr w:type="spellEnd"/>
-            <w:r>
-              <w:t>}</w:t>
+              <w:t>${carrier_vehicle}</w:t>
             </w:r>
           </w:p>
         </w:tc>
@@ -1630,15 +1561,7 @@
           </w:tcPr>
           <w:p>
             <w:r>
-              <w:t>${</w:t>
-            </w:r>
-            <w:proofErr w:type="spellStart"/>
-            <w:r>
-              <w:t>carrier_total</w:t>
-            </w:r>
-            <w:proofErr w:type="spellEnd"/>
-            <w:r>
-              <w:t>}</w:t>
+              <w:t>${carrier_total}</w:t>
             </w:r>
           </w:p>
         </w:tc>
@@ -1647,36 +1570,12 @@
     <w:p/>
     <w:p>
       <w:r>
-        <w:t>${</w:t>
-      </w:r>
-      <w:proofErr w:type="spellStart"/>
-      <w:r>
-        <w:t>sankey_diagram</w:t>
-      </w:r>
-      <w:proofErr w:type="spellEnd"/>
-      <w:r>
-        <w:t>}</w:t>
-      </w:r>
-    </w:p>
-    <w:p>
-      <w:r>
-        <w:t xml:space="preserve"> A ${</w:t>
-      </w:r>
-      <w:proofErr w:type="spellStart"/>
-      <w:r>
-        <w:t>company_name</w:t>
-      </w:r>
-      <w:proofErr w:type="spellEnd"/>
-      <w:r>
-        <w:t xml:space="preserve">} vizsgálata alapján az </w:t>
-      </w:r>
-      <w:proofErr w:type="spellStart"/>
-      <w:r>
-        <w:t>auditor</w:t>
-      </w:r>
-      <w:proofErr w:type="spellEnd"/>
-      <w:r>
-        <w:t xml:space="preserve"> az alábbi megtakarítási potenciálokat találta:</w:t>
+        <w:t>${sankey_diagram}</w:t>
+      </w:r>
+    </w:p>
+    <w:p>
+      <w:r>
+        <w:t xml:space="preserve"> A ${company_name} vizsgálata alapján az auditor az alábbi megtakarítási potenciálokat találta:</w:t>
       </w:r>
     </w:p>
     <w:p>
@@ -1692,153 +1591,17 @@
     </w:p>
     <w:p>
       <w:r>
-        <w:t>A(z) ${</w:t>
-      </w:r>
-      <w:proofErr w:type="spellStart"/>
-      <w:r>
-        <w:t>company_</w:t>
-      </w:r>
-      <w:proofErr w:type="gramStart"/>
-      <w:r>
-        <w:t>name</w:t>
-      </w:r>
-      <w:proofErr w:type="spellEnd"/>
-      <w:r>
-        <w:t>}-</w:t>
-      </w:r>
-      <w:proofErr w:type="gramEnd"/>
-      <w:r>
-        <w:t>t ${</w:t>
-      </w:r>
-      <w:proofErr w:type="spellStart"/>
-      <w:r>
-        <w:t>foundation_</w:t>
-      </w:r>
-      <w:proofErr w:type="gramStart"/>
-      <w:r>
-        <w:t>year</w:t>
-      </w:r>
-      <w:proofErr w:type="spellEnd"/>
-      <w:r>
-        <w:t>}-</w:t>
-      </w:r>
-      <w:proofErr w:type="gramEnd"/>
-      <w:r>
-        <w:t>ban/</w:t>
-      </w:r>
-      <w:proofErr w:type="spellStart"/>
-      <w:r>
-        <w:t>ben</w:t>
-      </w:r>
-      <w:proofErr w:type="spellEnd"/>
-      <w:r>
-        <w:t xml:space="preserve"> alapították, ${</w:t>
-      </w:r>
-      <w:proofErr w:type="spellStart"/>
-      <w:r>
-        <w:t>owner_</w:t>
-      </w:r>
-      <w:proofErr w:type="gramStart"/>
-      <w:r>
-        <w:t>percentage</w:t>
-      </w:r>
-      <w:proofErr w:type="spellEnd"/>
-      <w:r>
-        <w:t>}  tulajdonban</w:t>
-      </w:r>
-      <w:proofErr w:type="gramEnd"/>
-      <w:r>
-        <w:t xml:space="preserve"> álló vállalkozás.  Fő tevékenysége a ${</w:t>
-      </w:r>
-      <w:proofErr w:type="spellStart"/>
-      <w:r>
-        <w:t>company_product</w:t>
-      </w:r>
-      <w:proofErr w:type="spellEnd"/>
-      <w:r>
-        <w:t xml:space="preserve">}. Székhelye </w:t>
-      </w:r>
-      <w:proofErr w:type="gramStart"/>
-      <w:r>
-        <w:t>a  $</w:t>
-      </w:r>
-      <w:proofErr w:type="gramEnd"/>
-      <w:r>
-        <w:t>{</w:t>
-      </w:r>
-      <w:proofErr w:type="spellStart"/>
-      <w:r>
-        <w:t>company_place</w:t>
-      </w:r>
-      <w:proofErr w:type="spellEnd"/>
-      <w:r>
-        <w:t>} alatt van.</w:t>
-      </w:r>
-    </w:p>
-    <w:p>
-      <w:r>
-        <w:t>A ${</w:t>
-      </w:r>
-      <w:proofErr w:type="spellStart"/>
-      <w:r>
-        <w:t>data_year</w:t>
-      </w:r>
-      <w:proofErr w:type="spellEnd"/>
-      <w:r>
-        <w:t>} év adatai alapján az alkalmazotti létszáma ${</w:t>
-      </w:r>
-      <w:proofErr w:type="spellStart"/>
-      <w:r>
-        <w:t>employee_count</w:t>
-      </w:r>
-      <w:proofErr w:type="spellEnd"/>
-      <w:r>
-        <w:t>} fő, a ${</w:t>
-      </w:r>
-      <w:proofErr w:type="spellStart"/>
-      <w:r>
-        <w:t>data_year</w:t>
-      </w:r>
-      <w:proofErr w:type="spellEnd"/>
-      <w:r>
-        <w:t>} évi árbevétele ${profit}</w:t>
-      </w:r>
-      <w:proofErr w:type="spellStart"/>
-      <w:r>
-        <w:t>eFt</w:t>
-      </w:r>
-      <w:proofErr w:type="spellEnd"/>
-      <w:r>
-        <w:t xml:space="preserve"> volt. Az audit készítésének idején a telephely(</w:t>
-      </w:r>
-      <w:proofErr w:type="spellStart"/>
-      <w:r>
-        <w:t>ek</w:t>
-      </w:r>
-      <w:proofErr w:type="spellEnd"/>
-      <w:r>
-        <w:t>)</w:t>
-      </w:r>
-      <w:proofErr w:type="spellStart"/>
-      <w:r>
-        <w:t>en</w:t>
-      </w:r>
-      <w:proofErr w:type="spellEnd"/>
-      <w:r>
-        <w:t xml:space="preserve"> az alábbi tevékenységek és munkarendek kerültek megállapításra:</w:t>
-      </w:r>
-    </w:p>
-    <w:p>
-      <w:r>
-        <w:t>${</w:t>
-      </w:r>
-      <w:proofErr w:type="spellStart"/>
-      <w:r>
-        <w:t>block_complex</w:t>
-      </w:r>
-      <w:proofErr w:type="spellEnd"/>
-      <w:r>
-        <w:t>}</w:t>
+        <w:t>A(z) ${company_name}-t ${foundation_year}-ban/ben alapították, ${owner_percentage}  tulajdonban álló vállalkozás.  Fő tevékenysége a ${company_product}. Székhelye a  ${company_place} alatt van.</w:t>
+      </w:r>
+    </w:p>
+    <w:p>
+      <w:r>
+        <w:t>A ${data_year} év adatai alapján az alkalmazotti létszáma ${employee_count} fő, a ${data_year} évi árbevétele ${profit}eFt volt. Az audit készítésének idején a telephely(ek)en az alábbi tevékenységek és munkarendek kerültek megállapításra:</w:t>
+      </w:r>
+    </w:p>
+    <w:p>
+      <w:r>
+        <w:t>${block_complex}</w:t>
       </w:r>
     </w:p>
     <w:p/>
@@ -1885,23 +1648,7 @@
                 <w:b/>
                 <w:bCs/>
               </w:rPr>
-              <w:t>${</w:t>
-            </w:r>
-            <w:proofErr w:type="spellStart"/>
-            <w:r>
-              <w:rPr>
-                <w:b/>
-                <w:bCs/>
-              </w:rPr>
-              <w:t>complex_name</w:t>
-            </w:r>
-            <w:proofErr w:type="spellEnd"/>
-            <w:r>
-              <w:rPr>
-                <w:b/>
-                <w:bCs/>
-              </w:rPr>
-              <w:t>}</w:t>
+              <w:t>${complex_name}</w:t>
             </w:r>
           </w:p>
         </w:tc>
@@ -1925,45 +1672,27 @@
                 <w:sz w:val="2"/>
                 <w:szCs w:val="2"/>
               </w:rPr>
-              <w:t>${</w:t>
-            </w:r>
-            <w:proofErr w:type="spellStart"/>
-            <w:r>
+              <w:t>${function_shift_row}</w:t>
+            </w:r>
+          </w:p>
+          <w:p>
+            <w:pPr>
               <w:rPr>
                 <w:color w:val="FFFFFF" w:themeColor="background1"/>
                 <w:sz w:val="2"/>
                 <w:szCs w:val="2"/>
               </w:rPr>
-              <w:t>function_shift_row</w:t>
-            </w:r>
-            <w:proofErr w:type="spellEnd"/>
-            <w:r>
+            </w:pPr>
+          </w:p>
+          <w:p>
+            <w:pPr>
               <w:rPr>
                 <w:color w:val="FFFFFF" w:themeColor="background1"/>
                 <w:sz w:val="2"/>
                 <w:szCs w:val="2"/>
               </w:rPr>
-              <w:t>}</w:t>
-            </w:r>
-          </w:p>
-          <w:p>
-            <w:pPr>
-              <w:rPr>
-                <w:color w:val="FFFFFF" w:themeColor="background1"/>
-                <w:sz w:val="2"/>
-                <w:szCs w:val="2"/>
-              </w:rPr>
             </w:pPr>
           </w:p>
-          <w:p>
-            <w:pPr>
-              <w:rPr>
-                <w:color w:val="FFFFFF" w:themeColor="background1"/>
-                <w:sz w:val="2"/>
-                <w:szCs w:val="2"/>
-              </w:rPr>
-            </w:pPr>
-          </w:p>
         </w:tc>
         <w:tc>
           <w:tcPr>
@@ -1971,15 +1700,7 @@
           </w:tcPr>
           <w:p>
             <w:r>
-              <w:t>${</w:t>
-            </w:r>
-            <w:proofErr w:type="spellStart"/>
-            <w:r>
-              <w:t>complex_function</w:t>
-            </w:r>
-            <w:proofErr w:type="spellEnd"/>
-            <w:r>
-              <w:t>}</w:t>
+              <w:t>${complex_function}</w:t>
             </w:r>
           </w:p>
         </w:tc>
@@ -1989,15 +1710,7 @@
           </w:tcPr>
           <w:p>
             <w:r>
-              <w:t>${</w:t>
-            </w:r>
-            <w:proofErr w:type="spellStart"/>
-            <w:r>
-              <w:t>complex_shift</w:t>
-            </w:r>
-            <w:proofErr w:type="spellEnd"/>
-            <w:r>
-              <w:t>}</w:t>
+              <w:t>${complex_shift}</w:t>
             </w:r>
           </w:p>
         </w:tc>
@@ -2006,15 +1719,7 @@
     <w:p/>
     <w:p>
       <w:r>
-        <w:t>${/</w:t>
-      </w:r>
-      <w:proofErr w:type="spellStart"/>
-      <w:r>
-        <w:t>block_complex</w:t>
-      </w:r>
-      <w:proofErr w:type="spellEnd"/>
-      <w:r>
-        <w:t>}</w:t>
+        <w:t>${/block_complex}</w:t>
       </w:r>
     </w:p>
     <w:p>
@@ -2030,44 +1735,12 @@
     </w:p>
     <w:p>
       <w:r>
-        <w:t>A ${</w:t>
-      </w:r>
-      <w:proofErr w:type="spellStart"/>
-      <w:r>
-        <w:t>company_</w:t>
-      </w:r>
-      <w:proofErr w:type="gramStart"/>
-      <w:r>
-        <w:t>name</w:t>
-      </w:r>
-      <w:proofErr w:type="spellEnd"/>
-      <w:r>
-        <w:t>}a</w:t>
-      </w:r>
-      <w:proofErr w:type="gramEnd"/>
-      <w:r>
-        <w:t xml:space="preserve"> vizsgálati időszakban (${</w:t>
-      </w:r>
-      <w:proofErr w:type="spellStart"/>
-      <w:r>
-        <w:t>audit_interval</w:t>
-      </w:r>
-      <w:proofErr w:type="spellEnd"/>
-      <w:r>
-        <w:t>}) mért energiafogyasztási adatait az alábbi táblázatok foglalják össze:</w:t>
-      </w:r>
-    </w:p>
-    <w:p>
-      <w:r>
-        <w:t>${</w:t>
-      </w:r>
-      <w:proofErr w:type="spellStart"/>
-      <w:r>
-        <w:t>block_consumption</w:t>
-      </w:r>
-      <w:proofErr w:type="spellEnd"/>
-      <w:r>
-        <w:t>}</w:t>
+        <w:t>A ${company_name}a vizsgálati időszakban (${audit_interval}) mért energiafogyasztási adatait az alábbi táblázatok foglalják össze:</w:t>
+      </w:r>
+    </w:p>
+    <w:p>
+      <w:r>
+        <w:t>${block_consumption}</w:t>
       </w:r>
     </w:p>
     <w:p/>
@@ -2104,15 +1777,7 @@
               <w:jc w:val="center"/>
             </w:pPr>
             <w:r>
-              <w:t>Telephely: ${</w:t>
-            </w:r>
-            <w:proofErr w:type="spellStart"/>
-            <w:r>
-              <w:t>consumption_complex_name</w:t>
-            </w:r>
-            <w:proofErr w:type="spellEnd"/>
-            <w:r>
-              <w:t>}</w:t>
+              <w:t>Telephely: ${consumption_complex_name}</w:t>
             </w:r>
           </w:p>
         </w:tc>
@@ -2186,25 +1851,7 @@
                 <w:sz w:val="2"/>
                 <w:szCs w:val="2"/>
               </w:rPr>
-              <w:t>${</w:t>
-            </w:r>
-            <w:proofErr w:type="spellStart"/>
-            <w:r>
-              <w:rPr>
-                <w:color w:val="FFFFFF" w:themeColor="background1"/>
-                <w:sz w:val="2"/>
-                <w:szCs w:val="2"/>
-              </w:rPr>
-              <w:t>consumption_month_row</w:t>
-            </w:r>
-            <w:proofErr w:type="spellEnd"/>
-            <w:r>
-              <w:rPr>
-                <w:color w:val="FFFFFF" w:themeColor="background1"/>
-                <w:sz w:val="2"/>
-                <w:szCs w:val="2"/>
-              </w:rPr>
-              <w:t>}</w:t>
+              <w:t>${consumption_month_row}</w:t>
             </w:r>
           </w:p>
         </w:tc>
@@ -2214,15 +1861,7 @@
           </w:tcPr>
           <w:p>
             <w:r>
-              <w:t>${</w:t>
-            </w:r>
-            <w:proofErr w:type="spellStart"/>
-            <w:r>
-              <w:t>consumption_month</w:t>
-            </w:r>
-            <w:proofErr w:type="spellEnd"/>
-            <w:r>
-              <w:t>}</w:t>
+              <w:t>${consumption_month}</w:t>
             </w:r>
           </w:p>
         </w:tc>
@@ -2232,15 +1871,7 @@
           </w:tcPr>
           <w:p>
             <w:r>
-              <w:t>${</w:t>
-            </w:r>
-            <w:proofErr w:type="spellStart"/>
-            <w:r>
-              <w:t>consumption_carrier</w:t>
-            </w:r>
-            <w:proofErr w:type="spellEnd"/>
-            <w:r>
-              <w:t>}</w:t>
+              <w:t>${consumption_carrier}</w:t>
             </w:r>
           </w:p>
         </w:tc>
@@ -2250,15 +1881,7 @@
           </w:tcPr>
           <w:p>
             <w:r>
-              <w:t>${</w:t>
-            </w:r>
-            <w:proofErr w:type="spellStart"/>
-            <w:r>
-              <w:t>consumption_amount</w:t>
-            </w:r>
-            <w:proofErr w:type="spellEnd"/>
-            <w:r>
-              <w:t>}</w:t>
+              <w:t>${consumption_amount}</w:t>
             </w:r>
           </w:p>
         </w:tc>
@@ -2267,15 +1890,7 @@
     <w:p/>
     <w:p>
       <w:r>
-        <w:t>${/</w:t>
-      </w:r>
-      <w:proofErr w:type="spellStart"/>
-      <w:r>
-        <w:t>block_consumption</w:t>
-      </w:r>
-      <w:proofErr w:type="spellEnd"/>
-      <w:r>
-        <w:t>}</w:t>
+        <w:t>${/block_consumption}</w:t>
       </w:r>
     </w:p>
     <w:p>
@@ -2291,15 +1906,7 @@
     </w:p>
     <w:p>
       <w:r>
-        <w:t>A ${</w:t>
-      </w:r>
-      <w:proofErr w:type="spellStart"/>
-      <w:r>
-        <w:t>company_name</w:t>
-      </w:r>
-      <w:proofErr w:type="spellEnd"/>
-      <w:r>
-        <w:t>} az alábbi mérőkkel, illetve számított fogyasztásokkal rendelkezik:</w:t>
+        <w:t>A ${company_name} az alábbi mérőkkel, illetve számított fogyasztásokkal rendelkezik:</w:t>
       </w:r>
     </w:p>
     <w:tbl>
@@ -2383,25 +1990,7 @@
                 <w:sz w:val="2"/>
                 <w:szCs w:val="2"/>
               </w:rPr>
-              <w:t>${</w:t>
-            </w:r>
-            <w:proofErr w:type="spellStart"/>
-            <w:r>
-              <w:rPr>
-                <w:color w:val="FFFFFF" w:themeColor="background1"/>
-                <w:sz w:val="2"/>
-                <w:szCs w:val="2"/>
-              </w:rPr>
-              <w:t>network_standing_row</w:t>
-            </w:r>
-            <w:proofErr w:type="spellEnd"/>
-            <w:r>
-              <w:rPr>
-                <w:color w:val="FFFFFF" w:themeColor="background1"/>
-                <w:sz w:val="2"/>
-                <w:szCs w:val="2"/>
-              </w:rPr>
-              <w:t>}</w:t>
+              <w:t>${network_standing_row}</w:t>
             </w:r>
           </w:p>
         </w:tc>
@@ -2411,15 +2000,7 @@
           </w:tcPr>
           <w:p>
             <w:r>
-              <w:t>${</w:t>
-            </w:r>
-            <w:proofErr w:type="spellStart"/>
-            <w:r>
-              <w:t>network_mainstanding</w:t>
-            </w:r>
-            <w:proofErr w:type="spellEnd"/>
-            <w:r>
-              <w:t>}</w:t>
+              <w:t>${network_mainstanding}</w:t>
             </w:r>
           </w:p>
         </w:tc>
@@ -2429,15 +2010,7 @@
           </w:tcPr>
           <w:p>
             <w:r>
-              <w:t>${</w:t>
-            </w:r>
-            <w:proofErr w:type="spellStart"/>
-            <w:r>
-              <w:t>network_subto</w:t>
-            </w:r>
-            <w:proofErr w:type="spellEnd"/>
-            <w:r>
-              <w:t>}</w:t>
+              <w:t>${network_subto}</w:t>
             </w:r>
           </w:p>
         </w:tc>
@@ -2447,15 +2020,7 @@
           </w:tcPr>
           <w:p>
             <w:r>
-              <w:t>${</w:t>
-            </w:r>
-            <w:proofErr w:type="spellStart"/>
-            <w:r>
-              <w:t>network_consumption</w:t>
-            </w:r>
-            <w:proofErr w:type="spellEnd"/>
-            <w:r>
-              <w:t>}</w:t>
+              <w:t>${network_consumption}</w:t>
             </w:r>
           </w:p>
         </w:tc>
@@ -2475,15 +2040,7 @@
     </w:p>
     <w:p>
       <w:r>
-        <w:t>A ${</w:t>
-      </w:r>
-      <w:proofErr w:type="spellStart"/>
-      <w:r>
-        <w:t>company_name</w:t>
-      </w:r>
-      <w:proofErr w:type="spellEnd"/>
-      <w:r>
-        <w:t>} energiaköltségeinek vizsgálata során az alábbi tényértékeket tudtuk rögzíteni:</w:t>
+        <w:t>A ${company_name} energiaköltségeinek vizsgálata során az alábbi tényértékeket tudtuk rögzíteni:</w:t>
       </w:r>
     </w:p>
     <w:p/>
@@ -2495,83 +2052,22 @@
     <w:p/>
     <w:p>
       <w:r>
-        <w:t>Megtérülési számításainkban a földgáz és villamos energia esetében az amszterdami földgáz-, és villamosenergia tőzsde aktuálisan legtávolabbi időpontra leköthető egységárait vesszük alapul, egyéb energiahordozók esetében az auditírás időpontjában elérhető piaci egységárral számolunk. Az auditkészítés időpontjában, azaz ${</w:t>
-      </w:r>
-      <w:proofErr w:type="spellStart"/>
-      <w:r>
-        <w:t>current_</w:t>
-      </w:r>
-      <w:proofErr w:type="gramStart"/>
-      <w:r>
-        <w:t>date</w:t>
-      </w:r>
-      <w:proofErr w:type="spellEnd"/>
-      <w:r>
-        <w:t>}-</w:t>
-      </w:r>
-      <w:proofErr w:type="gramEnd"/>
-      <w:r>
-        <w:t>n elérhető legtávolabbi energiahordozó egységárak:</w:t>
-      </w:r>
-    </w:p>
-    <w:p>
-      <w:r>
-        <w:t>Földgáz: ${</w:t>
-      </w:r>
-      <w:proofErr w:type="spellStart"/>
-      <w:r>
-        <w:t>natural_gas_price</w:t>
-      </w:r>
-      <w:proofErr w:type="spellEnd"/>
-      <w:r>
-        <w:t>} EUR/</w:t>
-      </w:r>
-      <w:proofErr w:type="spellStart"/>
-      <w:r>
-        <w:t>MWh</w:t>
-      </w:r>
-      <w:proofErr w:type="spellEnd"/>
-    </w:p>
-    <w:p>
-      <w:r>
-        <w:t xml:space="preserve">Villamos </w:t>
-      </w:r>
-      <w:proofErr w:type="gramStart"/>
-      <w:r>
-        <w:t>energia:  $</w:t>
-      </w:r>
-      <w:proofErr w:type="gramEnd"/>
-      <w:r>
-        <w:t>{</w:t>
-      </w:r>
-      <w:proofErr w:type="spellStart"/>
-      <w:r>
-        <w:t>electric_energy_price</w:t>
-      </w:r>
-      <w:proofErr w:type="spellEnd"/>
-      <w:r>
-        <w:t>} EUR/</w:t>
-      </w:r>
-      <w:proofErr w:type="spellStart"/>
-      <w:r>
-        <w:t>MWh</w:t>
-      </w:r>
-      <w:proofErr w:type="spellEnd"/>
-      <w:r>
-        <w:t>.</w:t>
-      </w:r>
-    </w:p>
-    <w:p>
-      <w:r>
-        <w:t>Az érvényes Euro árfolyam: ${</w:t>
-      </w:r>
-      <w:proofErr w:type="spellStart"/>
-      <w:r>
-        <w:t>eur_huf_rate</w:t>
-      </w:r>
-      <w:proofErr w:type="spellEnd"/>
-      <w:r>
-        <w:t>} Ft/EURO</w:t>
+        <w:t>Megtérülési számításainkban a földgáz és villamos energia esetében az amszterdami földgáz-, és villamosenergia tőzsde aktuálisan legtávolabbi időpontra leköthető egységárait vesszük alapul, egyéb energiahordozók esetében az auditírás időpontjában elérhető piaci egységárral számolunk. Az auditkészítés időpontjában, azaz ${current_date}-n elérhető legtávolabbi energiahordozó egységárak:</w:t>
+      </w:r>
+    </w:p>
+    <w:p>
+      <w:r>
+        <w:t>Földgáz: ${natural_gas_price} EUR/MWh</w:t>
+      </w:r>
+    </w:p>
+    <w:p>
+      <w:r>
+        <w:t>Villamos energia:  ${electric_energy_price} EUR/MWh.</w:t>
+      </w:r>
+    </w:p>
+    <w:p>
+      <w:r>
+        <w:t>Az érvényes Euro árfolyam: ${eur_huf_rate} Ft/EURO</w:t>
       </w:r>
     </w:p>
     <w:p>
@@ -2904,17 +2400,8 @@
                 <w:i/>
                 <w:iCs/>
               </w:rPr>
-              <w:t>7,5 Ft/</w:t>
-            </w:r>
-            <w:proofErr w:type="spellStart"/>
-            <w:r>
-              <w:rPr>
-                <w:i/>
-                <w:iCs/>
-              </w:rPr>
-              <w:t>MWh</w:t>
-            </w:r>
-            <w:proofErr w:type="spellEnd"/>
+              <w:t>7,5 Ft/MWh</w:t>
+            </w:r>
           </w:p>
         </w:tc>
       </w:tr>
@@ -2988,17 +2475,8 @@
                 <w:i/>
                 <w:iCs/>
               </w:rPr>
-              <w:t>1,5 Ft/</w:t>
-            </w:r>
-            <w:proofErr w:type="spellStart"/>
-            <w:r>
-              <w:rPr>
-                <w:i/>
-                <w:iCs/>
-              </w:rPr>
-              <w:t>MWh</w:t>
-            </w:r>
-            <w:proofErr w:type="spellEnd"/>
+              <w:t>1,5 Ft/MWh</w:t>
+            </w:r>
           </w:p>
         </w:tc>
       </w:tr>
@@ -3072,17 +2550,8 @@
                 <w:i/>
                 <w:iCs/>
               </w:rPr>
-              <w:t>2,0 Ft/</w:t>
-            </w:r>
-            <w:proofErr w:type="spellStart"/>
-            <w:r>
-              <w:rPr>
-                <w:i/>
-                <w:iCs/>
-              </w:rPr>
-              <w:t>MWh</w:t>
-            </w:r>
-            <w:proofErr w:type="spellEnd"/>
+              <w:t>2,0 Ft/MWh</w:t>
+            </w:r>
           </w:p>
         </w:tc>
       </w:tr>
@@ -3431,17 +2900,8 @@
                 <w:i/>
                 <w:iCs/>
               </w:rPr>
-              <w:t>6,0 Ft/</w:t>
-            </w:r>
-            <w:proofErr w:type="spellStart"/>
-            <w:r>
-              <w:rPr>
-                <w:i/>
-                <w:iCs/>
-              </w:rPr>
-              <w:t>MWh</w:t>
-            </w:r>
-            <w:proofErr w:type="spellEnd"/>
+              <w:t>6,0 Ft/MWh</w:t>
+            </w:r>
           </w:p>
         </w:tc>
       </w:tr>
@@ -3516,17 +2976,8 @@
                 <w:i/>
                 <w:iCs/>
               </w:rPr>
-              <w:t>3,5 Ft/</w:t>
-            </w:r>
-            <w:proofErr w:type="spellStart"/>
-            <w:r>
-              <w:rPr>
-                <w:i/>
-                <w:iCs/>
-              </w:rPr>
-              <w:t>MWh</w:t>
-            </w:r>
-            <w:proofErr w:type="spellEnd"/>
+              <w:t>3,5 Ft/MWh</w:t>
+            </w:r>
           </w:p>
         </w:tc>
       </w:tr>
@@ -3600,17 +3051,8 @@
                 <w:i/>
                 <w:iCs/>
               </w:rPr>
-              <w:t>3,0 Ft/</w:t>
-            </w:r>
-            <w:proofErr w:type="spellStart"/>
-            <w:r>
-              <w:rPr>
-                <w:i/>
-                <w:iCs/>
-              </w:rPr>
-              <w:t>MWh</w:t>
-            </w:r>
-            <w:proofErr w:type="spellEnd"/>
+              <w:t>3,0 Ft/MWh</w:t>
+            </w:r>
           </w:p>
         </w:tc>
       </w:tr>
@@ -3855,52 +3297,12 @@
     </w:p>
     <w:p>
       <w:r>
-        <w:t xml:space="preserve"> ${</w:t>
-      </w:r>
-      <w:proofErr w:type="spellStart"/>
-      <w:r>
-        <w:t>natural_gas_converted</w:t>
-      </w:r>
-      <w:proofErr w:type="spellEnd"/>
-      <w:r>
-        <w:t>} Ft/kWh + 15 Ft/kWh = ${</w:t>
-      </w:r>
-      <w:proofErr w:type="spellStart"/>
-      <w:r>
-        <w:t>natural_gas_specific</w:t>
-      </w:r>
-      <w:proofErr w:type="spellEnd"/>
-      <w:r>
-        <w:t>} Ft/kWh földgázra,</w:t>
-      </w:r>
-    </w:p>
-    <w:p>
-      <w:r>
-        <w:t>a villamos energia esetében pedig ${</w:t>
-      </w:r>
-      <w:proofErr w:type="spellStart"/>
-      <w:r>
-        <w:t>electric_converted</w:t>
-      </w:r>
-      <w:proofErr w:type="spellEnd"/>
-      <w:r>
-        <w:t xml:space="preserve">} Ft/kWh + 30,915 Ft/kWh </w:t>
-      </w:r>
-      <w:proofErr w:type="gramStart"/>
-      <w:r>
-        <w:t>=  $</w:t>
-      </w:r>
-      <w:proofErr w:type="gramEnd"/>
-      <w:r>
-        <w:t>{</w:t>
-      </w:r>
-      <w:proofErr w:type="spellStart"/>
-      <w:r>
-        <w:t>electric_energy_specific</w:t>
-      </w:r>
-      <w:proofErr w:type="spellEnd"/>
-      <w:r>
-        <w:t>} Ft/kWh.</w:t>
+        <w:t xml:space="preserve"> ${natural_gas_converted} Ft/kWh + 15 Ft/kWh = ${natural_gas_specific} Ft/kWh földgázra,</w:t>
+      </w:r>
+    </w:p>
+    <w:p>
+      <w:r>
+        <w:t>a villamos energia esetében pedig ${electric_converted} Ft/kWh + 30,915 Ft/kWh =  ${electric_energy_specific} Ft/kWh.</w:t>
       </w:r>
     </w:p>
     <w:p>
@@ -4092,60 +3494,18 @@
     </w:p>
     <w:p>
       <w:r>
-        <w:t>BUBOR = ${</w:t>
-      </w:r>
-      <w:proofErr w:type="spellStart"/>
-      <w:r>
-        <w:t>bubor_</w:t>
-      </w:r>
-      <w:proofErr w:type="gramStart"/>
-      <w:r>
-        <w:t>rate</w:t>
-      </w:r>
-      <w:proofErr w:type="spellEnd"/>
-      <w:r>
-        <w:t>}%</w:t>
-      </w:r>
-      <w:proofErr w:type="gramEnd"/>
-    </w:p>
-    <w:p>
-      <w:r>
-        <w:t>Államkötvény hozam = ${</w:t>
-      </w:r>
-      <w:proofErr w:type="spellStart"/>
-      <w:r>
-        <w:t>bond_</w:t>
-      </w:r>
-      <w:proofErr w:type="gramStart"/>
-      <w:r>
-        <w:t>rate</w:t>
-      </w:r>
-      <w:proofErr w:type="spellEnd"/>
-      <w:r>
-        <w:t>}%</w:t>
-      </w:r>
-      <w:proofErr w:type="gramEnd"/>
-      <w:r>
-        <w:t xml:space="preserve"> </w:t>
-      </w:r>
-    </w:p>
-    <w:p>
-      <w:r>
-        <w:t>MNB alapkamat: ${</w:t>
-      </w:r>
-      <w:proofErr w:type="spellStart"/>
-      <w:r>
-        <w:t>mnb_</w:t>
-      </w:r>
-      <w:proofErr w:type="gramStart"/>
-      <w:r>
-        <w:t>rate</w:t>
-      </w:r>
-      <w:proofErr w:type="spellEnd"/>
-      <w:r>
-        <w:t>}%</w:t>
-      </w:r>
-      <w:proofErr w:type="gramEnd"/>
+        <w:t>BUBOR = ${bubor_rate}%</w:t>
+      </w:r>
+    </w:p>
+    <w:p>
+      <w:r>
+        <w:t xml:space="preserve">Államkötvény hozam = ${bond_rate}% </w:t>
+      </w:r>
+    </w:p>
+    <w:p>
+      <w:r>
+        <w:t>MNB alapkamat: ${mnb_rate}%</w:t>
+      </w:r>
     </w:p>
     <w:p/>
     <w:p>
@@ -4155,23 +3515,7 @@
     </w:p>
     <w:p>
       <w:r>
-        <w:t>A kamatráta az auditírás időpontjában tehát ${</w:t>
-      </w:r>
-      <w:proofErr w:type="spellStart"/>
-      <w:r>
-        <w:t>interest_</w:t>
-      </w:r>
-      <w:proofErr w:type="gramStart"/>
-      <w:r>
-        <w:t>rate</w:t>
-      </w:r>
-      <w:proofErr w:type="spellEnd"/>
-      <w:r>
-        <w:t>}%</w:t>
-      </w:r>
-      <w:proofErr w:type="gramEnd"/>
-      <w:r>
-        <w:t>.</w:t>
+        <w:t>A kamatráta az auditírás időpontjában tehát ${interest_rate}%.</w:t>
       </w:r>
     </w:p>
     <w:p/>
@@ -4190,22 +3534,7 @@
         <w:rPr>
           <w:rFonts w:ascii="Gungsuh" w:eastAsia="Gungsuh" w:hAnsi="Gungsuh" w:cs="Gungsuh"/>
         </w:rPr>
-        <w:t>NPV=</w:t>
-      </w:r>
-      <w:proofErr w:type="gramStart"/>
-      <w:r>
-        <w:rPr>
-          <w:rFonts w:ascii="Gungsuh" w:eastAsia="Gungsuh" w:hAnsi="Gungsuh" w:cs="Gungsuh"/>
-        </w:rPr>
-        <w:t>∑(</w:t>
-      </w:r>
-      <w:proofErr w:type="spellStart"/>
-      <w:proofErr w:type="gramEnd"/>
-      <w:r>
-        <w:rPr>
-          <w:rFonts w:ascii="Gungsuh" w:eastAsia="Gungsuh" w:hAnsi="Gungsuh" w:cs="Gungsuh"/>
-        </w:rPr>
-        <w:t>CF</w:t>
+        <w:t>NPV=∑(CF</w:t>
       </w:r>
       <w:r>
         <w:rPr>
@@ -4213,13 +3542,8 @@
         </w:rPr>
         <w:t>t</w:t>
       </w:r>
-      <w:proofErr w:type="spellEnd"/>
-      <w:r>
-        <w:t xml:space="preserve"> /(1+</w:t>
-      </w:r>
-      <w:proofErr w:type="gramStart"/>
-      <w:r>
-        <w:t>r)</w:t>
+      <w:r>
+        <w:t xml:space="preserve"> /(1+r)</w:t>
       </w:r>
       <w:r>
         <w:rPr>
@@ -4231,14 +3555,7 @@
         <w:rPr>
           <w:rFonts w:ascii="Gungsuh" w:eastAsia="Gungsuh" w:hAnsi="Gungsuh" w:cs="Gungsuh"/>
         </w:rPr>
-        <w:t>​​</w:t>
-      </w:r>
-      <w:proofErr w:type="gramEnd"/>
-      <w:r>
-        <w:rPr>
-          <w:rFonts w:ascii="Gungsuh" w:eastAsia="Gungsuh" w:hAnsi="Gungsuh" w:cs="Gungsuh"/>
-        </w:rPr>
-        <w:t>)−Beruházási költség</w:t>
+        <w:t>​​)−Beruházási költség</w:t>
       </w:r>
     </w:p>
     <w:p>
@@ -4268,15 +3585,7 @@
     <w:p/>
     <w:p>
       <w:r>
-        <w:t xml:space="preserve">A projektek </w:t>
-      </w:r>
-      <w:proofErr w:type="gramStart"/>
-      <w:r>
-        <w:t>megítélésénél</w:t>
-      </w:r>
-      <w:proofErr w:type="gramEnd"/>
-      <w:r>
-        <w:t xml:space="preserve"> Ha az IRR&gt;r akkor megéri megcsinálni, ha IRR&lt;r, akkor nem.</w:t>
+        <w:t>A projektek megítélésénél Ha az IRR&gt;r akkor megéri megcsinálni, ha IRR&lt;r, akkor nem.</w:t>
       </w:r>
     </w:p>
     <w:p>
@@ -4305,15 +3614,7 @@
     </w:p>
     <w:p>
       <w:r>
-        <w:t>A ${</w:t>
-      </w:r>
-      <w:proofErr w:type="spellStart"/>
-      <w:r>
-        <w:t>company_name</w:t>
-      </w:r>
-      <w:proofErr w:type="spellEnd"/>
-      <w:r>
-        <w:t>} az alábbi épületekkel rendelkezik:</w:t>
+        <w:t>A ${company_name} az alábbi épületekkel rendelkezik:</w:t>
       </w:r>
     </w:p>
     <w:tbl>
@@ -4395,25 +3696,7 @@
                 <w:sz w:val="2"/>
                 <w:szCs w:val="2"/>
               </w:rPr>
-              <w:t>${</w:t>
-            </w:r>
-            <w:proofErr w:type="spellStart"/>
-            <w:r>
-              <w:rPr>
-                <w:color w:val="FFFFFF" w:themeColor="background1"/>
-                <w:sz w:val="2"/>
-                <w:szCs w:val="2"/>
-              </w:rPr>
-              <w:t>building_listing_row</w:t>
-            </w:r>
-            <w:proofErr w:type="spellEnd"/>
-            <w:r>
-              <w:rPr>
-                <w:color w:val="FFFFFF" w:themeColor="background1"/>
-                <w:sz w:val="2"/>
-                <w:szCs w:val="2"/>
-              </w:rPr>
-              <w:t>}</w:t>
+              <w:t>${building_listing_row}</w:t>
             </w:r>
           </w:p>
         </w:tc>
@@ -4423,15 +3706,7 @@
           </w:tcPr>
           <w:p>
             <w:r>
-              <w:t>${</w:t>
-            </w:r>
-            <w:proofErr w:type="spellStart"/>
-            <w:r>
-              <w:t>building_listing_name</w:t>
-            </w:r>
-            <w:proofErr w:type="spellEnd"/>
-            <w:r>
-              <w:t>}</w:t>
+              <w:t>${building_listing_name}</w:t>
             </w:r>
           </w:p>
         </w:tc>
@@ -4441,15 +3716,7 @@
           </w:tcPr>
           <w:p>
             <w:r>
-              <w:t>${</w:t>
-            </w:r>
-            <w:proofErr w:type="spellStart"/>
-            <w:r>
-              <w:t>building_listing_complex</w:t>
-            </w:r>
-            <w:proofErr w:type="spellEnd"/>
-            <w:r>
-              <w:t>}</w:t>
+              <w:t>${building_listing_complex}</w:t>
             </w:r>
           </w:p>
         </w:tc>
@@ -4459,15 +3726,7 @@
           </w:tcPr>
           <w:p>
             <w:r>
-              <w:t>${</w:t>
-            </w:r>
-            <w:proofErr w:type="spellStart"/>
-            <w:r>
-              <w:t>building_listing_qf</w:t>
-            </w:r>
-            <w:proofErr w:type="spellEnd"/>
-            <w:r>
-              <w:t>}</w:t>
+              <w:t>${building_listing_qf}</w:t>
             </w:r>
           </w:p>
         </w:tc>
@@ -4477,15 +3736,7 @@
           </w:tcPr>
           <w:p>
             <w:r>
-              <w:t>${</w:t>
-            </w:r>
-            <w:proofErr w:type="spellStart"/>
-            <w:r>
-              <w:t>building_listing_status</w:t>
-            </w:r>
-            <w:proofErr w:type="spellEnd"/>
-            <w:r>
-              <w:t>}</w:t>
+              <w:t>${building_listing_status}</w:t>
             </w:r>
           </w:p>
         </w:tc>
@@ -4498,42 +3749,18 @@
       </w:pPr>
       <w:bookmarkStart w:id="8" w:name="_Toc239899315"/>
       <w:r>
-        <w:t>${</w:t>
-      </w:r>
-      <w:proofErr w:type="spellStart"/>
-      <w:r>
-        <w:t>subheading_building_heating</w:t>
-      </w:r>
-      <w:proofErr w:type="spellEnd"/>
-      <w:r>
-        <w:t>}</w:t>
+        <w:t>${subheading_building_heating}</w:t>
       </w:r>
       <w:bookmarkEnd w:id="8"/>
     </w:p>
     <w:p>
       <w:r>
-        <w:t>${</w:t>
-      </w:r>
-      <w:proofErr w:type="spellStart"/>
-      <w:r>
-        <w:t>heating_intro</w:t>
-      </w:r>
-      <w:proofErr w:type="spellEnd"/>
-      <w:r>
-        <w:t>}</w:t>
-      </w:r>
-    </w:p>
-    <w:p>
-      <w:r>
-        <w:t>${</w:t>
-      </w:r>
-      <w:proofErr w:type="spellStart"/>
-      <w:r>
-        <w:t>block_heating</w:t>
-      </w:r>
-      <w:proofErr w:type="spellEnd"/>
-      <w:r>
-        <w:t>}</w:t>
+        <w:t>${heating_intro}</w:t>
+      </w:r>
+    </w:p>
+    <w:p>
+      <w:r>
+        <w:t>${block_heating}</w:t>
       </w:r>
     </w:p>
     <w:tbl>
@@ -4626,25 +3853,7 @@
                 <w:sz w:val="2"/>
                 <w:szCs w:val="2"/>
               </w:rPr>
-              <w:t>${</w:t>
-            </w:r>
-            <w:proofErr w:type="spellStart"/>
-            <w:r>
-              <w:rPr>
-                <w:color w:val="FFFFFF" w:themeColor="background1"/>
-                <w:sz w:val="2"/>
-                <w:szCs w:val="2"/>
-              </w:rPr>
-              <w:t>heating_listing_row</w:t>
-            </w:r>
-            <w:proofErr w:type="spellEnd"/>
-            <w:r>
-              <w:rPr>
-                <w:color w:val="FFFFFF" w:themeColor="background1"/>
-                <w:sz w:val="2"/>
-                <w:szCs w:val="2"/>
-              </w:rPr>
-              <w:t>}</w:t>
+              <w:t>${heating_listing_row}</w:t>
             </w:r>
           </w:p>
         </w:tc>
@@ -4654,15 +3863,7 @@
           </w:tcPr>
           <w:p>
             <w:r>
-              <w:t>${</w:t>
-            </w:r>
-            <w:proofErr w:type="spellStart"/>
-            <w:r>
-              <w:t>heating_listing_complex</w:t>
-            </w:r>
-            <w:proofErr w:type="spellEnd"/>
-            <w:r>
-              <w:t>}</w:t>
+              <w:t>${heating_listing_complex}</w:t>
             </w:r>
           </w:p>
         </w:tc>
@@ -4672,15 +3873,7 @@
           </w:tcPr>
           <w:p>
             <w:r>
-              <w:t>${</w:t>
-            </w:r>
-            <w:proofErr w:type="spellStart"/>
-            <w:r>
-              <w:t>heating_listing_name</w:t>
-            </w:r>
-            <w:proofErr w:type="spellEnd"/>
-            <w:r>
-              <w:t>}</w:t>
+              <w:t>${heating_listing_name}</w:t>
             </w:r>
           </w:p>
         </w:tc>
@@ -4690,15 +3883,7 @@
           </w:tcPr>
           <w:p>
             <w:r>
-              <w:t>${</w:t>
-            </w:r>
-            <w:proofErr w:type="spellStart"/>
-            <w:r>
-              <w:t>heating_listing_type</w:t>
-            </w:r>
-            <w:proofErr w:type="spellEnd"/>
-            <w:r>
-              <w:t>}</w:t>
+              <w:t>${heating_listing_type}</w:t>
             </w:r>
           </w:p>
         </w:tc>
@@ -4708,15 +3893,7 @@
           </w:tcPr>
           <w:p>
             <w:r>
-              <w:t>${</w:t>
-            </w:r>
-            <w:proofErr w:type="spellStart"/>
-            <w:r>
-              <w:t>heating_listing_points</w:t>
-            </w:r>
-            <w:proofErr w:type="spellEnd"/>
-            <w:r>
-              <w:t>}</w:t>
+              <w:t>${heating_listing_points}</w:t>
             </w:r>
           </w:p>
         </w:tc>
@@ -4726,15 +3903,7 @@
           </w:tcPr>
           <w:p>
             <w:r>
-              <w:t>${</w:t>
-            </w:r>
-            <w:proofErr w:type="spellStart"/>
-            <w:r>
-              <w:t>heating_listing_status</w:t>
-            </w:r>
-            <w:proofErr w:type="spellEnd"/>
-            <w:r>
-              <w:t>}</w:t>
+              <w:t>${heating_listing_status}</w:t>
             </w:r>
           </w:p>
         </w:tc>
@@ -4743,28 +3912,12 @@
     <w:p/>
     <w:p>
       <w:r>
-        <w:t>${/</w:t>
-      </w:r>
-      <w:proofErr w:type="spellStart"/>
-      <w:r>
-        <w:t>block_heating</w:t>
-      </w:r>
-      <w:proofErr w:type="spellEnd"/>
-      <w:r>
-        <w:t>}</w:t>
-      </w:r>
-    </w:p>
-    <w:p>
-      <w:r>
-        <w:t>${</w:t>
-      </w:r>
-      <w:proofErr w:type="spellStart"/>
-      <w:r>
-        <w:t>heating_subtext</w:t>
-      </w:r>
-      <w:proofErr w:type="spellEnd"/>
-      <w:r>
-        <w:t>}</w:t>
+        <w:t>${/block_heating}</w:t>
+      </w:r>
+    </w:p>
+    <w:p>
+      <w:r>
+        <w:t>${heating_subtext}</w:t>
       </w:r>
     </w:p>
     <w:p>
@@ -4773,29 +3926,13 @@
       </w:pPr>
       <w:bookmarkStart w:id="9" w:name="_Toc239899316"/>
       <w:r>
-        <w:t>${</w:t>
-      </w:r>
-      <w:proofErr w:type="spellStart"/>
-      <w:r>
-        <w:t>subheading_building_hmv</w:t>
-      </w:r>
-      <w:proofErr w:type="spellEnd"/>
-      <w:r>
-        <w:t>}</w:t>
+        <w:t>${subheading_building_hmv}</w:t>
       </w:r>
       <w:bookmarkEnd w:id="9"/>
     </w:p>
     <w:p>
       <w:r>
-        <w:t>${</w:t>
-      </w:r>
-      <w:proofErr w:type="spellStart"/>
-      <w:r>
-        <w:t>hmv_intro</w:t>
-      </w:r>
-      <w:proofErr w:type="spellEnd"/>
-      <w:r>
-        <w:t>}</w:t>
+        <w:t>${hmv_intro}</w:t>
       </w:r>
     </w:p>
     <w:p>
@@ -4803,13 +3940,8 @@
         <w:t>$</w:t>
       </w:r>
       <w:r>
-        <w:t>{</w:t>
-      </w:r>
-      <w:proofErr w:type="spellStart"/>
-      <w:r>
-        <w:t>block_hmv</w:t>
-      </w:r>
-      <w:proofErr w:type="spellEnd"/>
+        <w:t>{block_hmv</w:t>
+      </w:r>
       <w:r>
         <w:t>}</w:t>
       </w:r>
@@ -4904,25 +4036,7 @@
                 <w:sz w:val="2"/>
                 <w:szCs w:val="2"/>
               </w:rPr>
-              <w:t>${</w:t>
-            </w:r>
-            <w:proofErr w:type="spellStart"/>
-            <w:r>
-              <w:rPr>
-                <w:color w:val="FFFFFF" w:themeColor="background1"/>
-                <w:sz w:val="2"/>
-                <w:szCs w:val="2"/>
-              </w:rPr>
-              <w:t>hmv_listing_row</w:t>
-            </w:r>
-            <w:proofErr w:type="spellEnd"/>
-            <w:r>
-              <w:rPr>
-                <w:color w:val="FFFFFF" w:themeColor="background1"/>
-                <w:sz w:val="2"/>
-                <w:szCs w:val="2"/>
-              </w:rPr>
-              <w:t>}</w:t>
+              <w:t>${hmv_listing_row}</w:t>
             </w:r>
           </w:p>
         </w:tc>
@@ -4932,15 +4046,7 @@
           </w:tcPr>
           <w:p>
             <w:r>
-              <w:t>${</w:t>
-            </w:r>
-            <w:proofErr w:type="spellStart"/>
-            <w:r>
-              <w:t>hmv_listing_complex</w:t>
-            </w:r>
-            <w:proofErr w:type="spellEnd"/>
-            <w:r>
-              <w:t>}</w:t>
+              <w:t>${hmv_listing_complex}</w:t>
             </w:r>
           </w:p>
         </w:tc>
@@ -4950,15 +4056,7 @@
           </w:tcPr>
           <w:p>
             <w:r>
-              <w:t>${</w:t>
-            </w:r>
-            <w:proofErr w:type="spellStart"/>
-            <w:r>
-              <w:t>hmv_listing_name</w:t>
-            </w:r>
-            <w:proofErr w:type="spellEnd"/>
-            <w:r>
-              <w:t>}</w:t>
+              <w:t>${hmv_listing_name}</w:t>
             </w:r>
           </w:p>
         </w:tc>
@@ -4968,15 +4066,7 @@
           </w:tcPr>
           <w:p>
             <w:r>
-              <w:t>${</w:t>
-            </w:r>
-            <w:proofErr w:type="spellStart"/>
-            <w:r>
-              <w:t>hmv_listing_points</w:t>
-            </w:r>
-            <w:proofErr w:type="spellEnd"/>
-            <w:r>
-              <w:t>}</w:t>
+              <w:t>${hmv_listing_points}</w:t>
             </w:r>
           </w:p>
         </w:tc>
@@ -4986,15 +4076,7 @@
           </w:tcPr>
           <w:p>
             <w:r>
-              <w:t>${</w:t>
-            </w:r>
-            <w:proofErr w:type="spellStart"/>
-            <w:r>
-              <w:t>hmv_listing_status</w:t>
-            </w:r>
-            <w:proofErr w:type="spellEnd"/>
-            <w:r>
-              <w:t>}</w:t>
+              <w:t>${hmv_listing_status}</w:t>
             </w:r>
           </w:p>
         </w:tc>
@@ -5004,15 +4086,7 @@
           </w:tcPr>
           <w:p>
             <w:r>
-              <w:t>${</w:t>
-            </w:r>
-            <w:proofErr w:type="spellStart"/>
-            <w:r>
-              <w:t>hmv_listing_desc</w:t>
-            </w:r>
-            <w:proofErr w:type="spellEnd"/>
-            <w:r>
-              <w:t>}</w:t>
+              <w:t>${hmv_listing_desc}</w:t>
             </w:r>
           </w:p>
         </w:tc>
@@ -5021,28 +4095,12 @@
     <w:p/>
     <w:p>
       <w:r>
-        <w:t>${/</w:t>
-      </w:r>
-      <w:proofErr w:type="spellStart"/>
-      <w:r>
-        <w:t>block_hmv</w:t>
-      </w:r>
-      <w:proofErr w:type="spellEnd"/>
-      <w:r>
-        <w:t>}</w:t>
-      </w:r>
-    </w:p>
-    <w:p>
-      <w:r>
-        <w:t>${</w:t>
-      </w:r>
-      <w:proofErr w:type="spellStart"/>
-      <w:r>
-        <w:t>hmv_subtext</w:t>
-      </w:r>
-      <w:proofErr w:type="spellEnd"/>
-      <w:r>
-        <w:t>}</w:t>
+        <w:t>${/block_hmv}</w:t>
+      </w:r>
+    </w:p>
+    <w:p>
+      <w:r>
+        <w:t>${hmv_subtext}</w:t>
       </w:r>
     </w:p>
     <w:p>
@@ -5052,40 +4110,22 @@
       <w:bookmarkStart w:id="10" w:name="_Toc239899317"/>
       <w:r>
         <w:lastRenderedPageBreak/>
+        <w:t>${subheading_building_lighting}</w:t>
+      </w:r>
+      <w:bookmarkEnd w:id="10"/>
+    </w:p>
+    <w:p>
+      <w:r>
+        <w:t>${lighting_intro}</w:t>
+      </w:r>
+    </w:p>
+    <w:p>
+      <w:r>
         <w:t>${</w:t>
       </w:r>
-      <w:proofErr w:type="spellStart"/>
-      <w:r>
-        <w:t>subheading_building_lighting</w:t>
-      </w:r>
-      <w:proofErr w:type="spellEnd"/>
-      <w:r>
-        <w:t>}</w:t>
-      </w:r>
-      <w:bookmarkEnd w:id="10"/>
-    </w:p>
-    <w:p>
-      <w:r>
-        <w:t>${</w:t>
-      </w:r>
-      <w:proofErr w:type="spellStart"/>
-      <w:r>
-        <w:t>lighting_intro</w:t>
-      </w:r>
-      <w:proofErr w:type="spellEnd"/>
-      <w:r>
-        <w:t>}</w:t>
-      </w:r>
-    </w:p>
-    <w:p>
-      <w:r>
-        <w:t>${</w:t>
-      </w:r>
-      <w:proofErr w:type="spellStart"/>
       <w:r>
         <w:t>block_lighting</w:t>
       </w:r>
-      <w:proofErr w:type="spellEnd"/>
       <w:r>
         <w:t>}</w:t>
       </w:r>
@@ -5180,25 +4220,7 @@
                 <w:sz w:val="2"/>
                 <w:szCs w:val="2"/>
               </w:rPr>
-              <w:t>${</w:t>
-            </w:r>
-            <w:proofErr w:type="spellStart"/>
-            <w:r>
-              <w:rPr>
-                <w:color w:val="FFFFFF" w:themeColor="background1"/>
-                <w:sz w:val="2"/>
-                <w:szCs w:val="2"/>
-              </w:rPr>
-              <w:t>lighting_listing_row</w:t>
-            </w:r>
-            <w:proofErr w:type="spellEnd"/>
-            <w:r>
-              <w:rPr>
-                <w:color w:val="FFFFFF" w:themeColor="background1"/>
-                <w:sz w:val="2"/>
-                <w:szCs w:val="2"/>
-              </w:rPr>
-              <w:t>}</w:t>
+              <w:t>${lighting_listing_row}</w:t>
             </w:r>
           </w:p>
         </w:tc>
@@ -5208,15 +4230,7 @@
           </w:tcPr>
           <w:p>
             <w:r>
-              <w:t>${</w:t>
-            </w:r>
-            <w:proofErr w:type="spellStart"/>
-            <w:r>
-              <w:t>lighting_listing_complex</w:t>
-            </w:r>
-            <w:proofErr w:type="spellEnd"/>
-            <w:r>
-              <w:t>}</w:t>
+              <w:t>${lighting_listing_complex}</w:t>
             </w:r>
           </w:p>
         </w:tc>
@@ -5226,15 +4240,7 @@
           </w:tcPr>
           <w:p>
             <w:r>
-              <w:t>${</w:t>
-            </w:r>
-            <w:proofErr w:type="spellStart"/>
-            <w:r>
-              <w:t>lighting_listing_zone</w:t>
-            </w:r>
-            <w:proofErr w:type="spellEnd"/>
-            <w:r>
-              <w:t>}</w:t>
+              <w:t>${lighting_listing_zone}</w:t>
             </w:r>
           </w:p>
         </w:tc>
@@ -5244,15 +4250,7 @@
           </w:tcPr>
           <w:p>
             <w:r>
-              <w:t>${</w:t>
-            </w:r>
-            <w:proofErr w:type="spellStart"/>
-            <w:r>
-              <w:t>lighting_listing_qf</w:t>
-            </w:r>
-            <w:proofErr w:type="spellEnd"/>
-            <w:r>
-              <w:t>}</w:t>
+              <w:t>${lighting_listing_qf}</w:t>
             </w:r>
           </w:p>
         </w:tc>
@@ -5262,15 +4260,7 @@
           </w:tcPr>
           <w:p>
             <w:r>
-              <w:t>${</w:t>
-            </w:r>
-            <w:proofErr w:type="spellStart"/>
-            <w:r>
-              <w:t>lighting_listing_annual</w:t>
-            </w:r>
-            <w:proofErr w:type="spellEnd"/>
-            <w:r>
-              <w:t>}</w:t>
+              <w:t>${lighting_listing_annual}</w:t>
             </w:r>
           </w:p>
         </w:tc>
@@ -5280,15 +4270,7 @@
           </w:tcPr>
           <w:p>
             <w:r>
-              <w:t>${</w:t>
-            </w:r>
-            <w:proofErr w:type="spellStart"/>
-            <w:r>
-              <w:t>lighting_listing_status</w:t>
-            </w:r>
-            <w:proofErr w:type="spellEnd"/>
-            <w:r>
-              <w:t>}</w:t>
+              <w:t>${lighting_listing_status}</w:t>
             </w:r>
           </w:p>
         </w:tc>
@@ -5297,28 +4279,12 @@
     <w:p/>
     <w:p>
       <w:r>
-        <w:t>${/</w:t>
-      </w:r>
-      <w:proofErr w:type="spellStart"/>
-      <w:r>
-        <w:t>block_lighting</w:t>
-      </w:r>
-      <w:proofErr w:type="spellEnd"/>
-      <w:r>
-        <w:t>}</w:t>
-      </w:r>
-    </w:p>
-    <w:p>
-      <w:r>
-        <w:t>${</w:t>
-      </w:r>
-      <w:proofErr w:type="spellStart"/>
-      <w:r>
-        <w:t>lighting_subtext</w:t>
-      </w:r>
-      <w:proofErr w:type="spellEnd"/>
-      <w:r>
-        <w:t>}</w:t>
+        <w:t>${/block_lighting}</w:t>
+      </w:r>
+    </w:p>
+    <w:p>
+      <w:r>
+        <w:t>${lighting_subtext}</w:t>
       </w:r>
     </w:p>
     <w:p>
@@ -5327,42 +4293,21 @@
       </w:pPr>
       <w:bookmarkStart w:id="11" w:name="_Toc239899318"/>
       <w:r>
+        <w:t>${subheading_building_cooling}</w:t>
+      </w:r>
+      <w:bookmarkEnd w:id="11"/>
+    </w:p>
+    <w:p>
+      <w:r>
+        <w:t>${cooling_intro}</w:t>
+      </w:r>
+    </w:p>
+    <w:p>
+      <w:r>
         <w:t>${</w:t>
       </w:r>
-      <w:proofErr w:type="spellStart"/>
-      <w:r>
-        <w:t>subheading_building_cooling</w:t>
-      </w:r>
-      <w:proofErr w:type="spellEnd"/>
-      <w:r>
-        <w:t>}</w:t>
-      </w:r>
-      <w:bookmarkEnd w:id="11"/>
-    </w:p>
-    <w:p>
-      <w:r>
-        <w:t>${</w:t>
-      </w:r>
-      <w:proofErr w:type="spellStart"/>
-      <w:r>
-        <w:t>cooling_intro</w:t>
-      </w:r>
-      <w:proofErr w:type="spellEnd"/>
-      <w:r>
-        <w:t>}</w:t>
-      </w:r>
-    </w:p>
-    <w:p>
-      <w:r>
-        <w:t>${</w:t>
-      </w:r>
-      <w:proofErr w:type="spellStart"/>
-      <w:r>
-        <w:t>block_cooling</w:t>
-      </w:r>
-      <w:proofErr w:type="spellEnd"/>
-      <w:r>
-        <w:t>}</w:t>
+      <w:r>
+        <w:t>block_cooling}</w:t>
       </w:r>
     </w:p>
     <w:tbl>
@@ -5466,25 +4411,7 @@
                 <w:sz w:val="2"/>
                 <w:szCs w:val="2"/>
               </w:rPr>
-              <w:t>${</w:t>
-            </w:r>
-            <w:proofErr w:type="spellStart"/>
-            <w:r>
-              <w:rPr>
-                <w:color w:val="FFFFFF" w:themeColor="background1"/>
-                <w:sz w:val="2"/>
-                <w:szCs w:val="2"/>
-              </w:rPr>
-              <w:t>cooling_listing_row</w:t>
-            </w:r>
-            <w:proofErr w:type="spellEnd"/>
-            <w:r>
-              <w:rPr>
-                <w:color w:val="FFFFFF" w:themeColor="background1"/>
-                <w:sz w:val="2"/>
-                <w:szCs w:val="2"/>
-              </w:rPr>
-              <w:t>}</w:t>
+              <w:t>${cooling_listing_row}</w:t>
             </w:r>
           </w:p>
         </w:tc>
@@ -5494,15 +4421,7 @@
           </w:tcPr>
           <w:p>
             <w:r>
-              <w:t>${</w:t>
-            </w:r>
-            <w:proofErr w:type="spellStart"/>
-            <w:r>
-              <w:t>cooling_listing_complex</w:t>
-            </w:r>
-            <w:proofErr w:type="spellEnd"/>
-            <w:r>
-              <w:t>}</w:t>
+              <w:t>${cooling_listing_complex}</w:t>
             </w:r>
           </w:p>
         </w:tc>
@@ -5512,15 +4431,7 @@
           </w:tcPr>
           <w:p>
             <w:r>
-              <w:t>${</w:t>
-            </w:r>
-            <w:proofErr w:type="spellStart"/>
-            <w:r>
-              <w:t>cooling_listing_name</w:t>
-            </w:r>
-            <w:proofErr w:type="spellEnd"/>
-            <w:r>
-              <w:t>}</w:t>
+              <w:t>${cooling_listing_name}</w:t>
             </w:r>
           </w:p>
         </w:tc>
@@ -5530,15 +4441,7 @@
           </w:tcPr>
           <w:p>
             <w:r>
-              <w:t>${</w:t>
-            </w:r>
-            <w:proofErr w:type="spellStart"/>
-            <w:r>
-              <w:t>cooling_listing_type</w:t>
-            </w:r>
-            <w:proofErr w:type="spellEnd"/>
-            <w:r>
-              <w:t>}</w:t>
+              <w:t>${cooling_listing_type}</w:t>
             </w:r>
           </w:p>
         </w:tc>
@@ -5548,15 +4451,7 @@
           </w:tcPr>
           <w:p>
             <w:r>
-              <w:t>${</w:t>
-            </w:r>
-            <w:proofErr w:type="spellStart"/>
-            <w:r>
-              <w:t>cooling_listing_base</w:t>
-            </w:r>
-            <w:proofErr w:type="spellEnd"/>
-            <w:r>
-              <w:t>}</w:t>
+              <w:t>${cooling_listing_base}</w:t>
             </w:r>
           </w:p>
         </w:tc>
@@ -5566,15 +4461,7 @@
           </w:tcPr>
           <w:p>
             <w:r>
-              <w:t>${</w:t>
-            </w:r>
-            <w:proofErr w:type="spellStart"/>
-            <w:r>
-              <w:t>cooling_listing_reg</w:t>
-            </w:r>
-            <w:proofErr w:type="spellEnd"/>
-            <w:r>
-              <w:t>}</w:t>
+              <w:t>${cooling_listing_reg}</w:t>
             </w:r>
           </w:p>
         </w:tc>
@@ -5584,15 +4471,7 @@
           </w:tcPr>
           <w:p>
             <w:r>
-              <w:t>${</w:t>
-            </w:r>
-            <w:proofErr w:type="spellStart"/>
-            <w:r>
-              <w:t>cooling_listing_combined</w:t>
-            </w:r>
-            <w:proofErr w:type="spellEnd"/>
-            <w:r>
-              <w:t>}</w:t>
+              <w:t>${cooling_listing_combined}</w:t>
             </w:r>
           </w:p>
         </w:tc>
@@ -5601,28 +4480,12 @@
     <w:p/>
     <w:p>
       <w:r>
-        <w:t>${/</w:t>
-      </w:r>
-      <w:proofErr w:type="spellStart"/>
-      <w:r>
-        <w:t>block_cooling</w:t>
-      </w:r>
-      <w:proofErr w:type="spellEnd"/>
-      <w:r>
-        <w:t>}</w:t>
-      </w:r>
-    </w:p>
-    <w:p>
-      <w:r>
-        <w:t>${</w:t>
-      </w:r>
-      <w:proofErr w:type="spellStart"/>
-      <w:r>
-        <w:t>cooling_subtext</w:t>
-      </w:r>
-      <w:proofErr w:type="spellEnd"/>
-      <w:r>
-        <w:t>}</w:t>
+        <w:t>${/block_cooling}</w:t>
+      </w:r>
+    </w:p>
+    <w:p>
+      <w:r>
+        <w:t>${cooling_subtext}</w:t>
       </w:r>
     </w:p>
     <w:p>
@@ -5631,42 +4494,18 @@
       </w:pPr>
       <w:bookmarkStart w:id="12" w:name="_Toc239899319"/>
       <w:r>
-        <w:t>${</w:t>
-      </w:r>
-      <w:proofErr w:type="spellStart"/>
-      <w:r>
-        <w:t>subheading_building_hvac</w:t>
-      </w:r>
-      <w:proofErr w:type="spellEnd"/>
-      <w:r>
-        <w:t>}</w:t>
+        <w:t>${subheading_building_hvac}</w:t>
       </w:r>
       <w:bookmarkEnd w:id="12"/>
     </w:p>
     <w:p>
       <w:r>
-        <w:t>${</w:t>
-      </w:r>
-      <w:proofErr w:type="spellStart"/>
-      <w:r>
-        <w:t>hvac_intro</w:t>
-      </w:r>
-      <w:proofErr w:type="spellEnd"/>
-      <w:r>
-        <w:t>}</w:t>
-      </w:r>
-    </w:p>
-    <w:p>
-      <w:r>
-        <w:t>${</w:t>
-      </w:r>
-      <w:proofErr w:type="spellStart"/>
-      <w:r>
-        <w:t>block_hvac</w:t>
-      </w:r>
-      <w:proofErr w:type="spellEnd"/>
-      <w:r>
-        <w:t>}</w:t>
+        <w:t>${hvac_intro}</w:t>
+      </w:r>
+    </w:p>
+    <w:p>
+      <w:r>
+        <w:t>${block_hvac}</w:t>
       </w:r>
     </w:p>
     <w:tbl>
@@ -5786,25 +4625,7 @@
                 <w:sz w:val="2"/>
                 <w:szCs w:val="2"/>
               </w:rPr>
-              <w:t>${</w:t>
-            </w:r>
-            <w:proofErr w:type="spellStart"/>
-            <w:r>
-              <w:rPr>
-                <w:color w:val="FFFFFF" w:themeColor="background1"/>
-                <w:sz w:val="2"/>
-                <w:szCs w:val="2"/>
-              </w:rPr>
-              <w:t>hvac_listing_row</w:t>
-            </w:r>
-            <w:proofErr w:type="spellEnd"/>
-            <w:r>
-              <w:rPr>
-                <w:color w:val="FFFFFF" w:themeColor="background1"/>
-                <w:sz w:val="2"/>
-                <w:szCs w:val="2"/>
-              </w:rPr>
-              <w:t>}</w:t>
+              <w:t>${hvac_listing_row}</w:t>
             </w:r>
           </w:p>
         </w:tc>
@@ -5814,15 +4635,7 @@
           </w:tcPr>
           <w:p>
             <w:r>
-              <w:t>${</w:t>
-            </w:r>
-            <w:proofErr w:type="spellStart"/>
-            <w:r>
-              <w:t>hvac_listing_complex</w:t>
-            </w:r>
-            <w:proofErr w:type="spellEnd"/>
-            <w:r>
-              <w:t>}</w:t>
+              <w:t>${hvac_listing_complex}</w:t>
             </w:r>
           </w:p>
         </w:tc>
@@ -5832,15 +4645,7 @@
           </w:tcPr>
           <w:p>
             <w:r>
-              <w:t>${</w:t>
-            </w:r>
-            <w:proofErr w:type="spellStart"/>
-            <w:r>
-              <w:t>hvac_listing_name</w:t>
-            </w:r>
-            <w:proofErr w:type="spellEnd"/>
-            <w:r>
-              <w:t>}</w:t>
+              <w:t>${hvac_listing_name}</w:t>
             </w:r>
           </w:p>
         </w:tc>
@@ -5850,15 +4655,7 @@
           </w:tcPr>
           <w:p>
             <w:r>
-              <w:t>${</w:t>
-            </w:r>
-            <w:proofErr w:type="spellStart"/>
-            <w:r>
-              <w:t>hvac_listing_sfp</w:t>
-            </w:r>
-            <w:proofErr w:type="spellEnd"/>
-            <w:r>
-              <w:t>}</w:t>
+              <w:t>${hvac_listing_sfp}</w:t>
             </w:r>
           </w:p>
         </w:tc>
@@ -5868,15 +4665,7 @@
           </w:tcPr>
           <w:p>
             <w:r>
-              <w:t>${</w:t>
-            </w:r>
-            <w:proofErr w:type="spellStart"/>
-            <w:r>
-              <w:t>hvac_listing_sfp_points</w:t>
-            </w:r>
-            <w:proofErr w:type="spellEnd"/>
-            <w:r>
-              <w:t>}</w:t>
+              <w:t>${hvac_listing_sfp_points}</w:t>
             </w:r>
           </w:p>
         </w:tc>
@@ -5886,15 +4675,7 @@
           </w:tcPr>
           <w:p>
             <w:r>
-              <w:t>${</w:t>
-            </w:r>
-            <w:proofErr w:type="spellStart"/>
-            <w:r>
-              <w:t>hvac_listing_heat</w:t>
-            </w:r>
-            <w:proofErr w:type="spellEnd"/>
-            <w:r>
-              <w:t>}</w:t>
+              <w:t>${hvac_listing_heat}</w:t>
             </w:r>
           </w:p>
         </w:tc>
@@ -5904,15 +4685,7 @@
           </w:tcPr>
           <w:p>
             <w:r>
-              <w:t>${</w:t>
-            </w:r>
-            <w:proofErr w:type="spellStart"/>
-            <w:r>
-              <w:t>hvac_listing_heat_points</w:t>
-            </w:r>
-            <w:proofErr w:type="spellEnd"/>
-            <w:r>
-              <w:t>}</w:t>
+              <w:t>${hvac_listing_heat_points}</w:t>
             </w:r>
           </w:p>
         </w:tc>
@@ -5922,15 +4695,7 @@
           </w:tcPr>
           <w:p>
             <w:r>
-              <w:t>${</w:t>
-            </w:r>
-            <w:proofErr w:type="spellStart"/>
-            <w:r>
-              <w:t>hvac_listing_insulation</w:t>
-            </w:r>
-            <w:proofErr w:type="spellEnd"/>
-            <w:r>
-              <w:t>}</w:t>
+              <w:t>${hvac_listing_insulation}</w:t>
             </w:r>
           </w:p>
         </w:tc>
@@ -5939,28 +4704,12 @@
     <w:p/>
     <w:p>
       <w:r>
-        <w:t>${/</w:t>
-      </w:r>
-      <w:proofErr w:type="spellStart"/>
-      <w:r>
-        <w:t>block_hvac</w:t>
-      </w:r>
-      <w:proofErr w:type="spellEnd"/>
-      <w:r>
-        <w:t>}</w:t>
-      </w:r>
-    </w:p>
-    <w:p>
-      <w:r>
-        <w:t>${</w:t>
-      </w:r>
-      <w:proofErr w:type="spellStart"/>
-      <w:r>
-        <w:t>hvac_subtext</w:t>
-      </w:r>
-      <w:proofErr w:type="spellEnd"/>
-      <w:r>
-        <w:t>}</w:t>
+        <w:t>${/block_hvac}</w:t>
+      </w:r>
+    </w:p>
+    <w:p>
+      <w:r>
+        <w:t>${hvac_subtext}</w:t>
       </w:r>
     </w:p>
     <w:p>
@@ -5976,15 +4725,7 @@
     </w:p>
     <w:p>
       <w:r>
-        <w:t>A ${</w:t>
-      </w:r>
-      <w:proofErr w:type="spellStart"/>
-      <w:r>
-        <w:t>company_name</w:t>
-      </w:r>
-      <w:proofErr w:type="spellEnd"/>
-      <w:r>
-        <w:t>} az alábbi járműveket üzemelteti:</w:t>
+        <w:t>A ${company_name} az alábbi járműveket üzemelteti:</w:t>
       </w:r>
     </w:p>
     <w:tbl>
@@ -6066,25 +4807,7 @@
                 <w:sz w:val="2"/>
                 <w:szCs w:val="2"/>
               </w:rPr>
-              <w:t>${</w:t>
-            </w:r>
-            <w:proofErr w:type="spellStart"/>
-            <w:r>
-              <w:rPr>
-                <w:color w:val="FFFFFF" w:themeColor="background1"/>
-                <w:sz w:val="2"/>
-                <w:szCs w:val="2"/>
-              </w:rPr>
-              <w:t>vehicles_listing_row</w:t>
-            </w:r>
-            <w:proofErr w:type="spellEnd"/>
-            <w:r>
-              <w:rPr>
-                <w:color w:val="FFFFFF" w:themeColor="background1"/>
-                <w:sz w:val="2"/>
-                <w:szCs w:val="2"/>
-              </w:rPr>
-              <w:t>}</w:t>
+              <w:t>${vehicles_listing_row}</w:t>
             </w:r>
           </w:p>
         </w:tc>
@@ -6094,15 +4817,7 @@
           </w:tcPr>
           <w:p>
             <w:r>
-              <w:t>${</w:t>
-            </w:r>
-            <w:proofErr w:type="spellStart"/>
-            <w:r>
-              <w:t>vehicles_listing_name</w:t>
-            </w:r>
-            <w:proofErr w:type="spellEnd"/>
-            <w:r>
-              <w:t>}</w:t>
+              <w:t>${vehicles_listing_name}</w:t>
             </w:r>
           </w:p>
         </w:tc>
@@ -6112,15 +4827,7 @@
           </w:tcPr>
           <w:p>
             <w:r>
-              <w:t>${</w:t>
-            </w:r>
-            <w:proofErr w:type="spellStart"/>
-            <w:r>
-              <w:t>vehicles_listing_complex</w:t>
-            </w:r>
-            <w:proofErr w:type="spellEnd"/>
-            <w:r>
-              <w:t>}</w:t>
+              <w:t>${vehicles_listing_complex}</w:t>
             </w:r>
           </w:p>
         </w:tc>
@@ -6130,15 +4837,7 @@
           </w:tcPr>
           <w:p>
             <w:r>
-              <w:t>${</w:t>
-            </w:r>
-            <w:proofErr w:type="spellStart"/>
-            <w:r>
-              <w:t>vehicles_listing_qf</w:t>
-            </w:r>
-            <w:proofErr w:type="spellEnd"/>
-            <w:r>
-              <w:t>}</w:t>
+              <w:t>${vehicles_listing_qf}</w:t>
             </w:r>
           </w:p>
         </w:tc>
@@ -6148,15 +4847,7 @@
           </w:tcPr>
           <w:p>
             <w:r>
-              <w:t>${</w:t>
-            </w:r>
-            <w:proofErr w:type="spellStart"/>
-            <w:r>
-              <w:t>vehicles_listing_status</w:t>
-            </w:r>
-            <w:proofErr w:type="spellEnd"/>
-            <w:r>
-              <w:t>}</w:t>
+              <w:t>${vehicles_listing_status}</w:t>
             </w:r>
           </w:p>
         </w:tc>
@@ -6170,467 +4861,24 @@
       <w:bookmarkStart w:id="14" w:name="_Toc239899321"/>
       <w:r>
         <w:lastRenderedPageBreak/>
-        <w:t>${</w:t>
-      </w:r>
-      <w:proofErr w:type="spellStart"/>
-      <w:r>
-        <w:t>technology_title</w:t>
-      </w:r>
-      <w:proofErr w:type="spellEnd"/>
-      <w:r>
-        <w:t>}</w:t>
+        <w:t>${technology_title}</w:t>
       </w:r>
       <w:bookmarkEnd w:id="14"/>
     </w:p>
     <w:p>
       <w:bookmarkStart w:id="15" w:name="_Toc239899322"/>
       <w:r>
-        <w:t>${</w:t>
-      </w:r>
-      <w:proofErr w:type="spellStart"/>
-      <w:r>
-        <w:t>technology_intro</w:t>
-      </w:r>
-      <w:proofErr w:type="spellEnd"/>
-      <w:r>
-        <w:t>}</w:t>
-      </w:r>
-    </w:p>
-    <w:p>
-      <w:r>
-        <w:t>${</w:t>
-      </w:r>
-      <w:proofErr w:type="spellStart"/>
-      <w:r>
-        <w:t>block_compressed_air</w:t>
-      </w:r>
-      <w:proofErr w:type="spellEnd"/>
-      <w:r>
-        <w:t>}</w:t>
-      </w:r>
-    </w:p>
-    <w:p>
-      <w:r>
-        <w:t>${</w:t>
-      </w:r>
-      <w:proofErr w:type="spellStart"/>
-      <w:r>
-        <w:t>compressed_air_sub</w:t>
-      </w:r>
-      <w:proofErr w:type="spellEnd"/>
-      <w:r>
-        <w:t>}</w:t>
-      </w:r>
-    </w:p>
-    <w:tbl>
-      <w:tblPr>
-        <w:tblStyle w:val="TableGrid"/>
-        <w:tblW w:w="0" w:type="auto"/>
-        <w:tblLook w:val="04A0" w:firstRow="1" w:lastRow="0" w:firstColumn="1" w:lastColumn="0" w:noHBand="0" w:noVBand="1"/>
-      </w:tblPr>
-      <w:tblGrid>
-        <w:gridCol w:w="4223"/>
-        <w:gridCol w:w="4793"/>
-      </w:tblGrid>
-      <w:tr>
-        <w:tc>
-          <w:tcPr>
-            <w:tcW w:w="4508" w:type="dxa"/>
-          </w:tcPr>
-          <w:p>
-            <w:r>
-              <w:t>Rendszer megnevezése</w:t>
-            </w:r>
-          </w:p>
-        </w:tc>
-        <w:tc>
-          <w:tcPr>
-            <w:tcW w:w="4508" w:type="dxa"/>
-          </w:tcPr>
-          <w:p>
-            <w:r>
-              <w:t>${</w:t>
-            </w:r>
-            <w:proofErr w:type="spellStart"/>
-            <w:r>
-              <w:t>compressed_air_name</w:t>
-            </w:r>
-            <w:proofErr w:type="spellEnd"/>
-            <w:r>
-              <w:t>}</w:t>
-            </w:r>
-          </w:p>
-        </w:tc>
-      </w:tr>
-      <w:tr>
-        <w:tc>
-          <w:tcPr>
-            <w:tcW w:w="4508" w:type="dxa"/>
-          </w:tcPr>
-          <w:p>
-            <w:r>
-              <w:t>Telephely</w:t>
-            </w:r>
-          </w:p>
-        </w:tc>
-        <w:tc>
-          <w:tcPr>
-            <w:tcW w:w="4508" w:type="dxa"/>
-          </w:tcPr>
-          <w:p>
-            <w:r>
-              <w:t>${</w:t>
-            </w:r>
-            <w:proofErr w:type="spellStart"/>
-            <w:r>
-              <w:t>compressed_air_complex</w:t>
-            </w:r>
-            <w:proofErr w:type="spellEnd"/>
-            <w:r>
-              <w:t>}</w:t>
-            </w:r>
-          </w:p>
-        </w:tc>
-      </w:tr>
-      <w:tr>
-        <w:tc>
-          <w:tcPr>
-            <w:tcW w:w="4508" w:type="dxa"/>
-          </w:tcPr>
-          <w:p>
-            <w:r>
-              <w:t>Hálózati nyomás (bar)</w:t>
-            </w:r>
-          </w:p>
-        </w:tc>
-        <w:tc>
-          <w:tcPr>
-            <w:tcW w:w="4508" w:type="dxa"/>
-          </w:tcPr>
-          <w:p>
-            <w:r>
-              <w:t>${</w:t>
-            </w:r>
-            <w:proofErr w:type="spellStart"/>
-            <w:r>
-              <w:t>compressed_air_pressure</w:t>
-            </w:r>
-            <w:proofErr w:type="spellEnd"/>
-            <w:r>
-              <w:t>}</w:t>
-            </w:r>
-          </w:p>
-        </w:tc>
-      </w:tr>
-      <w:tr>
-        <w:tc>
-          <w:tcPr>
-            <w:tcW w:w="4508" w:type="dxa"/>
-          </w:tcPr>
-          <w:p>
-            <w:r>
-              <w:t>Kompresszor típusa</w:t>
-            </w:r>
-          </w:p>
-        </w:tc>
-        <w:tc>
-          <w:tcPr>
-            <w:tcW w:w="4508" w:type="dxa"/>
-          </w:tcPr>
-          <w:p>
-            <w:r>
-              <w:t>${</w:t>
-            </w:r>
-            <w:proofErr w:type="spellStart"/>
-            <w:r>
-              <w:t>compressed_air_compressor_type</w:t>
-            </w:r>
-            <w:proofErr w:type="spellEnd"/>
-            <w:r>
-              <w:t>}</w:t>
-            </w:r>
-          </w:p>
-        </w:tc>
-      </w:tr>
-      <w:tr>
-        <w:tc>
-          <w:tcPr>
-            <w:tcW w:w="4508" w:type="dxa"/>
-          </w:tcPr>
-          <w:p>
-            <w:r>
-              <w:t>Mennyisége (db)</w:t>
-            </w:r>
-          </w:p>
-        </w:tc>
-        <w:tc>
-          <w:tcPr>
-            <w:tcW w:w="4508" w:type="dxa"/>
-          </w:tcPr>
-          <w:p>
-            <w:r>
-              <w:t>${</w:t>
-            </w:r>
-            <w:proofErr w:type="spellStart"/>
-            <w:r>
-              <w:t>compressed_air_compressor_amount</w:t>
-            </w:r>
-            <w:proofErr w:type="spellEnd"/>
-            <w:r>
-              <w:t>}</w:t>
-            </w:r>
-          </w:p>
-        </w:tc>
-      </w:tr>
-      <w:tr>
-        <w:tc>
-          <w:tcPr>
-            <w:tcW w:w="4508" w:type="dxa"/>
-          </w:tcPr>
-          <w:p>
-            <w:r>
-              <w:t>Névleges teljesítmény (kW/db)</w:t>
-            </w:r>
-          </w:p>
-        </w:tc>
-        <w:tc>
-          <w:tcPr>
-            <w:tcW w:w="4508" w:type="dxa"/>
-          </w:tcPr>
-          <w:p>
-            <w:r>
-              <w:t>${</w:t>
-            </w:r>
-            <w:proofErr w:type="spellStart"/>
-            <w:r>
-              <w:t>compressed_air_compressor_nominal</w:t>
-            </w:r>
-            <w:proofErr w:type="spellEnd"/>
-            <w:r>
-              <w:t>}</w:t>
-            </w:r>
-          </w:p>
-        </w:tc>
-      </w:tr>
-      <w:tr>
-        <w:tc>
-          <w:tcPr>
-            <w:tcW w:w="4508" w:type="dxa"/>
-          </w:tcPr>
-          <w:p>
-            <w:r>
-              <w:t>Működési mód</w:t>
-            </w:r>
-          </w:p>
-        </w:tc>
-        <w:tc>
-          <w:tcPr>
-            <w:tcW w:w="4508" w:type="dxa"/>
-          </w:tcPr>
-          <w:p>
-            <w:r>
-              <w:t>${</w:t>
-            </w:r>
-            <w:proofErr w:type="spellStart"/>
-            <w:r>
-              <w:t>compressed_air_compressor_mode</w:t>
-            </w:r>
-            <w:proofErr w:type="spellEnd"/>
-            <w:r>
-              <w:t>}</w:t>
-            </w:r>
-          </w:p>
-        </w:tc>
-      </w:tr>
-      <w:tr>
-        <w:tc>
-          <w:tcPr>
-            <w:tcW w:w="4508" w:type="dxa"/>
-          </w:tcPr>
-          <w:p>
-            <w:r>
-              <w:t>Hozzá tartozó almérés</w:t>
-            </w:r>
-          </w:p>
-        </w:tc>
-        <w:tc>
-          <w:tcPr>
-            <w:tcW w:w="4508" w:type="dxa"/>
-          </w:tcPr>
-          <w:p>
-            <w:r>
-              <w:t>${</w:t>
-            </w:r>
-            <w:proofErr w:type="spellStart"/>
-            <w:r>
-              <w:t>compressed_air_compressor_standing</w:t>
-            </w:r>
-            <w:proofErr w:type="spellEnd"/>
-            <w:r>
-              <w:t>}</w:t>
-            </w:r>
-          </w:p>
-        </w:tc>
-      </w:tr>
-      <w:tr>
-        <w:tc>
-          <w:tcPr>
-            <w:tcW w:w="4508" w:type="dxa"/>
-          </w:tcPr>
-          <w:p>
-            <w:r>
-              <w:t>Van lehetőség a nyomás csökkentésére?</w:t>
-            </w:r>
-          </w:p>
-        </w:tc>
-        <w:tc>
-          <w:tcPr>
-            <w:tcW w:w="4508" w:type="dxa"/>
-          </w:tcPr>
-          <w:p>
-            <w:r>
-              <w:t>${</w:t>
-            </w:r>
-            <w:proofErr w:type="spellStart"/>
-            <w:r>
-              <w:t>compressed_air_compressor_pressure</w:t>
-            </w:r>
-            <w:proofErr w:type="spellEnd"/>
-            <w:r>
-              <w:t>}</w:t>
-            </w:r>
-          </w:p>
-        </w:tc>
-      </w:tr>
-      <w:tr>
-        <w:tc>
-          <w:tcPr>
-            <w:tcW w:w="4508" w:type="dxa"/>
-          </w:tcPr>
-          <w:p>
-            <w:r>
-              <w:t>Van lehetőség hálózati optimalizációra?</w:t>
-            </w:r>
-          </w:p>
-        </w:tc>
-        <w:tc>
-          <w:tcPr>
-            <w:tcW w:w="4508" w:type="dxa"/>
-          </w:tcPr>
-          <w:p>
-            <w:r>
-              <w:t>${</w:t>
-            </w:r>
-            <w:proofErr w:type="spellStart"/>
-            <w:r>
-              <w:t>compressed_air_compressor_optimalisation</w:t>
-            </w:r>
-            <w:proofErr w:type="spellEnd"/>
-            <w:r>
-              <w:t>}</w:t>
-            </w:r>
-          </w:p>
-        </w:tc>
-      </w:tr>
-      <w:tr>
-        <w:tc>
-          <w:tcPr>
-            <w:tcW w:w="4508" w:type="dxa"/>
-          </w:tcPr>
-          <w:p>
-            <w:r>
-              <w:t>Van hulladékhő hasznosítás?</w:t>
-            </w:r>
-          </w:p>
-        </w:tc>
-        <w:tc>
-          <w:tcPr>
-            <w:tcW w:w="4508" w:type="dxa"/>
-          </w:tcPr>
-          <w:p>
-            <w:r>
-              <w:t>${</w:t>
-            </w:r>
-            <w:proofErr w:type="spellStart"/>
-            <w:r>
-              <w:t>compressed_air_compressor_retriever</w:t>
-            </w:r>
-            <w:proofErr w:type="spellEnd"/>
-            <w:r>
-              <w:t>}</w:t>
-            </w:r>
-          </w:p>
-        </w:tc>
-      </w:tr>
-      <w:tr>
-        <w:tc>
-          <w:tcPr>
-            <w:tcW w:w="4508" w:type="dxa"/>
-          </w:tcPr>
-          <w:p>
-            <w:r>
-              <w:t>Értékelés</w:t>
-            </w:r>
-          </w:p>
-        </w:tc>
-        <w:tc>
-          <w:tcPr>
-            <w:tcW w:w="4508" w:type="dxa"/>
-          </w:tcPr>
-          <w:p>
-            <w:r>
-              <w:t>${</w:t>
-            </w:r>
-            <w:proofErr w:type="spellStart"/>
-            <w:r>
-              <w:t>compressed_air_status</w:t>
-            </w:r>
-            <w:proofErr w:type="spellEnd"/>
-            <w:r>
-              <w:t>}</w:t>
-            </w:r>
-          </w:p>
-        </w:tc>
-      </w:tr>
-    </w:tbl>
-    <w:p/>
-    <w:p>
-      <w:r>
-        <w:t>${/</w:t>
-      </w:r>
-      <w:proofErr w:type="spellStart"/>
-      <w:r>
-        <w:t>block_compressed_air</w:t>
-      </w:r>
-      <w:proofErr w:type="spellEnd"/>
-      <w:r>
-        <w:t>}</w:t>
-      </w:r>
-    </w:p>
-    <w:p>
-      <w:r>
-        <w:t>${</w:t>
-      </w:r>
-      <w:proofErr w:type="spellStart"/>
-      <w:r>
-        <w:t>block_steam</w:t>
-      </w:r>
-      <w:proofErr w:type="spellEnd"/>
-      <w:r>
-        <w:t>}</w:t>
-      </w:r>
-    </w:p>
-    <w:p>
-      <w:r>
-        <w:t>${</w:t>
-      </w:r>
-      <w:proofErr w:type="spellStart"/>
-      <w:r>
-        <w:t>steam_sub</w:t>
-      </w:r>
-      <w:proofErr w:type="spellEnd"/>
-      <w:r>
-        <w:t>}</w:t>
+        <w:t>${technology_intro}</w:t>
+      </w:r>
+    </w:p>
+    <w:p>
+      <w:r>
+        <w:t>${compressed_air_sub}</w:t>
+      </w:r>
+    </w:p>
+    <w:p>
+      <w:r>
+        <w:t>${block_compressed_air}</w:t>
       </w:r>
     </w:p>
     <w:tbl>
@@ -6660,18 +4908,7 @@
           </w:tcPr>
           <w:p>
             <w:r>
-              <w:t>${</w:t>
-            </w:r>
-            <w:proofErr w:type="spellStart"/>
-            <w:r>
-              <w:t>steam</w:t>
-            </w:r>
-            <w:r>
-              <w:t>_name</w:t>
-            </w:r>
-            <w:proofErr w:type="spellEnd"/>
-            <w:r>
-              <w:t>}</w:t>
+              <w:t>${compressed_air_name}</w:t>
             </w:r>
           </w:p>
         </w:tc>
@@ -6693,18 +4930,7 @@
           </w:tcPr>
           <w:p>
             <w:r>
-              <w:t>${</w:t>
-            </w:r>
-            <w:proofErr w:type="spellStart"/>
-            <w:r>
-              <w:t>steam</w:t>
-            </w:r>
-            <w:r>
-              <w:t>_complex</w:t>
-            </w:r>
-            <w:proofErr w:type="spellEnd"/>
-            <w:r>
-              <w:t>}</w:t>
+              <w:t>${compressed_air_complex}</w:t>
             </w:r>
           </w:p>
         </w:tc>
@@ -6726,18 +4952,7 @@
           </w:tcPr>
           <w:p>
             <w:r>
-              <w:t>${</w:t>
-            </w:r>
-            <w:proofErr w:type="spellStart"/>
-            <w:r>
-              <w:t>steam</w:t>
-            </w:r>
-            <w:r>
-              <w:t>_pressure</w:t>
-            </w:r>
-            <w:proofErr w:type="spellEnd"/>
-            <w:r>
-              <w:t>}</w:t>
+              <w:t>${compressed_air_pressure}</w:t>
             </w:r>
           </w:p>
         </w:tc>
@@ -6749,7 +4964,7 @@
           </w:tcPr>
           <w:p>
             <w:r>
-              <w:t>Kompresszor típusa</w:t>
+              <w:t>${compressor_row_title}</w:t>
             </w:r>
           </w:p>
         </w:tc>
@@ -6759,16 +4974,11 @@
           </w:tcPr>
           <w:p>
             <w:r>
-              <w:t>${</w:t>
-            </w:r>
-            <w:proofErr w:type="spellStart"/>
-            <w:r>
-              <w:t>steam</w:t>
-            </w:r>
-            <w:r>
-              <w:t>_compressor_type</w:t>
-            </w:r>
-            <w:proofErr w:type="spellEnd"/>
+              <w:t>${compressed_air_compressor</w:t>
+            </w:r>
+            <w:r>
+              <w:t>_data</w:t>
+            </w:r>
             <w:r>
               <w:t>}</w:t>
             </w:r>
@@ -6782,7 +4992,7 @@
           </w:tcPr>
           <w:p>
             <w:r>
-              <w:t>Mennyisége (db)</w:t>
+              <w:t>Van lehetőség a nyomás csökkentésére?</w:t>
             </w:r>
           </w:p>
         </w:tc>
@@ -6792,16 +5002,11 @@
           </w:tcPr>
           <w:p>
             <w:r>
-              <w:t>${</w:t>
-            </w:r>
-            <w:proofErr w:type="spellStart"/>
-            <w:r>
-              <w:t>steam</w:t>
-            </w:r>
-            <w:r>
-              <w:t>_compressor_amount</w:t>
-            </w:r>
-            <w:proofErr w:type="spellEnd"/>
+              <w:t>${compressed_air_pressure</w:t>
+            </w:r>
+            <w:r>
+              <w:t>_reduction</w:t>
+            </w:r>
             <w:r>
               <w:t>}</w:t>
             </w:r>
@@ -6815,7 +5020,7 @@
           </w:tcPr>
           <w:p>
             <w:r>
-              <w:t>Névleges teljesítmény (kW/db)</w:t>
+              <w:t>Van lehetőség hálózati optimalizációra?</w:t>
             </w:r>
           </w:p>
         </w:tc>
@@ -6825,18 +5030,7 @@
           </w:tcPr>
           <w:p>
             <w:r>
-              <w:t>${</w:t>
-            </w:r>
-            <w:proofErr w:type="spellStart"/>
-            <w:r>
-              <w:t>steam</w:t>
-            </w:r>
-            <w:r>
-              <w:t>_compressor_nominal</w:t>
-            </w:r>
-            <w:proofErr w:type="spellEnd"/>
-            <w:r>
-              <w:t>}</w:t>
+              <w:t>${compressed_air_optimalisation}</w:t>
             </w:r>
           </w:p>
         </w:tc>
@@ -6848,7 +5042,7 @@
           </w:tcPr>
           <w:p>
             <w:r>
-              <w:t>Működési mód</w:t>
+              <w:t>Van hulladékhő hasznosítás?</w:t>
             </w:r>
           </w:p>
         </w:tc>
@@ -6858,18 +5052,7 @@
           </w:tcPr>
           <w:p>
             <w:r>
-              <w:t>${</w:t>
-            </w:r>
-            <w:proofErr w:type="spellStart"/>
-            <w:r>
-              <w:t>steam</w:t>
-            </w:r>
-            <w:r>
-              <w:t>_compressor_mode</w:t>
-            </w:r>
-            <w:proofErr w:type="spellEnd"/>
-            <w:r>
-              <w:t>}</w:t>
+              <w:t>${compressed_air_retriever}</w:t>
             </w:r>
           </w:p>
         </w:tc>
@@ -6881,7 +5064,7 @@
           </w:tcPr>
           <w:p>
             <w:r>
-              <w:t>Hozzá tartozó almérés</w:t>
+              <w:t>Értékelés</w:t>
             </w:r>
           </w:p>
         </w:tc>
@@ -6891,150 +5074,7 @@
           </w:tcPr>
           <w:p>
             <w:r>
-              <w:t>${</w:t>
-            </w:r>
-            <w:proofErr w:type="spellStart"/>
-            <w:r>
-              <w:t>steam</w:t>
-            </w:r>
-            <w:r>
-              <w:t>_compressor_standing</w:t>
-            </w:r>
-            <w:proofErr w:type="spellEnd"/>
-            <w:r>
-              <w:t>}</w:t>
-            </w:r>
-          </w:p>
-        </w:tc>
-      </w:tr>
-      <w:tr>
-        <w:tc>
-          <w:tcPr>
-            <w:tcW w:w="4508" w:type="dxa"/>
-          </w:tcPr>
-          <w:p>
-            <w:r>
-              <w:t>Van lehetőség a nyomás csökkentésére?</w:t>
-            </w:r>
-          </w:p>
-        </w:tc>
-        <w:tc>
-          <w:tcPr>
-            <w:tcW w:w="4508" w:type="dxa"/>
-          </w:tcPr>
-          <w:p>
-            <w:r>
-              <w:t>${</w:t>
-            </w:r>
-            <w:proofErr w:type="spellStart"/>
-            <w:r>
-              <w:t>steam</w:t>
-            </w:r>
-            <w:r>
-              <w:t>_compressor_pressure</w:t>
-            </w:r>
-            <w:proofErr w:type="spellEnd"/>
-            <w:r>
-              <w:t>}</w:t>
-            </w:r>
-          </w:p>
-        </w:tc>
-      </w:tr>
-      <w:tr>
-        <w:tc>
-          <w:tcPr>
-            <w:tcW w:w="4508" w:type="dxa"/>
-          </w:tcPr>
-          <w:p>
-            <w:r>
-              <w:t>Van lehetőség hálózati optimalizációra?</w:t>
-            </w:r>
-          </w:p>
-        </w:tc>
-        <w:tc>
-          <w:tcPr>
-            <w:tcW w:w="4508" w:type="dxa"/>
-          </w:tcPr>
-          <w:p>
-            <w:r>
-              <w:t>${</w:t>
-            </w:r>
-            <w:proofErr w:type="spellStart"/>
-            <w:r>
-              <w:t>steam</w:t>
-            </w:r>
-            <w:r>
-              <w:t>_compressor_optimalisation</w:t>
-            </w:r>
-            <w:proofErr w:type="spellEnd"/>
-            <w:r>
-              <w:t>}</w:t>
-            </w:r>
-          </w:p>
-        </w:tc>
-      </w:tr>
-      <w:tr>
-        <w:tc>
-          <w:tcPr>
-            <w:tcW w:w="4508" w:type="dxa"/>
-          </w:tcPr>
-          <w:p>
-            <w:r>
-              <w:t>Van hulladékhő hasznosítás?</w:t>
-            </w:r>
-          </w:p>
-        </w:tc>
-        <w:tc>
-          <w:tcPr>
-            <w:tcW w:w="4508" w:type="dxa"/>
-          </w:tcPr>
-          <w:p>
-            <w:r>
-              <w:t>${</w:t>
-            </w:r>
-            <w:proofErr w:type="spellStart"/>
-            <w:r>
-              <w:t>steam</w:t>
-            </w:r>
-            <w:r>
-              <w:t>_compressor_retriever</w:t>
-            </w:r>
-            <w:proofErr w:type="spellEnd"/>
-            <w:r>
-              <w:t>}</w:t>
-            </w:r>
-          </w:p>
-        </w:tc>
-      </w:tr>
-      <w:tr>
-        <w:tc>
-          <w:tcPr>
-            <w:tcW w:w="4508" w:type="dxa"/>
-          </w:tcPr>
-          <w:p>
-            <w:r>
-              <w:t>Értékelés</w:t>
-            </w:r>
-          </w:p>
-        </w:tc>
-        <w:tc>
-          <w:tcPr>
-            <w:tcW w:w="4508" w:type="dxa"/>
-          </w:tcPr>
-          <w:p>
-            <w:r>
-              <w:t>${</w:t>
-            </w:r>
-            <w:proofErr w:type="spellStart"/>
-            <w:r>
-              <w:t>steam</w:t>
-            </w:r>
-            <w:r>
-              <w:t>_status</w:t>
-            </w:r>
-            <w:proofErr w:type="spellEnd"/>
-            <w:r>
-              <w:t>}</w:t>
+              <w:t>${compressed_air_status}</w:t>
             </w:r>
           </w:p>
         </w:tc>
@@ -7043,41 +5083,17 @@
     <w:p/>
     <w:p>
       <w:r>
-        <w:t>${/</w:t>
-      </w:r>
-      <w:proofErr w:type="spellStart"/>
-      <w:r>
-        <w:t>block_steam</w:t>
-      </w:r>
-      <w:proofErr w:type="spellEnd"/>
-      <w:r>
-        <w:t>}</w:t>
-      </w:r>
-    </w:p>
-    <w:p>
-      <w:r>
-        <w:t>${</w:t>
-      </w:r>
-      <w:proofErr w:type="spellStart"/>
-      <w:r>
-        <w:t>block_tech_cooling</w:t>
-      </w:r>
-      <w:proofErr w:type="spellEnd"/>
-      <w:r>
-        <w:t>}</w:t>
-      </w:r>
-    </w:p>
-    <w:p>
-      <w:r>
-        <w:t>${</w:t>
-      </w:r>
-      <w:proofErr w:type="spellStart"/>
-      <w:r>
-        <w:t>tech_cooling_sub</w:t>
-      </w:r>
-      <w:proofErr w:type="spellEnd"/>
-      <w:r>
-        <w:t>}</w:t>
+        <w:t>${/block_compressed_air}</w:t>
+      </w:r>
+    </w:p>
+    <w:p>
+      <w:r>
+        <w:t>${steam_sub}</w:t>
+      </w:r>
+    </w:p>
+    <w:p>
+      <w:r>
+        <w:t>${block_steam}</w:t>
       </w:r>
     </w:p>
     <w:tbl>
@@ -7097,7 +5113,6 @@
           </w:tcPr>
           <w:p>
             <w:r>
-              <w:lastRenderedPageBreak/>
               <w:t>Rendszer megnevezése</w:t>
             </w:r>
           </w:p>
@@ -7108,15 +5123,7 @@
           </w:tcPr>
           <w:p>
             <w:r>
-              <w:t>${</w:t>
-            </w:r>
-            <w:proofErr w:type="spellStart"/>
-            <w:r>
-              <w:t>tech_cooling_name</w:t>
-            </w:r>
-            <w:proofErr w:type="spellEnd"/>
-            <w:r>
-              <w:t>}</w:t>
+              <w:t>${steam_name}</w:t>
             </w:r>
           </w:p>
         </w:tc>
@@ -7128,7 +5135,7 @@
           </w:tcPr>
           <w:p>
             <w:r>
-              <w:t>Hűtőberendezés típusa</w:t>
+              <w:t>Telephely</w:t>
             </w:r>
           </w:p>
         </w:tc>
@@ -7138,15 +5145,7 @@
           </w:tcPr>
           <w:p>
             <w:r>
-              <w:t>${</w:t>
-            </w:r>
-            <w:proofErr w:type="spellStart"/>
-            <w:r>
-              <w:t>tech_cooling_type</w:t>
-            </w:r>
-            <w:proofErr w:type="spellEnd"/>
-            <w:r>
-              <w:t>}</w:t>
+              <w:t>${steam_complex}</w:t>
             </w:r>
           </w:p>
         </w:tc>
@@ -7158,7 +5157,7 @@
           </w:tcPr>
           <w:p>
             <w:r>
-              <w:t>Mennyisége (db)</w:t>
+              <w:t>Hálózati nyomás (bar)</w:t>
             </w:r>
           </w:p>
         </w:tc>
@@ -7168,15 +5167,7 @@
           </w:tcPr>
           <w:p>
             <w:r>
-              <w:t>${</w:t>
-            </w:r>
-            <w:proofErr w:type="spellStart"/>
-            <w:r>
-              <w:t>tech_cooling_amount</w:t>
-            </w:r>
-            <w:proofErr w:type="spellEnd"/>
-            <w:r>
-              <w:t>}</w:t>
+              <w:t>${steam_pressure}</w:t>
             </w:r>
           </w:p>
         </w:tc>
@@ -7188,7 +5179,7 @@
           </w:tcPr>
           <w:p>
             <w:r>
-              <w:t>Névleges teljesítmény (kW/db)</w:t>
+              <w:t>${steam_row_title}</w:t>
             </w:r>
           </w:p>
         </w:tc>
@@ -7198,13 +5189,17 @@
           </w:tcPr>
           <w:p>
             <w:r>
-              <w:t>${</w:t>
-            </w:r>
-            <w:proofErr w:type="spellStart"/>
-            <w:r>
-              <w:t>tech_cooling_nominal</w:t>
-            </w:r>
-            <w:proofErr w:type="spellEnd"/>
+              <w:t>${steam_</w:t>
+            </w:r>
+            <w:r>
+              <w:t>machine</w:t>
+            </w:r>
+            <w:r>
+              <w:t>_</w:t>
+            </w:r>
+            <w:r>
+              <w:t>data</w:t>
+            </w:r>
             <w:r>
               <w:t>}</w:t>
             </w:r>
@@ -7218,7 +5213,13 @@
           </w:tcPr>
           <w:p>
             <w:r>
-              <w:t>Működési mód</w:t>
+              <w:t xml:space="preserve">Van </w:t>
+            </w:r>
+            <w:r>
+              <w:t>füstgáz</w:t>
+            </w:r>
+            <w:r>
+              <w:t xml:space="preserve"> hasznosítás?</w:t>
             </w:r>
           </w:p>
         </w:tc>
@@ -7228,15 +5229,7 @@
           </w:tcPr>
           <w:p>
             <w:r>
-              <w:t>${</w:t>
-            </w:r>
-            <w:proofErr w:type="spellStart"/>
-            <w:r>
-              <w:t>tech_cooling_mode</w:t>
-            </w:r>
-            <w:proofErr w:type="spellEnd"/>
-            <w:r>
-              <w:t>}</w:t>
+              <w:t>${steam_retriever}</w:t>
             </w:r>
           </w:p>
         </w:tc>
@@ -7248,7 +5241,7 @@
           </w:tcPr>
           <w:p>
             <w:r>
-              <w:t>Hozzá tartozó almérés</w:t>
+              <w:t>Értékelés</w:t>
             </w:r>
           </w:p>
         </w:tc>
@@ -7258,75 +5251,7 @@
           </w:tcPr>
           <w:p>
             <w:r>
-              <w:t>${</w:t>
-            </w:r>
-            <w:proofErr w:type="spellStart"/>
-            <w:r>
-              <w:t>tech_cooling_standing</w:t>
-            </w:r>
-            <w:proofErr w:type="spellEnd"/>
-            <w:r>
-              <w:t>}</w:t>
-            </w:r>
-          </w:p>
-        </w:tc>
-      </w:tr>
-      <w:tr>
-        <w:tc>
-          <w:tcPr>
-            <w:tcW w:w="4508" w:type="dxa"/>
-          </w:tcPr>
-          <w:p>
-            <w:r>
-              <w:t>Van hulladékhő hasznosítás?</w:t>
-            </w:r>
-          </w:p>
-        </w:tc>
-        <w:tc>
-          <w:tcPr>
-            <w:tcW w:w="4508" w:type="dxa"/>
-          </w:tcPr>
-          <w:p>
-            <w:r>
-              <w:t>${</w:t>
-            </w:r>
-            <w:proofErr w:type="spellStart"/>
-            <w:r>
-              <w:t>tech_cooling_retriever</w:t>
-            </w:r>
-            <w:proofErr w:type="spellEnd"/>
-            <w:r>
-              <w:t>}</w:t>
-            </w:r>
-          </w:p>
-        </w:tc>
-      </w:tr>
-      <w:tr>
-        <w:tc>
-          <w:tcPr>
-            <w:tcW w:w="4508" w:type="dxa"/>
-          </w:tcPr>
-          <w:p>
-            <w:r>
-              <w:t>Értékelés</w:t>
-            </w:r>
-          </w:p>
-        </w:tc>
-        <w:tc>
-          <w:tcPr>
-            <w:tcW w:w="4508" w:type="dxa"/>
-          </w:tcPr>
-          <w:p>
-            <w:r>
-              <w:t>${</w:t>
-            </w:r>
-            <w:proofErr w:type="spellStart"/>
-            <w:r>
-              <w:t>tech_cooling_status</w:t>
-            </w:r>
-            <w:proofErr w:type="spellEnd"/>
-            <w:r>
-              <w:t>}</w:t>
+              <w:t>${steam_status}</w:t>
             </w:r>
           </w:p>
         </w:tc>
@@ -7335,41 +5260,17 @@
     <w:p/>
     <w:p>
       <w:r>
-        <w:t>${/</w:t>
-      </w:r>
-      <w:proofErr w:type="spellStart"/>
-      <w:r>
-        <w:t>block_tech_cooling</w:t>
-      </w:r>
-      <w:proofErr w:type="spellEnd"/>
-      <w:r>
-        <w:t>}</w:t>
-      </w:r>
-    </w:p>
-    <w:p>
-      <w:r>
-        <w:t>${</w:t>
-      </w:r>
-      <w:proofErr w:type="spellStart"/>
-      <w:r>
-        <w:t>block_other</w:t>
-      </w:r>
-      <w:proofErr w:type="spellEnd"/>
-      <w:r>
-        <w:t>}</w:t>
-      </w:r>
-    </w:p>
-    <w:p>
-      <w:r>
-        <w:t>${</w:t>
-      </w:r>
-      <w:proofErr w:type="spellStart"/>
-      <w:r>
-        <w:t>other_sub</w:t>
-      </w:r>
-      <w:proofErr w:type="spellEnd"/>
-      <w:r>
-        <w:t>}</w:t>
+        <w:t>${/block_steam}</w:t>
+      </w:r>
+    </w:p>
+    <w:p>
+      <w:r>
+        <w:t>${tech_cooling_sub}</w:t>
+      </w:r>
+    </w:p>
+    <w:p>
+      <w:r>
+        <w:t>${block_tech_cooling}</w:t>
       </w:r>
     </w:p>
     <w:tbl>
@@ -7399,15 +5300,7 @@
           </w:tcPr>
           <w:p>
             <w:r>
-              <w:t>${</w:t>
-            </w:r>
-            <w:proofErr w:type="spellStart"/>
-            <w:r>
-              <w:t>other_name</w:t>
-            </w:r>
-            <w:proofErr w:type="spellEnd"/>
-            <w:r>
-              <w:t>}</w:t>
+              <w:t>${tech_cooling_name}</w:t>
             </w:r>
           </w:p>
         </w:tc>
@@ -7419,7 +5312,7 @@
           </w:tcPr>
           <w:p>
             <w:r>
-              <w:t>Telephely</w:t>
+              <w:t>${tech_cooling_row_title}</w:t>
             </w:r>
           </w:p>
         </w:tc>
@@ -7429,13 +5322,11 @@
           </w:tcPr>
           <w:p>
             <w:r>
-              <w:t>${</w:t>
-            </w:r>
-            <w:proofErr w:type="spellStart"/>
-            <w:r>
-              <w:t>other_complex</w:t>
-            </w:r>
-            <w:proofErr w:type="spellEnd"/>
+              <w:t>${tech_cooling_</w:t>
+            </w:r>
+            <w:r>
+              <w:t>row_data</w:t>
+            </w:r>
             <w:r>
               <w:t>}</w:t>
             </w:r>
@@ -7449,7 +5340,7 @@
           </w:tcPr>
           <w:p>
             <w:r>
-              <w:t>Technológiai berendezés típusa</w:t>
+              <w:t>Van hulladékhő hasznosítás?</w:t>
             </w:r>
           </w:p>
         </w:tc>
@@ -7459,15 +5350,7 @@
           </w:tcPr>
           <w:p>
             <w:r>
-              <w:t>${</w:t>
-            </w:r>
-            <w:proofErr w:type="spellStart"/>
-            <w:r>
-              <w:t>other_type</w:t>
-            </w:r>
-            <w:proofErr w:type="spellEnd"/>
-            <w:r>
-              <w:t>}</w:t>
+              <w:t>${tech_cooling_retriever}</w:t>
             </w:r>
           </w:p>
         </w:tc>
@@ -7479,7 +5362,7 @@
           </w:tcPr>
           <w:p>
             <w:r>
-              <w:t>Mennyisége (db)</w:t>
+              <w:t>Értékelés</w:t>
             </w:r>
           </w:p>
         </w:tc>
@@ -7489,135 +5372,7 @@
           </w:tcPr>
           <w:p>
             <w:r>
-              <w:t>${</w:t>
-            </w:r>
-            <w:proofErr w:type="spellStart"/>
-            <w:r>
-              <w:t>other_amount</w:t>
-            </w:r>
-            <w:proofErr w:type="spellEnd"/>
-            <w:r>
-              <w:t>}</w:t>
-            </w:r>
-          </w:p>
-        </w:tc>
-      </w:tr>
-      <w:tr>
-        <w:tc>
-          <w:tcPr>
-            <w:tcW w:w="4508" w:type="dxa"/>
-          </w:tcPr>
-          <w:p>
-            <w:r>
-              <w:t>Névleges hőteljesítmény (kW/db)</w:t>
-            </w:r>
-          </w:p>
-        </w:tc>
-        <w:tc>
-          <w:tcPr>
-            <w:tcW w:w="4508" w:type="dxa"/>
-          </w:tcPr>
-          <w:p>
-            <w:r>
-              <w:t>${</w:t>
-            </w:r>
-            <w:proofErr w:type="spellStart"/>
-            <w:r>
-              <w:t>other_nominal</w:t>
-            </w:r>
-            <w:proofErr w:type="spellEnd"/>
-            <w:r>
-              <w:t>}</w:t>
-            </w:r>
-          </w:p>
-        </w:tc>
-      </w:tr>
-      <w:tr>
-        <w:tc>
-          <w:tcPr>
-            <w:tcW w:w="4508" w:type="dxa"/>
-          </w:tcPr>
-          <w:p>
-            <w:r>
-              <w:t>Hozzá tartozó almérés</w:t>
-            </w:r>
-          </w:p>
-        </w:tc>
-        <w:tc>
-          <w:tcPr>
-            <w:tcW w:w="4508" w:type="dxa"/>
-          </w:tcPr>
-          <w:p>
-            <w:r>
-              <w:t>${</w:t>
-            </w:r>
-            <w:proofErr w:type="spellStart"/>
-            <w:r>
-              <w:t>other_standing</w:t>
-            </w:r>
-            <w:proofErr w:type="spellEnd"/>
-            <w:r>
-              <w:t>}</w:t>
-            </w:r>
-          </w:p>
-        </w:tc>
-      </w:tr>
-      <w:tr>
-        <w:tc>
-          <w:tcPr>
-            <w:tcW w:w="4508" w:type="dxa"/>
-          </w:tcPr>
-          <w:p>
-            <w:r>
-              <w:t>Van hulladékhő hasznosítás?</w:t>
-            </w:r>
-          </w:p>
-        </w:tc>
-        <w:tc>
-          <w:tcPr>
-            <w:tcW w:w="4508" w:type="dxa"/>
-          </w:tcPr>
-          <w:p>
-            <w:r>
-              <w:t>${</w:t>
-            </w:r>
-            <w:proofErr w:type="spellStart"/>
-            <w:r>
-              <w:t>other_retriever</w:t>
-            </w:r>
-            <w:proofErr w:type="spellEnd"/>
-            <w:r>
-              <w:t>}</w:t>
-            </w:r>
-          </w:p>
-        </w:tc>
-      </w:tr>
-      <w:tr>
-        <w:tc>
-          <w:tcPr>
-            <w:tcW w:w="4508" w:type="dxa"/>
-          </w:tcPr>
-          <w:p>
-            <w:r>
-              <w:t>Értékelés</w:t>
-            </w:r>
-          </w:p>
-        </w:tc>
-        <w:tc>
-          <w:tcPr>
-            <w:tcW w:w="4508" w:type="dxa"/>
-          </w:tcPr>
-          <w:p>
-            <w:r>
-              <w:t>${</w:t>
-            </w:r>
-            <w:proofErr w:type="spellStart"/>
-            <w:r>
-              <w:t>other_status</w:t>
-            </w:r>
-            <w:proofErr w:type="spellEnd"/>
-            <w:r>
-              <w:t>}</w:t>
+              <w:t>${tech_cooling_status}</w:t>
             </w:r>
           </w:p>
         </w:tc>
@@ -7626,15 +5381,145 @@
     <w:p/>
     <w:p>
       <w:r>
-        <w:t>${/</w:t>
-      </w:r>
-      <w:proofErr w:type="spellStart"/>
-      <w:r>
-        <w:t>block_other</w:t>
-      </w:r>
-      <w:proofErr w:type="spellEnd"/>
-      <w:r>
-        <w:t>}</w:t>
+        <w:t>${/block_tech_cooling}</w:t>
+      </w:r>
+    </w:p>
+    <w:p>
+      <w:r>
+        <w:t>${other_sub}</w:t>
+      </w:r>
+    </w:p>
+    <w:p>
+      <w:r>
+        <w:lastRenderedPageBreak/>
+        <w:t>${block_other}</w:t>
+      </w:r>
+    </w:p>
+    <w:tbl>
+      <w:tblPr>
+        <w:tblStyle w:val="TableGrid"/>
+        <w:tblW w:w="0" w:type="auto"/>
+        <w:tblLook w:val="04A0" w:firstRow="1" w:lastRow="0" w:firstColumn="1" w:lastColumn="0" w:noHBand="0" w:noVBand="1"/>
+      </w:tblPr>
+      <w:tblGrid>
+        <w:gridCol w:w="4508"/>
+        <w:gridCol w:w="4508"/>
+      </w:tblGrid>
+      <w:tr>
+        <w:tc>
+          <w:tcPr>
+            <w:tcW w:w="4508" w:type="dxa"/>
+          </w:tcPr>
+          <w:p>
+            <w:r>
+              <w:t>Rendszer megnevezése</w:t>
+            </w:r>
+          </w:p>
+        </w:tc>
+        <w:tc>
+          <w:tcPr>
+            <w:tcW w:w="4508" w:type="dxa"/>
+          </w:tcPr>
+          <w:p>
+            <w:r>
+              <w:t>${other_name}</w:t>
+            </w:r>
+          </w:p>
+        </w:tc>
+      </w:tr>
+      <w:tr>
+        <w:tc>
+          <w:tcPr>
+            <w:tcW w:w="4508" w:type="dxa"/>
+          </w:tcPr>
+          <w:p>
+            <w:r>
+              <w:t>Telephely</w:t>
+            </w:r>
+          </w:p>
+        </w:tc>
+        <w:tc>
+          <w:tcPr>
+            <w:tcW w:w="4508" w:type="dxa"/>
+          </w:tcPr>
+          <w:p>
+            <w:r>
+              <w:t>${other_complex}</w:t>
+            </w:r>
+          </w:p>
+        </w:tc>
+      </w:tr>
+      <w:tr>
+        <w:tc>
+          <w:tcPr>
+            <w:tcW w:w="4508" w:type="dxa"/>
+          </w:tcPr>
+          <w:p>
+            <w:r>
+              <w:t>${other_row_title}</w:t>
+            </w:r>
+          </w:p>
+        </w:tc>
+        <w:tc>
+          <w:tcPr>
+            <w:tcW w:w="4508" w:type="dxa"/>
+          </w:tcPr>
+          <w:p>
+            <w:r>
+              <w:t>${other_row_data}</w:t>
+            </w:r>
+          </w:p>
+        </w:tc>
+      </w:tr>
+      <w:tr>
+        <w:tc>
+          <w:tcPr>
+            <w:tcW w:w="4508" w:type="dxa"/>
+          </w:tcPr>
+          <w:p>
+            <w:r>
+              <w:t>Van hulladékhő hasznosítás?</w:t>
+            </w:r>
+          </w:p>
+        </w:tc>
+        <w:tc>
+          <w:tcPr>
+            <w:tcW w:w="4508" w:type="dxa"/>
+          </w:tcPr>
+          <w:p>
+            <w:r>
+              <w:t>${other_retriever}</w:t>
+            </w:r>
+          </w:p>
+        </w:tc>
+      </w:tr>
+      <w:tr>
+        <w:tc>
+          <w:tcPr>
+            <w:tcW w:w="4508" w:type="dxa"/>
+          </w:tcPr>
+          <w:p>
+            <w:r>
+              <w:t>Értékelés</w:t>
+            </w:r>
+          </w:p>
+        </w:tc>
+        <w:tc>
+          <w:tcPr>
+            <w:tcW w:w="4508" w:type="dxa"/>
+          </w:tcPr>
+          <w:p>
+            <w:r>
+              <w:t>${other_status}</w:t>
+            </w:r>
+          </w:p>
+        </w:tc>
+      </w:tr>
+    </w:tbl>
+    <w:p/>
+    <w:p>
+      <w:r>
+        <w:t>${/block_other}</w:t>
       </w:r>
     </w:p>
     <w:p>
@@ -7643,34 +5528,13 @@
       </w:pPr>
       <w:r>
         <w:lastRenderedPageBreak/>
-        <w:t>${</w:t>
-      </w:r>
-      <w:proofErr w:type="spellStart"/>
-      <w:r>
-        <w:t>technology_offset_index</w:t>
-      </w:r>
-      <w:proofErr w:type="spellEnd"/>
-      <w:proofErr w:type="gramStart"/>
-      <w:r>
-        <w:t>}.A</w:t>
-      </w:r>
-      <w:proofErr w:type="gramEnd"/>
-      <w:r>
-        <w:t xml:space="preserve"> fogyasztások felosztása</w:t>
+        <w:t>${technology_offset_index}.A fogyasztások felosztása</w:t>
       </w:r>
       <w:bookmarkEnd w:id="15"/>
     </w:p>
     <w:p>
       <w:r>
-        <w:t>A ${</w:t>
-      </w:r>
-      <w:proofErr w:type="spellStart"/>
-      <w:r>
-        <w:t>company_name</w:t>
-      </w:r>
-      <w:proofErr w:type="spellEnd"/>
-      <w:r>
-        <w:t>} az ismertetett rendszerek mért vagy számított fogyasztásai alapján az alábbi energiafogyasztási profillal rendelkezik:</w:t>
+        <w:t>A ${company_name} az ismertetett rendszerek mért vagy számított fogyasztásai alapján az alábbi energiafogyasztási profillal rendelkezik:</w:t>
       </w:r>
     </w:p>
     <w:tbl>
@@ -7895,15 +5759,7 @@
     <w:p/>
     <w:p>
       <w:r>
-        <w:t>${</w:t>
-      </w:r>
-      <w:proofErr w:type="spellStart"/>
-      <w:r>
-        <w:t>sankey_diagram</w:t>
-      </w:r>
-      <w:proofErr w:type="spellEnd"/>
-      <w:r>
-        <w:t>}</w:t>
+        <w:t>${sankey_diagram}</w:t>
       </w:r>
     </w:p>
     <w:p>
@@ -7913,66 +5769,13 @@
       <w:bookmarkStart w:id="16" w:name="_Toc239899323"/>
       <w:r>
         <w:lastRenderedPageBreak/>
-        <w:t>${technology_offset_2_index</w:t>
-      </w:r>
-      <w:proofErr w:type="gramStart"/>
-      <w:r>
-        <w:t>}.Energia</w:t>
-      </w:r>
-      <w:proofErr w:type="gramEnd"/>
-      <w:r>
-        <w:t xml:space="preserve"> teljesítmény mutató meghatározása</w:t>
+        <w:t>${technology_offset_2_index}.Energia teljesítmény mutató meghatározása</w:t>
       </w:r>
       <w:bookmarkEnd w:id="16"/>
     </w:p>
     <w:p>
       <w:r>
-        <w:t>Minden gazdálkodó szervezet esetében fontos, hogy ne önmagában kerüljön meghatározásra az energiafogyasztás. Az ETM (Energia Teljesítmény Mutató) olyan mérőszám, amely az energiafelhasználást egy releváns teljesítmény jellemzőhöz – például termelési mennyiséghez, alapterülethez vagy üzemórához – viszonyítva teszi mérhetővé és összehasonlíthatóvá az energetikai teljesítményt. A ${</w:t>
-      </w:r>
-      <w:proofErr w:type="spellStart"/>
-      <w:r>
-        <w:t>company_name</w:t>
-      </w:r>
-      <w:proofErr w:type="spellEnd"/>
-      <w:r>
-        <w:t>} gazdálkodásában ez a mutató a ${</w:t>
-      </w:r>
-      <w:proofErr w:type="spellStart"/>
-      <w:r>
-        <w:t>product_</w:t>
-      </w:r>
-      <w:proofErr w:type="gramStart"/>
-      <w:r>
-        <w:t>name</w:t>
-      </w:r>
-      <w:proofErr w:type="spellEnd"/>
-      <w:r>
-        <w:t>}-</w:t>
-      </w:r>
-      <w:proofErr w:type="spellStart"/>
-      <w:proofErr w:type="gramEnd"/>
-      <w:r>
-        <w:t>ra</w:t>
-      </w:r>
-      <w:proofErr w:type="spellEnd"/>
-      <w:r>
-        <w:t xml:space="preserve">/re vonatkoztatott fajlagos </w:t>
-      </w:r>
-      <w:proofErr w:type="gramStart"/>
-      <w:r>
-        <w:t>energia felhasználás</w:t>
-      </w:r>
-      <w:proofErr w:type="gramEnd"/>
-      <w:r>
-        <w:t>. A ${</w:t>
-      </w:r>
-      <w:proofErr w:type="spellStart"/>
-      <w:r>
-        <w:t>audit_interval</w:t>
-      </w:r>
-      <w:proofErr w:type="spellEnd"/>
-      <w:r>
-        <w:t>} időszak termelés számai az alábbi táblázat szerint alakultak:</w:t>
+        <w:t>Minden gazdálkodó szervezet esetében fontos, hogy ne önmagában kerüljön meghatározásra az energiafogyasztás. Az ETM (Energia Teljesítmény Mutató) olyan mérőszám, amely az energiafelhasználást egy releváns teljesítmény jellemzőhöz – például termelési mennyiséghez, alapterülethez vagy üzemórához – viszonyítva teszi mérhetővé és összehasonlíthatóvá az energetikai teljesítményt. A ${company_name} gazdálkodásában ez a mutató a ${product_name}-ra/re vonatkoztatott fajlagos energia felhasználás. A ${audit_interval} időszak termelés számai az alábbi táblázat szerint alakultak:</w:t>
       </w:r>
     </w:p>
     <w:tbl>
@@ -8032,25 +5835,7 @@
                 <w:sz w:val="2"/>
                 <w:szCs w:val="2"/>
               </w:rPr>
-              <w:t>${</w:t>
-            </w:r>
-            <w:proofErr w:type="spellStart"/>
-            <w:r>
-              <w:rPr>
-                <w:color w:val="FFFFFF" w:themeColor="background1"/>
-                <w:sz w:val="2"/>
-                <w:szCs w:val="2"/>
-              </w:rPr>
-              <w:t>product_listing_row</w:t>
-            </w:r>
-            <w:proofErr w:type="spellEnd"/>
-            <w:r>
-              <w:rPr>
-                <w:color w:val="FFFFFF" w:themeColor="background1"/>
-                <w:sz w:val="2"/>
-                <w:szCs w:val="2"/>
-              </w:rPr>
-              <w:t>}</w:t>
+              <w:t>${product_listing_row}</w:t>
             </w:r>
           </w:p>
         </w:tc>
@@ -8060,15 +5845,7 @@
           </w:tcPr>
           <w:p>
             <w:r>
-              <w:t>${</w:t>
-            </w:r>
-            <w:proofErr w:type="spellStart"/>
-            <w:r>
-              <w:t>product_listing_name</w:t>
-            </w:r>
-            <w:proofErr w:type="spellEnd"/>
-            <w:r>
-              <w:t>}</w:t>
+              <w:t>${product_listing_name}</w:t>
             </w:r>
           </w:p>
         </w:tc>
@@ -8078,15 +5855,7 @@
           </w:tcPr>
           <w:p>
             <w:r>
-              <w:t>${</w:t>
-            </w:r>
-            <w:proofErr w:type="spellStart"/>
-            <w:r>
-              <w:t>product_listing_amount</w:t>
-            </w:r>
-            <w:proofErr w:type="spellEnd"/>
-            <w:r>
-              <w:t>}</w:t>
+              <w:t>${product_listing_amount}</w:t>
             </w:r>
           </w:p>
         </w:tc>
@@ -8105,44 +5874,18 @@
       <w:bookmarkStart w:id="17" w:name="_Toc239899324"/>
       <w:r>
         <w:lastRenderedPageBreak/>
-        <w:t>${technology_offset_3_index</w:t>
-      </w:r>
-      <w:proofErr w:type="gramStart"/>
-      <w:r>
-        <w:t>}.Javaslatok</w:t>
-      </w:r>
-      <w:proofErr w:type="gramEnd"/>
-      <w:r>
-        <w:t xml:space="preserve"> és források</w:t>
+        <w:t>${technology_offset_3_index}.Javaslatok és források</w:t>
       </w:r>
       <w:bookmarkEnd w:id="17"/>
     </w:p>
     <w:p>
-      <w:proofErr w:type="gramStart"/>
-      <w:r>
-        <w:t>a)Kapacitás</w:t>
-      </w:r>
-      <w:proofErr w:type="gramEnd"/>
-      <w:r>
-        <w:t>-optimalizálás:</w:t>
-      </w:r>
-    </w:p>
-    <w:p>
-      <w:proofErr w:type="gramStart"/>
-      <w:r>
-        <w:t>b)Épületenergetikai</w:t>
-      </w:r>
-      <w:proofErr w:type="gramEnd"/>
-      <w:r>
-        <w:t xml:space="preserve"> javaslatok: ${</w:t>
-      </w:r>
-      <w:proofErr w:type="spellStart"/>
-      <w:r>
-        <w:t>suggestion_a</w:t>
-      </w:r>
-      <w:proofErr w:type="spellEnd"/>
-      <w:r>
-        <w:t>}</w:t>
+      <w:r>
+        <w:t>a)Kapacitás-optimalizálás:</w:t>
+      </w:r>
+    </w:p>
+    <w:p>
+      <w:r>
+        <w:t>b)Épületenergetikai javaslatok: ${suggestion_a}</w:t>
       </w:r>
     </w:p>
     <w:p>
@@ -8153,15 +5896,7 @@
         <w:t xml:space="preserve"> </w:t>
       </w:r>
       <w:r>
-        <w:t>${</w:t>
-      </w:r>
-      <w:proofErr w:type="spellStart"/>
-      <w:r>
-        <w:t>suggestion_b</w:t>
-      </w:r>
-      <w:proofErr w:type="spellEnd"/>
-      <w:r>
-        <w:t>}</w:t>
+        <w:t>${suggestion_b}</w:t>
       </w:r>
     </w:p>
     <w:p>
@@ -8172,73 +5907,34 @@
         <w:t xml:space="preserve"> </w:t>
       </w:r>
       <w:r>
-        <w:t>${</w:t>
-      </w:r>
-      <w:proofErr w:type="spellStart"/>
-      <w:r>
-        <w:t>suggestion_c</w:t>
-      </w:r>
-      <w:proofErr w:type="spellEnd"/>
-      <w:r>
-        <w:t>}</w:t>
-      </w:r>
-    </w:p>
-    <w:p>
-      <w:proofErr w:type="gramStart"/>
-      <w:r>
-        <w:t>e)Szállítás</w:t>
-      </w:r>
-      <w:proofErr w:type="gramEnd"/>
-      <w:r>
-        <w:t xml:space="preserve"> optimalizálás:</w:t>
+        <w:t>${suggestion_c}</w:t>
+      </w:r>
+    </w:p>
+    <w:p>
+      <w:r>
+        <w:t>e)Szállítás optimalizálás:</w:t>
       </w:r>
       <w:r>
         <w:t xml:space="preserve"> </w:t>
       </w:r>
       <w:r>
-        <w:t>${</w:t>
-      </w:r>
-      <w:proofErr w:type="spellStart"/>
-      <w:r>
-        <w:t>suggestion_d</w:t>
-      </w:r>
-      <w:proofErr w:type="spellEnd"/>
-      <w:r>
-        <w:t>}</w:t>
-      </w:r>
-    </w:p>
-    <w:p>
-      <w:proofErr w:type="gramStart"/>
-      <w:r>
-        <w:t>f)Alternatív</w:t>
-      </w:r>
-      <w:proofErr w:type="gramEnd"/>
-      <w:r>
-        <w:t xml:space="preserve"> hőtermelési/hűtési javaslatok:</w:t>
+        <w:t>${suggestion_d}</w:t>
+      </w:r>
+    </w:p>
+    <w:p>
+      <w:r>
+        <w:t>f)Alternatív hőtermelési/hűtési javaslatok:</w:t>
       </w:r>
       <w:r>
         <w:t xml:space="preserve"> </w:t>
       </w:r>
       <w:r>
-        <w:t>${</w:t>
-      </w:r>
-      <w:proofErr w:type="spellStart"/>
-      <w:r>
-        <w:t>suggestion_e</w:t>
-      </w:r>
-      <w:proofErr w:type="spellEnd"/>
-      <w:r>
-        <w:t>}</w:t>
-      </w:r>
-    </w:p>
-    <w:p>
-      <w:proofErr w:type="gramStart"/>
-      <w:r>
-        <w:t>g)Megújuló</w:t>
-      </w:r>
-      <w:proofErr w:type="gramEnd"/>
-      <w:r>
-        <w:t xml:space="preserve"> energiaforrás bevonási javaslatok: Kapacitásbővítés vagy napelem rendszer telepítése javasolt</w:t>
+        <w:t>${suggestion_e}</w:t>
+      </w:r>
+    </w:p>
+    <w:p>
+      <w:r>
+        <w:t>g)Megújuló energiaforrás bevonási javaslatok: Kapacitásbővítés vagy napelem rendszer telepítése javasolt</w:t>
       </w:r>
     </w:p>
     <w:sectPr>
@@ -8312,19 +6008,11 @@
               <w:color w:val="000000"/>
             </w:rPr>
           </w:pPr>
-          <w:proofErr w:type="spellStart"/>
           <w:r>
             <w:rPr>
               <w:color w:val="000000"/>
             </w:rPr>
-            <w:t>Balajti</w:t>
-          </w:r>
-          <w:proofErr w:type="spellEnd"/>
-          <w:r>
-            <w:rPr>
-              <w:color w:val="000000"/>
-            </w:rPr>
-            <w:t xml:space="preserve"> Energetika Kft.</w:t>
+            <w:t>Balajti Energetika Kft.</w:t>
           </w:r>
         </w:p>
       </w:tc>
@@ -8347,21 +6035,7 @@
             <w:rPr>
               <w:color w:val="000000"/>
             </w:rPr>
-            <w:t>${</w:t>
-          </w:r>
-          <w:proofErr w:type="spellStart"/>
-          <w:r>
-            <w:rPr>
-              <w:color w:val="000000"/>
-            </w:rPr>
-            <w:t>company_name</w:t>
-          </w:r>
-          <w:proofErr w:type="spellEnd"/>
-          <w:r>
-            <w:rPr>
-              <w:color w:val="000000"/>
-            </w:rPr>
-            <w:t>}</w:t>
+            <w:t>${company_name}</w:t>
           </w:r>
           <w:r>
             <w:rPr>

</xml_diff>